<commit_message>
Polish JAMIA manuscript with clinical framing and verified literature
</commit_message>
<xml_diff>
--- a/analysis/output/manuscript/Manuscript.docx
+++ b/analysis/output/manuscript/Manuscript.docx
@@ -2,7 +2,7 @@
 <file path=word/document.xml><?xml version="1.0" encoding="utf-8"?>
 <w:document xmlns:w="http://schemas.openxmlformats.org/wordprocessingml/2006/main" xmlns:m="http://schemas.openxmlformats.org/officeDocument/2006/math" xmlns:r="http://schemas.openxmlformats.org/officeDocument/2006/relationships" xmlns:o="urn:schemas-microsoft-com:office:office" xmlns:v="urn:schemas-microsoft-com:vml" xmlns:w10="urn:schemas-microsoft-com:office:word" xmlns:a="http://schemas.openxmlformats.org/drawingml/2006/main" xmlns:pic="http://schemas.openxmlformats.org/drawingml/2006/picture" xmlns:wp="http://schemas.openxmlformats.org/drawingml/2006/wordprocessingDrawing">
   <w:body>
-    <w:bookmarkStart w:id="64" w:name="X26e74a24f867deabfa9c1d5ee51de4ca1fc52bd"/>
+    <w:bookmarkStart w:id="58" w:name="X26e74a24f867deabfa9c1d5ee51de4ca1fc52bd"/>
     <w:p>
       <w:pPr>
         <w:pStyle w:val="Title"/>
@@ -42,13 +42,13 @@
     </w:p>
     <w:p>
       <w:r>
-        <w:t>Word counts: main text 2787; structured abstract 232.</w:t>
+        <w:t>Word counts: main text 3425; structured abstract 239.</w:t>
       </w:r>
     </w:p>
     <w:bookmarkEnd w:id="9"/>
     <w:bookmarkStart w:id="15" w:name="abstract"/>
     <w:p>
-      <w:bookmarkStart w:id="70" w:name="loc_5"/>
+      <w:bookmarkStart w:id="64" w:name="loc_5"/>
       <w:pPr>
         <w:pStyle w:val="Heading1"/>
         <w:pageBreakBefore/>
@@ -60,7 +60,7 @@
         </w:rPr>
         <w:t>ABSTRACT</w:t>
       </w:r>
-      <w:bookmarkEnd w:id="70"/>
+      <w:bookmarkEnd w:id="64"/>
     </w:p>
     <w:bookmarkStart w:id="10" w:name="objective"/>
     <w:p>
@@ -92,7 +92,7 @@
         <w:t xml:space="preserve">Materials and Methods. </w:t>
       </w:r>
       <w:r>
-        <w:t xml:space="preserve">ARBITER separates model interpretation from executable decision rules and retains sources, answers and evidence. We compared its Sonnet workflow with a same-model minimal-prompt comparator using identical supplied documents for 102 trials from 16 reviews. Two experts independently rated five domains per trial (510 trial–domain cells), then chose among blinded labels. The formal primary endpoint was ARBITER preference where arm ratings differed and both experts chose the same label; all-cell agreement was secondary. Paired intervals resampled trials within fixed reviews.</w:t>
+        <w:t xml:space="preserve">ARBITER retains sources, evidence and signalling answers, then applies RoB 2 decision rules in software. We compared its Sonnet workflow with a same-model minimal-prompt comparator (Unassisted) using identical supplied documents for 102 trials from 16 reviews. Two experts independently rated five domains per trial (510 assessments) before choosing among blinded labels. The primary endpoint was the proportion of agreed expert choices matching ARBITER where workflows disagreed. Agreement with each expert across all 510 assessments was secondary. Paired intervals resampled trials within fixed reviews.</w:t>
       </w:r>
     </w:p>
     <w:bookmarkEnd w:id="11"/>
@@ -109,7 +109,7 @@
         <w:t xml:space="preserve">Results. </w:t>
       </w:r>
       <w:r>
-        <w:t xml:space="preserve">Agreed choices favored ARBITER in 53/60 cells (88%; 95% CI, 80–96%), from 80 arm-discordant cells with 20 split choices. Exact agreement was 371/510 (72.7%) versus 332/510 (65.1%) against Expert 1 and 433/510 (84.9%) versus 400/510 (78.4%) against Expert 2. Paired gains were 7.6 percentage points (95% CI, 5.1–10.2) and 6.5 (3.5–9.4), with the largest observed domain gains in selection of the reported result. Published-label agreement differed by −1.8 points (−5.1 to 1.6). All 510 ARBITER domain outputs followed executable rules; structural checks did not assess semantic evidence support. Median runtime was 7.6 versus 0.5 minutes per trial.</w:t>
+        <w:t xml:space="preserve">The chosen label matched ARBITER in 53/60 agreed choices (88%; 95% CI, 80–96%), from 80 workflow disagreements with 20 split choices. Exact agreement was 371/510 (72.7%) versus 332/510 (65.1%) against Expert 1 and 433/510 (84.9%) versus 400/510 (78.4%) against Expert 2. Paired gains were 7.6 percentage points (95% CI, 5.1–10.2) and 6.5 (3.5–9.4). Against published labels, ARBITER minus Unassisted agreement was −1.8 points (−5.1 to 1.6). All 510 ARBITER domain outputs followed executable rules. Structural checks did not assess whether evidence supported the answers. Median runtime was 7.6 versus 0.5 minutes per trial.</w:t>
       </w:r>
     </w:p>
     <w:bookmarkEnd w:id="12"/>
@@ -126,7 +126,7 @@
         <w:t xml:space="preserve">Discussion. </w:t>
       </w:r>
       <w:r>
-        <w:t xml:space="preserve">Agreement depended on domain and reference. The complete-workflow comparison does not isolate component effects or measure human workload.</w:t>
+        <w:t xml:space="preserve">Agreement varied by domain and reference. Instructions, tools and computation differed between workflows; the comparison does not isolate component effects or measure reviewer benefit.</w:t>
       </w:r>
     </w:p>
     <w:bookmarkEnd w:id="13"/>
@@ -143,14 +143,14 @@
         <w:t xml:space="preserve">Conclusion. </w:t>
       </w:r>
       <w:r>
-        <w:t xml:space="preserve">ARBITER provides inspectable assessment records and had greater agreement with both independent experts in this benchmark.</w:t>
+        <w:t xml:space="preserve">ARBITER preserves an inspectable assessment pathway and had greater agreement with both independent experts in this benchmark.</w:t>
       </w:r>
     </w:p>
     <w:bookmarkEnd w:id="14"/>
     <w:bookmarkEnd w:id="15"/>
     <w:bookmarkStart w:id="16" w:name="background-and-significance"/>
     <w:p>
-      <w:bookmarkStart w:id="76" w:name="loc_11"/>
+      <w:bookmarkStart w:id="70" w:name="loc_11"/>
       <w:pPr>
         <w:pStyle w:val="Heading1"/>
         <w:pageBreakBefore/>
@@ -161,14 +161,14 @@
         </w:rPr>
         <w:t>BACKGROUND AND SIGNIFICANCE</w:t>
       </w:r>
-      <w:bookmarkEnd w:id="76"/>
+      <w:bookmarkEnd w:id="70"/>
     </w:p>
     <w:p>
       <w:pPr>
         <w:pStyle w:val="FirstParagraph"/>
       </w:pPr>
       <w:r>
-        <w:t xml:space="preserve">Reviewers need to understand how a risk-of-bias judgment follows from the trial evidence. The Cochrane risk-of-bias tool for randomised trials (RoB 2) structures assessment of a specific trial result through signalling questions, domain algorithms and an Overall judgment.[1] Applying it requires both interpretation of trial evidence and consistent translation of answers into ratings. Experienced assessors can disagree, and implementation instructions can improve reliability.[2–3] Published reviews also differ when assessing the same trials with the earlier instrument.[4–5] For AI-assisted appraisal, transparent records and human oversight are therefore central concerns of evidence-synthesis organizations.[6–7]</w:t>
+        <w:t xml:space="preserve">A risk-of-bias judgment is a conclusion about a particular trial result. To examine that conclusion, a reviewer needs to follow the supporting evidence through the assessment. The Cochrane risk-of-bias tool for randomised trials (RoB 2) makes this pathway explicit through signalling questions and algorithms that translate answers into domain judgments.[1] Interpretation remains necessary at each question. Experienced assessors have reported application difficulties and disagreement; condition-specific implementation instructions and calibration were followed by improved agreement in one review setting.[2,3] Studies using the earlier Cochrane instrument also found different interpretations of the same trial information across reviews.[4] For AI-assisted assessment, the relevant problem is therefore how to preserve a judgment’s basis while evaluating the judgment itself.</w:t>
       </w:r>
     </w:p>
     <w:p>
@@ -176,7 +176,7 @@
         <w:pStyle w:val="BodyText"/>
       </w:pPr>
       <w:r>
-        <w:t xml:space="preserve">Automated appraisal has developed along complementary paths: exposing evidence for inspection, structuring the assessment process and evaluating judgments against human references. Systems have paired automated judgments with extracted evidence and, in interactive RoB 2 workflows, reviewer edits.[8–9] Expert-reference evaluation, structured RoB 2 prompts and answer-derived ratings have also been studied,[10–11] as have same-model comparisons of direct and constrained prompts for the earlier instrument.[12] These precedents shift the question from whether AI can produce a plausible label to what a complete workflow makes reviewable and how its judgments perform under a defined comparison.</w:t>
+        <w:t xml:space="preserve">Earlier systems establish that evidence display and structured assessment are practical approaches to this problem. RobotReviewer paired automated judgments with extracted supporting sentences for the earlier instrument.[5] ROBOTO2 extends evidence-linked assessment to an interactive RoB 2 workflow in which reviewers can inspect and change proposed answers and judgments.[6] Structured RoB 2 prompting has also been evaluated against human assessments, including checks of whether domain ratings follow from signalling answers.[7,8] Same-model comparisons of direct and constrained prompts have also been studied with the earlier instrument.[9] These approaches make different parts of an assessment available for examination. Their existence shifts the evaluation question toward the properties and performance of a specified implementation.</w:t>
       </w:r>
     </w:p>
     <w:p>
@@ -184,13 +184,13 @@
         <w:pStyle w:val="BodyText"/>
       </w:pPr>
       <w:r>
-        <w:t xml:space="preserve">Procedural checks and judgment quality answer different parts of that question. Software can faithfully apply a decision rule to an inappropriate answer; a quotation can occur in a source without supporting the interpretation attached to it. Similarly, agreement with published labels may differ from agreement with fresh expert assessments. Prior studies have examined domain agreement, repeated assessments and reference dependence,[10–11,13–18] but differences in inputs, datasets and references preclude ranking systems by their reported percentages. A paired, same-model evaluation can estimate differences in agreement within one benchmark while keeping procedural properties separate.</w:t>
+        <w:t xml:space="preserve">Three properties require separate assessment. A source link establishes where quoted text occurs; it does not establish that the text supports the answer. Applying the decision rules establishes how recorded answers produce a rating; it does not establish that those answers are appropriate. Agreement then depends on the human reference, as studies using published labels and fresh assessments illustrate.[7,8,10] ARBITER preserves the source-to-answer-to-rating pathway and evaluates its complete workflow in a paired, same-model benchmark. The empirical question is whether this complete workflow agrees more often with independent assessors than minimal prompting, and where disagreement remains.</w:t>
       </w:r>
     </w:p>
     <w:bookmarkEnd w:id="16"/>
     <w:bookmarkStart w:id="17" w:name="objective-1"/>
     <w:p>
-      <w:bookmarkStart w:id="80" w:name="loc_15"/>
+      <w:bookmarkStart w:id="74" w:name="loc_15"/>
       <w:pPr>
         <w:pStyle w:val="Heading1"/>
       </w:pPr>
@@ -200,20 +200,20 @@
         </w:rPr>
         <w:t>OBJECTIVE</w:t>
       </w:r>
-      <w:bookmarkEnd w:id="80"/>
+      <w:bookmarkEnd w:id="74"/>
     </w:p>
     <w:p>
       <w:pPr>
         <w:pStyle w:val="FirstParagraph"/>
       </w:pPr>
       <w:r>
-        <w:t xml:space="preserve">We asked what assessment pathway ARBITER makes inspectable and how its complete Sonnet workflow compares with the same model given a minimal prompt and identical supplied trial documents. We evaluated conditional expert preference, agreement with each independent expert across all domains, rule conformance, evidence-record integrity and computational burden.</w:t>
+        <w:t xml:space="preserve">We evaluated what ARBITER makes inspectable and how its complete Sonnet workflow compares with the same model given minimal instructions and identical supplied trial evidence. The formal primary endpoint concerned agreed expert label choices where the workflows differed. Secondary and supporting outcomes assessed independent expert agreement across all domains, consistency with decision rules, source records and computation.</w:t>
       </w:r>
     </w:p>
     <w:bookmarkEnd w:id="17"/>
-    <w:bookmarkStart w:id="25" w:name="materials-and-methods-1"/>
-    <w:p>
-      <w:bookmarkStart w:id="82" w:name="loc_17"/>
+    <w:bookmarkStart w:id="24" w:name="materials-and-methods-1"/>
+    <w:p>
+      <w:bookmarkStart w:id="76" w:name="loc_17"/>
       <w:pPr>
         <w:pStyle w:val="Heading1"/>
       </w:pPr>
@@ -223,11 +223,11 @@
         </w:rPr>
         <w:t>MATERIALS AND METHODS</w:t>
       </w:r>
-      <w:bookmarkEnd w:id="82"/>
+      <w:bookmarkEnd w:id="76"/>
     </w:p>
     <w:bookmarkStart w:id="18" w:name="system-design"/>
     <w:p>
-      <w:bookmarkStart w:id="83" w:name="loc_18"/>
+      <w:bookmarkStart w:id="77" w:name="loc_18"/>
       <w:pPr>
         <w:pStyle w:val="Heading2"/>
       </w:pPr>
@@ -237,14 +237,14 @@
         </w:rPr>
         <w:t>System design</w:t>
       </w:r>
-      <w:bookmarkEnd w:id="83"/>
+      <w:bookmarkEnd w:id="77"/>
     </w:p>
     <w:p>
       <w:pPr>
         <w:pStyle w:val="FirstParagraph"/>
       </w:pPr>
       <w:r>
-        <w:t xml:space="preserve">ARBITER assigns evidence interpretation to the AI model and reproducible checks to software (Figure 1). The model identifies the trial result and answers RoB 2 signalling questions. The software retains content-hashed sources, extracts quoted spans, binds evidence records to source locations and applies the official decision algorithms. A reviewer approves the proposed result before domain assessment and can inspect the resulting answers and cited evidence. The exported HTML report and audit file preserve this pathway for independent inspection.</w:t>
+        <w:t xml:space="preserve">ARBITER separates interpretation of trial evidence from application of the RoB 2 decision rules (Figure 1). The AI model identifies the result to assess and answers the signalling questions; software applies the official algorithms to those answers. It retains the source documents with digital fingerprints that identify their exact contents, extracts quoted passages and records their locations. In interactive use, a reviewer can approve the proposed result before domain assessment and inspect the answers and cited evidence. In this benchmark, the automated run procedure accepted the proposed result unchanged. The exported HTML report and accompanying audit file preserve the assessment for inspection.</w:t>
       </w:r>
     </w:p>
     <w:p>
@@ -252,7 +252,7 @@
         <w:pStyle w:val="BodyText"/>
       </w:pPr>
       <w:r>
-        <w:t xml:space="preserve">Every required answer must have an evidence basis. Text quotations are server-extracted spans; image regions are rendered and linked to source pages. Model-written image descriptions are not independently checked against image content. The software computes a proposed rating and permits an override only with a recorded rationale and evidence. Proposed and adopted ratings were checked separately. These safeguards make interpretation traceable without establishing that it is defensible.</w:t>
+        <w:t xml:space="preserve">Every required answer must cite an evidence basis. Software extracts text quotations directly from the stored documents and links image regions to source pages. The model’s descriptions of images are not independently checked against the image content. The software computes a proposed domain rating from the recorded answers; a different adopted rating requires a recorded rationale and evidence. We checked proposed and adopted ratings separately. This record makes the basis of a judgment traceable without establishing that the evidence supports the answer.</w:t>
       </w:r>
     </w:p>
     <w:p>
@@ -260,13 +260,13 @@
         <w:pStyle w:val="BodyText"/>
       </w:pPr>
       <w:r>
-        <w:t xml:space="preserve">The AVATAR assessment illustrates the pathway for all-cause death after early surgery versus watchful waiting in asymptomatic severe aortic stenosis (Figure 2; complete trace in the supplement). The case was selected to explain the workflow, not to represent typical performance. Its stored documents did not establish a dated analysis plan for the assessed result.</w:t>
+        <w:t xml:space="preserve">The AVATAR assessment illustrates the pathway for all-cause death after early surgery versus watchful waiting in asymptomatic severe aortic stenosis (Figure 2; complete trace in the supplement). The case illustrates the workflow rather than typical performance. Its stored documents did not establish a dated analysis plan for the assessed result.</w:t>
       </w:r>
     </w:p>
     <w:bookmarkEnd w:id="18"/>
-    <w:bookmarkStart w:id="21" w:name="benchmark-and-assessment-arms"/>
-    <w:p>
-      <w:bookmarkStart w:id="87" w:name="loc_22"/>
+    <w:bookmarkStart w:id="20" w:name="benchmark-and-assessment-arms"/>
+    <w:p>
+      <w:bookmarkStart w:id="81" w:name="loc_22"/>
       <w:pPr>
         <w:pStyle w:val="Heading2"/>
       </w:pPr>
@@ -276,14 +276,14 @@
         </w:rPr>
         <w:t>Benchmark and assessment arms</w:t>
       </w:r>
-      <w:bookmarkEnd w:id="87"/>
+      <w:bookmarkEnd w:id="81"/>
     </w:p>
     <w:p>
       <w:pPr>
         <w:pStyle w:val="FirstParagraph"/>
       </w:pPr>
       <w:r>
-        <w:t xml:space="preserve">The source set contained 105 trials from 16 published meta-analyses. Selection proceeded through each review’s table order, taking up to seven available eligible trials and replacing unavailable reports with the next eligible trial in that order. Excluding three unsupported designs left 102 trials. The supplementary benchmark table documents the reviews, specialties and source availability. Prompts targeted the result labeled by the review, using its outcome, time point, contrast and printed result, rather than automatically selecting the trial’s primary outcome. Published labels could cover broader, inferred or different targets. Published-reference comparisons retained the full domain cohort; target uncertainty was considered qualitatively.</w:t>
+        <w:t xml:space="preserve">The source set contained 105 trials from 16 published meta-analyses. Within each review, selection followed its table order, taking up to seven available eligible trials and replacing unavailable reports with the next eligible trial. Three trials were excluded under the analysis plan, leaving 102 trials. The supplementary benchmark table documents the reviews, specialties and source availability. [Pending: how the reviews were identified and selected, eligibility criteria and confirmation of the excluded design classifications.]</w:t>
       </w:r>
     </w:p>
     <w:p>
@@ -291,7 +291,7 @@
         <w:pStyle w:val="BodyText"/>
       </w:pPr>
       <w:r>
-        <w:t xml:space="preserve">Both arms received identical underlying trial evidence: articles, supplements, registry projections, protocols and statistical analysis plans available in the captured input set. Unassisted received copies of the registry projections and acquired documents from the ARBITER run; nothing was fetched anew. Availability varied by trial. The supplied De Waal registry record concerned another trial and did not establish information about the assessed result.</w:t>
+        <w:t xml:space="preserve">The assessment task specified a result using the review’s reported outcome and available trial information, including the time point, comparison and numerical result as printed. It did not automatically select the trial’s primary outcome. Correspondence between the specified result and the published risk-of-bias label could be partial, inferred, different or indeterminate; some published labels covered several outcomes. Comparisons with published labels retained all domain cells, with target uncertainty considered qualitatively.</w:t>
       </w:r>
     </w:p>
     <w:p>
@@ -299,7 +299,15 @@
         <w:pStyle w:val="BodyText"/>
       </w:pPr>
       <w:r>
-        <w:t xml:space="preserve">The arms differed in how they used this evidence. Unassisted received the assessment task sentence and one fixed output-format sentence, without RoB 2 guidance. It could read and search local documents but had no ARBITER service, assessment skill or web access. ARBITER additionally received the assessment skill and its guidance. Input parity thus concerns trial evidence, not instructions or processing. The contrast evaluates the complete workflow and does not isolate guidance, software or computation. It also does not represent the structured-prompt comparators used in several prior studies.[10–11,14–15]</w:t>
+        <w:t xml:space="preserve">Both arms received identical underlying trial evidence: articles, supplements, stored copies of registry records, protocols and statistical analysis plans available in the captured input set. Unassisted, the same-model minimal-prompt comparator, received copies of the registry records and acquired documents from the ARBITER run; these were not fetched anew. Availability varied by trial. The supplied De Waal registry record concerned another trial and did not establish information about the assessed result.</w:t>
+      </w:r>
+    </w:p>
+    <w:p>
+      <w:pPr>
+        <w:pStyle w:val="BodyText"/>
+      </w:pPr>
+      <w:r>
+        <w:t xml:space="preserve">Unassisted received the assessment task sentence and one fixed output-format sentence, without RoB 2 guidance. It could read and search local documents but had no access to ARBITER’s software service, assessment instructions or the web. ARBITER additionally received its assessment instructions and guidance, supplied as an assessment skill. Thus, the arms shared trial evidence but differed in instructions and processing. The comparison evaluated the complete workflow and did not isolate the effects of guidance, software or computation. It also differed from the structured-prompt comparators used in several prior studies.[7,8,11,12]</w:t>
       </w:r>
     </w:p>
     <w:p>
@@ -319,26 +327,12 @@
         <w:t xml:space="preserve">claude-sonnet-5-5</w:t>
       </w:r>
       <w:r>
-        <w:t xml:space="preserve">, medium effort, in Claude Code 2.1.278 with isolated settings, connectors and memory disabled. ARBITER ran on 12 October 2026 and Unassisted on 14 October 2026, once per trial per arm. The installable source is available from the</w:t>
+        <w:t xml:space="preserve">, medium effort, in Claude Code 2.1.278, with isolated settings and external connectors and memory disabled. ARBITER ran on 12 October 2026 and Unassisted on 14 October 2026, once per trial per arm. eMethods identifies the evaluated software revision. The installable public release is ARBITER 1.0.0, commit</w:t>
       </w:r>
       <w:r>
         <w:t xml:space="preserve"> </w:t>
       </w:r>
       <w:hyperlink r:id="rId19">
-        <w:r>
-          <w:rPr>
-            <w:rStyle w:val="Hyperlink"/>
-          </w:rPr>
-          <w:t xml:space="preserve">public repository</w:t>
-        </w:r>
-      </w:hyperlink>
-      <w:r>
-        <w:t xml:space="preserve">; the evaluated version is ARBITER 1.0.0, public commit</w:t>
-      </w:r>
-      <w:r>
-        <w:t xml:space="preserve"> </w:t>
-      </w:r>
-      <w:hyperlink r:id="rId20">
         <w:r>
           <w:rPr>
             <w:rStyle w:val="Hyperlink"/>
@@ -347,13 +341,25 @@
         </w:r>
       </w:hyperlink>
       <w:r>
-        <w:t xml:space="preserve">. The ARBITER harness approved the proposed result unchanged. The protocol allowed “Continue.” at most twice per phase without coaching. eMethods reproduces both prompt templates, the ARBITER skill invocation, the Unassisted format instruction and a filled example.</w:t>
-      </w:r>
-    </w:p>
-    <w:bookmarkEnd w:id="21"/>
-    <w:bookmarkStart w:id="22" w:name="independent-expert-references"/>
-    <w:p>
-      <w:bookmarkStart w:id="92" w:name="loc_27"/>
+        <w:t xml:space="preserve">. The retained release audit documents the assessment-command correspondence without establishing equivalence of the complete releases. The protocol allowed</w:t>
+      </w:r>
+      <w:r>
+        <w:t xml:space="preserve"> </w:t>
+      </w:r>
+      <w:r>
+        <w:t xml:space="preserve">“Continue.”</w:t>
+      </w:r>
+      <w:r>
+        <w:t xml:space="preserve"> </w:t>
+      </w:r>
+      <w:r>
+        <w:t xml:space="preserve">at most twice per phase without coaching. eMethods reproduces both prompt templates, the command invoking the ARBITER assessment skill, the Unassisted format instruction and a filled example. [Pending: development and selection of the prompts and assessment skill, data used in development, any overlap with the benchmark and documentation fixing the evaluated versions.]</w:t>
+      </w:r>
+    </w:p>
+    <w:bookmarkEnd w:id="20"/>
+    <w:bookmarkStart w:id="21" w:name="independent-expert-references"/>
+    <w:p>
+      <w:bookmarkStart w:id="87" w:name="loc_28"/>
       <w:pPr>
         <w:pStyle w:val="Heading2"/>
       </w:pPr>
@@ -363,14 +369,14 @@
         </w:rPr>
         <w:t>Independent expert references</w:t>
       </w:r>
-      <w:bookmarkEnd w:id="92"/>
+      <w:bookmarkEnd w:id="87"/>
     </w:p>
     <w:p>
       <w:pPr>
         <w:pStyle w:val="FirstParagraph"/>
       </w:pPr>
       <w:r>
-        <w:t xml:space="preserve">Two blinded experts assessed all 102 trials across the five domains. Each trial–domain pair constituted a cell. Each expert independently recorded signalling answers and a domain rating, then froze both before seeing any offered label. No AI was used for these judgments. Experts could consult sources beyond the arms’ inputs. [Expert qualifications, experience and training].</w:t>
+        <w:t xml:space="preserve">Two blinded experts assessed all 102 trials across the five domains. Each trial–domain pair constituted a cell. Each expert independently recorded signalling answers and a domain rating, then froze both before seeing any offered label. No AI was used for these judgments. Experts could consult sources beyond the arms’ inputs. [Pending: expert qualifications, experience and training; assessment instructions and guidance supplied; whether experts received the same specified targets as the arms; and conventions for assessing targets containing several outcomes.]</w:t>
       </w:r>
     </w:p>
     <w:p>
@@ -378,13 +384,13 @@
         <w:pStyle w:val="BodyText"/>
       </w:pPr>
       <w:r>
-        <w:t xml:space="preserve">Each expert then saw the published, Unassisted and ARBITER labels in an order randomized for each cell, without source identities or rationales, and chose the most defensible label. Subsequently, each supplied a revised rating, which could differ from all offered labels, and recorded answer retention or change. Independent ratings, forced choices and revised ratings were analyzed separately. Blinded adjudication of discordant data-extraction items supplied a design precedent.[19] The assessment form and procedures are in eMethods.</w:t>
-      </w:r>
-    </w:p>
-    <w:bookmarkEnd w:id="22"/>
-    <w:bookmarkStart w:id="23" w:name="outcomes"/>
-    <w:p>
-      <w:bookmarkStart w:id="95" w:name="loc_30"/>
+        <w:t xml:space="preserve">Each expert then saw the published, Unassisted and ARBITER labels in an order randomized for each cell, without source identities or rationales, and chose the most defensible label. Each subsequently supplied a revised rating, which could differ from all offered labels, and recorded whether signalling answers were retained or changed. Independent ratings, label choices and revised ratings were analyzed separately. Blinded adjudication of discordant data-extraction items supplied a design precedent.[13] eMethods summarizes the assessment sequence; the completed assessment workbooks are available in the study repository. [Pending: original assessor instructions and blank assessment form.]</w:t>
+      </w:r>
+    </w:p>
+    <w:bookmarkEnd w:id="21"/>
+    <w:bookmarkStart w:id="22" w:name="outcomes"/>
+    <w:p>
+      <w:bookmarkStart w:id="90" w:name="loc_31"/>
       <w:pPr>
         <w:pStyle w:val="Heading2"/>
       </w:pPr>
@@ -394,14 +400,14 @@
         </w:rPr>
         <w:t>Outcomes</w:t>
       </w:r>
-      <w:bookmarkEnd w:id="95"/>
+      <w:bookmarkEnd w:id="90"/>
     </w:p>
     <w:p>
       <w:pPr>
         <w:pStyle w:val="FirstParagraph"/>
       </w:pPr>
       <w:r>
-        <w:t xml:space="preserve">The formal primary endpoint was the proportion of agreed forced choices favoring ARBITER among cells where the arms disagreed. The denominator included only cells in which both experts chose the same label; the numerator included those where that label matched ARBITER. Credit followed label equality, so every source matching the chosen label received credit; neither arm received credit if neither matched. Cells with identical labels from all sources provided no preference information. Sensitivities used each expert’s choices across all arm disagreements and counted split choices as ARBITER losses without assigning Unassisted wins.</w:t>
+        <w:t xml:space="preserve">The formal primary endpoint was the proportion of agreed expert label choices matching ARBITER among cells where the arms’ ratings differed. The denominator included only cells in which both experts chose the same label; the numerator included those where that label matched ARBITER. Credit followed label equality: every source matching the chosen label received credit, and neither arm received credit if neither matched. Cells with identical labels from all sources provided no information about label choice between sources. Sensitivity analyses used each expert’s choices across all arm disagreements and counted split choices as ARBITER losses without assigning Unassisted wins. The endpoint measures label-choice match, not preference for a system’s reasoning or workflow.</w:t>
       </w:r>
     </w:p>
     <w:p>
@@ -409,7 +415,7 @@
         <w:pStyle w:val="BodyText"/>
       </w:pPr>
       <w:r>
-        <w:t xml:space="preserve">Secondary agreement outcomes compared each source with each expert’s independent ratings across all 510 cells. Exact agreement and paired percentage-point differences quantified agreement magnitude; linearly weighted Cohen’s κ supplied ordinal context. Published labels were another source, not an expert standard. Supporting analyses included expert-to-expert agreement, unweighted κ, confusion matrices, expert means and restriction to cells where the independent experts agreed.</w:t>
+        <w:t xml:space="preserve">Secondary agreement outcomes compared each source with each expert’s independent domain ratings across all 510 cells. These domain ratings were read directly from the experts’ assessment records. Exact agreement was the proportion of ratings matching the reference; paired percentage-point differences compared the arms’ matches within the same cells. Linearly weighted Cohen’s κ supplied complementary ordinal context. Published labels were another source, not an expert standard. Supporting analyses included expert-to-expert agreement, unweighted κ, confusion matrices, expert means and restriction to cells where the independent experts agreed.</w:t>
       </w:r>
     </w:p>
     <w:p>
@@ -417,7 +423,7 @@
         <w:pStyle w:val="BodyText"/>
       </w:pPr>
       <w:r>
-        <w:t xml:space="preserve">Signalling-answer agreement distinguished five levels: yes, probably yes, no, probably no and no information. Collapsed coding combined definite and probable affirmative answers and combined definite and probable negative answers, leaving no information separate. Explicit answers were matched by trial, domain, question and component. Missing, inactive, not applicable, unmatched and unresolved answers were excluded; paired contrasts required evaluable answers in both arms. Published-label comparisons used weighted κ, exact agreement, sensitivity for Some concerns or High, and specificity, with Gwet’s AC2 supplementary. An All-Low rule described label prevalence; its κ was suppressed because predictions lacked variance. Missing predictions counted as disagreement.</w:t>
+        <w:t xml:space="preserve">Signalling-answer agreement distinguished five levels: yes, probably yes, no, probably no and no information. Collapsed coding combined definite and probable affirmative answers and combined definite and probable negative answers, leaving no information separate. Answers were matched by trial, domain, question and component. A component was an explicitly named part of an answer, such as a separate answer for a particular outcome; an undivided answer was treated as one component. Answers for different named components were not pooled. Missing, inactive, not applicable, unmatched and unresolved answers were excluded; paired contrasts required evaluable answers in both arms. These comparisons assessed signalling answers separately from the recorded domain ratings. Published-label comparisons used weighted κ, exact agreement, sensitivity for Some concerns or High, and specificity, with Gwet’s AC2 supplementary. An All-Low rule described label prevalence; its κ was suppressed because predictions lacked variance. Missing predictions counted as disagreement.</w:t>
       </w:r>
     </w:p>
     <w:p>
@@ -425,7 +431,7 @@
         <w:pStyle w:val="BodyText"/>
       </w:pPr>
       <w:r>
-        <w:t xml:space="preserve">Process outcomes assessed rule conformance and evidence-record integrity. We applied the official RoB 2 algorithms to each arm’s own answers, using effect of assignment for deviations from intended interventions.[1] The five domains concern randomisation, deviations from intended interventions, missing outcome data, outcome measurement and selection of the reported result. Contradictory ratings or skipped required questions constituted rule breaks; absent ratings and answers were unevaluable. A sensitivity recursively resolved invalid required answers as negative or no information. Overall checks permitted escalation when multiple domains had Some concerns. Evidence coverage counted required active answers citing a passage or image. Quotation and bundle audits checked source binding and structural integrity, not whether the evidence justified the answer.</w:t>
+        <w:t xml:space="preserve">Process outcomes assessed consistency with the decision rules and the completeness and source links of the retained records. We applied the official RoB 2 algorithms to each arm’s own answers, using effect of assignment for deviations from intended interventions.[1] The five domains concern randomisation, deviations from intended interventions, missing outcome data, outcome measurement and selection of the reported result. Ratings that contradicted their answers or omitted required questions constituted rule breaks; absent ratings and answer sets were unevaluable. A sensitivity analysis recursively resolved invalid required answers as negative or no information. Overall checks permitted escalation when multiple domains had Some concerns. Evidence coverage counted required active answers citing a passage or image. Quotation checks assessed whether evidence records identified the captured source and its location; audit-file checks assessed the integrity of the retained assessment files. These structural checks did not assess whether the evidence justified the answer. The algorithm determines proposed ratings; adopted ratings were checked separately because documented overrides were permitted.</w:t>
       </w:r>
     </w:p>
     <w:p>
@@ -433,7 +439,7 @@
         <w:pStyle w:val="BodyText"/>
       </w:pPr>
       <w:r>
-        <w:t xml:space="preserve">Computational outcomes were runtime, summed across wall-clock turn durations, and API list-price equivalents reconstructed from recorded token components and frozen provider rates. The runs used a subscription; dollar estimates were not expenditure. eMethods details cache and side-call handling.</w:t>
+        <w:t xml:space="preserve">Computational outcomes were runtime, summed across the elapsed durations of the model’s turns, and application programming interface (API) list-price equivalents reconstructed from recorded token counts and fixed provider rates. Tokens are the units of text processed or generated by the model. The runs used a subscription, so these dollar estimates were not expenditure. eMethods details the treatment of cached inputs and additional model calls.</w:t>
       </w:r>
     </w:p>
     <w:p>
@@ -441,13 +447,13 @@
         <w:pStyle w:val="BodyText"/>
       </w:pPr>
       <w:r>
-        <w:t xml:space="preserve">Exploratory analyses examined derived Overall ratings, severity and direction of disagreement, and rules-only recomputation. Derived Overall took the worst independent domain rating without optional escalation for multiple Some concerns. Expert-reference analyses used all 102 trials; Published Overall comparisons used only the 81 trials with observed labels, excluding 21 without labels. Directional analyses partitioned ratings stricter or more lenient than Published into expert matches to the arm, Published or neither. Rules-only recomputation replaced Unassisted ratings that contradicted their answers while retaining invalid paths and missing ratings. Original disagreement populations remained fixed; new ties could credit both arms. Binary expert comparisons and severity strata were exploratory. Forced choices across all disputed cells and revised ratings were descriptive because offered labels could anchor responses.</w:t>
-      </w:r>
-    </w:p>
-    <w:bookmarkEnd w:id="23"/>
-    <w:bookmarkStart w:id="24" w:name="statistical-analysis"/>
-    <w:p>
-      <w:bookmarkStart w:id="102" w:name="loc_37"/>
+        <w:t xml:space="preserve">Exploratory analyses examined derived Overall ratings, severity and direction of disagreement, and rules-only recomputation. Derived Overall took the worst independent domain rating without optional escalation for multiple Some concerns. It summarized the five domains rather than providing an independent sixth domain. Expert-reference analyses used all 102 trials; Published Overall comparisons used only the 81 trials with observed labels, excluding 21 without labels. Directional analyses partitioned ratings stricter or more lenient than Published into expert matches to the arm, Published or neither. Rules-only recomputation replaced Unassisted ratings that contradicted their answers while retaining invalid answer sequences and missing ratings. Original disagreement populations remained fixed; new ties could credit both arms. Binary expert comparisons and severity strata were exploratory. Label choices across all disputed cells and revised ratings were descriptive because offered labels could anchor responses.</w:t>
+      </w:r>
+    </w:p>
+    <w:bookmarkEnd w:id="22"/>
+    <w:bookmarkStart w:id="23" w:name="statistical-analysis"/>
+    <w:p>
+      <w:bookmarkStart w:id="97" w:name="loc_38"/>
       <w:pPr>
         <w:pStyle w:val="Heading2"/>
       </w:pPr>
@@ -457,14 +463,14 @@
         </w:rPr>
         <w:t>Statistical analysis</w:t>
       </w:r>
-      <w:bookmarkEnd w:id="102"/>
+      <w:bookmarkEnd w:id="97"/>
     </w:p>
     <w:p>
       <w:pPr>
         <w:pStyle w:val="FirstParagraph"/>
       </w:pPr>
       <w:r>
-        <w:t xml:space="preserve">We used 10,000 stratified trial-cluster bootstrap resamples, seed 20261018. Each resample retained the trial count within each of the 16 fixed reviews and carried paired arms and all domain cells together. Paired contrasts shared resampling weights. Percentile 95% CIs quantify trial variation conditional on these reviews, two experts and observed model runs; they do not quantify variation across new reviews, experts or repeated runs. Expert means averaged expert-specific estimates within each shared resample. No</w:t>
+        <w:t xml:space="preserve">We used 10,000 stratified trial-cluster bootstrap resamples, seed 20261018. Trials were sampled with replacement within each of the 16 fixed reviews, retaining each review’s trial count and carrying both arms and all domain ratings together. Paired contrasts shared resampling weights. Percentile 95% CIs quantify trial variation conditional on these reviews, two experts and observed model runs; they do not quantify variation across new reviews, experts or repeated runs. Expert means averaged expert-specific estimates within each shared resample. No</w:t>
       </w:r>
       <w:r>
         <w:t xml:space="preserve"> </w:t>
@@ -480,14 +486,14 @@
         <w:t xml:space="preserve"> </w:t>
       </w:r>
       <w:r>
-        <w:t xml:space="preserve">values or multiplicity adjustments were used. Only the formal primary endpoint was confirmatory; other outcomes were secondary or exploratory as indicated. Reporting follows TRIPOD-LLM and GRRAS, with an accompanying item map and author-completion fields.[20–21]</w:t>
-      </w:r>
-    </w:p>
+        <w:t>values or multiplicity adjustments were used. The primary endpoint and secondary or exploratory outcomes were distinguished as specified above. Reporting was guided by TRIPOD-LLM and GRRAS, with an accompanying item map and author-completion fields.⁠[14,15]</w:t>
+      </w:r>
+    </w:p>
+    <w:bookmarkEnd w:id="23"/>
     <w:bookmarkEnd w:id="24"/>
-    <w:bookmarkEnd w:id="25"/>
-    <w:bookmarkStart w:id="26" w:name="results-1"/>
-    <w:p>
-      <w:bookmarkStart w:id="104" w:name="loc_39"/>
+    <w:bookmarkStart w:id="25" w:name="results-1"/>
+    <w:p>
+      <w:bookmarkStart w:id="99" w:name="loc_40"/>
       <w:pPr>
         <w:pStyle w:val="Heading1"/>
       </w:pPr>
@@ -497,7 +503,7 @@
         </w:rPr>
         <w:t>RESULTS</w:t>
       </w:r>
-      <w:bookmarkEnd w:id="104"/>
+      <w:bookmarkEnd w:id="99"/>
     </w:p>
     <w:p>
       <w:pPr>
@@ -506,11 +512,11 @@
         <w:keepLines/>
       </w:pPr>
       <w:r>
-        <w:t xml:space="preserve">The 102 included trials yielded 510 trial-domain cells, all independently assessed by both experts (Figure 3; Table 1). Published labels were Low in 427/510 cells (83.7%), compared with 277/510 (54.3%) for Expert 1 and 346/510 (67.8%) for Expert 2. An all-Low rule matched 83.7% of Published domain labels. The experts agreed in 388/510 cells (76.1%; linearly weighted κ, 0.59).</w:t>
-      </w:r>
-    </w:p>
-    <w:p>
-      <w:bookmarkStart w:id="106" w:name="loc_41"/>
+        <w:t xml:space="preserve">The 102 included trials yielded 510 trial–domain cells, all independently assessed by both experts (Figure 3; Table 1). Published labels were Low in 427/510 cells (83.7%), compared with 277/510 (54.3%) for Expert 1 and 346/510 (67.8%) for Expert 2. An all-Low rule matched 83.7% of Published domain labels. The experts agreed in 388/510 cells (76.1%; linearly weighted κ, 0.59).</w:t>
+      </w:r>
+    </w:p>
+    <w:p>
+      <w:bookmarkStart w:id="101" w:name="loc_42"/>
       <w:pPr>
         <w:pStyle w:val="Heading2"/>
         <w:keepNext/>
@@ -523,7 +529,7 @@
         </w:rPr>
         <w:t>Table 1. Benchmark and reference context</w:t>
       </w:r>
-      <w:bookmarkEnd w:id="106"/>
+      <w:bookmarkEnd w:id="101"/>
     </w:p>
     <w:tbl>
       <w:tblPr>
@@ -1326,11 +1332,11 @@
         <w:keepLines/>
       </w:pPr>
       <w:r>
-        <w:t xml:space="preserve">The formal primary endpoint favored ARBITER in 53/60 agreed choices (88%; 95% CI, 80–96%), versus 7/60 (12%) for Unassisted (Table 2). These came from 80 cells where the arms disagreed; the experts split in 20. Expert-specific preference shares were 63/80 (79%) and 61/80 (76%). Counting every split choice against ARBITER gave 53/80 (66%).</w:t>
-      </w:r>
-    </w:p>
-    <w:p>
-      <w:bookmarkStart w:id="108" w:name="loc_43"/>
+        <w:t xml:space="preserve">Among 80 cells where the arms’ ratings differed, the experts chose the same label in 60 and split in 20. The agreed label matched ARBITER in 53/60 cells (88%; 95% CI, 80–96%) and Unassisted in 7/60 (12%), constituting the formal primary result (Table 2). Across all 80 disagreements, the label chosen by Expert 1 matched ARBITER in 63/80 (79%), and that chosen by Expert 2 matched ARBITER in 61/80 (76%). Counting every split choice against ARBITER gave 53/80 (66%).</w:t>
+      </w:r>
+    </w:p>
+    <w:p>
+      <w:bookmarkStart w:id="103" w:name="loc_44"/>
       <w:pPr>
         <w:pStyle w:val="Heading2"/>
         <w:keepNext/>
@@ -1343,7 +1349,7 @@
         </w:rPr>
         <w:t>Table 2. Conditional primary endpoint and core sensitivities</w:t>
       </w:r>
-      <w:bookmarkEnd w:id="108"/>
+      <w:bookmarkEnd w:id="103"/>
     </w:p>
     <w:tbl>
       <w:tblPr>
@@ -1750,7 +1756,7 @@
         <w:pStyle w:val="BodyText"/>
       </w:pPr>
       <w:r>
-        <w:t xml:space="preserve">The domain profiles showed both gains and disagreement. Selection of the reported result (D5) had the largest observed gains: 19.6 points (95% CI, 11.8–27.5) and 11.8 (2.9–20.6) against Experts 1 and 2. For missing outcome data (D3), ARBITER matched 43/102 ratings from Expert 1 (42.2%) and 80/102 from Expert 2 (78.4%); the experts agreed in 54/102 cells. Published labels matched the experts in 301/510 and 362/510 cells. Against Published across all 510 cells, ARBITER matched 386/510 (75.7%) and Unassisted 395/510 (77.5%), a paired difference of −1.8 points (95% CI, −5.1 to 1.6).</w:t>
+        <w:t xml:space="preserve">The domain profiles showed both gains and disagreement. Selection of the reported result (D5) had the largest observed gains: 19.6 points (95% CI, 11.8–27.5) and 11.8 (2.9–20.6) against Experts 1 and 2. For missing outcome data (D3), ARBITER matched 43/102 ratings from Expert 1 (42.2%) and 80/102 from Expert 2 (78.4%); the experts agreed in 54/102 cells.</w:t>
       </w:r>
     </w:p>
     <w:p>
@@ -1758,7 +1764,15 @@
         <w:pStyle w:val="BodyText"/>
       </w:pPr>
       <w:r>
-        <w:t xml:space="preserve">Signalling-answer comparisons depended on coding (Figure 5). In D3 against Expert 1, the five-level paired difference was −10.3 points (95% CI, −17.2 to −3.2), whereas the collapsed difference was +8.5 (3.5–13.7), both using 165 paired components. In D5, collapsed gains were +11.3 points against Expert 1 and +3.7 (−0.3 to 7.4) against Expert 2. The supplement reports complete question-level results and source-specific absolute rates. Exploratory rules-only recomputation changed 26 Unassisted labels while retaining their recorded answers, invalid paths and missingness.</w:t>
+        <w:t xml:space="preserve">Published labels matched the experts in 301/510 and 362/510 cells. Against Published across all 510 cells, ARBITER matched 386/510 (75.7%) and Unassisted 395/510 (77.5%), a paired difference of −1.8 points (95% CI, −5.1 to 1.6).</w:t>
+      </w:r>
+    </w:p>
+    <w:p>
+      <w:pPr>
+        <w:pStyle w:val="BodyText"/>
+      </w:pPr>
+      <w:r>
+        <w:t xml:space="preserve">Signalling-answer agreement depended on whether probable and definite answers were distinguished (Figure 5). In D3 against Expert 1, the five-level paired ARBITER minus Unassisted difference was −10.3 points (95% CI, −17.2 to −3.2), whereas the collapsed difference was +8.5 (3.5–13.7), both using 165 paired components. In D5, collapsed gains were +11.3 points against Expert 1, using 301 paired components, and +3.7 (−0.3 to 7.4) against Expert 2, using 300. The supplement reports complete question-level results and source-specific absolute rates, whose eligible denominators may differ from those of the paired contrasts. Exploratory rules-only recomputation changed 26 Unassisted labels while retaining their recorded answers, invalid answer sequences and missingness.</w:t>
       </w:r>
     </w:p>
     <w:p>
@@ -1768,11 +1782,11 @@
         <w:keepLines/>
       </w:pPr>
       <w:r>
-        <w:t xml:space="preserve">ARBITER’s outputs conformed to the executable rules (Table 3). All 510 domain outputs reproduced from the algorithms, with no recorded domain overrides. Unassisted had 65/509 evaluable rule breaks: 26 contradictory ratings and 39 required-question omissions; one cell was unevaluable. All 1538 active required answers cited a passage or image. All 1407/1407 text spans and 14 image records met source-binding checks, and all 102 bundles passed structural verification. These audits counted different objects and did not assess semantic evidence support.</w:t>
-      </w:r>
-    </w:p>
-    <w:p>
-      <w:bookmarkStart w:id="113" w:name="loc_48"/>
+        <w:t xml:space="preserve">All 510 adopted ARBITER domain outputs conformed to the algorithms, with no recorded domain overrides (Table 3). The algorithm determines the proposed ratings; the absence of overrides and conformance of the adopted ratings were observations in this benchmark. Unassisted had 65/509 evaluable rule breaks: 26 contradictory ratings and 39 required-question omissions; one cell was unevaluable. All 1538 active required answers cited a passage or image. All 1407/1407 text spans and 14 image records met checks linking them to their stored sources, and all 102 exported assessment records passed checks of completeness and consistency. These audits counted different objects and did not establish whether the cited evidence supported the answers.</w:t>
+      </w:r>
+    </w:p>
+    <w:p>
+      <w:bookmarkStart w:id="109" w:name="loc_50"/>
       <w:pPr>
         <w:pStyle w:val="Heading2"/>
         <w:keepNext/>
@@ -1785,7 +1799,7 @@
         </w:rPr>
         <w:t>Table 3. Process checks and computational resources</w:t>
       </w:r>
-      <w:bookmarkEnd w:id="113"/>
+      <w:bookmarkEnd w:id="109"/>
     </w:p>
     <w:tbl>
       <w:tblPr>
@@ -2801,7 +2815,7 @@
               <w:top w:type="dxa" w:w="35"/>
               <w:bottom w:type="dxa" w:w="35"/>
               <w:start w:type="dxa" w:w="70"/>
-              <w:end w:type="dxa" w:w="70"/>
+              <w:end w:type="dxa" w:w="900"/>
             </w:tcMar>
             <w:tcBorders>
               <w:top w:val="nil" w:sz="0" w:color="666666"/>
@@ -3389,10 +3403,10 @@
         <w:t xml:space="preserve">ARBITER required more computation. Median (IQR) runtime was 7.6 (6.1–10.5) versus 0.5 (0.4–0.5) minutes per trial; the paired mean difference was 11.0 minutes (95% CI, 8.4–14.1). Median (IQR) API list-price equivalents were US$3.78 (3.46–4.10) versus US$0.09 (0.07–0.13), with a paired mean difference of US$3.68 (3.61–3.75).</w:t>
       </w:r>
     </w:p>
-    <w:bookmarkEnd w:id="26"/>
-    <w:bookmarkStart w:id="28" w:name="discussion-1"/>
-    <w:p>
-      <w:bookmarkStart w:id="115" w:name="loc_50"/>
+    <w:bookmarkEnd w:id="25"/>
+    <w:bookmarkStart w:id="27" w:name="discussion-1"/>
+    <w:p>
+      <w:bookmarkStart w:id="111" w:name="loc_52"/>
       <w:pPr>
         <w:pStyle w:val="Heading1"/>
       </w:pPr>
@@ -3402,14 +3416,14 @@
         </w:rPr>
         <w:t>DISCUSSION</w:t>
       </w:r>
-      <w:bookmarkEnd w:id="115"/>
+      <w:bookmarkEnd w:id="111"/>
     </w:p>
     <w:p>
       <w:pPr>
         <w:pStyle w:val="FirstParagraph"/>
       </w:pPr>
       <w:r>
-        <w:t xml:space="preserve">ARBITER addresses two requirements of AI-assisted appraisal: preserving the basis of a judgment and evaluating the judgment itself. Its complete Sonnet workflow produced inspectable, rule-conformant records and agreed more often with each independent expert than the same model given a minimal prompt. The formal primary preference result favored ARBITER among agreed choices on arm disagreements; the secondary all-cell comparisons showed the extent of agreement beyond that selected population.</w:t>
+        <w:t xml:space="preserve">ARBITER preserved the evidence and decisions behind each assessment and agreed more often with both independent experts than the same-model minimal-prompt comparator, Unassisted. Across all 510 trial–domain assessments, paired agreement gains were 7.6 percentage points (95% CI, 5.1–10.2) against Expert 1 and 6.5 (3.5–9.4) against Expert 2. These secondary comparisons used independent ratings frozen before experts saw the offered labels.</w:t>
       </w:r>
     </w:p>
     <w:p>
@@ -3417,7 +3431,7 @@
         <w:pStyle w:val="BodyText"/>
       </w:pPr>
       <w:r>
-        <w:t xml:space="preserve">The record provides a concrete way to interrogate a judgment. For example, a reviewer examining selection of the reported result can move from the domain rating to the signalling answers, inspect their cited source locations and ask whether the documents establish a dated analysis plan for that result. The illustrative AVATAR trace exposes that evidentiary boundary rather than hiding it behind a final label. Source binding makes the cited material retrievable, and executable rules make the answer-to-rating transition reproducible. Neither establishes that the model selected the relevant evidence or interpreted it appropriately. Image descriptions remain model-written, and recorded overrides preserve departures for review. This distinction between citation coverage and evidentiary support also arises in evaluations of generative search.[22]</w:t>
+        <w:t xml:space="preserve">The formal primary endpoint answered a narrower question about disputed ratings. Among 80 assessments in which the workflows differed, both experts chose the same blinded label in 60 and split in 20. ARBITER matched the agreed choice in 53/60 (88%; 95% CI, 80–96%). This endpoint measures agreement with the chosen label in a selected subset. Experts saw neither source identities nor rationales, so their choices do not endorse a system or its reasoning. The independent-rating comparisons provide the broader context.</w:t>
       </w:r>
     </w:p>
     <w:p>
@@ -3425,7 +3439,7 @@
         <w:pStyle w:val="BodyText"/>
       </w:pPr>
       <w:r>
-        <w:t xml:space="preserve">ARBITER builds on earlier evidence-assisted assessment tools. Evidence display, interactive RoB 2 review, structured prompting and answer-derived judgments already have precedents.[8–12] ARBITER contributes an available implementation that retains sources, evidence, answers and decisions alongside a paired evaluation of its complete workflow. Its contrast includes guidance, tool use and additional processing, so the observed advantage cannot be assigned to the rule engine or another individual component. Nor does comparison with a minimal prompt establish superiority over other structured systems. Studies of human–AI collaboration address how assistance changes reviewer work,[23] a separate question from this offline benchmark. A recent preprint describes RoB2-Evaluator, which uses fixed RoB 2 guidance and locked instructions and was evaluated against independent reviewers’ consensus ratings.[24] That work further supports positioning ARBITER through its specific implementation and evaluation, rather than a claim of priority for constrained assessment.</w:t>
+        <w:t xml:space="preserve">The retained record makes the route to a rating examinable. In the illustrative AVATAR assessment, the stored documents did not establish a dated analysis plan for the assessed result. A reviewer can inspect the signalling answers and cited passages to examine that interpretation. ARBITER copies quotations directly from stored documents, links them to source locations and applies the decision rules to the recorded answers. Software computes a proposed rating from the answers, but the workflow permits a different adopted rating with recorded evidence and rationale. No domain overrides occurred in these runs.</w:t>
       </w:r>
     </w:p>
     <w:p>
@@ -3433,7 +3447,7 @@
         <w:pStyle w:val="BodyText"/>
       </w:pPr>
       <w:r>
-        <w:t xml:space="preserve">The domain findings sharpen the scope of the agreement advantage. D5 had the largest observed gains, but D3 showed substantially different absolute agreement against the two experts. The negative five-level D3 signalling contrast against Expert 1 became positive when probable and definite answers were combined. Collapsed agreement therefore captures a different aspect of the answers, rather than resolving the unfavorable five-level result. D5’s smaller collapsed gain against Expert 2 further limits a uniform explanation. These diagnostics and rules-only recomputation describe patterns and consistency; neither identifies a causal component effect. Separate expert estimates preserve the judgment variability familiar from RoB 2 reliability studies.[2–3]</w:t>
+        <w:t xml:space="preserve">All 510 ARBITER domain outputs followed the executable rules, but the quoted evidence still requires interpretation. The source checks established the integrity of the links and exported records, not whether each passage justified its answer; image descriptions also remained model-written. Liang and colleagues addressed evidence support as a separate outcome in RoB 2 assessment by retrieving trial passages and using another model to classify support for generated claims.[16] Their automated verification is an evaluation approach rather than independent human adjudication. It identifies a directly relevant task for ARBITER’s next evaluation: checking whether the recorded evidence supports the interpretation attached to it.</w:t>
       </w:r>
     </w:p>
     <w:p>
@@ -3441,7 +3455,7 @@
         <w:pStyle w:val="BodyText"/>
       </w:pPr>
       <w:r>
-        <w:t xml:space="preserve">The Published-reference findings also constrain interpretation. Published labels were predominantly Low, and the paired agreement difference was small and compatible with either direction, despite the positive differences against both experts. Assessment targets and judgment thresholds may contribute, but disagreement does not establish that Published labels were wrong. Neither experts nor published reviews supply an error-free standard. The bootstrap reflects trial variation within fixed reviews; it does not establish that effects differ between domains or references merely because individual intervals differ in whether they include zero.</w:t>
+        <w:t xml:space="preserve">The comparison estimates the difference between complete workflows. Both used the same model and supplied trial evidence, but ARBITER received additional guidance, tools and computation. The observed gains cannot be assigned to its decision rules, evidence records or another component, and minimal prompting does not represent the structured alternatives already studied.[6,7,8] RoB2-Evaluator, described in a recent preprint, is another rule-constrained RoB 2 implementation.[17] Choi and colleagues separately examined repeated outputs and algorithm conformance in a single-trial pilot.[18] Their design and this multi-trial, single-run benchmark address complementary questions; ARBITER’s results do not establish repeatability.</w:t>
       </w:r>
     </w:p>
     <w:p>
@@ -3449,12 +3463,36 @@
         <w:pStyle w:val="BodyText"/>
       </w:pPr>
       <w:r>
-        <w:t xml:space="preserve">The benchmark covers one model configuration, one run per arm, 16 fixed reviews and two experts. Ordered, availability-dependent trial selection limits generalization beyond the included material. Experts could consult additional sources, reports may have appeared in model training, and supplied-source errors matter, as the unrelated De Waal registry illustrates. Independent ratings were frozen before label exposure, but offered labels could influence forced choices and revised ratings. Derived Overall summarizes the same domain assessments and is not independent confirmation. These limits favor replication with repeated runs and structured comparators, independent assessment of semantic evidence support, and prospective studies of reviewer use. The higher runtime and list-price equivalents quantify the computation needed to produce the record; human checking time, adoption and automation bias remain unmeasured.</w:t>
-      </w:r>
-    </w:p>
-    <w:bookmarkStart w:id="27" w:name="conclusion-1"/>
-    <w:p>
-      <w:bookmarkStart w:id="122" w:name="loc_57"/>
+        <w:t xml:space="preserve">Domain findings limit a uniform account of the agreement advantage. Selection of the reported result had the largest observed gains, whereas missing outcome data (D3) yielded agreement of 43/102 with Expert 1 and 80/102 with Expert 2. For D3 signalling answers against Expert 1, the paired difference was unfavorable with five-level coding, −10.3 points (95% CI, −17.2 to −3.2), but favorable after combining probable with definite answers, +8.5 (3.5–13.7). Collapsing categories changes the question being measured and does not remove the unfavorable result. The smaller collapsed gain for selection of the reported result against Expert 2 also limits a uniform explanation. Rules-only recomputation describes consistency without identifying which component caused the agreement differences.</w:t>
+      </w:r>
+    </w:p>
+    <w:p>
+      <w:pPr>
+        <w:pStyle w:val="BodyText"/>
+      </w:pPr>
+      <w:r>
+        <w:t xml:space="preserve">Agreement with labels reported in the source reviews showed a different pattern. The ARBITER minus Unassisted difference was −1.8 percentage points (95% CI, −5.1 to 1.6), compatible with either direction. Published labels were predominantly Low, and some assessment targets were broader, inferred or different from those evaluated here. Target differences and judgment thresholds are possible explanations, not established causes. The separate expert estimates and D3 disagreements also show why fresh assessments cannot be treated as an error-free standard. Intervals on individual estimates do not test differences between domains or references.</w:t>
+      </w:r>
+    </w:p>
+    <w:p>
+      <w:pPr>
+        <w:pStyle w:val="BodyText"/>
+      </w:pPr>
+      <w:r>
+        <w:t xml:space="preserve">Generalization is bounded by ordered, availability-dependent trial selection, 16 fixed reviews, two experts and one run per arm. The bootstrap quantifies trial variation within those reviews, conditional on the experts and observed runs. Experts could consult additional sources, and prior model exposure to trial reports is unknown. The unrelated De Waal registry record illustrates the importance of checking supplied sources. Offered labels could influence forced choices and revised ratings; derived Overall ratings reuse the domain assessments and provide no independent confirmation.</w:t>
+      </w:r>
+    </w:p>
+    <w:p>
+      <w:pPr>
+        <w:pStyle w:val="BodyText"/>
+      </w:pPr>
+      <w:r>
+        <w:t xml:space="preserve">Human use remains a separate empirical question. In Jardim and colleagues’ study of RobotReviewer in ongoing reviews using the earlier instrument, reviewers used snippets to locate material and checked the original report when needed.[19] That study lacked a manual-only comparison and could not estimate time savings. ARBITER’s longer runtime and higher list-price equivalents quantify computation, not reviewer workload. Whether its records help reviewers identify unsupported interpretations, how long checking takes and whether reviewers accept inappropriate suggestions require direct observation of reviewers using the workflow.</w:t>
+      </w:r>
+    </w:p>
+    <w:bookmarkStart w:id="26" w:name="conclusion-1"/>
+    <w:p>
+      <w:bookmarkStart w:id="121" w:name="loc_62"/>
       <w:pPr>
         <w:pStyle w:val="Heading2"/>
       </w:pPr>
@@ -3464,21 +3502,21 @@
         </w:rPr>
         <w:t>Conclusion</w:t>
       </w:r>
-      <w:bookmarkEnd w:id="122"/>
+      <w:bookmarkEnd w:id="121"/>
     </w:p>
     <w:p>
       <w:pPr>
         <w:pStyle w:val="FirstParagraph"/>
       </w:pPr>
       <w:r>
-        <w:t xml:space="preserve">ARBITER makes the basis of a RoB 2 assessment inspectable and had greater agreement with both independent experts than a same-model minimal-prompt comparator in this benchmark. Domain and reference dependence qualify that advantage. The available workflow lets reviewers inspect the evidence and decisions behind each assessment, alongside measured agreement and remaining disagreements with expert judgment.</w:t>
-      </w:r>
-    </w:p>
+        <w:t xml:space="preserve">ARBITER makes the pathway from source evidence through signalling answers to RoB 2 ratings inspectable. Its complete workflow had greater agreement with both independent experts than a same-model minimal-prompt comparator, with domain and reference dependence. The available implementation retains the supplied sources, recorded answers, cited evidence and rating decisions for inspection.</w:t>
+      </w:r>
+    </w:p>
+    <w:bookmarkEnd w:id="26"/>
     <w:bookmarkEnd w:id="27"/>
-    <w:bookmarkEnd w:id="28"/>
-    <w:bookmarkStart w:id="38" w:name="back-matter"/>
-    <w:p>
-      <w:bookmarkStart w:id="124" w:name="loc_59"/>
+    <w:bookmarkStart w:id="37" w:name="back-matter"/>
+    <w:p>
+      <w:bookmarkStart w:id="123" w:name="loc_64"/>
       <w:pPr>
         <w:pStyle w:val="Heading1"/>
       </w:pPr>
@@ -3488,11 +3526,11 @@
         </w:rPr>
         <w:t>BACK MATTER</w:t>
       </w:r>
-      <w:bookmarkEnd w:id="124"/>
-    </w:p>
-    <w:bookmarkStart w:id="29" w:name="acknowledgments-and-ai-use"/>
-    <w:p>
-      <w:bookmarkStart w:id="125" w:name="loc_60"/>
+      <w:bookmarkEnd w:id="123"/>
+    </w:p>
+    <w:bookmarkStart w:id="28" w:name="acknowledgments-and-ai-use"/>
+    <w:p>
+      <w:bookmarkStart w:id="124" w:name="loc_65"/>
       <w:pPr>
         <w:pStyle w:val="Heading2"/>
       </w:pPr>
@@ -3502,7 +3540,7 @@
         </w:rPr>
         <w:t>Acknowledgments and AI use</w:t>
       </w:r>
-      <w:bookmarkEnd w:id="125"/>
+      <w:bookmarkEnd w:id="124"/>
     </w:p>
     <w:p>
       <w:pPr>
@@ -3512,10 +3550,10 @@
         <w:t xml:space="preserve">[Non-author contributors and acknowledgments]. OpenAI GPT-6-Astra, GPT-6.1-Sol and GPT-6-Luna, accessed through T3 Code, assisted literature research, drafting and editorial checks in this revision. Final author review, approval and accountability remain pending; any AI assistance before this revision remains to be confirmed. [Author to verify the complete disclosure, including any AI use in code, data processing or figures, and provide matching cover-letter disclosure]. The expert assessments and forced-choice adjudication used no AI.</w:t>
       </w:r>
     </w:p>
-    <w:bookmarkEnd w:id="29"/>
-    <w:bookmarkStart w:id="30" w:name="funding"/>
-    <w:p>
-      <w:bookmarkStart w:id="127" w:name="loc_62"/>
+    <w:bookmarkEnd w:id="28"/>
+    <w:bookmarkStart w:id="29" w:name="funding"/>
+    <w:p>
+      <w:bookmarkStart w:id="126" w:name="loc_67"/>
       <w:pPr>
         <w:pStyle w:val="Heading2"/>
       </w:pPr>
@@ -3525,7 +3563,7 @@
         </w:rPr>
         <w:t>Funding</w:t>
       </w:r>
-      <w:bookmarkEnd w:id="127"/>
+      <w:bookmarkEnd w:id="126"/>
     </w:p>
     <w:p>
       <w:pPr>
@@ -3535,10 +3573,10 @@
         <w:t xml:space="preserve">[Funding sources, grant identifiers and funder role, or an explicit statement of no funding].</w:t>
       </w:r>
     </w:p>
-    <w:bookmarkEnd w:id="30"/>
-    <w:bookmarkStart w:id="31" w:name="competing-interests"/>
-    <w:p>
-      <w:bookmarkStart w:id="129" w:name="loc_64"/>
+    <w:bookmarkEnd w:id="29"/>
+    <w:bookmarkStart w:id="30" w:name="competing-interests"/>
+    <w:p>
+      <w:bookmarkStart w:id="128" w:name="loc_69"/>
       <w:pPr>
         <w:pStyle w:val="Heading2"/>
       </w:pPr>
@@ -3548,7 +3586,7 @@
         </w:rPr>
         <w:t>Competing interests</w:t>
       </w:r>
-      <w:bookmarkEnd w:id="129"/>
+      <w:bookmarkEnd w:id="128"/>
     </w:p>
     <w:p>
       <w:pPr>
@@ -3558,10 +3596,10 @@
         <w:t xml:space="preserve">[Author-specific competing interests, including relevant relationships to ARBITER, or an explicit declaration of none].</w:t>
       </w:r>
     </w:p>
-    <w:bookmarkEnd w:id="31"/>
-    <w:bookmarkStart w:id="32" w:name="author-contributions"/>
-    <w:p>
-      <w:bookmarkStart w:id="131" w:name="loc_66"/>
+    <w:bookmarkEnd w:id="30"/>
+    <w:bookmarkStart w:id="31" w:name="author-contributions"/>
+    <w:p>
+      <w:bookmarkStart w:id="130" w:name="loc_71"/>
       <w:pPr>
         <w:pStyle w:val="Heading2"/>
       </w:pPr>
@@ -3571,7 +3609,7 @@
         </w:rPr>
         <w:t>Author contributions</w:t>
       </w:r>
-      <w:bookmarkEnd w:id="131"/>
+      <w:bookmarkEnd w:id="130"/>
     </w:p>
     <w:p>
       <w:pPr>
@@ -3581,10 +3619,10 @@
         <w:t xml:space="preserve">[Author names mapped to CRediT roles; confirmation of final approval and accountability].</w:t>
       </w:r>
     </w:p>
-    <w:bookmarkEnd w:id="32"/>
-    <w:bookmarkStart w:id="33" w:name="Xa795f839aa3476760733bd38e4d2d15944e6881"/>
-    <w:p>
-      <w:bookmarkStart w:id="133" w:name="loc_68"/>
+    <w:bookmarkEnd w:id="31"/>
+    <w:bookmarkStart w:id="32" w:name="Xa795f839aa3476760733bd38e4d2d15944e6881"/>
+    <w:p>
+      <w:bookmarkStart w:id="132" w:name="loc_73"/>
       <w:pPr>
         <w:pStyle w:val="Heading2"/>
       </w:pPr>
@@ -3594,7 +3632,7 @@
         </w:rPr>
         <w:t>Ethics, registration and public involvement</w:t>
       </w:r>
-      <w:bookmarkEnd w:id="133"/>
+      <w:bookmarkEnd w:id="132"/>
     </w:p>
     <w:p>
       <w:pPr>
@@ -3604,10 +3642,10 @@
         <w:t xml:space="preserve">[Ethics approval or exemption determination and consent requirements, including the expert assessment and forced-choice component]. [Study registration status and identifier, if applicable]. [Patient and public involvement statement].</w:t>
       </w:r>
     </w:p>
-    <w:bookmarkEnd w:id="33"/>
-    <w:bookmarkStart w:id="37" w:name="data-availability"/>
-    <w:p>
-      <w:bookmarkStart w:id="135" w:name="loc_70"/>
+    <w:bookmarkEnd w:id="32"/>
+    <w:bookmarkStart w:id="36" w:name="data-availability"/>
+    <w:p>
+      <w:bookmarkStart w:id="134" w:name="loc_75"/>
       <w:pPr>
         <w:pStyle w:val="Heading2"/>
       </w:pPr>
@@ -3617,7 +3655,7 @@
         </w:rPr>
         <w:t>Data availability</w:t>
       </w:r>
-      <w:bookmarkEnd w:id="135"/>
+      <w:bookmarkEnd w:id="134"/>
     </w:p>
     <w:p>
       <w:pPr>
@@ -3629,7 +3667,7 @@
       <w:r>
         <w:t xml:space="preserve"> </w:t>
       </w:r>
-      <w:hyperlink r:id="rId34">
+      <w:hyperlink r:id="rId33">
         <w:r>
           <w:rPr>
             <w:rStyle w:val="Hyperlink"/>
@@ -3646,7 +3684,7 @@
       <w:r>
         <w:t xml:space="preserve"> </w:t>
       </w:r>
-      <w:hyperlink r:id="rId20">
+      <w:hyperlink r:id="rId19">
         <w:r>
           <w:rPr>
             <w:rStyle w:val="Hyperlink"/>
@@ -3660,7 +3698,7 @@
       <w:r>
         <w:t xml:space="preserve"> </w:t>
       </w:r>
-      <w:hyperlink r:id="rId35">
+      <w:hyperlink r:id="rId34">
         <w:r>
           <w:rPr>
             <w:rStyle w:val="Hyperlink"/>
@@ -3677,7 +3715,7 @@
       <w:r>
         <w:t xml:space="preserve"> </w:t>
       </w:r>
-      <w:hyperlink r:id="rId36">
+      <w:hyperlink r:id="rId35">
         <w:r>
           <w:rPr>
             <w:rStyle w:val="Hyperlink"/>
@@ -3692,11 +3730,11 @@
         <w:t xml:space="preserve">provide the figures, editable tables and reproduction links. Trial PDFs will not be redistributed; trial DOIs and source-file hashes will identify the inputs. Author declarations and archival registration remain pending completion.</w:t>
       </w:r>
     </w:p>
+    <w:bookmarkEnd w:id="36"/>
     <w:bookmarkEnd w:id="37"/>
-    <w:bookmarkEnd w:id="38"/>
-    <w:bookmarkStart w:id="63" w:name="references"/>
-    <w:p>
-      <w:bookmarkStart w:id="137" w:name="loc_72"/>
+    <w:bookmarkStart w:id="57" w:name="references"/>
+    <w:p>
+      <w:bookmarkStart w:id="136" w:name="loc_77"/>
       <w:pPr>
         <w:pStyle w:val="Heading1"/>
       </w:pPr>
@@ -3706,7 +3744,7 @@
         </w:rPr>
         <w:t>REFERENCES</w:t>
       </w:r>
-      <w:bookmarkEnd w:id="137"/>
+      <w:bookmarkEnd w:id="136"/>
     </w:p>
     <w:p>
       <w:pPr>
@@ -3734,7 +3772,7 @@
       <w:r>
         <w:t xml:space="preserve">2019;366:l4898. doi:</w:t>
       </w:r>
-      <w:hyperlink r:id="rId39">
+      <w:hyperlink r:id="rId38">
         <w:r>
           <w:rPr>
             <w:rStyle w:val="Hyperlink"/>
@@ -3772,7 +3810,7 @@
       <w:r>
         <w:t xml:space="preserve">2020;126:37–44. doi:</w:t>
       </w:r>
-      <w:hyperlink r:id="rId40">
+      <w:hyperlink r:id="rId39">
         <w:r>
           <w:rPr>
             <w:rStyle w:val="Hyperlink"/>
@@ -3810,7 +3848,7 @@
       <w:r>
         <w:t xml:space="preserve">2022;141:99–105. doi:</w:t>
       </w:r>
-      <w:hyperlink r:id="rId41">
+      <w:hyperlink r:id="rId40">
         <w:r>
           <w:rPr>
             <w:rStyle w:val="Hyperlink"/>
@@ -3848,7 +3886,7 @@
       <w:r>
         <w:t xml:space="preserve">2019;9:e028382. doi:</w:t>
       </w:r>
-      <w:hyperlink r:id="rId42">
+      <w:hyperlink r:id="rId41">
         <w:r>
           <w:rPr>
             <w:rStyle w:val="Hyperlink"/>
@@ -3868,104 +3906,6 @@
         </w:numPr>
       </w:pPr>
       <w:r>
-        <w:t xml:space="preserve">Yao Y, Shen J, Luo J, et al. Disagreements in risk of bias assessment for randomized controlled trials in hypertension-related Cochrane reviews.</w:t>
-      </w:r>
-      <w:r>
-        <w:t xml:space="preserve"> </w:t>
-      </w:r>
-      <w:r>
-        <w:rPr>
-          <w:i/>
-          <w:iCs/>
-        </w:rPr>
-        <w:t xml:space="preserve">Trials</w:t>
-      </w:r>
-      <w:r>
-        <w:t xml:space="preserve"> </w:t>
-      </w:r>
-      <w:r>
-        <w:t xml:space="preserve">2024;25:405. doi:</w:t>
-      </w:r>
-      <w:hyperlink r:id="rId43">
-        <w:r>
-          <w:rPr>
-            <w:rStyle w:val="Hyperlink"/>
-          </w:rPr>
-          <w:t xml:space="preserve">10.1186/s13063-024-08145-2</w:t>
-        </w:r>
-      </w:hyperlink>
-      <w:r>
-        <w:t xml:space="preserve">.</w:t>
-      </w:r>
-    </w:p>
-    <w:p>
-      <w:pPr>
-        <w:numPr>
-          <w:ilvl w:val="0"/>
-          <w:numId w:val="1001"/>
-        </w:numPr>
-      </w:pPr>
-      <w:r>
-        <w:t xml:space="preserve">Flemyng E, Noel-Storr A, Macura B, et al. Position statement on artificial intelligence (AI) use in evidence synthesis across Cochrane, the Campbell Collaboration, JBI, and the Collaboration for Environmental Evidence 2025.</w:t>
-      </w:r>
-      <w:r>
-        <w:t xml:space="preserve"> </w:t>
-      </w:r>
-      <w:r>
-        <w:rPr>
-          <w:i/>
-          <w:iCs/>
-        </w:rPr>
-        <w:t xml:space="preserve">JBI Evid Synth</w:t>
-      </w:r>
-      <w:r>
-        <w:t xml:space="preserve"> </w:t>
-      </w:r>
-      <w:r>
-        <w:t xml:space="preserve">2025;23:2162–66. doi:</w:t>
-      </w:r>
-      <w:hyperlink r:id="rId44">
-        <w:r>
-          <w:rPr>
-            <w:rStyle w:val="Hyperlink"/>
-          </w:rPr>
-          <w:t xml:space="preserve">10.11124/JBIES-25-00480</w:t>
-        </w:r>
-      </w:hyperlink>
-      <w:r>
-        <w:t xml:space="preserve">.</w:t>
-      </w:r>
-    </w:p>
-    <w:p>
-      <w:pPr>
-        <w:numPr>
-          <w:ilvl w:val="0"/>
-          <w:numId w:val="1001"/>
-        </w:numPr>
-      </w:pPr>
-      <w:r>
-        <w:t xml:space="preserve">Thomas J, Flemyng E, Noel-Storr A, et al. Responsible use of AI in evidence SynthEsis (RAISE): recommendations and guidance. OSF. doi:</w:t>
-      </w:r>
-      <w:hyperlink r:id="rId45">
-        <w:r>
-          <w:rPr>
-            <w:rStyle w:val="Hyperlink"/>
-          </w:rPr>
-          <w:t xml:space="preserve">10.17605/OSF.IO/FWAUD</w:t>
-        </w:r>
-      </w:hyperlink>
-      <w:r>
-        <w:t xml:space="preserve">. Accessed 19 October 2026. Living project; the DOI identifies the guidance collection.</w:t>
-      </w:r>
-    </w:p>
-    <w:p>
-      <w:pPr>
-        <w:numPr>
-          <w:ilvl w:val="0"/>
-          <w:numId w:val="1001"/>
-        </w:numPr>
-      </w:pPr>
-      <w:r>
         <w:t xml:space="preserve">Marshall IJ, Kuiper J, Wallace BC. RobotReviewer: evaluation of a system for automatically assessing bias in clinical trials.</w:t>
       </w:r>
       <w:r>
@@ -3984,7 +3924,7 @@
       <w:r>
         <w:t xml:space="preserve">2016;23:193–201. doi:</w:t>
       </w:r>
-      <w:hyperlink r:id="rId46">
+      <w:hyperlink r:id="rId42">
         <w:r>
           <w:rPr>
             <w:rStyle w:val="Hyperlink"/>
@@ -4019,7 +3959,7 @@
       <w:r>
         <w:t xml:space="preserve">. Association for Computational Linguistics, 2025:12–25. doi:</w:t>
       </w:r>
-      <w:hyperlink r:id="rId47">
+      <w:hyperlink r:id="rId43">
         <w:r>
           <w:rPr>
             <w:rStyle w:val="Hyperlink"/>
@@ -4057,7 +3997,7 @@
       <w:r>
         <w:t xml:space="preserve">2026;21:e0353155. doi:</w:t>
       </w:r>
-      <w:hyperlink r:id="rId48">
+      <w:hyperlink r:id="rId44">
         <w:r>
           <w:rPr>
             <w:rStyle w:val="Hyperlink"/>
@@ -4095,7 +4035,7 @@
       <w:r>
         <w:t xml:space="preserve">2025;27:e70450. doi:</w:t>
       </w:r>
-      <w:hyperlink r:id="rId49">
+      <w:hyperlink r:id="rId45">
         <w:r>
           <w:rPr>
             <w:rStyle w:val="Hyperlink"/>
@@ -4133,7 +4073,7 @@
       <w:r>
         <w:t xml:space="preserve">2026;31:332–41. doi:</w:t>
       </w:r>
-      <w:hyperlink r:id="rId50">
+      <w:hyperlink r:id="rId46">
         <w:r>
           <w:rPr>
             <w:rStyle w:val="Hyperlink"/>
@@ -4171,7 +4111,7 @@
       <w:r>
         <w:t xml:space="preserve">2026;126:106238. doi:</w:t>
       </w:r>
-      <w:hyperlink r:id="rId51">
+      <w:hyperlink r:id="rId47">
         <w:r>
           <w:rPr>
             <w:rStyle w:val="Hyperlink"/>
@@ -4209,7 +4149,7 @@
       <w:r>
         <w:t xml:space="preserve">2025;3:e70044. doi:</w:t>
       </w:r>
-      <w:hyperlink r:id="rId52">
+      <w:hyperlink r:id="rId48">
         <w:r>
           <w:rPr>
             <w:rStyle w:val="Hyperlink"/>
@@ -4247,7 +4187,7 @@
       <w:r>
         <w:t xml:space="preserve">2026;28:e84915. doi:</w:t>
       </w:r>
-      <w:hyperlink r:id="rId53">
+      <w:hyperlink r:id="rId49">
         <w:r>
           <w:rPr>
             <w:rStyle w:val="Hyperlink"/>
@@ -4267,6 +4207,196 @@
         </w:numPr>
       </w:pPr>
       <w:r>
+        <w:t xml:space="preserve">Gartlehner G, Kugley S, Crotty K, et al. Artificial Intelligence–Assisted Data Extraction With a Large Language Model: A Study Within Reviews.</w:t>
+      </w:r>
+      <w:r>
+        <w:t xml:space="preserve"> </w:t>
+      </w:r>
+      <w:r>
+        <w:rPr>
+          <w:i/>
+          <w:iCs/>
+        </w:rPr>
+        <w:t xml:space="preserve">Ann Intern Med</w:t>
+      </w:r>
+      <w:r>
+        <w:t xml:space="preserve"> </w:t>
+      </w:r>
+      <w:r>
+        <w:t xml:space="preserve">2025;178:1763–71. doi:</w:t>
+      </w:r>
+      <w:hyperlink r:id="rId50">
+        <w:r>
+          <w:rPr>
+            <w:rStyle w:val="Hyperlink"/>
+          </w:rPr>
+          <w:t xml:space="preserve">10.7326/ANNALS-25-00739</w:t>
+        </w:r>
+      </w:hyperlink>
+      <w:r>
+        <w:t xml:space="preserve">.</w:t>
+      </w:r>
+    </w:p>
+    <w:p>
+      <w:pPr>
+        <w:numPr>
+          <w:ilvl w:val="0"/>
+          <w:numId w:val="1001"/>
+        </w:numPr>
+      </w:pPr>
+      <w:r>
+        <w:t xml:space="preserve">Gallifant J, Afshar M, Ameen S, et al. The TRIPOD-LLM reporting guideline for studies using large language models.</w:t>
+      </w:r>
+      <w:r>
+        <w:t xml:space="preserve"> </w:t>
+      </w:r>
+      <w:r>
+        <w:rPr>
+          <w:i/>
+          <w:iCs/>
+        </w:rPr>
+        <w:t xml:space="preserve">Nat Med</w:t>
+      </w:r>
+      <w:r>
+        <w:t xml:space="preserve"> </w:t>
+      </w:r>
+      <w:r>
+        <w:t xml:space="preserve">2025;31:60–69. doi:</w:t>
+      </w:r>
+      <w:hyperlink r:id="rId51">
+        <w:r>
+          <w:rPr>
+            <w:rStyle w:val="Hyperlink"/>
+          </w:rPr>
+          <w:t xml:space="preserve">10.1038/s41591-024-03425-5</w:t>
+        </w:r>
+      </w:hyperlink>
+      <w:r>
+        <w:t xml:space="preserve">.</w:t>
+      </w:r>
+    </w:p>
+    <w:p>
+      <w:pPr>
+        <w:numPr>
+          <w:ilvl w:val="0"/>
+          <w:numId w:val="1001"/>
+        </w:numPr>
+      </w:pPr>
+      <w:r>
+        <w:t xml:space="preserve">Kottner J, Audigé L, Brorson S, et al. Guidelines for Reporting Reliability and Agreement Studies (GRRAS) were proposed.</w:t>
+      </w:r>
+      <w:r>
+        <w:t xml:space="preserve"> </w:t>
+      </w:r>
+      <w:r>
+        <w:rPr>
+          <w:i/>
+          <w:iCs/>
+        </w:rPr>
+        <w:t xml:space="preserve">J Clin Epidemiol</w:t>
+      </w:r>
+      <w:r>
+        <w:t xml:space="preserve"> </w:t>
+      </w:r>
+      <w:r>
+        <w:t xml:space="preserve">2011;64:96–106. doi:</w:t>
+      </w:r>
+      <w:hyperlink r:id="rId52">
+        <w:r>
+          <w:rPr>
+            <w:rStyle w:val="Hyperlink"/>
+          </w:rPr>
+          <w:t xml:space="preserve">10.1016/j.jclinepi.2010.03.002</w:t>
+        </w:r>
+      </w:hyperlink>
+      <w:r>
+        <w:t xml:space="preserve">.</w:t>
+      </w:r>
+    </w:p>
+    <w:p>
+      <w:pPr>
+        <w:numPr>
+          <w:ilvl w:val="0"/>
+          <w:numId w:val="1001"/>
+        </w:numPr>
+      </w:pPr>
+      <w:r>
+        <w:t xml:space="preserve">Liang Z, Sheffield C, Butera G, Antani S. Retrieve-Then-Verify for Evaluating Evidence Support and Hallucination in Large Language Model–Generated Medical Information: Empirical Study.</w:t>
+      </w:r>
+      <w:r>
+        <w:t xml:space="preserve"> </w:t>
+      </w:r>
+      <w:r>
+        <w:rPr>
+          <w:i/>
+          <w:iCs/>
+        </w:rPr>
+        <w:t xml:space="preserve">JMIR AI</w:t>
+      </w:r>
+      <w:r>
+        <w:t xml:space="preserve"> </w:t>
+      </w:r>
+      <w:r>
+        <w:t xml:space="preserve">2026;5:e93761. doi:</w:t>
+      </w:r>
+      <w:hyperlink r:id="rId53">
+        <w:r>
+          <w:rPr>
+            <w:rStyle w:val="Hyperlink"/>
+          </w:rPr>
+          <w:t xml:space="preserve">10.2196/93761</w:t>
+        </w:r>
+      </w:hyperlink>
+      <w:r>
+        <w:t xml:space="preserve">.</w:t>
+      </w:r>
+    </w:p>
+    <w:p>
+      <w:pPr>
+        <w:numPr>
+          <w:ilvl w:val="0"/>
+          <w:numId w:val="1001"/>
+        </w:numPr>
+      </w:pPr>
+      <w:r>
+        <w:t xml:space="preserve">Joseph J, Vishwanath R, Sisirkumar JV. RoB2-Evaluator: Development and Technical Evaluation of a Rule-Constrained Large Language Model System for Cochrane Risk of Bias 2 Assessment.</w:t>
+      </w:r>
+      <w:r>
+        <w:t xml:space="preserve"> </w:t>
+      </w:r>
+      <w:r>
+        <w:rPr>
+          <w:i/>
+          <w:iCs/>
+        </w:rPr>
+        <w:t xml:space="preserve">medRxiv</w:t>
+      </w:r>
+      <w:r>
+        <w:t xml:space="preserve"> </w:t>
+      </w:r>
+      <w:r>
+        <w:t xml:space="preserve">[Preprint]. Posted 23 September 2026. doi:</w:t>
+      </w:r>
+      <w:hyperlink r:id="rId54">
+        <w:r>
+          <w:rPr>
+            <w:rStyle w:val="Hyperlink"/>
+          </w:rPr>
+          <w:t xml:space="preserve">10.64898/2026.09.22.26363693</w:t>
+        </w:r>
+      </w:hyperlink>
+      <w:r>
+        <w:t xml:space="preserve">.</w:t>
+      </w:r>
+    </w:p>
+    <w:p>
+      <w:pPr>
+        <w:numPr>
+          <w:ilvl w:val="0"/>
+          <w:numId w:val="1001"/>
+        </w:numPr>
+      </w:pPr>
+      <w:r>
         <w:t xml:space="preserve">Choi J, Swan H, Kim MJ, et al. Variability, algorithm conformance, and accuracy of large language model–based tools for risk-of-bias (RoB 2.0) assessment of randomized trials: a pilot study.</w:t>
       </w:r>
       <w:r>
@@ -4285,7 +4415,7 @@
       <w:r>
         <w:t xml:space="preserve">2026;2:91–97. doi:</w:t>
       </w:r>
-      <w:hyperlink r:id="rId54">
+      <w:hyperlink r:id="rId55">
         <w:r>
           <w:rPr>
             <w:rStyle w:val="Hyperlink"/>
@@ -4305,7 +4435,7 @@
         </w:numPr>
       </w:pPr>
       <w:r>
-        <w:t xml:space="preserve">Eisele-Metzger A, Lieberum JL, Toews M, et al. Exploring the potential of Claude 2 for risk of bias assessment: Using a large language model to assess randomized controlled trials with RoB 2.</w:t>
+        <w:t xml:space="preserve">Jardim PSJ, Rose CJ, Ames HM, et al. Automating risk of bias assessment in systematic reviews: a real-time mixed methods comparison of human researchers to a machine learning system.</w:t>
       </w:r>
       <w:r>
         <w:t xml:space="preserve"> </w:t>
@@ -4315,293 +4445,30 @@
           <w:i/>
           <w:iCs/>
         </w:rPr>
-        <w:t xml:space="preserve">Res Synth Methods</w:t>
+        <w:t xml:space="preserve">BMC Med Res Methodol</w:t>
       </w:r>
       <w:r>
         <w:t xml:space="preserve"> </w:t>
       </w:r>
       <w:r>
-        <w:t xml:space="preserve">2025;16:491–508. doi:</w:t>
-      </w:r>
-      <w:hyperlink r:id="rId55">
-        <w:r>
-          <w:rPr>
-            <w:rStyle w:val="Hyperlink"/>
-          </w:rPr>
-          <w:t xml:space="preserve">10.1017/rsm.2025.12</w:t>
-        </w:r>
-      </w:hyperlink>
-      <w:r>
-        <w:t xml:space="preserve">.</w:t>
-      </w:r>
-    </w:p>
-    <w:p>
-      <w:pPr>
-        <w:numPr>
-          <w:ilvl w:val="0"/>
-          <w:numId w:val="1001"/>
-        </w:numPr>
-      </w:pPr>
-      <w:r>
-        <w:t xml:space="preserve">Sahu V. Five methodological considerations for validating LLMs in risk of bias assessment.</w:t>
-      </w:r>
-      <w:r>
-        <w:t xml:space="preserve"> </w:t>
-      </w:r>
-      <w:r>
-        <w:rPr>
-          <w:i/>
-          <w:iCs/>
-        </w:rPr>
-        <w:t xml:space="preserve">Res Synth Methods</w:t>
-      </w:r>
-      <w:r>
-        <w:t xml:space="preserve"> </w:t>
-      </w:r>
-      <w:r>
-        <w:t xml:space="preserve">2026;17:1054–56. doi:</w:t>
+        <w:t xml:space="preserve">2022;22:167. doi:</w:t>
       </w:r>
       <w:hyperlink r:id="rId56">
         <w:r>
           <w:rPr>
             <w:rStyle w:val="Hyperlink"/>
           </w:rPr>
-          <w:t xml:space="preserve">10.1017/rsm.2026.10073</w:t>
+          <w:t xml:space="preserve">10.1186/s12874-022-01649-y</w:t>
         </w:r>
       </w:hyperlink>
       <w:r>
         <w:t xml:space="preserve">.</w:t>
       </w:r>
     </w:p>
-    <w:p>
-      <w:pPr>
-        <w:numPr>
-          <w:ilvl w:val="0"/>
-          <w:numId w:val="1001"/>
-        </w:numPr>
-      </w:pPr>
-      <w:r>
-        <w:t xml:space="preserve">Gartlehner G, Kugley S, Crotty K, et al. Artificial Intelligence–Assisted Data Extraction With a Large Language Model: A Study Within Reviews.</w:t>
-      </w:r>
-      <w:r>
-        <w:t xml:space="preserve"> </w:t>
-      </w:r>
-      <w:r>
-        <w:rPr>
-          <w:i/>
-          <w:iCs/>
-        </w:rPr>
-        <w:t xml:space="preserve">Ann Intern Med</w:t>
-      </w:r>
-      <w:r>
-        <w:t xml:space="preserve"> </w:t>
-      </w:r>
-      <w:r>
-        <w:t xml:space="preserve">2025;178:1763–71. doi:</w:t>
-      </w:r>
-      <w:hyperlink r:id="rId57">
-        <w:r>
-          <w:rPr>
-            <w:rStyle w:val="Hyperlink"/>
-          </w:rPr>
-          <w:t xml:space="preserve">10.7326/ANNALS-25-00739</w:t>
-        </w:r>
-      </w:hyperlink>
-      <w:r>
-        <w:t xml:space="preserve">.</w:t>
-      </w:r>
-    </w:p>
-    <w:p>
-      <w:pPr>
-        <w:numPr>
-          <w:ilvl w:val="0"/>
-          <w:numId w:val="1001"/>
-        </w:numPr>
-      </w:pPr>
-      <w:r>
-        <w:t xml:space="preserve">Gallifant J, Afshar M, Ameen S, et al. The TRIPOD-LLM reporting guideline for studies using large language models.</w:t>
-      </w:r>
-      <w:r>
-        <w:t xml:space="preserve"> </w:t>
-      </w:r>
-      <w:r>
-        <w:rPr>
-          <w:i/>
-          <w:iCs/>
-        </w:rPr>
-        <w:t xml:space="preserve">Nat Med</w:t>
-      </w:r>
-      <w:r>
-        <w:t xml:space="preserve"> </w:t>
-      </w:r>
-      <w:r>
-        <w:t xml:space="preserve">2025;31:60–69. doi:</w:t>
-      </w:r>
-      <w:hyperlink r:id="rId58">
-        <w:r>
-          <w:rPr>
-            <w:rStyle w:val="Hyperlink"/>
-          </w:rPr>
-          <w:t xml:space="preserve">10.1038/s41591-024-03425-5</w:t>
-        </w:r>
-      </w:hyperlink>
-      <w:r>
-        <w:t xml:space="preserve">.</w:t>
-      </w:r>
-    </w:p>
-    <w:p>
-      <w:pPr>
-        <w:numPr>
-          <w:ilvl w:val="0"/>
-          <w:numId w:val="1001"/>
-        </w:numPr>
-      </w:pPr>
-      <w:r>
-        <w:t xml:space="preserve">Kottner J, Audigé L, Brorson S, et al. Guidelines for Reporting Reliability and Agreement Studies (GRRAS) were proposed.</w:t>
-      </w:r>
-      <w:r>
-        <w:t xml:space="preserve"> </w:t>
-      </w:r>
-      <w:r>
-        <w:rPr>
-          <w:i/>
-          <w:iCs/>
-        </w:rPr>
-        <w:t xml:space="preserve">J Clin Epidemiol</w:t>
-      </w:r>
-      <w:r>
-        <w:t xml:space="preserve"> </w:t>
-      </w:r>
-      <w:r>
-        <w:t xml:space="preserve">2011;64:96–106. doi:</w:t>
-      </w:r>
-      <w:hyperlink r:id="rId59">
-        <w:r>
-          <w:rPr>
-            <w:rStyle w:val="Hyperlink"/>
-          </w:rPr>
-          <w:t xml:space="preserve">10.1016/j.jclinepi.2010.03.002</w:t>
-        </w:r>
-      </w:hyperlink>
-      <w:r>
-        <w:t xml:space="preserve">.</w:t>
-      </w:r>
-    </w:p>
-    <w:p>
-      <w:pPr>
-        <w:numPr>
-          <w:ilvl w:val="0"/>
-          <w:numId w:val="1001"/>
-        </w:numPr>
-      </w:pPr>
-      <w:r>
-        <w:t xml:space="preserve">Liu N, Zhang T, Liang P. Evaluating verifiability in generative search engines. In:</w:t>
-      </w:r>
-      <w:r>
-        <w:t xml:space="preserve"> </w:t>
-      </w:r>
-      <w:r>
-        <w:rPr>
-          <w:i/>
-          <w:iCs/>
-        </w:rPr>
-        <w:t xml:space="preserve">Findings of the Association for Computational Linguistics: EMNLP 2023</w:t>
-      </w:r>
-      <w:r>
-        <w:t xml:space="preserve">. Association for Computational Linguistics, 2023:7001–25. doi:</w:t>
-      </w:r>
-      <w:hyperlink r:id="rId60">
-        <w:r>
-          <w:rPr>
-            <w:rStyle w:val="Hyperlink"/>
-          </w:rPr>
-          <w:t xml:space="preserve">10.18653/v1/2023.findings-emnlp.467</w:t>
-        </w:r>
-      </w:hyperlink>
-      <w:r>
-        <w:t xml:space="preserve">.</w:t>
-      </w:r>
-    </w:p>
-    <w:p>
-      <w:pPr>
-        <w:numPr>
-          <w:ilvl w:val="0"/>
-          <w:numId w:val="1001"/>
-        </w:numPr>
-      </w:pPr>
-      <w:r>
-        <w:t xml:space="preserve">Li Y, Yang F, Wu M, Li J. Human-AI collaboration enhances the performance of large language models in risk of bias assessment.</w:t>
-      </w:r>
-      <w:r>
-        <w:t xml:space="preserve"> </w:t>
-      </w:r>
-      <w:r>
-        <w:rPr>
-          <w:i/>
-          <w:iCs/>
-        </w:rPr>
-        <w:t xml:space="preserve">BMC Med Res Methodol</w:t>
-      </w:r>
-      <w:r>
-        <w:t xml:space="preserve"> </w:t>
-      </w:r>
-      <w:r>
-        <w:t xml:space="preserve">2026;26:37. doi:</w:t>
-      </w:r>
-      <w:hyperlink r:id="rId61">
-        <w:r>
-          <w:rPr>
-            <w:rStyle w:val="Hyperlink"/>
-          </w:rPr>
-          <w:t xml:space="preserve">10.1186/s12874-025-02763-3</w:t>
-        </w:r>
-      </w:hyperlink>
-      <w:r>
-        <w:t xml:space="preserve">.</w:t>
-      </w:r>
-    </w:p>
-    <w:p>
-      <w:pPr>
-        <w:numPr>
-          <w:ilvl w:val="0"/>
-          <w:numId w:val="1001"/>
-        </w:numPr>
-      </w:pPr>
-      <w:r>
-        <w:t xml:space="preserve">Joseph J, Vishwanath R, Sisirkumar JV. RoB2-Evaluator: Development and Technical Evaluation of a Rule-Constrained Large Language Model System for Cochrane Risk of Bias 2 Assessment.</w:t>
-      </w:r>
-      <w:r>
-        <w:t xml:space="preserve"> </w:t>
-      </w:r>
-      <w:r>
-        <w:rPr>
-          <w:i/>
-          <w:iCs/>
-        </w:rPr>
-        <w:t xml:space="preserve">medRxiv</w:t>
-      </w:r>
-      <w:r>
-        <w:t xml:space="preserve"> </w:t>
-      </w:r>
-      <w:r>
-        <w:t xml:space="preserve">[Preprint]. Posted 23 September 2026. doi:</w:t>
-      </w:r>
-      <w:hyperlink r:id="rId62">
-        <w:r>
-          <w:rPr>
-            <w:rStyle w:val="Hyperlink"/>
-          </w:rPr>
-          <w:t xml:space="preserve">10.64898/2026.09.22.26363693</w:t>
-        </w:r>
-      </w:hyperlink>
-      <w:r>
-        <w:t xml:space="preserve">.</w:t>
-      </w:r>
-    </w:p>
-    <w:bookmarkEnd w:id="63"/>
-    <w:bookmarkEnd w:id="64"/>
-    <w:p>
-      <w:bookmarkStart w:id="162" w:name="loc_97"/>
+    <w:bookmarkEnd w:id="57"/>
+    <w:bookmarkEnd w:id="58"/>
+    <w:p>
+      <w:bookmarkStart w:id="156" w:name="loc_97"/>
       <w:pPr>
         <w:pStyle w:val="Heading1"/>
         <w:pageBreakBefore/>
@@ -4609,7 +4476,7 @@
       <w:r>
         <w:t>FIGURE LEGENDS</w:t>
       </w:r>
-      <w:bookmarkEnd w:id="162"/>
+      <w:bookmarkEnd w:id="156"/>
     </w:p>
     <w:p>
       <w:pPr>

</xml_diff>

<commit_message>
Polish JAMIA manuscript for expert readers with IMRaD and expanded literature
</commit_message>
<xml_diff>
--- a/analysis/output/manuscript/Manuscript.docx
+++ b/analysis/output/manuscript/Manuscript.docx
@@ -2,7 +2,7 @@
 <file path=word/document.xml><?xml version="1.0" encoding="utf-8"?>
 <w:document xmlns:w="http://schemas.openxmlformats.org/wordprocessingml/2006/main" xmlns:m="http://schemas.openxmlformats.org/officeDocument/2006/math" xmlns:r="http://schemas.openxmlformats.org/officeDocument/2006/relationships" xmlns:o="urn:schemas-microsoft-com:office:office" xmlns:v="urn:schemas-microsoft-com:vml" xmlns:w10="urn:schemas-microsoft-com:office:word" xmlns:a="http://schemas.openxmlformats.org/drawingml/2006/main" xmlns:pic="http://schemas.openxmlformats.org/drawingml/2006/picture" xmlns:wp="http://schemas.openxmlformats.org/drawingml/2006/wordprocessingDrawing">
   <w:body>
-    <w:bookmarkStart w:id="58" w:name="X26e74a24f867deabfa9c1d5ee51de4ca1fc52bd"/>
+    <w:bookmarkStart w:id="62" w:name="X26e74a24f867deabfa9c1d5ee51de4ca1fc52bd"/>
     <w:p>
       <w:pPr>
         <w:pStyle w:val="Title"/>
@@ -42,13 +42,13 @@
     </w:p>
     <w:p>
       <w:r>
-        <w:t>Word counts: main text 3425; structured abstract 239.</w:t>
+        <w:t>Word counts: main text 3368; structured abstract 225.</w:t>
       </w:r>
     </w:p>
     <w:bookmarkEnd w:id="9"/>
     <w:bookmarkStart w:id="15" w:name="abstract"/>
     <w:p>
-      <w:bookmarkStart w:id="64" w:name="loc_5"/>
+      <w:bookmarkStart w:id="68" w:name="loc_5"/>
       <w:pPr>
         <w:pStyle w:val="Heading1"/>
         <w:pageBreakBefore/>
@@ -60,7 +60,7 @@
         </w:rPr>
         <w:t>ABSTRACT</w:t>
       </w:r>
-      <w:bookmarkEnd w:id="64"/>
+      <w:bookmarkEnd w:id="68"/>
     </w:p>
     <w:bookmarkStart w:id="10" w:name="objective"/>
     <w:p>
@@ -75,7 +75,7 @@
         <w:t xml:space="preserve">Objective. </w:t>
       </w:r>
       <w:r>
-        <w:t xml:space="preserve">To present an inspectable workflow for the Cochrane risk-of-bias tool for randomised trials (RoB 2) and evaluate its judgments against independent experts.</w:t>
+        <w:t xml:space="preserve">To present ARBITER, an inspectable workflow for the Cochrane risk-of-bias tool for randomised trials (RoB 2), and compare its judgments with same-model minimal prompting.</w:t>
       </w:r>
     </w:p>
     <w:bookmarkEnd w:id="10"/>
@@ -92,7 +92,7 @@
         <w:t xml:space="preserve">Materials and Methods. </w:t>
       </w:r>
       <w:r>
-        <w:t xml:space="preserve">ARBITER retains sources, evidence and signalling answers, then applies RoB 2 decision rules in software. We compared its Sonnet workflow with a same-model minimal-prompt comparator (Unassisted) using identical supplied documents for 102 trials from 16 reviews. Two experts independently rated five domains per trial (510 assessments) before choosing among blinded labels. The primary endpoint was the proportion of agreed expert choices matching ARBITER where workflows disagreed. Agreement with each expert across all 510 assessments was secondary. Paired intervals resampled trials within fixed reviews.</w:t>
+        <w:t xml:space="preserve">ARBITER retains sources, evidence and signalling answers and applies decision rules in software. Its Sonnet workflow and a minimal-prompt comparator (Unassisted) assessed identical supplied documents for 102 trials from 16 reviews. Two experts independently rated 510 trial–domain assessments before choosing among blinded labels. The primary endpoint measured agreed label choices matching ARBITER where workflows disagreed. Independent expert agreement was secondary. Paired intervals resampled trials within fixed reviews.</w:t>
       </w:r>
     </w:p>
     <w:bookmarkEnd w:id="11"/>
@@ -109,7 +109,7 @@
         <w:t xml:space="preserve">Results. </w:t>
       </w:r>
       <w:r>
-        <w:t xml:space="preserve">The chosen label matched ARBITER in 53/60 agreed choices (88%; 95% CI, 80–96%), from 80 workflow disagreements with 20 split choices. Exact agreement was 371/510 (72.7%) versus 332/510 (65.1%) against Expert 1 and 433/510 (84.9%) versus 400/510 (78.4%) against Expert 2. Paired gains were 7.6 percentage points (95% CI, 5.1–10.2) and 6.5 (3.5–9.4). Against published labels, ARBITER minus Unassisted agreement was −1.8 points (−5.1 to 1.6). All 510 ARBITER domain outputs followed executable rules. Structural checks did not assess whether evidence supported the answers. Median runtime was 7.6 versus 0.5 minutes per trial.</w:t>
+        <w:t xml:space="preserve">Among 80 workflow disagreements, experts agreed on 60 label choices and split on 20; 53/60 agreed choices matched ARBITER (88%; 95% CI, 80–96%). Exact agreement was 371/510 (72.7%) versus 332/510 (65.1%) against Expert 1 and 433/510 (84.9%) versus 400/510 (78.4%) against Expert 2. Paired gains were 7.6 percentage points (95% CI, 5.1–10.2) and 6.5 (3.5–9.4). Against published labels, ARBITER minus Unassisted agreement was −1.8 points (−5.1 to 1.6). All 510 ARBITER domain outputs followed executable rules. Structural checks did not assess evidence support. Median runtime was 7.6 versus 0.5 minutes per trial.</w:t>
       </w:r>
     </w:p>
     <w:bookmarkEnd w:id="12"/>
@@ -126,7 +126,7 @@
         <w:t xml:space="preserve">Discussion. </w:t>
       </w:r>
       <w:r>
-        <w:t xml:space="preserve">Agreement varied by domain and reference. Instructions, tools and computation differed between workflows; the comparison does not isolate component effects or measure reviewer benefit.</w:t>
+        <w:t xml:space="preserve">Label matching does not endorse ARBITER’s reasoning. Agreement varied by domain and reference. The complete-workflow comparison cannot isolate component effects or establish reviewer benefit.</w:t>
       </w:r>
     </w:p>
     <w:bookmarkEnd w:id="13"/>
@@ -143,14 +143,14 @@
         <w:t xml:space="preserve">Conclusion. </w:t>
       </w:r>
       <w:r>
-        <w:t xml:space="preserve">ARBITER preserves an inspectable assessment pathway and had greater agreement with both independent experts in this benchmark.</w:t>
+        <w:t xml:space="preserve">ARBITER preserved an inspectable assessment pathway and agreed more often with both independent experts in this single-run benchmark.</w:t>
       </w:r>
     </w:p>
     <w:bookmarkEnd w:id="14"/>
     <w:bookmarkEnd w:id="15"/>
-    <w:bookmarkStart w:id="16" w:name="background-and-significance"/>
-    <w:p>
-      <w:bookmarkStart w:id="70" w:name="loc_11"/>
+    <w:bookmarkStart w:id="18" w:name="introduction"/>
+    <w:p>
+      <w:bookmarkStart w:id="74" w:name="loc_11"/>
       <w:pPr>
         <w:pStyle w:val="Heading1"/>
         <w:pageBreakBefore/>
@@ -159,61 +159,76 @@
         <w:rPr>
           <w:b/>
         </w:rPr>
-        <w:t>BACKGROUND AND SIGNIFICANCE</w:t>
-      </w:r>
-      <w:bookmarkEnd w:id="70"/>
-    </w:p>
-    <w:p>
-      <w:pPr>
-        <w:pStyle w:val="FirstParagraph"/>
-      </w:pPr>
-      <w:r>
-        <w:t xml:space="preserve">A risk-of-bias judgment is a conclusion about a particular trial result. To examine that conclusion, a reviewer needs to follow the supporting evidence through the assessment. The Cochrane risk-of-bias tool for randomised trials (RoB 2) makes this pathway explicit through signalling questions and algorithms that translate answers into domain judgments.[1] Interpretation remains necessary at each question. Experienced assessors have reported application difficulties and disagreement; condition-specific implementation instructions and calibration were followed by improved agreement in one review setting.[2,3] Studies using the earlier Cochrane instrument also found different interpretations of the same trial information across reviews.[4] For AI-assisted assessment, the relevant problem is therefore how to preserve a judgment’s basis while evaluating the judgment itself.</w:t>
-      </w:r>
-    </w:p>
-    <w:p>
-      <w:pPr>
-        <w:pStyle w:val="BodyText"/>
-      </w:pPr>
-      <w:r>
-        <w:t xml:space="preserve">Earlier systems establish that evidence display and structured assessment are practical approaches to this problem. RobotReviewer paired automated judgments with extracted supporting sentences for the earlier instrument.[5] ROBOTO2 extends evidence-linked assessment to an interactive RoB 2 workflow in which reviewers can inspect and change proposed answers and judgments.[6] Structured RoB 2 prompting has also been evaluated against human assessments, including checks of whether domain ratings follow from signalling answers.[7,8] Same-model comparisons of direct and constrained prompts have also been studied with the earlier instrument.[9] These approaches make different parts of an assessment available for examination. Their existence shifts the evaluation question toward the properties and performance of a specified implementation.</w:t>
-      </w:r>
-    </w:p>
-    <w:p>
-      <w:pPr>
-        <w:pStyle w:val="BodyText"/>
-      </w:pPr>
-      <w:r>
-        <w:t xml:space="preserve">Three properties require separate assessment. A source link establishes where quoted text occurs; it does not establish that the text supports the answer. Applying the decision rules establishes how recorded answers produce a rating; it does not establish that those answers are appropriate. Agreement then depends on the human reference, as studies using published labels and fresh assessments illustrate.[7,8,10] ARBITER preserves the source-to-answer-to-rating pathway and evaluates its complete workflow in a paired, same-model benchmark. The empirical question is whether this complete workflow agrees more often with independent assessors than minimal prompting, and where disagreement remains.</w:t>
-      </w:r>
-    </w:p>
-    <w:bookmarkEnd w:id="16"/>
-    <w:bookmarkStart w:id="17" w:name="objective-1"/>
-    <w:p>
-      <w:bookmarkStart w:id="74" w:name="loc_15"/>
-      <w:pPr>
-        <w:pStyle w:val="Heading1"/>
+        <w:t>INTRODUCTION</w:t>
+      </w:r>
+      <w:bookmarkEnd w:id="74"/>
+    </w:p>
+    <w:bookmarkStart w:id="16" w:name="background-and-significance"/>
+    <w:p>
+      <w:bookmarkStart w:id="75" w:name="loc_12"/>
+      <w:pPr>
+        <w:pStyle w:val="Heading2"/>
       </w:pPr>
       <w:r>
         <w:rPr>
           <w:b/>
         </w:rPr>
-        <w:t>OBJECTIVE</w:t>
-      </w:r>
-      <w:bookmarkEnd w:id="74"/>
+        <w:t>Background and significance</w:t>
+      </w:r>
+      <w:bookmarkEnd w:id="75"/>
     </w:p>
     <w:p>
       <w:pPr>
         <w:pStyle w:val="FirstParagraph"/>
       </w:pPr>
       <w:r>
-        <w:t xml:space="preserve">We evaluated what ARBITER makes inspectable and how its complete Sonnet workflow compares with the same model given minimal instructions and identical supplied trial evidence. The formal primary endpoint concerned agreed expert label choices where the workflows differed. Secondary and supporting outcomes assessed independent expert agreement across all domains, consistency with decision rules, source records and computation.</w:t>
+        <w:t xml:space="preserve">AI-assisted RoB 2 assessment requires both interpretation of trial evidence and consistent application of the decision rules.[1] An assessment record can expose how a judgment was reached, but its interpretive quality remains an empirical question. RoB 2 reliability studies have documented disagreement and application difficulties; review-specific instructions and calibration were followed by improved agreement in one setting.[2,3] Work with the earlier Cochrane instrument also identified different interpretations of the same information across reviews.[4] These findings make the reference assessment and the basis of each judgment material to evaluating an automated workflow.</w:t>
+      </w:r>
+    </w:p>
+    <w:p>
+      <w:pPr>
+        <w:pStyle w:val="BodyText"/>
+      </w:pPr>
+      <w:r>
+        <w:t xml:space="preserve">Existing systems already make evidence and intermediate decisions available for review. RobotReviewer paired judgments with supporting sentences for the earlier instrument and evaluated text relevance separately from classification.[5] ROBOTO2 provides an interactive RoB 2 workflow with retrieved evidence and editable answers and judgments.[6] RoBGuard combines question reformulation, multimodal document parsing and collaboration among model roles for RoB 2 assessment.[7] Structured RoB 2 prompting has been compared with human assessments,[8,9] and same-model comparisons of direct and constrained prompts have been studied with the earlier instrument.[10] These precedents support evaluating what a specified implementation adds under a defined comparison.</w:t>
+      </w:r>
+    </w:p>
+    <w:p>
+      <w:pPr>
+        <w:pStyle w:val="BodyText"/>
+      </w:pPr>
+      <w:r>
+        <w:t xml:space="preserve">ARBITER retains trial documents, cited evidence, signalling answers and rating decisions. The model interprets the evidence; software derives proposed ratings from the recorded answers. The complete workflows used the same reported model identifier and configuration and identical supplied trial documents, while instructions, tools and processing differed. Independent expert ratings, blinded label choices and process audits then address distinct aspects of its output.</w:t>
+      </w:r>
+    </w:p>
+    <w:bookmarkEnd w:id="16"/>
+    <w:bookmarkStart w:id="17" w:name="objective-1"/>
+    <w:p>
+      <w:bookmarkStart w:id="79" w:name="loc_16"/>
+      <w:pPr>
+        <w:pStyle w:val="Heading2"/>
+      </w:pPr>
+      <w:r>
+        <w:rPr>
+          <w:b/>
+        </w:rPr>
+        <w:t>Objective</w:t>
+      </w:r>
+      <w:bookmarkEnd w:id="79"/>
+    </w:p>
+    <w:p>
+      <w:pPr>
+        <w:pStyle w:val="FirstParagraph"/>
+      </w:pPr>
+      <w:r>
+        <w:t xml:space="preserve">We asked how often ARBITER’s judgments matched agreed blinded expert label choices when the workflows disagreed, and whether its complete workflow agreed more often with independent expert ratings than same-model minimal prompting. The label-choice endpoint was formally primary; independent expert agreement across all assessments was secondary. Supporting outcomes examined rule conformance, source records and computation.</w:t>
       </w:r>
     </w:p>
     <w:bookmarkEnd w:id="17"/>
-    <w:bookmarkStart w:id="24" w:name="materials-and-methods-1"/>
-    <w:p>
-      <w:bookmarkStart w:id="76" w:name="loc_17"/>
+    <w:bookmarkEnd w:id="18"/>
+    <w:bookmarkStart w:id="25" w:name="materials-and-methods-1"/>
+    <w:p>
+      <w:bookmarkStart w:id="81" w:name="loc_18"/>
       <w:pPr>
         <w:pStyle w:val="Heading1"/>
       </w:pPr>
@@ -223,11 +238,11 @@
         </w:rPr>
         <w:t>MATERIALS AND METHODS</w:t>
       </w:r>
-      <w:bookmarkEnd w:id="76"/>
-    </w:p>
-    <w:bookmarkStart w:id="18" w:name="system-design"/>
-    <w:p>
-      <w:bookmarkStart w:id="77" w:name="loc_18"/>
+      <w:bookmarkEnd w:id="81"/>
+    </w:p>
+    <w:bookmarkStart w:id="19" w:name="system-design"/>
+    <w:p>
+      <w:bookmarkStart w:id="82" w:name="loc_19"/>
       <w:pPr>
         <w:pStyle w:val="Heading2"/>
       </w:pPr>
@@ -237,14 +252,14 @@
         </w:rPr>
         <w:t>System design</w:t>
       </w:r>
-      <w:bookmarkEnd w:id="77"/>
+      <w:bookmarkEnd w:id="82"/>
     </w:p>
     <w:p>
       <w:pPr>
         <w:pStyle w:val="FirstParagraph"/>
       </w:pPr>
       <w:r>
-        <w:t xml:space="preserve">ARBITER separates interpretation of trial evidence from application of the RoB 2 decision rules (Figure 1). The AI model identifies the result to assess and answers the signalling questions; software applies the official algorithms to those answers. It retains the source documents with digital fingerprints that identify their exact contents, extracts quoted passages and records their locations. In interactive use, a reviewer can approve the proposed result before domain assessment and inspect the answers and cited evidence. In this benchmark, the automated run procedure accepted the proposed result unchanged. The exported HTML report and accompanying audit file preserve the assessment for inspection.</w:t>
+        <w:t xml:space="preserve">ARBITER separates interpretation of trial evidence from application of the RoB 2 decision rules (Figure 1). The AI model identifies the result to assess and answers the signalling questions; software applies the official algorithms to those answers. It preserves source provenance by retaining documents with cryptographic hashes that identify their exact contents, extracting quoted passages and recording their locations. In interactive use, a reviewer can approve the proposed result before domain assessment and inspect the answers and cited evidence. The automated benchmark runs accepted the proposed result unchanged. The exported HTML report and accompanying audit file preserve the assessment for inspection.</w:t>
       </w:r>
     </w:p>
     <w:p>
@@ -252,7 +267,7 @@
         <w:pStyle w:val="BodyText"/>
       </w:pPr>
       <w:r>
-        <w:t xml:space="preserve">Every required answer must cite an evidence basis. Software extracts text quotations directly from the stored documents and links image regions to source pages. The model’s descriptions of images are not independently checked against the image content. The software computes a proposed domain rating from the recorded answers; a different adopted rating requires a recorded rationale and evidence. We checked proposed and adopted ratings separately. This record makes the basis of a judgment traceable without establishing that the evidence supports the answer.</w:t>
+        <w:t xml:space="preserve">Each required signalling answer must cite an evidence basis. Software extracts text quotations directly from the stored documents and links image regions to source pages. Model-written image descriptions are not independently checked against image content. The software computes a proposed domain rating from the recorded answers; a different adopted rating requires a recorded rationale and evidence. We checked proposed and adopted ratings separately. The record preserves the basis of each judgment but does not establish whether the evidence supports the answer.</w:t>
       </w:r>
     </w:p>
     <w:p>
@@ -263,10 +278,10 @@
         <w:t xml:space="preserve">The AVATAR assessment illustrates the pathway for all-cause death after early surgery versus watchful waiting in asymptomatic severe aortic stenosis (Figure 2; complete trace in the supplement). The case illustrates the workflow rather than typical performance. Its stored documents did not establish a dated analysis plan for the assessed result.</w:t>
       </w:r>
     </w:p>
-    <w:bookmarkEnd w:id="18"/>
-    <w:bookmarkStart w:id="20" w:name="benchmark-and-assessment-arms"/>
-    <w:p>
-      <w:bookmarkStart w:id="81" w:name="loc_22"/>
+    <w:bookmarkEnd w:id="19"/>
+    <w:bookmarkStart w:id="21" w:name="benchmark-and-assessment-arms"/>
+    <w:p>
+      <w:bookmarkStart w:id="86" w:name="loc_23"/>
       <w:pPr>
         <w:pStyle w:val="Heading2"/>
       </w:pPr>
@@ -276,14 +291,14 @@
         </w:rPr>
         <w:t>Benchmark and assessment arms</w:t>
       </w:r>
-      <w:bookmarkEnd w:id="81"/>
+      <w:bookmarkEnd w:id="86"/>
     </w:p>
     <w:p>
       <w:pPr>
         <w:pStyle w:val="FirstParagraph"/>
       </w:pPr>
       <w:r>
-        <w:t xml:space="preserve">The source set contained 105 trials from 16 published meta-analyses. Within each review, selection followed its table order, taking up to seven available eligible trials and replacing unavailable reports with the next eligible trial. Three trials were excluded under the analysis plan, leaving 102 trials. The supplementary benchmark table documents the reviews, specialties and source availability. [Pending: how the reviews were identified and selected, eligibility criteria and confirmation of the excluded design classifications.]</w:t>
+        <w:t xml:space="preserve">The source set contained 105 trials from 16 published meta-analyses. Within each review, trials were selected in table order, taking up to seven available eligible trials and replacing unavailable reports with the next eligible trial. Three trials were excluded under the analysis plan, leaving 102 trials. The supplementary benchmark table documents the reviews, specialties and source availability. [Pending: how the reviews were identified and selected, eligibility criteria and confirmation of the excluded design classifications.]</w:t>
       </w:r>
     </w:p>
     <w:p>
@@ -291,7 +306,7 @@
         <w:pStyle w:val="BodyText"/>
       </w:pPr>
       <w:r>
-        <w:t xml:space="preserve">The assessment task specified a result using the review’s reported outcome and available trial information, including the time point, comparison and numerical result as printed. It did not automatically select the trial’s primary outcome. Correspondence between the specified result and the published risk-of-bias label could be partial, inferred, different or indeterminate; some published labels covered several outcomes. Comparisons with published labels retained all domain cells, with target uncertainty considered qualitatively.</w:t>
+        <w:t xml:space="preserve">The assessment task specified a result using the review’s reported outcome and available trial information, including the time point, comparison and numerical result as printed. It did not automatically select the trial’s primary outcome. Correspondence between the specified result and the published risk-of-bias label could be partial, inferred, different or indeterminate; some published labels covered several outcomes. Comparisons with published labels retained all domain cells; target uncertainty was considered qualitatively.</w:t>
       </w:r>
     </w:p>
     <w:p>
@@ -307,7 +322,7 @@
         <w:pStyle w:val="BodyText"/>
       </w:pPr>
       <w:r>
-        <w:t xml:space="preserve">Unassisted received the assessment task sentence and one fixed output-format sentence, without RoB 2 guidance. It could read and search local documents but had no access to ARBITER’s software service, assessment instructions or the web. ARBITER additionally received its assessment instructions and guidance, supplied as an assessment skill. Thus, the arms shared trial evidence but differed in instructions and processing. The comparison evaluated the complete workflow and did not isolate the effects of guidance, software or computation. It also differed from the structured-prompt comparators used in several prior studies.[7,8,11,12]</w:t>
+        <w:t xml:space="preserve">Unassisted received the assessment task sentence and one fixed output-format sentence, without RoB 2 guidance. It could read and search local documents but had no access to ARBITER’s software service, assessment instructions or the web. ARBITER additionally received assessment instructions and guidance through an assessment skill, a packaged set of workflow instructions. The arms therefore shared trial evidence but differed in instructions and processing. The comparison evaluated the complete workflow and did not isolate the effects of guidance, software or computation. It also differed from the structured-prompt comparators used in several prior studies.[8,9,11,12]</w:t>
       </w:r>
     </w:p>
     <w:p>
@@ -327,12 +342,12 @@
         <w:t xml:space="preserve">claude-sonnet-5-5</w:t>
       </w:r>
       <w:r>
-        <w:t xml:space="preserve">, medium effort, in Claude Code 2.1.278, with isolated settings and external connectors and memory disabled. ARBITER ran on 12 October 2026 and Unassisted on 14 October 2026, once per trial per arm. eMethods identifies the evaluated software revision. The installable public release is ARBITER 1.0.0, commit</w:t>
+        <w:t xml:space="preserve">, medium effort, in Claude Code 2.1.278, with isolated settings and external connectors and memory disabled. ARBITER ran on 12 October 2026 and Unassisted on 14 October 2026, once per trial per arm. Identity of the immutable underlying model snapshot across the two dates was not established. eMethods identifies the evaluated software revision. The installable public release is ARBITER 1.0.0, commit</w:t>
       </w:r>
       <w:r>
         <w:t xml:space="preserve"> </w:t>
       </w:r>
-      <w:hyperlink r:id="rId19">
+      <w:hyperlink r:id="rId20">
         <w:r>
           <w:rPr>
             <w:rStyle w:val="Hyperlink"/>
@@ -341,12 +356,39 @@
         </w:r>
       </w:hyperlink>
       <w:r>
-        <w:t xml:space="preserve">. The retained release audit documents the assessment-command correspondence without establishing equivalence of the complete releases. The protocol allowed</w:t>
+        <w:t xml:space="preserve">. The evaluated runner invoked</w:t>
       </w:r>
       <w:r>
         <w:t xml:space="preserve"> </w:t>
       </w:r>
       <w:r>
+        <w:rPr>
+          <w:rStyle w:val="VerbatimChar"/>
+        </w:rPr>
+        <w:t xml:space="preserve">/rob2-assess</w:t>
+      </w:r>
+      <w:r>
+        <w:t xml:space="preserve">;</w:t>
+      </w:r>
+      <w:r>
+        <w:t xml:space="preserve"> </w:t>
+      </w:r>
+      <w:r>
+        <w:rPr>
+          <w:rStyle w:val="VerbatimChar"/>
+        </w:rPr>
+        <w:t xml:space="preserve">/arbiter-assess</w:t>
+      </w:r>
+      <w:r>
+        <w:t xml:space="preserve"> </w:t>
+      </w:r>
+      <w:r>
+        <w:t xml:space="preserve">is the public command name. The retained release audit documents correspondence between the evaluated and public assessment commands, without establishing equivalence of the complete releases. The protocol allowed</w:t>
+      </w:r>
+      <w:r>
+        <w:t xml:space="preserve"> </w:t>
+      </w:r>
+      <w:r>
         <w:t xml:space="preserve">“Continue.”</w:t>
       </w:r>
       <w:r>
@@ -356,10 +398,10 @@
         <w:t xml:space="preserve">at most twice per phase without coaching. eMethods reproduces both prompt templates, the command invoking the ARBITER assessment skill, the Unassisted format instruction and a filled example. [Pending: development and selection of the prompts and assessment skill, data used in development, any overlap with the benchmark and documentation fixing the evaluated versions.]</w:t>
       </w:r>
     </w:p>
-    <w:bookmarkEnd w:id="20"/>
-    <w:bookmarkStart w:id="21" w:name="independent-expert-references"/>
-    <w:p>
-      <w:bookmarkStart w:id="87" w:name="loc_28"/>
+    <w:bookmarkEnd w:id="21"/>
+    <w:bookmarkStart w:id="22" w:name="independent-expert-references"/>
+    <w:p>
+      <w:bookmarkStart w:id="92" w:name="loc_29"/>
       <w:pPr>
         <w:pStyle w:val="Heading2"/>
       </w:pPr>
@@ -369,14 +411,14 @@
         </w:rPr>
         <w:t>Independent expert references</w:t>
       </w:r>
-      <w:bookmarkEnd w:id="87"/>
+      <w:bookmarkEnd w:id="92"/>
     </w:p>
     <w:p>
       <w:pPr>
         <w:pStyle w:val="FirstParagraph"/>
       </w:pPr>
       <w:r>
-        <w:t xml:space="preserve">Two blinded experts assessed all 102 trials across the five domains. Each trial–domain pair constituted a cell. Each expert independently recorded signalling answers and a domain rating, then froze both before seeing any offered label. No AI was used for these judgments. Experts could consult sources beyond the arms’ inputs. [Pending: expert qualifications, experience and training; assessment instructions and guidance supplied; whether experts received the same specified targets as the arms; and conventions for assessing targets containing several outcomes.]</w:t>
+        <w:t xml:space="preserve">Two blinded experts assessed all 102 trials across the five domains. Each trial–domain pair constituted a cell. Each expert independently recorded and froze signalling answers and domain ratings before seeing any offered label. No AI was used for these judgments. Experts could consult sources beyond the arms’ inputs. [Pending: expert qualifications, experience and training; assessment instructions and guidance supplied; whether experts received the same specified targets as the arms; and conventions for assessing targets containing several outcomes.]</w:t>
       </w:r>
     </w:p>
     <w:p>
@@ -384,13 +426,13 @@
         <w:pStyle w:val="BodyText"/>
       </w:pPr>
       <w:r>
-        <w:t xml:space="preserve">Each expert then saw the published, Unassisted and ARBITER labels in an order randomized for each cell, without source identities or rationales, and chose the most defensible label. Each subsequently supplied a revised rating, which could differ from all offered labels, and recorded whether signalling answers were retained or changed. Independent ratings, label choices and revised ratings were analyzed separately. Blinded adjudication of discordant data-extraction items supplied a design precedent.[13] eMethods summarizes the assessment sequence; the completed assessment workbooks are available in the study repository. [Pending: original assessor instructions and blank assessment form.]</w:t>
-      </w:r>
-    </w:p>
-    <w:bookmarkEnd w:id="21"/>
-    <w:bookmarkStart w:id="22" w:name="outcomes"/>
-    <w:p>
-      <w:bookmarkStart w:id="90" w:name="loc_31"/>
+        <w:t xml:space="preserve">Each expert then saw the published, Unassisted and ARBITER labels in an order randomized for each cell, without source identities or rationales, and chose the most defensible label. Each expert subsequently supplied a revised rating, which could differ from all offered labels, and recorded whether signalling answers were retained or changed. Independent ratings, label choices and revised ratings were analyzed separately. Blinded adjudication of discordant data-extraction items supplied a design precedent.[13] eMethods summarizes the assessment sequence; the completed assessment workbooks are available in the study repository. [Pending: original assessor instructions and blank assessment form.]</w:t>
+      </w:r>
+    </w:p>
+    <w:bookmarkEnd w:id="22"/>
+    <w:bookmarkStart w:id="23" w:name="outcomes"/>
+    <w:p>
+      <w:bookmarkStart w:id="95" w:name="loc_32"/>
       <w:pPr>
         <w:pStyle w:val="Heading2"/>
       </w:pPr>
@@ -400,7 +442,7 @@
         </w:rPr>
         <w:t>Outcomes</w:t>
       </w:r>
-      <w:bookmarkEnd w:id="90"/>
+      <w:bookmarkEnd w:id="95"/>
     </w:p>
     <w:p>
       <w:pPr>
@@ -415,7 +457,7 @@
         <w:pStyle w:val="BodyText"/>
       </w:pPr>
       <w:r>
-        <w:t xml:space="preserve">Secondary agreement outcomes compared each source with each expert’s independent domain ratings across all 510 cells. These domain ratings were read directly from the experts’ assessment records. Exact agreement was the proportion of ratings matching the reference; paired percentage-point differences compared the arms’ matches within the same cells. Linearly weighted Cohen’s κ supplied complementary ordinal context. Published labels were another source, not an expert standard. Supporting analyses included expert-to-expert agreement, unweighted κ, confusion matrices, expert means and restriction to cells where the independent experts agreed.</w:t>
+        <w:t xml:space="preserve">Secondary outcomes compared each source with each expert’s independent domain ratings across all 510 cells using exact agreement, paired percentage-point differences between arms and linearly weighted Cohen’s κ. Reference ratings were read directly from the experts’ assessment records. Published labels were another source, not an expert standard. Supporting analyses included expert-to-expert agreement, unweighted κ, confusion matrices, expert means and restriction to cells where the independent experts agreed.</w:t>
       </w:r>
     </w:p>
     <w:p>
@@ -423,7 +465,7 @@
         <w:pStyle w:val="BodyText"/>
       </w:pPr>
       <w:r>
-        <w:t xml:space="preserve">Signalling-answer agreement distinguished five levels: yes, probably yes, no, probably no and no information. Collapsed coding combined definite and probable affirmative answers and combined definite and probable negative answers, leaving no information separate. Answers were matched by trial, domain, question and component. A component was an explicitly named part of an answer, such as a separate answer for a particular outcome; an undivided answer was treated as one component. Answers for different named components were not pooled. Missing, inactive, not applicable, unmatched and unresolved answers were excluded; paired contrasts required evaluable answers in both arms. These comparisons assessed signalling answers separately from the recorded domain ratings. Published-label comparisons used weighted κ, exact agreement, sensitivity for Some concerns or High, and specificity, with Gwet’s AC2 supplementary. An All-Low rule described label prevalence; its κ was suppressed because predictions lacked variance. Missing predictions counted as disagreement.</w:t>
+        <w:t xml:space="preserve">Signalling-answer agreement distinguished five levels: yes, probably yes, no, probably no and no information. Collapsed coding combined definite and probable affirmative answers and combined definite and probable negative answers, leaving no information separate. Answers were matched by trial, domain, question and component. A component was an explicitly named part of an answer, such as a separate answer for a particular outcome; an undivided answer was treated as one component. Answers for different named components were not pooled. Missing, inactive, not applicable, unmatched and unresolved answers were excluded; paired contrasts required evaluable answers in both arms. These comparisons assessed signalling answers separately from the recorded domain ratings.</w:t>
       </w:r>
     </w:p>
     <w:p>
@@ -431,7 +473,7 @@
         <w:pStyle w:val="BodyText"/>
       </w:pPr>
       <w:r>
-        <w:t xml:space="preserve">Process outcomes assessed consistency with the decision rules and the completeness and source links of the retained records. We applied the official RoB 2 algorithms to each arm’s own answers, using effect of assignment for deviations from intended interventions.[1] The five domains concern randomisation, deviations from intended interventions, missing outcome data, outcome measurement and selection of the reported result. Ratings that contradicted their answers or omitted required questions constituted rule breaks; absent ratings and answer sets were unevaluable. A sensitivity analysis recursively resolved invalid required answers as negative or no information. Overall checks permitted escalation when multiple domains had Some concerns. Evidence coverage counted required active answers citing a passage or image. Quotation checks assessed whether evidence records identified the captured source and its location; audit-file checks assessed the integrity of the retained assessment files. These structural checks did not assess whether the evidence justified the answer. The algorithm determines proposed ratings; adopted ratings were checked separately because documented overrides were permitted.</w:t>
+        <w:t xml:space="preserve">Published-label comparisons used weighted κ, exact agreement, sensitivity for Some concerns or High, and specificity, with Gwet’s AC2 supplementary. An All-Low rule described label prevalence; its κ was suppressed because predictions lacked variance. Missing predictions counted as disagreement.</w:t>
       </w:r>
     </w:p>
     <w:p>
@@ -439,7 +481,7 @@
         <w:pStyle w:val="BodyText"/>
       </w:pPr>
       <w:r>
-        <w:t xml:space="preserve">Computational outcomes were runtime, summed across the elapsed durations of the model’s turns, and application programming interface (API) list-price equivalents reconstructed from recorded token counts and fixed provider rates. Tokens are the units of text processed or generated by the model. The runs used a subscription, so these dollar estimates were not expenditure. eMethods details the treatment of cached inputs and additional model calls.</w:t>
+        <w:t xml:space="preserve">Process outcomes assessed algorithm conformance, record completeness and source provenance. We applied the official RoB 2 algorithms to each arm’s own answers, using effect of assignment for deviations from intended interventions.[1] Ratings that contradicted their answers or omitted required questions constituted rule breaks; absent ratings and answer sets were unevaluable. A sensitivity analysis recursively resolved invalid required answers as negative or no information. Overall checks permitted escalation when multiple domains had Some concerns. Evidence coverage counted required active answers citing a passage or image. Quotation checks assessed whether evidence records identified the captured source and its location; audit-file checks assessed the integrity of the retained assessment files. These structural checks did not assess whether the evidence justified the answer. The algorithm determines proposed ratings; adopted ratings were checked separately because documented overrides were permitted.</w:t>
       </w:r>
     </w:p>
     <w:p>
@@ -447,13 +489,21 @@
         <w:pStyle w:val="BodyText"/>
       </w:pPr>
       <w:r>
-        <w:t xml:space="preserve">Exploratory analyses examined derived Overall ratings, severity and direction of disagreement, and rules-only recomputation. Derived Overall took the worst independent domain rating without optional escalation for multiple Some concerns. It summarized the five domains rather than providing an independent sixth domain. Expert-reference analyses used all 102 trials; Published Overall comparisons used only the 81 trials with observed labels, excluding 21 without labels. Directional analyses partitioned ratings stricter or more lenient than Published into expert matches to the arm, Published or neither. Rules-only recomputation replaced Unassisted ratings that contradicted their answers while retaining invalid answer sequences and missing ratings. Original disagreement populations remained fixed; new ties could credit both arms. Binary expert comparisons and severity strata were exploratory. Label choices across all disputed cells and revised ratings were descriptive because offered labels could anchor responses.</w:t>
-      </w:r>
-    </w:p>
-    <w:bookmarkEnd w:id="22"/>
-    <w:bookmarkStart w:id="23" w:name="statistical-analysis"/>
-    <w:p>
-      <w:bookmarkStart w:id="97" w:name="loc_38"/>
+        <w:t xml:space="preserve">Computational outcomes were runtime, summed across the elapsed durations of the model’s turns, and application programming interface (API) list-price equivalents reconstructed from recorded token counts and fixed provider rates. The runs used a subscription, so these dollar estimates were not expenditure. eMethods details the treatment of cached inputs and additional model calls.</w:t>
+      </w:r>
+    </w:p>
+    <w:p>
+      <w:pPr>
+        <w:pStyle w:val="BodyText"/>
+      </w:pPr>
+      <w:r>
+        <w:t xml:space="preserve">Exploratory analyses examined derived Overall ratings, severity and direction of disagreement, and rules-only recomputation. Derived Overall took the worst independent domain rating without optional escalation for multiple Some concerns. It summarized the five domains and was not an independent sixth domain. Expert-reference analyses used all 102 trials; Published Overall comparisons used only the 81 trials with observed labels, excluding 21 without labels. Directional analyses partitioned ratings stricter or more lenient than Published into expert matches to the arm, Published or neither. Rules-only recomputation replaced Unassisted ratings that contradicted their answers while retaining invalid answer sequences and missing ratings. Original disagreement populations remained fixed; new ties could credit both arms. Binary expert comparisons and severity strata were exploratory. Label choices across all disputed cells and revised ratings were descriptive because offered labels could anchor responses.</w:t>
+      </w:r>
+    </w:p>
+    <w:bookmarkEnd w:id="23"/>
+    <w:bookmarkStart w:id="24" w:name="statistical-analysis"/>
+    <w:p>
+      <w:bookmarkStart w:id="103" w:name="loc_40"/>
       <w:pPr>
         <w:pStyle w:val="Heading2"/>
       </w:pPr>
@@ -463,14 +513,14 @@
         </w:rPr>
         <w:t>Statistical analysis</w:t>
       </w:r>
-      <w:bookmarkEnd w:id="97"/>
+      <w:bookmarkEnd w:id="103"/>
     </w:p>
     <w:p>
       <w:pPr>
         <w:pStyle w:val="FirstParagraph"/>
       </w:pPr>
       <w:r>
-        <w:t xml:space="preserve">We used 10,000 stratified trial-cluster bootstrap resamples, seed 20261018. Trials were sampled with replacement within each of the 16 fixed reviews, retaining each review’s trial count and carrying both arms and all domain ratings together. Paired contrasts shared resampling weights. Percentile 95% CIs quantify trial variation conditional on these reviews, two experts and observed model runs; they do not quantify variation across new reviews, experts or repeated runs. Expert means averaged expert-specific estimates within each shared resample. No</w:t>
+        <w:t xml:space="preserve">We estimated uncertainty with 10,000 stratified trial-cluster bootstrap resamples, seed 20261018. Trials were sampled with replacement within each of the 16 fixed reviews, retaining each review’s trial count and carrying both arms and all domain ratings together. Paired contrasts shared resampling weights. Percentile 95% CIs quantify trial variation conditional on these reviews, two experts and observed model runs; they do not quantify variation across new reviews, experts or repeated runs. Expert means averaged expert-specific estimates within each shared resample. No</w:t>
       </w:r>
       <w:r>
         <w:t xml:space="preserve"> </w:t>
@@ -486,14 +536,14 @@
         <w:t xml:space="preserve"> </w:t>
       </w:r>
       <w:r>
-        <w:t>values or multiplicity adjustments were used. The primary endpoint and secondary or exploratory outcomes were distinguished as specified above. Reporting was guided by TRIPOD-LLM and GRRAS, with an accompanying item map and author-completion fields.⁠[14,15]</w:t>
-      </w:r>
-    </w:p>
-    <w:bookmarkEnd w:id="23"/>
+        <w:t>values or multiplicity adjustments were used. Analyses retained the primary, secondary and exploratory outcome distinctions specified above. Reporting was guided by TRIPOD-LLM and GRRAS, with an accompanying item map and author-completion fields.⁠[14,15]</w:t>
+      </w:r>
+    </w:p>
     <w:bookmarkEnd w:id="24"/>
-    <w:bookmarkStart w:id="25" w:name="results-1"/>
-    <w:p>
-      <w:bookmarkStart w:id="99" w:name="loc_40"/>
+    <w:bookmarkEnd w:id="25"/>
+    <w:bookmarkStart w:id="26" w:name="results-1"/>
+    <w:p>
+      <w:bookmarkStart w:id="105" w:name="loc_42"/>
       <w:pPr>
         <w:pStyle w:val="Heading1"/>
       </w:pPr>
@@ -503,7 +553,7 @@
         </w:rPr>
         <w:t>RESULTS</w:t>
       </w:r>
-      <w:bookmarkEnd w:id="99"/>
+      <w:bookmarkEnd w:id="105"/>
     </w:p>
     <w:p>
       <w:pPr>
@@ -516,7 +566,7 @@
       </w:r>
     </w:p>
     <w:p>
-      <w:bookmarkStart w:id="101" w:name="loc_42"/>
+      <w:bookmarkStart w:id="107" w:name="loc_44"/>
       <w:pPr>
         <w:pStyle w:val="Heading2"/>
         <w:keepNext/>
@@ -529,7 +579,7 @@
         </w:rPr>
         <w:t>Table 1. Benchmark and reference context</w:t>
       </w:r>
-      <w:bookmarkEnd w:id="101"/>
+      <w:bookmarkEnd w:id="107"/>
     </w:p>
     <w:tbl>
       <w:tblPr>
@@ -1332,11 +1382,11 @@
         <w:keepLines/>
       </w:pPr>
       <w:r>
-        <w:t xml:space="preserve">Among 80 cells where the arms’ ratings differed, the experts chose the same label in 60 and split in 20. The agreed label matched ARBITER in 53/60 cells (88%; 95% CI, 80–96%) and Unassisted in 7/60 (12%), constituting the formal primary result (Table 2). Across all 80 disagreements, the label chosen by Expert 1 matched ARBITER in 63/80 (79%), and that chosen by Expert 2 matched ARBITER in 61/80 (76%). Counting every split choice against ARBITER gave 53/80 (66%).</w:t>
-      </w:r>
-    </w:p>
-    <w:p>
-      <w:bookmarkStart w:id="103" w:name="loc_44"/>
+        <w:t xml:space="preserve">The arms’ ratings differed in 80 cells; the experts chose the same label in 60 and split in 20. The agreed label matched ARBITER in 53/60 cells (88%; 95% CI, 80–96%) and Unassisted in 7/60 (12%), constituting the formal primary result (Table 2). Across all 80 disagreements, the label chosen by Expert 1 matched ARBITER in 63/80 (79%), and that chosen by Expert 2 matched ARBITER in 61/80 (76%). Counting every split choice against ARBITER gave 53/80 (66%).</w:t>
+      </w:r>
+    </w:p>
+    <w:p>
+      <w:bookmarkStart w:id="109" w:name="loc_46"/>
       <w:pPr>
         <w:pStyle w:val="Heading2"/>
         <w:keepNext/>
@@ -1349,7 +1399,7 @@
         </w:rPr>
         <w:t>Table 2. Conditional primary endpoint and core sensitivities</w:t>
       </w:r>
-      <w:bookmarkEnd w:id="103"/>
+      <w:bookmarkEnd w:id="109"/>
     </w:p>
     <w:tbl>
       <w:tblPr>
@@ -1748,7 +1798,7 @@
         <w:pStyle w:val="BodyText"/>
       </w:pPr>
       <w:r>
-        <w:t xml:space="preserve">ARBITER had greater agreement with each independent expert across the full cohort (Figure 4). It matched Expert 1 in 371/510 cells (72.7%) versus 332/510 (65.1%) for Unassisted, a paired gain of 7.6 percentage points (95% CI, 5.1–10.2). Against Expert 2, agreement was 433/510 (84.9%) versus 400/510 (78.4%), a gain of 6.5 points (3.5–9.4). Weighted κ values were 0.51 and 0.69 for ARBITER, compared with 0.35 and 0.53 for Unassisted.</w:t>
+        <w:t xml:space="preserve">Across the full cohort, ARBITER agreed more often with both independent experts (Figure 4). It matched Expert 1 in 371/510 cells (72.7%) versus 332/510 (65.1%) for Unassisted, a paired gain of 7.6 percentage points (95% CI, 5.1–10.2). Against Expert 2, agreement was 433/510 (84.9%) versus 400/510 (78.4%), a gain of 6.5 points (3.5–9.4). Weighted κ values were 0.51 and 0.69 for ARBITER, compared with 0.35 and 0.53 for Unassisted.</w:t>
       </w:r>
     </w:p>
     <w:p>
@@ -1756,7 +1806,7 @@
         <w:pStyle w:val="BodyText"/>
       </w:pPr>
       <w:r>
-        <w:t xml:space="preserve">The domain profiles showed both gains and disagreement. Selection of the reported result (D5) had the largest observed gains: 19.6 points (95% CI, 11.8–27.5) and 11.8 (2.9–20.6) against Experts 1 and 2. For missing outcome data (D3), ARBITER matched 43/102 ratings from Expert 1 (42.2%) and 80/102 from Expert 2 (78.4%); the experts agreed in 54/102 cells.</w:t>
+        <w:t xml:space="preserve">Agreement gains varied by domain, alongside disagreement between experts. Selection of the reported result (D5) had the largest observed gains: 19.6 points (95% CI, 11.8–27.5) and 11.8 (2.9–20.6) against Experts 1 and 2. For missing outcome data (D3), ARBITER matched 43/102 ratings from Expert 1 (42.2%) and 80/102 from Expert 2 (78.4%); the experts agreed in 54/102 cells.</w:t>
       </w:r>
     </w:p>
     <w:p>
@@ -1782,11 +1832,11 @@
         <w:keepLines/>
       </w:pPr>
       <w:r>
-        <w:t xml:space="preserve">All 510 adopted ARBITER domain outputs conformed to the algorithms, with no recorded domain overrides (Table 3). The algorithm determines the proposed ratings; the absence of overrides and conformance of the adopted ratings were observations in this benchmark. Unassisted had 65/509 evaluable rule breaks: 26 contradictory ratings and 39 required-question omissions; one cell was unevaluable. All 1538 active required answers cited a passage or image. All 1407/1407 text spans and 14 image records met checks linking them to their stored sources, and all 102 exported assessment records passed checks of completeness and consistency. These audits counted different objects and did not establish whether the cited evidence supported the answers.</w:t>
-      </w:r>
-    </w:p>
-    <w:p>
-      <w:bookmarkStart w:id="109" w:name="loc_50"/>
+        <w:t xml:space="preserve">All 510 adopted ARBITER domain outputs conformed to the algorithms, with no recorded domain overrides (Table 3). Proposed ratings are determined algorithmically; the absence of overrides and conformance of adopted ratings were observations in this benchmark. Unassisted had rule breaks in 65/509 evaluable domain outputs: 26 contradictory ratings and 39 required-question omissions; one cell was unevaluable. All 1538 active required answers cited a passage or image. All 1407/1407 text spans and 14 image records passed source-provenance checks, and all 102 exported assessment records passed completeness and consistency checks. These audits counted different objects and did not establish whether the cited evidence supported the answers.</w:t>
+      </w:r>
+    </w:p>
+    <w:p>
+      <w:bookmarkStart w:id="115" w:name="loc_52"/>
       <w:pPr>
         <w:pStyle w:val="Heading2"/>
         <w:keepNext/>
@@ -1799,7 +1849,7 @@
         </w:rPr>
         <w:t>Table 3. Process checks and computational resources</w:t>
       </w:r>
-      <w:bookmarkEnd w:id="109"/>
+      <w:bookmarkEnd w:id="115"/>
     </w:p>
     <w:tbl>
       <w:tblPr>
@@ -3403,10 +3453,10 @@
         <w:t xml:space="preserve">ARBITER required more computation. Median (IQR) runtime was 7.6 (6.1–10.5) versus 0.5 (0.4–0.5) minutes per trial; the paired mean difference was 11.0 minutes (95% CI, 8.4–14.1). Median (IQR) API list-price equivalents were US$3.78 (3.46–4.10) versus US$0.09 (0.07–0.13), with a paired mean difference of US$3.68 (3.61–3.75).</w:t>
       </w:r>
     </w:p>
-    <w:bookmarkEnd w:id="25"/>
-    <w:bookmarkStart w:id="27" w:name="discussion-1"/>
-    <w:p>
-      <w:bookmarkStart w:id="111" w:name="loc_52"/>
+    <w:bookmarkEnd w:id="26"/>
+    <w:bookmarkStart w:id="28" w:name="discussion-1"/>
+    <w:p>
+      <w:bookmarkStart w:id="117" w:name="loc_54"/>
       <w:pPr>
         <w:pStyle w:val="Heading1"/>
       </w:pPr>
@@ -3416,14 +3466,14 @@
         </w:rPr>
         <w:t>DISCUSSION</w:t>
       </w:r>
-      <w:bookmarkEnd w:id="111"/>
+      <w:bookmarkEnd w:id="117"/>
     </w:p>
     <w:p>
       <w:pPr>
         <w:pStyle w:val="FirstParagraph"/>
       </w:pPr>
       <w:r>
-        <w:t xml:space="preserve">ARBITER preserved the evidence and decisions behind each assessment and agreed more often with both independent experts than the same-model minimal-prompt comparator, Unassisted. Across all 510 trial–domain assessments, paired agreement gains were 7.6 percentage points (95% CI, 5.1–10.2) against Expert 1 and 6.5 (3.5–9.4) against Expert 2. These secondary comparisons used independent ratings frozen before experts saw the offered labels.</w:t>
+        <w:t xml:space="preserve">ARBITER retained an inspectable assessment pathway and had greater agreement with both independent experts than Unassisted across the 510 trial–domain assessments. These secondary comparisons used ratings frozen before experts saw offered labels. The formal primary endpoint concerned a selected subset: among 80 arm-discordant assessments, experts agreed on 60 blinded label choices and split on 20; 53/60 agreed choices matched ARBITER (88%; 95% CI, 80–96%). Because experts saw labels without source identities or rationales, this result measures conditional label matching. It does not establish endorsement of ARBITER or its reasoning. The independent ratings provide the broader agreement comparison.</w:t>
       </w:r>
     </w:p>
     <w:p>
@@ -3431,7 +3481,7 @@
         <w:pStyle w:val="BodyText"/>
       </w:pPr>
       <w:r>
-        <w:t xml:space="preserve">The formal primary endpoint answered a narrower question about disputed ratings. Among 80 assessments in which the workflows differed, both experts chose the same blinded label in 60 and split in 20. ARBITER matched the agreed choice in 53/60 (88%; 95% CI, 80–96%). This endpoint measures agreement with the chosen label in a selected subset. Experts saw neither source identities nor rationales, so their choices do not endorse a system or its reasoning. The independent-rating comparisons provide the broader context.</w:t>
+        <w:t xml:space="preserve">That agreement advantage was not uniform. Selection of the reported result (D5) had the largest observed domain-rating gains, whereas missing outcome data (D3) showed marked reference dependence. For D3 signalling answers against Expert 1, the paired ARBITER minus Unassisted difference was unfavorable with five-level coding, −10.3 percentage points (95% CI, −17.2 to −3.2), and favorable with collapsed coding, +8.5 (3.5–13.7). Combining probable with definite answers changes the distinctions being assessed; the favorable collapsed estimate does not remove the adverse five-level finding. The D5 collapsed contrast against Expert 2 was also smaller, +3.7 points (−0.3 to 7.4). Neither pattern identifies why the experts or workflows differed, and intervals for individual estimates do not test differences between domains.</w:t>
       </w:r>
     </w:p>
     <w:p>
@@ -3439,7 +3489,7 @@
         <w:pStyle w:val="BodyText"/>
       </w:pPr>
       <w:r>
-        <w:t xml:space="preserve">The retained record makes the route to a rating examinable. In the illustrative AVATAR assessment, the stored documents did not establish a dated analysis plan for the assessed result. A reviewer can inspect the signalling answers and cited passages to examine that interpretation. ARBITER copies quotations directly from stored documents, links them to source locations and applies the decision rules to the recorded answers. Software computes a proposed rating from the answers, but the workflow permits a different adopted rating with recorded evidence and rationale. No domain overrides occurred in these runs.</w:t>
+        <w:t xml:space="preserve">The reference also changed the overall interpretation. Against Published labels, the paired ARBITER minus Unassisted difference was −1.8 percentage points (95% CI, −5.1 to 1.6), compatible with either direction. Published labels were predominantly Low, and some covered broader, inferred or different assessment targets. These differences qualify their use as a reference without establishing the cause of disagreement. Huang and Gandhi likewise evaluated model assessments against both review-derived and fresh human references,[8,9] while Nyrhi used published assessments in separate RoB 1 and RoB 2 corpora.[16] Those designs do not supply interchangeable standards. Our experts could consult sources beyond the arms’ inputs, and their own disagreement, especially in D3, precludes treating fresh ratings as error-free truth.</w:t>
       </w:r>
     </w:p>
     <w:p>
@@ -3447,7 +3497,7 @@
         <w:pStyle w:val="BodyText"/>
       </w:pPr>
       <w:r>
-        <w:t xml:space="preserve">All 510 ARBITER domain outputs followed the executable rules, but the quoted evidence still requires interpretation. The source checks established the integrity of the links and exported records, not whether each passage justified its answer; image descriptions also remained model-written. Liang and colleagues addressed evidence support as a separate outcome in RoB 2 assessment by retrieving trial passages and using another model to classify support for generated claims.[16] Their automated verification is an evaluation approach rather than independent human adjudication. It identifies a directly relevant task for ARBITER’s next evaluation: checking whether the recorded evidence supports the interpretation attached to it.</w:t>
+        <w:t xml:space="preserve">The retained record allows these interpretations to be examined. In the illustrative AVATAR assessment, stored documents did not establish a dated analysis plan for the assessed result; the answers and cited passages preserve the basis for that judgment. ARBITER binds text quotations and image regions to stored sources and records their locations. Software computes proposed ratings, while a different adopted rating requires evidence and a rationale. All 510 adopted domain outputs conformed to the executable rules, and no domain overrides occurred. This observed conformance concerns the transition from recorded answers to ratings. It leaves the appropriateness of those answers open to assessment.</w:t>
       </w:r>
     </w:p>
     <w:p>
@@ -3455,7 +3505,7 @@
         <w:pStyle w:val="BodyText"/>
       </w:pPr>
       <w:r>
-        <w:t xml:space="preserve">The comparison estimates the difference between complete workflows. Both used the same model and supplied trial evidence, but ARBITER received additional guidance, tools and computation. The observed gains cannot be assigned to its decision rules, evidence records or another component, and minimal prompting does not represent the structured alternatives already studied.[6,7,8] RoB2-Evaluator, described in a recent preprint, is another rule-constrained RoB 2 implementation.[17] Choi and colleagues separately examined repeated outputs and algorithm conformance in a single-trial pilot.[18] Their design and this multi-trial, single-run benchmark address complementary questions; ARBITER’s results do not establish repeatability.</w:t>
+        <w:t xml:space="preserve">Conformance is already an explicit evaluation target in related work. Choi and colleagues examined expert agreement, rule conformance and repeated outputs in a single-trial pilot.[17] Their questions overlap with ours, but their repeated single-trial design and this multi-trial, single-run comparison address different sources of variation. LogiMed-RoB audits hierarchical consistency in RoB 2 assessments.[18] ARBITER’s source checks assess a different property: they establish source binding and record integrity without determining whether passages justify answers; image descriptions remained model-written. Liang’s RoB 2 retrieve-then-verify study addresses evidence support using a judge model, rather than independent human adjudication.[19] Independent assessment of each passage-to-answer relation, including image-derived interpretations, remains necessary to evaluate that property in ARBITER.</w:t>
       </w:r>
     </w:p>
     <w:p>
@@ -3463,7 +3513,7 @@
         <w:pStyle w:val="BodyText"/>
       </w:pPr>
       <w:r>
-        <w:t xml:space="preserve">Domain findings limit a uniform account of the agreement advantage. Selection of the reported result had the largest observed gains, whereas missing outcome data (D3) yielded agreement of 43/102 with Expert 1 and 80/102 with Expert 2. For D3 signalling answers against Expert 1, the paired difference was unfavorable with five-level coding, −10.3 points (95% CI, −17.2 to −3.2), but favorable after combining probable with definite answers, +8.5 (3.5–13.7). Collapsing categories changes the question being measured and does not remove the unfavorable result. The smaller collapsed gain for selection of the reported result against Expert 2 also limits a uniform explanation. Rules-only recomputation describes consistency without identifying which component caused the agreement differences.</w:t>
+        <w:t xml:space="preserve">The observed differences belong to the complete workflows. Identical supplied trial documents and a common reported model identifier and configuration make the comparison informative, but ARBITER also received additional guidance, tools and computation. The study cannot attribute its agreement advantage to rule enforcement, evidence recording or another component. Rules-only recomputation describes internal consistency but cannot recover those component effects. Minimal prompting also does not represent the structured alternatives already evaluated.[6,8,9,10] RoB2-Evaluator, described in a preprint, is another rule-constrained RoB 2 implementation.[20] ARBITER required greater computation: median runtime was 7.6 versus 0.5 minutes per trial, with higher API list-price equivalents. These quantities describe computational burden; the subscription-based runs did not incur those reconstructed list-price amounts as expenditure.</w:t>
       </w:r>
     </w:p>
     <w:p>
@@ -3471,7 +3521,7 @@
         <w:pStyle w:val="BodyText"/>
       </w:pPr>
       <w:r>
-        <w:t xml:space="preserve">Agreement with labels reported in the source reviews showed a different pattern. The ARBITER minus Unassisted difference was −1.8 percentage points (95% CI, −5.1 to 1.6), compatible with either direction. Published labels were predominantly Low, and some assessment targets were broader, inferred or different from those evaluated here. Target differences and judgment thresholds are possible explanations, not established causes. The separate expert estimates and D3 disagreements also show why fresh assessments cannot be treated as an error-free standard. Intervals on individual estimates do not test differences between domains or references.</w:t>
+        <w:t xml:space="preserve">Generalization is bounded by ordered, availability-dependent trial selection, 16 fixed reviews, two experts and one run per trial per arm. Bootstrap intervals describe trial variation within those reviews, conditional on the observed experts and runs. They do not quantify variation across new reviews, assessors or repeated runs. Prior model exposure to reports is unknown. Offered labels could influence forced choices and revised ratings, despite source blinding. Results pertain to the evaluated software revision; documented assessment-command correspondence does not establish equivalence with the complete public release.</w:t>
       </w:r>
     </w:p>
     <w:p>
@@ -3479,20 +3529,12 @@
         <w:pStyle w:val="BodyText"/>
       </w:pPr>
       <w:r>
-        <w:t xml:space="preserve">Generalization is bounded by ordered, availability-dependent trial selection, 16 fixed reviews, two experts and one run per arm. The bootstrap quantifies trial variation within those reviews, conditional on the experts and observed runs. Experts could consult additional sources, and prior model exposure to trial reports is unknown. The unrelated De Waal registry record illustrates the importance of checking supplied sources. Offered labels could influence forced choices and revised ratings; derived Overall ratings reuse the domain assessments and provide no independent confirmation.</w:t>
-      </w:r>
-    </w:p>
-    <w:p>
-      <w:pPr>
-        <w:pStyle w:val="BodyText"/>
-      </w:pPr>
-      <w:r>
-        <w:t xml:space="preserve">Human use remains a separate empirical question. In Jardim and colleagues’ study of RobotReviewer in ongoing reviews using the earlier instrument, reviewers used snippets to locate material and checked the original report when needed.[19] That study lacked a manual-only comparison and could not estimate time savings. ARBITER’s longer runtime and higher list-price equivalents quantify computation, not reviewer workload. Whether its records help reviewers identify unsupported interpretations, how long checking takes and whether reviewers accept inappropriate suggestions require direct observation of reviewers using the workflow.</w:t>
-      </w:r>
-    </w:p>
-    <w:bookmarkStart w:id="26" w:name="conclusion-1"/>
-    <w:p>
-      <w:bookmarkStart w:id="121" w:name="loc_62"/>
+        <w:t xml:space="preserve">Reviewer use requires a separate evaluation. Soboczenski and colleagues randomized manual and RobotReviewer-assisted tasks using four domains of the earlier instrument, directly observing assessment time and reviewer behavior.[21] Jardim’s study in ongoing reviews found mixed acceptability and lacked a manual-only time comparison.[22] These studies show why output agreement, checking time and adoption merit separate outcomes. They do not establish benefit for ARBITER. A reviewer study should examine whether users detect unsupported interpretations, how long verification takes and how suggestions affect their final judgments, without treating acceptance or correction rates as semantic validation. ARBITER’s computational runtime cannot answer those questions.</w:t>
+      </w:r>
+    </w:p>
+    <w:bookmarkStart w:id="27" w:name="conclusion-1"/>
+    <w:p>
+      <w:bookmarkStart w:id="126" w:name="loc_63"/>
       <w:pPr>
         <w:pStyle w:val="Heading2"/>
       </w:pPr>
@@ -3502,21 +3544,21 @@
         </w:rPr>
         <w:t>Conclusion</w:t>
       </w:r>
-      <w:bookmarkEnd w:id="121"/>
+      <w:bookmarkEnd w:id="126"/>
     </w:p>
     <w:p>
       <w:pPr>
         <w:pStyle w:val="FirstParagraph"/>
       </w:pPr>
       <w:r>
-        <w:t xml:space="preserve">ARBITER makes the pathway from source evidence through signalling answers to RoB 2 ratings inspectable. Its complete workflow had greater agreement with both independent experts than a same-model minimal-prompt comparator, with domain and reference dependence. The available implementation retains the supplied sources, recorded answers, cited evidence and rating decisions for inspection.</w:t>
-      </w:r>
-    </w:p>
-    <w:bookmarkEnd w:id="26"/>
+        <w:t xml:space="preserve">ARBITER preserves the pathway from supplied sources through signalling answers to RoB 2 rating decisions. Its complete workflow agreed more often with both independent experts than same-model minimal prompting, with domain and reference dependence. The retained record supports inspection; evidence support and benefit during reviewer use remain to be evaluated.</w:t>
+      </w:r>
+    </w:p>
     <w:bookmarkEnd w:id="27"/>
-    <w:bookmarkStart w:id="37" w:name="back-matter"/>
-    <w:p>
-      <w:bookmarkStart w:id="123" w:name="loc_64"/>
+    <w:bookmarkEnd w:id="28"/>
+    <w:bookmarkStart w:id="38" w:name="back-matter"/>
+    <w:p>
+      <w:bookmarkStart w:id="128" w:name="loc_65"/>
       <w:pPr>
         <w:pStyle w:val="Heading1"/>
       </w:pPr>
@@ -3526,11 +3568,11 @@
         </w:rPr>
         <w:t>BACK MATTER</w:t>
       </w:r>
-      <w:bookmarkEnd w:id="123"/>
-    </w:p>
-    <w:bookmarkStart w:id="28" w:name="acknowledgments-and-ai-use"/>
-    <w:p>
-      <w:bookmarkStart w:id="124" w:name="loc_65"/>
+      <w:bookmarkEnd w:id="128"/>
+    </w:p>
+    <w:bookmarkStart w:id="29" w:name="acknowledgments-and-ai-use"/>
+    <w:p>
+      <w:bookmarkStart w:id="129" w:name="loc_66"/>
       <w:pPr>
         <w:pStyle w:val="Heading2"/>
       </w:pPr>
@@ -3540,7 +3582,7 @@
         </w:rPr>
         <w:t>Acknowledgments and AI use</w:t>
       </w:r>
-      <w:bookmarkEnd w:id="124"/>
+      <w:bookmarkEnd w:id="129"/>
     </w:p>
     <w:p>
       <w:pPr>
@@ -3550,10 +3592,10 @@
         <w:t xml:space="preserve">[Non-author contributors and acknowledgments]. OpenAI GPT-6-Astra, GPT-6.1-Sol and GPT-6-Luna, accessed through T3 Code, assisted literature research, drafting and editorial checks in this revision. Final author review, approval and accountability remain pending; any AI assistance before this revision remains to be confirmed. [Author to verify the complete disclosure, including any AI use in code, data processing or figures, and provide matching cover-letter disclosure]. The expert assessments and forced-choice adjudication used no AI.</w:t>
       </w:r>
     </w:p>
-    <w:bookmarkEnd w:id="28"/>
-    <w:bookmarkStart w:id="29" w:name="funding"/>
-    <w:p>
-      <w:bookmarkStart w:id="126" w:name="loc_67"/>
+    <w:bookmarkEnd w:id="29"/>
+    <w:bookmarkStart w:id="30" w:name="funding"/>
+    <w:p>
+      <w:bookmarkStart w:id="131" w:name="loc_68"/>
       <w:pPr>
         <w:pStyle w:val="Heading2"/>
       </w:pPr>
@@ -3563,7 +3605,7 @@
         </w:rPr>
         <w:t>Funding</w:t>
       </w:r>
-      <w:bookmarkEnd w:id="126"/>
+      <w:bookmarkEnd w:id="131"/>
     </w:p>
     <w:p>
       <w:pPr>
@@ -3573,10 +3615,10 @@
         <w:t xml:space="preserve">[Funding sources, grant identifiers and funder role, or an explicit statement of no funding].</w:t>
       </w:r>
     </w:p>
-    <w:bookmarkEnd w:id="29"/>
-    <w:bookmarkStart w:id="30" w:name="competing-interests"/>
-    <w:p>
-      <w:bookmarkStart w:id="128" w:name="loc_69"/>
+    <w:bookmarkEnd w:id="30"/>
+    <w:bookmarkStart w:id="31" w:name="competing-interests"/>
+    <w:p>
+      <w:bookmarkStart w:id="133" w:name="loc_70"/>
       <w:pPr>
         <w:pStyle w:val="Heading2"/>
       </w:pPr>
@@ -3586,7 +3628,7 @@
         </w:rPr>
         <w:t>Competing interests</w:t>
       </w:r>
-      <w:bookmarkEnd w:id="128"/>
+      <w:bookmarkEnd w:id="133"/>
     </w:p>
     <w:p>
       <w:pPr>
@@ -3596,10 +3638,10 @@
         <w:t xml:space="preserve">[Author-specific competing interests, including relevant relationships to ARBITER, or an explicit declaration of none].</w:t>
       </w:r>
     </w:p>
-    <w:bookmarkEnd w:id="30"/>
-    <w:bookmarkStart w:id="31" w:name="author-contributions"/>
-    <w:p>
-      <w:bookmarkStart w:id="130" w:name="loc_71"/>
+    <w:bookmarkEnd w:id="31"/>
+    <w:bookmarkStart w:id="32" w:name="author-contributions"/>
+    <w:p>
+      <w:bookmarkStart w:id="135" w:name="loc_72"/>
       <w:pPr>
         <w:pStyle w:val="Heading2"/>
       </w:pPr>
@@ -3609,7 +3651,7 @@
         </w:rPr>
         <w:t>Author contributions</w:t>
       </w:r>
-      <w:bookmarkEnd w:id="130"/>
+      <w:bookmarkEnd w:id="135"/>
     </w:p>
     <w:p>
       <w:pPr>
@@ -3619,10 +3661,10 @@
         <w:t xml:space="preserve">[Author names mapped to CRediT roles; confirmation of final approval and accountability].</w:t>
       </w:r>
     </w:p>
-    <w:bookmarkEnd w:id="31"/>
-    <w:bookmarkStart w:id="32" w:name="Xa795f839aa3476760733bd38e4d2d15944e6881"/>
-    <w:p>
-      <w:bookmarkStart w:id="132" w:name="loc_73"/>
+    <w:bookmarkEnd w:id="32"/>
+    <w:bookmarkStart w:id="33" w:name="Xa795f839aa3476760733bd38e4d2d15944e6881"/>
+    <w:p>
+      <w:bookmarkStart w:id="137" w:name="loc_74"/>
       <w:pPr>
         <w:pStyle w:val="Heading2"/>
       </w:pPr>
@@ -3632,7 +3674,7 @@
         </w:rPr>
         <w:t>Ethics, registration and public involvement</w:t>
       </w:r>
-      <w:bookmarkEnd w:id="132"/>
+      <w:bookmarkEnd w:id="137"/>
     </w:p>
     <w:p>
       <w:pPr>
@@ -3642,10 +3684,10 @@
         <w:t xml:space="preserve">[Ethics approval or exemption determination and consent requirements, including the expert assessment and forced-choice component]. [Study registration status and identifier, if applicable]. [Patient and public involvement statement].</w:t>
       </w:r>
     </w:p>
-    <w:bookmarkEnd w:id="32"/>
-    <w:bookmarkStart w:id="36" w:name="data-availability"/>
-    <w:p>
-      <w:bookmarkStart w:id="134" w:name="loc_75"/>
+    <w:bookmarkEnd w:id="33"/>
+    <w:bookmarkStart w:id="37" w:name="data-availability"/>
+    <w:p>
+      <w:bookmarkStart w:id="139" w:name="loc_76"/>
       <w:pPr>
         <w:pStyle w:val="Heading2"/>
       </w:pPr>
@@ -3655,7 +3697,7 @@
         </w:rPr>
         <w:t>Data availability</w:t>
       </w:r>
-      <w:bookmarkEnd w:id="134"/>
+      <w:bookmarkEnd w:id="139"/>
     </w:p>
     <w:p>
       <w:pPr>
@@ -3667,7 +3709,7 @@
       <w:r>
         <w:t xml:space="preserve"> </w:t>
       </w:r>
-      <w:hyperlink r:id="rId33">
+      <w:hyperlink r:id="rId34">
         <w:r>
           <w:rPr>
             <w:rStyle w:val="Hyperlink"/>
@@ -3684,7 +3726,7 @@
       <w:r>
         <w:t xml:space="preserve"> </w:t>
       </w:r>
-      <w:hyperlink r:id="rId19">
+      <w:hyperlink r:id="rId20">
         <w:r>
           <w:rPr>
             <w:rStyle w:val="Hyperlink"/>
@@ -3698,7 +3740,7 @@
       <w:r>
         <w:t xml:space="preserve"> </w:t>
       </w:r>
-      <w:hyperlink r:id="rId34">
+      <w:hyperlink r:id="rId35">
         <w:r>
           <w:rPr>
             <w:rStyle w:val="Hyperlink"/>
@@ -3715,7 +3757,7 @@
       <w:r>
         <w:t xml:space="preserve"> </w:t>
       </w:r>
-      <w:hyperlink r:id="rId35">
+      <w:hyperlink r:id="rId36">
         <w:r>
           <w:rPr>
             <w:rStyle w:val="Hyperlink"/>
@@ -3730,11 +3772,11 @@
         <w:t xml:space="preserve">provide the figures, editable tables and reproduction links. Trial PDFs will not be redistributed; trial DOIs and source-file hashes will identify the inputs. Author declarations and archival registration remain pending completion.</w:t>
       </w:r>
     </w:p>
-    <w:bookmarkEnd w:id="36"/>
     <w:bookmarkEnd w:id="37"/>
-    <w:bookmarkStart w:id="57" w:name="references"/>
-    <w:p>
-      <w:bookmarkStart w:id="136" w:name="loc_77"/>
+    <w:bookmarkEnd w:id="38"/>
+    <w:bookmarkStart w:id="61" w:name="references"/>
+    <w:p>
+      <w:bookmarkStart w:id="141" w:name="loc_78"/>
       <w:pPr>
         <w:pStyle w:val="Heading1"/>
       </w:pPr>
@@ -3744,7 +3786,7 @@
         </w:rPr>
         <w:t>REFERENCES</w:t>
       </w:r>
-      <w:bookmarkEnd w:id="136"/>
+      <w:bookmarkEnd w:id="141"/>
     </w:p>
     <w:p>
       <w:pPr>
@@ -3772,7 +3814,7 @@
       <w:r>
         <w:t xml:space="preserve">2019;366:l4898. doi:</w:t>
       </w:r>
-      <w:hyperlink r:id="rId38">
+      <w:hyperlink r:id="rId39">
         <w:r>
           <w:rPr>
             <w:rStyle w:val="Hyperlink"/>
@@ -3810,7 +3852,7 @@
       <w:r>
         <w:t xml:space="preserve">2020;126:37–44. doi:</w:t>
       </w:r>
-      <w:hyperlink r:id="rId39">
+      <w:hyperlink r:id="rId40">
         <w:r>
           <w:rPr>
             <w:rStyle w:val="Hyperlink"/>
@@ -3848,7 +3890,7 @@
       <w:r>
         <w:t xml:space="preserve">2022;141:99–105. doi:</w:t>
       </w:r>
-      <w:hyperlink r:id="rId40">
+      <w:hyperlink r:id="rId41">
         <w:r>
           <w:rPr>
             <w:rStyle w:val="Hyperlink"/>
@@ -3886,7 +3928,7 @@
       <w:r>
         <w:t xml:space="preserve">2019;9:e028382. doi:</w:t>
       </w:r>
-      <w:hyperlink r:id="rId41">
+      <w:hyperlink r:id="rId42">
         <w:r>
           <w:rPr>
             <w:rStyle w:val="Hyperlink"/>
@@ -3924,7 +3966,7 @@
       <w:r>
         <w:t xml:space="preserve">2016;23:193–201. doi:</w:t>
       </w:r>
-      <w:hyperlink r:id="rId42">
+      <w:hyperlink r:id="rId43">
         <w:r>
           <w:rPr>
             <w:rStyle w:val="Hyperlink"/>
@@ -3959,7 +4001,7 @@
       <w:r>
         <w:t xml:space="preserve">. Association for Computational Linguistics, 2025:12–25. doi:</w:t>
       </w:r>
-      <w:hyperlink r:id="rId43">
+      <w:hyperlink r:id="rId44">
         <w:r>
           <w:rPr>
             <w:rStyle w:val="Hyperlink"/>
@@ -3979,6 +4021,44 @@
         </w:numPr>
       </w:pPr>
       <w:r>
+        <w:t xml:space="preserve">Ji C, Zhao B, Wang Z, et al. RoBGuard: Enhancing LLMs to Assess Risk of Bias in Clinical Trial Documents. In:</w:t>
+      </w:r>
+      <w:r>
+        <w:t xml:space="preserve"> </w:t>
+      </w:r>
+      <w:r>
+        <w:rPr>
+          <w:i/>
+          <w:iCs/>
+        </w:rPr>
+        <w:t xml:space="preserve">Proceedings of the 31st International Conference on Computational Linguistics</w:t>
+      </w:r>
+      <w:r>
+        <w:t xml:space="preserve">. Association for Computational Linguistics, 2025:1258–77. Available at:</w:t>
+      </w:r>
+      <w:r>
+        <w:t xml:space="preserve"> </w:t>
+      </w:r>
+      <w:hyperlink r:id="rId45">
+        <w:r>
+          <w:rPr>
+            <w:rStyle w:val="Hyperlink"/>
+          </w:rPr>
+          <w:t xml:space="preserve">ACL Anthology</w:t>
+        </w:r>
+      </w:hyperlink>
+      <w:r>
+        <w:t xml:space="preserve">.</w:t>
+      </w:r>
+    </w:p>
+    <w:p>
+      <w:pPr>
+        <w:numPr>
+          <w:ilvl w:val="0"/>
+          <w:numId w:val="1001"/>
+        </w:numPr>
+      </w:pPr>
+      <w:r>
         <w:t xml:space="preserve">Gandhi S, Shokravi A, Chelliahpillai Y, et al. Evaluating large language model performance in Risk of Bias assessments: A cross-sectional validation study.</w:t>
       </w:r>
       <w:r>
@@ -3997,7 +4077,7 @@
       <w:r>
         <w:t xml:space="preserve">2026;21:e0353155. doi:</w:t>
       </w:r>
-      <w:hyperlink r:id="rId44">
+      <w:hyperlink r:id="rId46">
         <w:r>
           <w:rPr>
             <w:rStyle w:val="Hyperlink"/>
@@ -4035,7 +4115,7 @@
       <w:r>
         <w:t xml:space="preserve">2025;27:e70450. doi:</w:t>
       </w:r>
-      <w:hyperlink r:id="rId45">
+      <w:hyperlink r:id="rId47">
         <w:r>
           <w:rPr>
             <w:rStyle w:val="Hyperlink"/>
@@ -4073,7 +4153,7 @@
       <w:r>
         <w:t xml:space="preserve">2026;31:332–41. doi:</w:t>
       </w:r>
-      <w:hyperlink r:id="rId46">
+      <w:hyperlink r:id="rId48">
         <w:r>
           <w:rPr>
             <w:rStyle w:val="Hyperlink"/>
@@ -4093,44 +4173,6 @@
         </w:numPr>
       </w:pPr>
       <w:r>
-        <w:t xml:space="preserve">Nyrhi L, Ponkilainen V, Laaksonen J, et al. Large language models for risk-of-bias assessment in randomised clinical trials—a comparative validation study.</w:t>
-      </w:r>
-      <w:r>
-        <w:t xml:space="preserve"> </w:t>
-      </w:r>
-      <w:r>
-        <w:rPr>
-          <w:i/>
-          <w:iCs/>
-        </w:rPr>
-        <w:t xml:space="preserve">EBioMedicine</w:t>
-      </w:r>
-      <w:r>
-        <w:t xml:space="preserve"> </w:t>
-      </w:r>
-      <w:r>
-        <w:t xml:space="preserve">2026;126:106238. doi:</w:t>
-      </w:r>
-      <w:hyperlink r:id="rId47">
-        <w:r>
-          <w:rPr>
-            <w:rStyle w:val="Hyperlink"/>
-          </w:rPr>
-          <w:t xml:space="preserve">10.1016/j.ebiom.2026.106238</w:t>
-        </w:r>
-      </w:hyperlink>
-      <w:r>
-        <w:t xml:space="preserve">.</w:t>
-      </w:r>
-    </w:p>
-    <w:p>
-      <w:pPr>
-        <w:numPr>
-          <w:ilvl w:val="0"/>
-          <w:numId w:val="1001"/>
-        </w:numPr>
-      </w:pPr>
-      <w:r>
         <w:t xml:space="preserve">Taneri PE. Human Versus Artificial Intelligence: Comparing Cochrane Authors’ and ChatGPT’s Risk of Bias Assessments.</w:t>
       </w:r>
       <w:r>
@@ -4149,7 +4191,7 @@
       <w:r>
         <w:t xml:space="preserve">2025;3:e70044. doi:</w:t>
       </w:r>
-      <w:hyperlink r:id="rId48">
+      <w:hyperlink r:id="rId49">
         <w:r>
           <w:rPr>
             <w:rStyle w:val="Hyperlink"/>
@@ -4187,7 +4229,7 @@
       <w:r>
         <w:t xml:space="preserve">2026;28:e84915. doi:</w:t>
       </w:r>
-      <w:hyperlink r:id="rId49">
+      <w:hyperlink r:id="rId50">
         <w:r>
           <w:rPr>
             <w:rStyle w:val="Hyperlink"/>
@@ -4225,7 +4267,7 @@
       <w:r>
         <w:t xml:space="preserve">2025;178:1763–71. doi:</w:t>
       </w:r>
-      <w:hyperlink r:id="rId50">
+      <w:hyperlink r:id="rId51">
         <w:r>
           <w:rPr>
             <w:rStyle w:val="Hyperlink"/>
@@ -4263,7 +4305,7 @@
       <w:r>
         <w:t xml:space="preserve">2025;31:60–69. doi:</w:t>
       </w:r>
-      <w:hyperlink r:id="rId51">
+      <w:hyperlink r:id="rId52">
         <w:r>
           <w:rPr>
             <w:rStyle w:val="Hyperlink"/>
@@ -4301,7 +4343,7 @@
       <w:r>
         <w:t xml:space="preserve">2011;64:96–106. doi:</w:t>
       </w:r>
-      <w:hyperlink r:id="rId52">
+      <w:hyperlink r:id="rId53">
         <w:r>
           <w:rPr>
             <w:rStyle w:val="Hyperlink"/>
@@ -4321,7 +4363,7 @@
         </w:numPr>
       </w:pPr>
       <w:r>
-        <w:t xml:space="preserve">Liang Z, Sheffield C, Butera G, Antani S. Retrieve-Then-Verify for Evaluating Evidence Support and Hallucination in Large Language Model–Generated Medical Information: Empirical Study.</w:t>
+        <w:t xml:space="preserve">Nyrhi L, Ponkilainen V, Laaksonen J, et al. Large language models for risk-of-bias assessment in randomised clinical trials—a comparative validation study.</w:t>
       </w:r>
       <w:r>
         <w:t xml:space="preserve"> </w:t>
@@ -4331,58 +4373,20 @@
           <w:i/>
           <w:iCs/>
         </w:rPr>
-        <w:t xml:space="preserve">JMIR AI</w:t>
+        <w:t xml:space="preserve">EBioMedicine</w:t>
       </w:r>
       <w:r>
         <w:t xml:space="preserve"> </w:t>
       </w:r>
       <w:r>
-        <w:t xml:space="preserve">2026;5:e93761. doi:</w:t>
-      </w:r>
-      <w:hyperlink r:id="rId53">
-        <w:r>
-          <w:rPr>
-            <w:rStyle w:val="Hyperlink"/>
-          </w:rPr>
-          <w:t xml:space="preserve">10.2196/93761</w:t>
-        </w:r>
-      </w:hyperlink>
-      <w:r>
-        <w:t xml:space="preserve">.</w:t>
-      </w:r>
-    </w:p>
-    <w:p>
-      <w:pPr>
-        <w:numPr>
-          <w:ilvl w:val="0"/>
-          <w:numId w:val="1001"/>
-        </w:numPr>
-      </w:pPr>
-      <w:r>
-        <w:t xml:space="preserve">Joseph J, Vishwanath R, Sisirkumar JV. RoB2-Evaluator: Development and Technical Evaluation of a Rule-Constrained Large Language Model System for Cochrane Risk of Bias 2 Assessment.</w:t>
-      </w:r>
-      <w:r>
-        <w:t xml:space="preserve"> </w:t>
-      </w:r>
-      <w:r>
-        <w:rPr>
-          <w:i/>
-          <w:iCs/>
-        </w:rPr>
-        <w:t xml:space="preserve">medRxiv</w:t>
-      </w:r>
-      <w:r>
-        <w:t xml:space="preserve"> </w:t>
-      </w:r>
-      <w:r>
-        <w:t xml:space="preserve">[Preprint]. Posted 23 September 2026. doi:</w:t>
+        <w:t xml:space="preserve">2026;126:106238. doi:</w:t>
       </w:r>
       <w:hyperlink r:id="rId54">
         <w:r>
           <w:rPr>
             <w:rStyle w:val="Hyperlink"/>
           </w:rPr>
-          <w:t xml:space="preserve">10.64898/2026.09.22.26363693</w:t>
+          <w:t xml:space="preserve">10.1016/j.ebiom.2026.106238</w:t>
         </w:r>
       </w:hyperlink>
       <w:r>
@@ -4435,6 +4439,161 @@
         </w:numPr>
       </w:pPr>
       <w:r>
+        <w:t xml:space="preserve">Huang J, Tang Z, Ling Q, Kuang Z, E H. Can LLMs Follow Medical Expert Logic? A Benchmark for Hierarchical Logical Consistency in Risk-of-Bias Assessment.</w:t>
+      </w:r>
+      <w:r>
+        <w:t xml:space="preserve"> </w:t>
+      </w:r>
+      <w:r>
+        <w:rPr>
+          <w:i/>
+          <w:iCs/>
+        </w:rPr>
+        <w:t xml:space="preserve">arXiv</w:t>
+      </w:r>
+      <w:r>
+        <w:t xml:space="preserve"> </w:t>
+      </w:r>
+      <w:r>
+        <w:t xml:space="preserve">report, version 1, 10 September 2026.</w:t>
+      </w:r>
+      <w:r>
+        <w:t xml:space="preserve"> </w:t>
+      </w:r>
+      <w:hyperlink r:id="rId56">
+        <w:r>
+          <w:rPr>
+            <w:rStyle w:val="Hyperlink"/>
+          </w:rPr>
+          <w:t xml:space="preserve">arXiv:2609.11185v1</w:t>
+        </w:r>
+      </w:hyperlink>
+      <w:r>
+        <w:t xml:space="preserve">. Accepted to EMNLP 2026 Main Conference.</w:t>
+      </w:r>
+    </w:p>
+    <w:p>
+      <w:pPr>
+        <w:numPr>
+          <w:ilvl w:val="0"/>
+          <w:numId w:val="1001"/>
+        </w:numPr>
+      </w:pPr>
+      <w:r>
+        <w:t xml:space="preserve">Liang Z, Sheffield C, Butera G, Antani S. Retrieve-Then-Verify for Evaluating Evidence Support and Hallucination in Large Language Model–Generated Medical Information: Empirical Study.</w:t>
+      </w:r>
+      <w:r>
+        <w:t xml:space="preserve"> </w:t>
+      </w:r>
+      <w:r>
+        <w:rPr>
+          <w:i/>
+          <w:iCs/>
+        </w:rPr>
+        <w:t xml:space="preserve">JMIR AI</w:t>
+      </w:r>
+      <w:r>
+        <w:t xml:space="preserve"> </w:t>
+      </w:r>
+      <w:r>
+        <w:t xml:space="preserve">2026;5:e93761. doi:</w:t>
+      </w:r>
+      <w:hyperlink r:id="rId57">
+        <w:r>
+          <w:rPr>
+            <w:rStyle w:val="Hyperlink"/>
+          </w:rPr>
+          <w:t xml:space="preserve">10.2196/93761</w:t>
+        </w:r>
+      </w:hyperlink>
+      <w:r>
+        <w:t xml:space="preserve">.</w:t>
+      </w:r>
+    </w:p>
+    <w:p>
+      <w:pPr>
+        <w:numPr>
+          <w:ilvl w:val="0"/>
+          <w:numId w:val="1001"/>
+        </w:numPr>
+      </w:pPr>
+      <w:r>
+        <w:t xml:space="preserve">Joseph J, Vishwanath R, Sisirkumar JV. RoB2-Evaluator: Development and Technical Evaluation of a Rule-Constrained Large Language Model System for Cochrane Risk of Bias 2 Assessment.</w:t>
+      </w:r>
+      <w:r>
+        <w:t xml:space="preserve"> </w:t>
+      </w:r>
+      <w:r>
+        <w:rPr>
+          <w:i/>
+          <w:iCs/>
+        </w:rPr>
+        <w:t xml:space="preserve">medRxiv</w:t>
+      </w:r>
+      <w:r>
+        <w:t xml:space="preserve"> </w:t>
+      </w:r>
+      <w:r>
+        <w:t xml:space="preserve">[Preprint]. Posted 23 September 2026. doi:</w:t>
+      </w:r>
+      <w:hyperlink r:id="rId58">
+        <w:r>
+          <w:rPr>
+            <w:rStyle w:val="Hyperlink"/>
+          </w:rPr>
+          <w:t xml:space="preserve">10.64898/2026.09.22.26363693</w:t>
+        </w:r>
+      </w:hyperlink>
+      <w:r>
+        <w:t xml:space="preserve">.</w:t>
+      </w:r>
+    </w:p>
+    <w:p>
+      <w:pPr>
+        <w:numPr>
+          <w:ilvl w:val="0"/>
+          <w:numId w:val="1001"/>
+        </w:numPr>
+      </w:pPr>
+      <w:r>
+        <w:t xml:space="preserve">Soboczenski F, Trikalinos TA, Kuiper J, et al. Machine learning to help researchers evaluate biases in clinical trials: a prospective, randomized user study.</w:t>
+      </w:r>
+      <w:r>
+        <w:t xml:space="preserve"> </w:t>
+      </w:r>
+      <w:r>
+        <w:rPr>
+          <w:i/>
+          <w:iCs/>
+        </w:rPr>
+        <w:t xml:space="preserve">BMC Med Inform Decis Mak</w:t>
+      </w:r>
+      <w:r>
+        <w:t xml:space="preserve"> </w:t>
+      </w:r>
+      <w:r>
+        <w:t xml:space="preserve">2019;19:96. doi:</w:t>
+      </w:r>
+      <w:hyperlink r:id="rId59">
+        <w:r>
+          <w:rPr>
+            <w:rStyle w:val="Hyperlink"/>
+          </w:rPr>
+          <w:t xml:space="preserve">10.1186/s12911-019-0814-z</w:t>
+        </w:r>
+      </w:hyperlink>
+      <w:r>
+        <w:t xml:space="preserve">.</w:t>
+      </w:r>
+    </w:p>
+    <w:p>
+      <w:pPr>
+        <w:numPr>
+          <w:ilvl w:val="0"/>
+          <w:numId w:val="1001"/>
+        </w:numPr>
+      </w:pPr>
+      <w:r>
         <w:t xml:space="preserve">Jardim PSJ, Rose CJ, Ames HM, et al. Automating risk of bias assessment in systematic reviews: a real-time mixed methods comparison of human researchers to a machine learning system.</w:t>
       </w:r>
       <w:r>
@@ -4453,7 +4612,7 @@
       <w:r>
         <w:t xml:space="preserve">2022;22:167. doi:</w:t>
       </w:r>
-      <w:hyperlink r:id="rId56">
+      <w:hyperlink r:id="rId60">
         <w:r>
           <w:rPr>
             <w:rStyle w:val="Hyperlink"/>
@@ -4465,10 +4624,10 @@
         <w:t xml:space="preserve">.</w:t>
       </w:r>
     </w:p>
-    <w:bookmarkEnd w:id="57"/>
-    <w:bookmarkEnd w:id="58"/>
-    <w:p>
-      <w:bookmarkStart w:id="156" w:name="loc_97"/>
+    <w:bookmarkEnd w:id="61"/>
+    <w:bookmarkEnd w:id="62"/>
+    <w:p>
+      <w:bookmarkStart w:id="164" w:name="loc_101"/>
       <w:pPr>
         <w:pStyle w:val="Heading1"/>
         <w:pageBreakBefore/>
@@ -4476,7 +4635,7 @@
       <w:r>
         <w:t>FIGURE LEGENDS</w:t>
       </w:r>
-      <w:bookmarkEnd w:id="156"/>
+      <w:bookmarkEnd w:id="164"/>
     </w:p>
     <w:p>
       <w:pPr>

</xml_diff>

<commit_message>
Publish author-informed manuscript with reconciled reporting provenance
</commit_message>
<xml_diff>
--- a/analysis/output/manuscript/Manuscript.docx
+++ b/analysis/output/manuscript/Manuscript.docx
@@ -2,7 +2,7 @@
 <file path=word/document.xml><?xml version="1.0" encoding="utf-8"?>
 <w:document xmlns:w="http://schemas.openxmlformats.org/wordprocessingml/2006/main" xmlns:m="http://schemas.openxmlformats.org/officeDocument/2006/math" xmlns:r="http://schemas.openxmlformats.org/officeDocument/2006/relationships" xmlns:o="urn:schemas-microsoft-com:office:office" xmlns:v="urn:schemas-microsoft-com:vml" xmlns:w10="urn:schemas-microsoft-com:office:word" xmlns:a="http://schemas.openxmlformats.org/drawingml/2006/main" xmlns:pic="http://schemas.openxmlformats.org/drawingml/2006/picture" xmlns:wp="http://schemas.openxmlformats.org/drawingml/2006/wordprocessingDrawing">
   <w:body>
-    <w:bookmarkStart w:id="62" w:name="X26e74a24f867deabfa9c1d5ee51de4ca1fc52bd"/>
+    <w:bookmarkStart w:id="63" w:name="Xd6bc0427f4ae1b62f36b1141b02008da0f1b7c7"/>
     <w:p>
       <w:pPr>
         <w:pStyle w:val="Title"/>
@@ -12,7 +12,7 @@
           <w:b/>
           <w:sz w:val="28"/>
         </w:rPr>
-        <w:t xml:space="preserve">ARBITER: an auditable workflow for AI-assisted risk-of-bias assessment</w:t>
+        <w:t xml:space="preserve">ARBITER: an evidence-linked workflow for AI-assisted risk-of-bias assessment</w:t>
       </w:r>
     </w:p>
     <w:bookmarkStart w:id="9" w:name="front-matter-notes"/>
@@ -42,13 +42,13 @@
     </w:p>
     <w:p>
       <w:r>
-        <w:t>Word counts: main text 3368; structured abstract 225.</w:t>
+        <w:t>Word counts: main text 3704; structured abstract 214.</w:t>
       </w:r>
     </w:p>
     <w:bookmarkEnd w:id="9"/>
     <w:bookmarkStart w:id="15" w:name="abstract"/>
     <w:p>
-      <w:bookmarkStart w:id="68" w:name="loc_5"/>
+      <w:bookmarkStart w:id="69" w:name="loc_5"/>
       <w:pPr>
         <w:pStyle w:val="Heading1"/>
         <w:pageBreakBefore/>
@@ -60,7 +60,7 @@
         </w:rPr>
         <w:t>ABSTRACT</w:t>
       </w:r>
-      <w:bookmarkEnd w:id="68"/>
+      <w:bookmarkEnd w:id="69"/>
     </w:p>
     <w:bookmarkStart w:id="10" w:name="objective"/>
     <w:p>
@@ -92,7 +92,7 @@
         <w:t xml:space="preserve">Materials and Methods. </w:t>
       </w:r>
       <w:r>
-        <w:t xml:space="preserve">ARBITER retains sources, evidence and signalling answers and applies decision rules in software. Its Sonnet workflow and a minimal-prompt comparator (Unassisted) assessed identical supplied documents for 102 trials from 16 reviews. Two experts independently rated 510 trial–domain assessments before choosing among blinded labels. The primary endpoint measured agreed label choices matching ARBITER where workflows disagreed. Independent expert agreement was secondary. Paired intervals resampled trials within fixed reviews.</w:t>
+        <w:t xml:space="preserve">ARBITER retains sources, evidence and signalling answers and applies decision rules in software. Its Sonnet workflow and a minimal-prompt comparator (Unassisted) assessed identical supplied documents for 102 trials from 16 reviews. Outcomes included agreement with published labels, independent expert ratings and conditional blinded label choices. Paired intervals resampled trials within fixed reviews.</w:t>
       </w:r>
     </w:p>
     <w:bookmarkEnd w:id="11"/>
@@ -109,7 +109,7 @@
         <w:t xml:space="preserve">Results. </w:t>
       </w:r>
       <w:r>
-        <w:t xml:space="preserve">Among 80 workflow disagreements, experts agreed on 60 label choices and split on 20; 53/60 agreed choices matched ARBITER (88%; 95% CI, 80–96%). Exact agreement was 371/510 (72.7%) versus 332/510 (65.1%) against Expert 1 and 433/510 (84.9%) versus 400/510 (78.4%) against Expert 2. Paired gains were 7.6 percentage points (95% CI, 5.1–10.2) and 6.5 (3.5–9.4). Against published labels, ARBITER minus Unassisted agreement was −1.8 points (−5.1 to 1.6). All 510 ARBITER domain outputs followed executable rules. Structural checks did not assess evidence support. Median runtime was 7.6 versus 0.5 minutes per trial.</w:t>
+        <w:t xml:space="preserve">Against published labels, ARBITER minus Unassisted exact agreement was −1.8 percentage points (95% CI, −5.1 to 1.6). Exact agreement was 371/510 (72.7%) versus 332/510 (65.1%) against Expert 1 and 433/510 (84.9%) versus 400/510 (78.4%) against Expert 2. Paired gains were 7.6 points (95% CI, 5.1–10.2) and 6.5 (3.5–9.4). Among 80 workflow disagreements, experts agreed on 60 blinded label choices and split on 20; 53/60 agreed choices matched ARBITER (88%; 95% CI, 80–96%). All 510 ARBITER domain outputs followed executable rules. Structural checks did not assess evidence support. Median runtime was 7.6 versus 0.5 minutes per trial.</w:t>
       </w:r>
     </w:p>
     <w:bookmarkEnd w:id="12"/>
@@ -150,7 +150,7 @@
     <w:bookmarkEnd w:id="15"/>
     <w:bookmarkStart w:id="18" w:name="introduction"/>
     <w:p>
-      <w:bookmarkStart w:id="74" w:name="loc_11"/>
+      <w:bookmarkStart w:id="75" w:name="loc_11"/>
       <w:pPr>
         <w:pStyle w:val="Heading1"/>
         <w:pageBreakBefore/>
@@ -161,11 +161,11 @@
         </w:rPr>
         <w:t>INTRODUCTION</w:t>
       </w:r>
-      <w:bookmarkEnd w:id="74"/>
+      <w:bookmarkEnd w:id="75"/>
     </w:p>
     <w:bookmarkStart w:id="16" w:name="background-and-significance"/>
     <w:p>
-      <w:bookmarkStart w:id="75" w:name="loc_12"/>
+      <w:bookmarkStart w:id="76" w:name="loc_12"/>
       <w:pPr>
         <w:pStyle w:val="Heading2"/>
       </w:pPr>
@@ -175,14 +175,14 @@
         </w:rPr>
         <w:t>Background and significance</w:t>
       </w:r>
-      <w:bookmarkEnd w:id="75"/>
+      <w:bookmarkEnd w:id="76"/>
     </w:p>
     <w:p>
       <w:pPr>
         <w:pStyle w:val="FirstParagraph"/>
       </w:pPr>
       <w:r>
-        <w:t xml:space="preserve">AI-assisted RoB 2 assessment requires both interpretation of trial evidence and consistent application of the decision rules.[1] An assessment record can expose how a judgment was reached, but its interpretive quality remains an empirical question. RoB 2 reliability studies have documented disagreement and application difficulties; review-specific instructions and calibration were followed by improved agreement in one setting.[2,3] Work with the earlier Cochrane instrument also identified different interpretations of the same information across reviews.[4] These findings make the reference assessment and the basis of each judgment material to evaluating an automated workflow.</w:t>
+        <w:t xml:space="preserve">Risk-of-bias assessment informs how trial results contribute to evidence synthesis. The Cochrane risk-of-bias tool for randomised trials (RoB 2) evaluates a specified result across five domains, using signalling answers to propose domain judgments and an overall rating.[1] Reviewers must identify the relevant outcome, comparison and analysis, interpret information across trial reports and supporting documents, and justify their answers. The work therefore involves both evidence interpretation and consistent rule application.</w:t>
       </w:r>
     </w:p>
     <w:p>
@@ -190,7 +190,7 @@
         <w:pStyle w:val="BodyText"/>
       </w:pPr>
       <w:r>
-        <w:t xml:space="preserve">Existing systems already make evidence and intermediate decisions available for review. RobotReviewer paired judgments with supporting sentences for the earlier instrument and evaluated text relevance separately from classification.[5] ROBOTO2 provides an interactive RoB 2 workflow with retrieved evidence and editable answers and judgments.[6] RoBGuard combines question reformulation, multimodal document parsing and collaboration among model roles for RoB 2 assessment.[7] Structured RoB 2 prompting has been compared with human assessments,[8,9] and same-model comparisons of direct and constrained prompts have been studied with the earlier instrument.[10] These precedents support evaluating what a specified implementation adds under a defined comparison.</w:t>
+        <w:t xml:space="preserve">RoB 2 reliability studies document disagreement and application difficulties; review-specific instructions and calibration were followed by improved agreement in one setting.[2,3] Work with the earlier Cochrane instrument also identified different interpretations of the same information across reviews.[4] These demands recur as evidence syntheses are updated. Riaz and colleagues describe a framework for automated, living evidence synthesis that integrates distinct review tasks with human oversight.[5] This provides a motivation to investigate assistance with appraisal, without assuming that automation reduces reviewer workload.</w:t>
       </w:r>
     </w:p>
     <w:p>
@@ -198,13 +198,21 @@
         <w:pStyle w:val="BodyText"/>
       </w:pPr>
       <w:r>
-        <w:t xml:space="preserve">ARBITER retains trial documents, cited evidence, signalling answers and rating decisions. The model interprets the evidence; software derives proposed ratings from the recorded answers. The complete workflows used the same reported model identifier and configuration and identical supplied trial documents, while instructions, tools and processing differed. Independent expert ratings, blinded label choices and process audits then address distinct aspects of its output.</w:t>
+        <w:t xml:space="preserve">Prior systems have made substantial parts of the assessment accessible to automation. RobotReviewer paired judgments with supporting sentences for the earlier instrument and evaluated text relevance separately from classification.[6] ROBOTO2 integrates document parsing, retrieved evidence, preliminary signalling answers and editable judgments; its evaluation also identified overly conservative and no-information responses despite available evidence.[7] RoBGuard combines question reformulation, multimodal document parsing and collaboration among model roles.[8] Structured RoB 2 prompting has been compared with human assessments,[9,10] and same-model comparisons of direct and constrained prompts have been studied with the earlier instrument.[11] These approaches establish useful capabilities, but a plausible label or authentic quotation does not establish appropriate evidence interpretation. Evaluation must distinguish evidence selection, signalling answers and rule application, and identify the reference against which agreement is measured.</w:t>
+      </w:r>
+    </w:p>
+    <w:p>
+      <w:pPr>
+        <w:pStyle w:val="BodyText"/>
+      </w:pPr>
+      <w:r>
+        <w:t xml:space="preserve">The Agentic Risk of Bias Inference Tool for Evidence Reviews (ARBITER) retains sources, selected evidence, signalling answers and decision traces for experienced evidence reviewers who retain responsibility for the assessment. The model interprets trial evidence; software derives proposed ratings from the recorded answers. We evaluated this complete workflow against same-model minimal prompting with identical supplied trial documents.</w:t>
       </w:r>
     </w:p>
     <w:bookmarkEnd w:id="16"/>
     <w:bookmarkStart w:id="17" w:name="objective-1"/>
     <w:p>
-      <w:bookmarkStart w:id="79" w:name="loc_16"/>
+      <w:bookmarkStart w:id="81" w:name="loc_17"/>
       <w:pPr>
         <w:pStyle w:val="Heading2"/>
       </w:pPr>
@@ -214,21 +222,21 @@
         </w:rPr>
         <w:t>Objective</w:t>
       </w:r>
-      <w:bookmarkEnd w:id="79"/>
+      <w:bookmarkEnd w:id="81"/>
     </w:p>
     <w:p>
       <w:pPr>
         <w:pStyle w:val="FirstParagraph"/>
       </w:pPr>
       <w:r>
-        <w:t xml:space="preserve">We asked how often ARBITER’s judgments matched agreed blinded expert label choices when the workflows disagreed, and whether its complete workflow agreed more often with independent expert ratings than same-model minimal prompting. The label-choice endpoint was formally primary; independent expert agreement across all assessments was secondary. Supporting outcomes examined rule conformance, source records and computation.</w:t>
+        <w:t xml:space="preserve">We examined agreement with published review labels and independently recorded expert ratings, followed by blinded label choices where the workflows disagreed. We also evaluated domain and signalling-answer variation, rule conformance, source records and computational burden. These outcomes address distinct properties of the assessment rather than a single standard of correctness.</w:t>
       </w:r>
     </w:p>
     <w:bookmarkEnd w:id="17"/>
     <w:bookmarkEnd w:id="18"/>
     <w:bookmarkStart w:id="25" w:name="materials-and-methods-1"/>
     <w:p>
-      <w:bookmarkStart w:id="81" w:name="loc_18"/>
+      <w:bookmarkStart w:id="83" w:name="loc_19"/>
       <w:pPr>
         <w:pStyle w:val="Heading1"/>
       </w:pPr>
@@ -238,11 +246,11 @@
         </w:rPr>
         <w:t>MATERIALS AND METHODS</w:t>
       </w:r>
-      <w:bookmarkEnd w:id="81"/>
+      <w:bookmarkEnd w:id="83"/>
     </w:p>
     <w:bookmarkStart w:id="19" w:name="system-design"/>
     <w:p>
-      <w:bookmarkStart w:id="82" w:name="loc_19"/>
+      <w:bookmarkStart w:id="84" w:name="loc_20"/>
       <w:pPr>
         <w:pStyle w:val="Heading2"/>
       </w:pPr>
@@ -252,14 +260,14 @@
         </w:rPr>
         <w:t>System design</w:t>
       </w:r>
-      <w:bookmarkEnd w:id="82"/>
+      <w:bookmarkEnd w:id="84"/>
     </w:p>
     <w:p>
       <w:pPr>
         <w:pStyle w:val="FirstParagraph"/>
       </w:pPr>
       <w:r>
-        <w:t xml:space="preserve">ARBITER separates interpretation of trial evidence from application of the RoB 2 decision rules (Figure 1). The AI model identifies the result to assess and answers the signalling questions; software applies the official algorithms to those answers. It preserves source provenance by retaining documents with cryptographic hashes that identify their exact contents, extracting quoted passages and recording their locations. In interactive use, a reviewer can approve the proposed result before domain assessment and inspect the answers and cited evidence. The automated benchmark runs accepted the proposed result unchanged. The exported HTML report and accompanying audit file preserve the assessment for inspection.</w:t>
+        <w:t xml:space="preserve">ARBITER separates interpretation of trial evidence from application of the RoB 2 decision rules (Figure 1). The model identifies the result to assess, examines the available documents and answers the signalling questions; software computes the domain ratings implied by those answers. A result-approval step allows an interactive reviewer to inspect the proposed target before domain assessment. In the automated benchmark, the harness accepted that proposal unchanged.</w:t>
       </w:r>
     </w:p>
     <w:p>
@@ -267,7 +275,23 @@
         <w:pStyle w:val="BodyText"/>
       </w:pPr>
       <w:r>
-        <w:t xml:space="preserve">Each required signalling answer must cite an evidence basis. Software extracts text quotations directly from the stored documents and links image regions to source pages. Model-written image descriptions are not independently checked against image content. The software computes a proposed domain rating from the recorded answers; a different adopted rating requires a recorded rationale and evidence. We checked proposed and adopted ratings separately. The record preserves the basis of each judgment but does not establish whether the evidence supports the answer.</w:t>
+        <w:t xml:space="preserve">Source documents are retained with cryptographic hashes identifying their contents. Extracted page text has a separate version identifier linking passages to the captured document and extraction. The model selects evidence through document-reading and search tools, using returned passage references, page and line ranges, or copied text that must match a source passage. Unmatched or ambiguous copied text is rejected. Software stores the selected source slice with its source, page and character offsets. This constrains fabricated quotation wording within the text evidence pathway; it does not establish that a passage is relevant, complete or appropriately interpreted. Document-extraction errors can persist.</w:t>
+      </w:r>
+    </w:p>
+    <w:p>
+      <w:pPr>
+        <w:pStyle w:val="BodyText"/>
+      </w:pPr>
+      <w:r>
+        <w:t xml:space="preserve">For material requiring visual interpretation, evidence records link a rendered source page and selected region to a model-written transcription. These links do not independently verify the transcription or interpretation. Each signalling answer records its evidential basis and justification, with provision for uncertainty and counterevidence. Software checks answer options, required question paths and evidence references before applying the decision algorithms.</w:t>
+      </w:r>
+    </w:p>
+    <w:p>
+      <w:pPr>
+        <w:pStyle w:val="BodyText"/>
+      </w:pPr>
+      <w:r>
+        <w:t xml:space="preserve">The algorithm-derived proposal and adopted domain rating are recorded separately. A departure requires a documented rationale and supporting evidence linked to the saved answers. Proposed and adopted ratings were checked separately in the evaluation. The exported HTML report and audit file retain evidence links, answers and decision traces for inspection. Runtime source-text matching, assessment-file verification and the study’s structural source-provenance audit are distinct checks; the latter did not independently re-extract quotations from original documents. None determines whether the evidence justifies the signalling answers.</w:t>
       </w:r>
     </w:p>
     <w:p>
@@ -281,7 +305,7 @@
     <w:bookmarkEnd w:id="19"/>
     <w:bookmarkStart w:id="21" w:name="benchmark-and-assessment-arms"/>
     <w:p>
-      <w:bookmarkStart w:id="86" w:name="loc_23"/>
+      <w:bookmarkStart w:id="90" w:name="loc_26"/>
       <w:pPr>
         <w:pStyle w:val="Heading2"/>
       </w:pPr>
@@ -291,14 +315,14 @@
         </w:rPr>
         <w:t>Benchmark and assessment arms</w:t>
       </w:r>
-      <w:bookmarkEnd w:id="86"/>
+      <w:bookmarkEnd w:id="90"/>
     </w:p>
     <w:p>
       <w:pPr>
         <w:pStyle w:val="FirstParagraph"/>
       </w:pPr>
       <w:r>
-        <w:t xml:space="preserve">The source set contained 105 trials from 16 published meta-analyses. Within each review, trials were selected in table order, taking up to seven available eligible trials and replacing unavailable reports with the next eligible trial. Three trials were excluded under the analysis plan, leaving 102 trials. The supplementary benchmark table documents the reviews, specialties and source availability. [Pending: how the reviews were identified and selected, eligibility criteria and confirmation of the excluded design classifications.]</w:t>
+        <w:t xml:space="preserve">We assembled a purposive benchmark spanning 15 medical specialties. The selection team reported searching Europe PMC for 2025–2026 meta-analyses of randomized trials, prioritizing journal standing and citation counts while requiring explicit RoB 2 use and extractable trial-level domain judgments. Search and ranking records were not recovered; the selected reviews are not verified as the highest-ranked or most-cited eligible candidates. The source set contained 105 trials from 16 reviews. Within reviews, trials were selected in table order, taking up to seven obtainable eligible trials and replacing unavailable reports with the next eligible trial; duplicate trials were removed. Three trials designated by the author as unsupported designs were excluded, leaving 102. Atwine’s stored design classification is disputed by the author; its specific unsupported subtype remains unverified. The supplementary benchmark table documents reviews, specialties and source availability.</w:t>
       </w:r>
     </w:p>
     <w:p>
@@ -306,7 +330,7 @@
         <w:pStyle w:val="BodyText"/>
       </w:pPr>
       <w:r>
-        <w:t xml:space="preserve">The assessment task specified a result using the review’s reported outcome and available trial information, including the time point, comparison and numerical result as printed. It did not automatically select the trial’s primary outcome. Correspondence between the specified result and the published risk-of-bias label could be partial, inferred, different or indeterminate; some published labels covered several outcomes. Comparisons with published labels retained all domain cells; target uncertainty was considered qualitatively.</w:t>
+        <w:t xml:space="preserve">Candidate targets initially followed trial-primary outcomes. Before the reported runs, 43 of 105 targets were revised toward the results underlying the published review labels. Final prompts specified the assessment outcome, comparison, time point and numerical result as printed in the revised target ledger. Correspondence with published labels could still be partial, inferred, different or indeterminate; some labels covered several outcomes. Comparisons retained all domain cells; target uncertainty was considered qualitatively.</w:t>
       </w:r>
     </w:p>
     <w:p>
@@ -322,7 +346,7 @@
         <w:pStyle w:val="BodyText"/>
       </w:pPr>
       <w:r>
-        <w:t xml:space="preserve">Unassisted received the assessment task sentence and one fixed output-format sentence, without RoB 2 guidance. It could read and search local documents but had no access to ARBITER’s software service, assessment instructions or the web. ARBITER additionally received assessment instructions and guidance through an assessment skill, a packaged set of workflow instructions. The arms therefore shared trial evidence but differed in instructions and processing. The comparison evaluated the complete workflow and did not isolate the effects of guidance, software or computation. It also differed from the structured-prompt comparators used in several prior studies.[8,9,11,12]</w:t>
+        <w:t xml:space="preserve">Unassisted received the assessment task sentence and one fixed output-format sentence, without RoB 2 guidance. It could read and search local documents but had no access to ARBITER’s software service, assessment instructions or the web. ARBITER additionally received assessment instructions and guidance through an assessment skill, a packaged set of workflow instructions. The arms therefore shared trial evidence but differed in instructions and processing. The comparison evaluated the complete workflow and did not isolate the effects of guidance, software or computation. It also differed from the structured-prompt comparators used in several prior studies.[9,10,12,13]</w:t>
       </w:r>
     </w:p>
     <w:p>
@@ -395,13 +419,28 @@
         <w:t xml:space="preserve"> </w:t>
       </w:r>
       <w:r>
-        <w:t xml:space="preserve">at most twice per phase without coaching. eMethods reproduces both prompt templates, the command invoking the ARBITER assessment skill, the Unassisted format instruction and a filled example. [Pending: development and selection of the prompts and assessment skill, data used in development, any overlap with the benchmark and documentation fixing the evaluated versions.]</w:t>
+        <w:t xml:space="preserve">at most twice per phase without coaching. eMethods reproduces both prompt templates, the command invoking the ARBITER assessment skill, the Unassisted format instruction and a filled example. Recovered ARBITER</w:t>
+      </w:r>
+      <w:r>
+        <w:t xml:space="preserve"> </w:t>
+      </w:r>
+      <w:r>
+        <w:rPr>
+          <w:rStyle w:val="VerbatimChar"/>
+        </w:rPr>
+        <w:t xml:space="preserve">eval/</w:t>
+      </w:r>
+      <w:r>
+        <w:t xml:space="preserve"> </w:t>
+      </w:r>
+      <w:r>
+        <w:t xml:space="preserve">records contain ten prostate-cancer trials and synthetic diagnostic cases used in development. The author reports that this benchmark was not used in development; the recovered records do not establish an exhaustive development-exposure history. [Pending: complete prompt and assessment-skill selection history and version-freeze documentation.]</w:t>
       </w:r>
     </w:p>
     <w:bookmarkEnd w:id="21"/>
     <w:bookmarkStart w:id="22" w:name="independent-expert-references"/>
     <w:p>
-      <w:bookmarkStart w:id="92" w:name="loc_29"/>
+      <w:bookmarkStart w:id="96" w:name="loc_32"/>
       <w:pPr>
         <w:pStyle w:val="Heading2"/>
       </w:pPr>
@@ -411,14 +450,14 @@
         </w:rPr>
         <w:t>Independent expert references</w:t>
       </w:r>
-      <w:bookmarkEnd w:id="92"/>
+      <w:bookmarkEnd w:id="96"/>
     </w:p>
     <w:p>
       <w:pPr>
         <w:pStyle w:val="FirstParagraph"/>
       </w:pPr>
       <w:r>
-        <w:t xml:space="preserve">Two blinded experts assessed all 102 trials across the five domains. Each trial–domain pair constituted a cell. Each expert independently recorded and froze signalling answers and domain ratings before seeing any offered label. No AI was used for these judgments. Experts could consult sources beyond the arms’ inputs. [Pending: expert qualifications, experience and training; assessment instructions and guidance supplied; whether experts received the same specified targets as the arms; and conventions for assessing targets containing several outcomes.]</w:t>
+        <w:t xml:space="preserve">Two blinded experts, published researchers from BEACON Lab, assessed all 102 trials across the five domains. Each trial–domain pair constituted a cell. Each expert independently recorded and froze signalling answers and domain ratings before seeing any offered label. No AI was used for these judgments. Experts received the same trial materials, supplements and ClinicalTrials.gov records as the arms, the same task prompt specifying outcomes, contrasts and numerical anchors, and access to Cochrane RoB 2 guidance. [Pending: individual qualifications and RoB 2 experience, training/calibration and conventions for targets containing several outcomes.]</w:t>
       </w:r>
     </w:p>
     <w:p>
@@ -426,13 +465,13 @@
         <w:pStyle w:val="BodyText"/>
       </w:pPr>
       <w:r>
-        <w:t xml:space="preserve">Each expert then saw the published, Unassisted and ARBITER labels in an order randomized for each cell, without source identities or rationales, and chose the most defensible label. Each expert subsequently supplied a revised rating, which could differ from all offered labels, and recorded whether signalling answers were retained or changed. Independent ratings, label choices and revised ratings were analyzed separately. Blinded adjudication of discordant data-extraction items supplied a design precedent.[13] eMethods summarizes the assessment sequence; the completed assessment workbooks are available in the study repository. [Pending: original assessor instructions and blank assessment form.]</w:t>
+        <w:t xml:space="preserve">Each expert then saw the published, Unassisted and ARBITER labels in an order randomized for each cell, without source identities or rationales, and chose the most defensible label. Each expert subsequently supplied a revised rating, which could differ from all offered labels, and recorded whether signalling answers were retained or changed. Independent ratings, label choices and revised ratings were analyzed separately. Blinded adjudication of discordant data-extraction items supplied a design precedent.[14] eMethods summarizes the assessment sequence; the completed assessment workbooks are available in the study repository. [Pending: original blank assessment form.]</w:t>
       </w:r>
     </w:p>
     <w:bookmarkEnd w:id="22"/>
     <w:bookmarkStart w:id="23" w:name="outcomes"/>
     <w:p>
-      <w:bookmarkStart w:id="95" w:name="loc_32"/>
+      <w:bookmarkStart w:id="99" w:name="loc_35"/>
       <w:pPr>
         <w:pStyle w:val="Heading2"/>
       </w:pPr>
@@ -442,14 +481,14 @@
         </w:rPr>
         <w:t>Outcomes</w:t>
       </w:r>
-      <w:bookmarkEnd w:id="95"/>
+      <w:bookmarkEnd w:id="99"/>
     </w:p>
     <w:p>
       <w:pPr>
         <w:pStyle w:val="FirstParagraph"/>
       </w:pPr>
       <w:r>
-        <w:t xml:space="preserve">The formal primary endpoint was the proportion of agreed expert label choices matching ARBITER among cells where the arms’ ratings differed. The denominator included only cells in which both experts chose the same label; the numerator included those where that label matched ARBITER. Credit followed label equality: every source matching the chosen label received credit, and neither arm received credit if neither matched. Cells with identical labels from all sources provided no information about label choice between sources. Sensitivity analyses used each expert’s choices across all arm disagreements and counted split choices as ARBITER losses without assigning Unassisted wins. The endpoint measures label-choice match, not preference for a system’s reasoning or workflow.</w:t>
+        <w:t xml:space="preserve">We evaluated agreement with published review labels (Published), independent expert ratings and subsequent blinded label choices, followed by domain/answer detail, structural checks and computation. This reporting order was adopted after analysis; it does not imply prospective outcome specification.</w:t>
       </w:r>
     </w:p>
     <w:p>
@@ -457,7 +496,7 @@
         <w:pStyle w:val="BodyText"/>
       </w:pPr>
       <w:r>
-        <w:t xml:space="preserve">Secondary outcomes compared each source with each expert’s independent domain ratings across all 510 cells using exact agreement, paired percentage-point differences between arms and linearly weighted Cohen’s κ. Reference ratings were read directly from the experts’ assessment records. Published labels were another source, not an expert standard. Supporting analyses included expert-to-expert agreement, unweighted κ, confusion matrices, expert means and restriction to cells where the independent experts agreed.</w:t>
+        <w:t xml:space="preserve">Published-label comparisons used exact agreement and paired percentage-point differences between arms across all 510 cells, followed by linearly weighted Cohen’s κ, sensitivity for Some concerns or High, and specificity, with Gwet’s AC2 supplementary. An All-Low rule described label prevalence; its κ was suppressed because predictions lacked variance. Missing predictions counted as disagreement. Published labels were a review-derived reference, distinct from the independent expert ratings.</w:t>
       </w:r>
     </w:p>
     <w:p>
@@ -465,15 +504,23 @@
         <w:pStyle w:val="BodyText"/>
       </w:pPr>
       <w:r>
+        <w:t xml:space="preserve">Each source was compared separately with each expert’s independent domain ratings using exact agreement, paired percentage-point differences between arms and linearly weighted κ. Reference ratings were read directly from the experts’ assessment records. Supporting analyses included expert-to-expert agreement, unweighted κ, confusion matrices, expert means and restriction to cells where independent experts agreed.</w:t>
+      </w:r>
+    </w:p>
+    <w:p>
+      <w:pPr>
+        <w:pStyle w:val="BodyText"/>
+      </w:pPr>
+      <w:r>
+        <w:t xml:space="preserve">The conditional blinded-label outcome was the proportion of agreed expert choices matching ARBITER among cells where the arms’ ratings differed. The denominator included only cells in which both experts chose the same label; the numerator included those where that label matched ARBITER. Credit followed label equality: every source matching the chosen label received credit, and neither arm received credit if neither matched. Cells with identical labels from all sources provided no information about choice between sources. Sensitivities used each expert’s choices across all arm disagreements and counted split choices as ARBITER losses without assigning Unassisted wins. This measures conditional label matching, not preference for a system’s reasoning or workflow.</w:t>
+      </w:r>
+    </w:p>
+    <w:p>
+      <w:pPr>
+        <w:pStyle w:val="BodyText"/>
+      </w:pPr>
+      <w:r>
         <w:t xml:space="preserve">Signalling-answer agreement distinguished five levels: yes, probably yes, no, probably no and no information. Collapsed coding combined definite and probable affirmative answers and combined definite and probable negative answers, leaving no information separate. Answers were matched by trial, domain, question and component. A component was an explicitly named part of an answer, such as a separate answer for a particular outcome; an undivided answer was treated as one component. Answers for different named components were not pooled. Missing, inactive, not applicable, unmatched and unresolved answers were excluded; paired contrasts required evaluable answers in both arms. These comparisons assessed signalling answers separately from the recorded domain ratings.</w:t>
-      </w:r>
-    </w:p>
-    <w:p>
-      <w:pPr>
-        <w:pStyle w:val="BodyText"/>
-      </w:pPr>
-      <w:r>
-        <w:t xml:space="preserve">Published-label comparisons used weighted κ, exact agreement, sensitivity for Some concerns or High, and specificity, with Gwet’s AC2 supplementary. An All-Low rule described label prevalence; its κ was suppressed because predictions lacked variance. Missing predictions counted as disagreement.</w:t>
       </w:r>
     </w:p>
     <w:p>
@@ -503,7 +550,7 @@
     <w:bookmarkEnd w:id="23"/>
     <w:bookmarkStart w:id="24" w:name="statistical-analysis"/>
     <w:p>
-      <w:bookmarkStart w:id="103" w:name="loc_40"/>
+      <w:bookmarkStart w:id="108" w:name="loc_44"/>
       <w:pPr>
         <w:pStyle w:val="Heading2"/>
       </w:pPr>
@@ -513,7 +560,7 @@
         </w:rPr>
         <w:t>Statistical analysis</w:t>
       </w:r>
-      <w:bookmarkEnd w:id="103"/>
+      <w:bookmarkEnd w:id="108"/>
     </w:p>
     <w:p>
       <w:pPr>
@@ -536,14 +583,14 @@
         <w:t xml:space="preserve"> </w:t>
       </w:r>
       <w:r>
-        <w:t>values or multiplicity adjustments were used. Analyses retained the primary, secondary and exploratory outcome distinctions specified above. Reporting was guided by TRIPOD-LLM and GRRAS, with an accompanying item map and author-completion fields.⁠[14,15]</w:t>
+        <w:t>values or multiplicity adjustments were used. Reporting was guided by TRIPOD-LLM and GRRAS, with an accompanying item map and author-completion fields.⁠[15,16]</w:t>
       </w:r>
     </w:p>
     <w:bookmarkEnd w:id="24"/>
     <w:bookmarkEnd w:id="25"/>
     <w:bookmarkStart w:id="26" w:name="results-1"/>
     <w:p>
-      <w:bookmarkStart w:id="105" w:name="loc_42"/>
+      <w:bookmarkStart w:id="110" w:name="loc_46"/>
       <w:pPr>
         <w:pStyle w:val="Heading1"/>
       </w:pPr>
@@ -553,7 +600,7 @@
         </w:rPr>
         <w:t>RESULTS</w:t>
       </w:r>
-      <w:bookmarkEnd w:id="105"/>
+      <w:bookmarkEnd w:id="110"/>
     </w:p>
     <w:p>
       <w:pPr>
@@ -562,11 +609,11 @@
         <w:keepLines/>
       </w:pPr>
       <w:r>
-        <w:t xml:space="preserve">The 102 included trials yielded 510 trial–domain cells, all independently assessed by both experts (Figure 3; Table 1). Published labels were Low in 427/510 cells (83.7%), compared with 277/510 (54.3%) for Expert 1 and 346/510 (67.8%) for Expert 2. An all-Low rule matched 83.7% of Published domain labels. The experts agreed in 388/510 cells (76.1%; linearly weighted κ, 0.59).</w:t>
-      </w:r>
-    </w:p>
-    <w:p>
-      <w:bookmarkStart w:id="107" w:name="loc_44"/>
+        <w:t xml:space="preserve">The 102 included trials yielded 510 trial–domain cells, all independently assessed by both experts (Figure 3; Table 1). Published labels were Low in 427/510 cells (83.7%), compared with 277/510 (54.3%) for Expert 1 and 346/510 (67.8%) for Expert 2. An all-Low rule matched 83.7% of Published domain labels. Against Published across all 510 cells, ARBITER matched 386/510 (75.7%) and Unassisted 395/510 (77.5%), a paired difference of −1.8 points (95% CI, −5.1 to 1.6).</w:t>
+      </w:r>
+    </w:p>
+    <w:p>
+      <w:bookmarkStart w:id="112" w:name="loc_48"/>
       <w:pPr>
         <w:pStyle w:val="Heading2"/>
         <w:keepNext/>
@@ -579,7 +626,7 @@
         </w:rPr>
         <w:t>Table 1. Benchmark and reference context</w:t>
       </w:r>
-      <w:bookmarkEnd w:id="107"/>
+      <w:bookmarkEnd w:id="112"/>
     </w:p>
     <w:tbl>
       <w:tblPr>
@@ -1378,15 +1425,23 @@
     <w:p>
       <w:pPr>
         <w:pStyle w:val="BodyText"/>
+      </w:pPr>
+      <w:r>
+        <w:t xml:space="preserve">Across the full cohort, ARBITER agreed more often with both independent experts (Figure 4). It matched Expert 1 in 371/510 cells (72.7%) versus 332/510 (65.1%) for Unassisted, a paired gain of 7.6 percentage points (95% CI, 5.1–10.2). Against Expert 2, agreement was 433/510 (84.9%) versus 400/510 (78.4%), a gain of 6.5 points (3.5–9.4). The experts agreed in 388/510 cells (76.1%); Published labels matched the experts in 301/510 and 362/510 cells. Weighted κ values were 0.51 and 0.69 for ARBITER, compared with 0.35 and 0.53 for Unassisted; expert-to-expert weighted κ was 0.59.</w:t>
+      </w:r>
+    </w:p>
+    <w:p>
+      <w:pPr>
+        <w:pStyle w:val="BodyText"/>
         <w:keepNext w:val="0"/>
         <w:keepLines/>
       </w:pPr>
       <w:r>
-        <w:t xml:space="preserve">The arms’ ratings differed in 80 cells; the experts chose the same label in 60 and split in 20. The agreed label matched ARBITER in 53/60 cells (88%; 95% CI, 80–96%) and Unassisted in 7/60 (12%), constituting the formal primary result (Table 2). Across all 80 disagreements, the label chosen by Expert 1 matched ARBITER in 63/80 (79%), and that chosen by Expert 2 matched ARBITER in 61/80 (76%). Counting every split choice against ARBITER gave 53/80 (66%).</w:t>
-      </w:r>
-    </w:p>
-    <w:p>
-      <w:bookmarkStart w:id="109" w:name="loc_46"/>
+        <w:t xml:space="preserve">The arms’ ratings differed in 80 cells; the experts chose the same label in 60 and split in 20. The agreed label matched ARBITER in 53/60 cells (88%; 95% CI, 80–96%) and Unassisted in 7/60 (12%); Table 2 summarizes these choices. Across all 80 disagreements, the label chosen by Expert 1 matched ARBITER in 63/80 (79%), and that chosen by Expert 2 matched ARBITER in 61/80 (76%). Counting every split choice against ARBITER gave 53/80 (66%).</w:t>
+      </w:r>
+    </w:p>
+    <w:p>
+      <w:bookmarkStart w:id="115" w:name="loc_51"/>
       <w:pPr>
         <w:pStyle w:val="Heading2"/>
         <w:keepNext/>
@@ -1397,9 +1452,9 @@
         <w:rPr>
           <w:b/>
         </w:rPr>
-        <w:t>Table 2. Conditional primary endpoint and core sensitivities</w:t>
-      </w:r>
-      <w:bookmarkEnd w:id="109"/>
+        <w:t>Table 2. Conditional blinded-label choices and sensitivities</w:t>
+      </w:r>
+      <w:bookmarkEnd w:id="115"/>
     </w:p>
     <w:tbl>
       <w:tblPr>
@@ -1519,7 +1574,7 @@
                 <w:rFonts w:ascii="Arial" w:hAnsi="Arial"/>
                 <w:sz w:val="20"/>
               </w:rPr>
-              <w:t xml:space="default">Agreed choices (formal primary)</w:t>
+              <w:t xml:space="default">Agreed choices</w:t>
             </w:r>
           </w:p>
         </w:tc>
@@ -1787,7 +1842,7 @@
                 <w:rFonts w:ascii="Arial" w:hAnsi="Arial"/>
                 <w:sz w:val="20"/>
               </w:rPr>
-              <w:t xml:space="default">The formal primary endpoint conditions on 80 arm-discordant cells and the 60 for which the experts made an agreed choice; 20 choices split. Expert-specific sensitivities use all 80. The final row counts all 20 splits against ARBITER by assumption, without assigning Unassisted wins. Expert 1 chose neither arm in 4/80 cells; this is distinct from the split-loss assumption. CI, 95% confidence interval; 10,000 percentile bootstrap replicates, trials resampled within meta-analysis; seed 20261018.</w:t>
+              <w:t xml:space="default">Conditional blinded-label choice evaluation includes 80 arm-discordant cells and the 60 for which the experts made an agreed choice; 20 choices split. Expert-specific sensitivities use all 80. The final row counts all 20 splits against ARBITER by assumption, without assigning Unassisted wins. Expert 1 chose neither arm in 4/80 cells; this is distinct from the split-loss assumption. CI, 95% confidence interval; 10,000 percentile bootstrap replicates, trials resampled within meta-analysis; seed 20261018.</w:t>
             </w:r>
           </w:p>
         </w:tc>
@@ -1798,23 +1853,7 @@
         <w:pStyle w:val="BodyText"/>
       </w:pPr>
       <w:r>
-        <w:t xml:space="preserve">Across the full cohort, ARBITER agreed more often with both independent experts (Figure 4). It matched Expert 1 in 371/510 cells (72.7%) versus 332/510 (65.1%) for Unassisted, a paired gain of 7.6 percentage points (95% CI, 5.1–10.2). Against Expert 2, agreement was 433/510 (84.9%) versus 400/510 (78.4%), a gain of 6.5 points (3.5–9.4). Weighted κ values were 0.51 and 0.69 for ARBITER, compared with 0.35 and 0.53 for Unassisted.</w:t>
-      </w:r>
-    </w:p>
-    <w:p>
-      <w:pPr>
-        <w:pStyle w:val="BodyText"/>
-      </w:pPr>
-      <w:r>
         <w:t xml:space="preserve">Agreement gains varied by domain, alongside disagreement between experts. Selection of the reported result (D5) had the largest observed gains: 19.6 points (95% CI, 11.8–27.5) and 11.8 (2.9–20.6) against Experts 1 and 2. For missing outcome data (D3), ARBITER matched 43/102 ratings from Expert 1 (42.2%) and 80/102 from Expert 2 (78.4%); the experts agreed in 54/102 cells.</w:t>
-      </w:r>
-    </w:p>
-    <w:p>
-      <w:pPr>
-        <w:pStyle w:val="BodyText"/>
-      </w:pPr>
-      <w:r>
-        <w:t xml:space="preserve">Published labels matched the experts in 301/510 and 362/510 cells. Against Published across all 510 cells, ARBITER matched 386/510 (75.7%) and Unassisted 395/510 (77.5%), a paired difference of −1.8 points (95% CI, −5.1 to 1.6).</w:t>
       </w:r>
     </w:p>
     <w:p>
@@ -1836,7 +1875,7 @@
       </w:r>
     </w:p>
     <w:p>
-      <w:bookmarkStart w:id="115" w:name="loc_52"/>
+      <w:bookmarkStart w:id="119" w:name="loc_55"/>
       <w:pPr>
         <w:pStyle w:val="Heading2"/>
         <w:keepNext/>
@@ -1849,7 +1888,7 @@
         </w:rPr>
         <w:t>Table 3. Process checks and computational resources</w:t>
       </w:r>
-      <w:bookmarkEnd w:id="115"/>
+      <w:bookmarkEnd w:id="119"/>
     </w:p>
     <w:tbl>
       <w:tblPr>
@@ -3456,7 +3495,7 @@
     <w:bookmarkEnd w:id="26"/>
     <w:bookmarkStart w:id="28" w:name="discussion-1"/>
     <w:p>
-      <w:bookmarkStart w:id="117" w:name="loc_54"/>
+      <w:bookmarkStart w:id="121" w:name="loc_57"/>
       <w:pPr>
         <w:pStyle w:val="Heading1"/>
       </w:pPr>
@@ -3466,14 +3505,14 @@
         </w:rPr>
         <w:t>DISCUSSION</w:t>
       </w:r>
-      <w:bookmarkEnd w:id="117"/>
+      <w:bookmarkEnd w:id="121"/>
     </w:p>
     <w:p>
       <w:pPr>
         <w:pStyle w:val="FirstParagraph"/>
       </w:pPr>
       <w:r>
-        <w:t xml:space="preserve">ARBITER retained an inspectable assessment pathway and had greater agreement with both independent experts than Unassisted across the 510 trial–domain assessments. These secondary comparisons used ratings frozen before experts saw offered labels. The formal primary endpoint concerned a selected subset: among 80 arm-discordant assessments, experts agreed on 60 blinded label choices and split on 20; 53/60 agreed choices matched ARBITER (88%; 95% CI, 80–96%). Because experts saw labels without source identities or rationales, this result measures conditional label matching. It does not establish endorsement of ARBITER or its reasoning. The independent ratings provide the broader agreement comparison.</w:t>
+        <w:t xml:space="preserve">Agreement depended on the reference: ARBITER did not show a clear advantage against published review labels, but agreed more often with each independent expert than Unassisted across the 510 trial–domain assessments. Independent ratings were frozen before exposure to offered labels. The blinded-choice result concerned a selected subset: among 80 arm-discordant assessments, experts agreed on 60 choices and split on 20; 53/60 agreed choices matched ARBITER (88%; 95% CI, 80–96%). Labels were shown without source identities or rationales, so this conditional match does not establish endorsement of ARBITER’s reasoning. The broader comparison comes from the independently recorded ratings.</w:t>
       </w:r>
     </w:p>
     <w:p>
@@ -3489,7 +3528,7 @@
         <w:pStyle w:val="BodyText"/>
       </w:pPr>
       <w:r>
-        <w:t xml:space="preserve">The reference also changed the overall interpretation. Against Published labels, the paired ARBITER minus Unassisted difference was −1.8 percentage points (95% CI, −5.1 to 1.6), compatible with either direction. Published labels were predominantly Low, and some covered broader, inferred or different assessment targets. These differences qualify their use as a reference without establishing the cause of disagreement. Huang and Gandhi likewise evaluated model assessments against both review-derived and fresh human references,[8,9] while Nyrhi used published assessments in separate RoB 1 and RoB 2 corpora.[16] Those designs do not supply interchangeable standards. Our experts could consult sources beyond the arms’ inputs, and their own disagreement, especially in D3, precludes treating fresh ratings as error-free truth.</w:t>
+        <w:t xml:space="preserve">The reference also changed the overall interpretation. Against Published labels, the paired ARBITER minus Unassisted difference was −1.8 percentage points (95% CI, −5.1 to 1.6), compatible with either direction. Published labels were predominantly Low, and some covered broader, inferred or different assessment targets. These differences qualify their use as a reference without establishing the cause of disagreement. Huang and Gandhi likewise evaluated model assessments against both review-derived and fresh human references,[9,10] while Nyrhi used published assessments in separate RoB 1 and RoB 2 corpora.[17] Those designs do not supply interchangeable standards. Our experts received the same trial materials and task prompts as the arms, but their own disagreement, especially in D3, precludes treating fresh ratings as error-free truth.</w:t>
       </w:r>
     </w:p>
     <w:p>
@@ -3505,7 +3544,7 @@
         <w:pStyle w:val="BodyText"/>
       </w:pPr>
       <w:r>
-        <w:t xml:space="preserve">Conformance is already an explicit evaluation target in related work. Choi and colleagues examined expert agreement, rule conformance and repeated outputs in a single-trial pilot.[17] Their questions overlap with ours, but their repeated single-trial design and this multi-trial, single-run comparison address different sources of variation. LogiMed-RoB audits hierarchical consistency in RoB 2 assessments.[18] ARBITER’s source checks assess a different property: they establish source binding and record integrity without determining whether passages justify answers; image descriptions remained model-written. Liang’s RoB 2 retrieve-then-verify study addresses evidence support using a judge model, rather than independent human adjudication.[19] Independent assessment of each passage-to-answer relation, including image-derived interpretations, remains necessary to evaluate that property in ARBITER.</w:t>
+        <w:t xml:space="preserve">Conformance is already an explicit evaluation target in related work. Choi and colleagues examined expert agreement, rule conformance and repeated outputs in a single-trial pilot.[18] Their questions overlap with ours, but their repeated single-trial design and this multi-trial, single-run comparison address different sources of variation. LogiMed-RoB audits hierarchical consistency in RoB 2 assessments.[19] ARBITER’s source checks assess a different property: they establish source binding and record integrity without determining whether passages justify answers; image descriptions remained model-written. Liang’s RoB 2 retrieve-then-verify study addresses evidence support using a judge model, rather than independent human adjudication.[20] Independent assessment of each passage-to-answer relation, including image-derived interpretations, remains necessary to evaluate that property in ARBITER.</w:t>
       </w:r>
     </w:p>
     <w:p>
@@ -3513,7 +3552,7 @@
         <w:pStyle w:val="BodyText"/>
       </w:pPr>
       <w:r>
-        <w:t xml:space="preserve">The observed differences belong to the complete workflows. Identical supplied trial documents and a common reported model identifier and configuration make the comparison informative, but ARBITER also received additional guidance, tools and computation. The study cannot attribute its agreement advantage to rule enforcement, evidence recording or another component. Rules-only recomputation describes internal consistency but cannot recover those component effects. Minimal prompting also does not represent the structured alternatives already evaluated.[6,8,9,10] RoB2-Evaluator, described in a preprint, is another rule-constrained RoB 2 implementation.[20] ARBITER required greater computation: median runtime was 7.6 versus 0.5 minutes per trial, with higher API list-price equivalents. These quantities describe computational burden; the subscription-based runs did not incur those reconstructed list-price amounts as expenditure.</w:t>
+        <w:t xml:space="preserve">The observed differences belong to the complete workflows. Identical supplied trial documents and a common reported model identifier and configuration make the comparison informative, but ARBITER also received additional guidance, tools and computation. The study cannot attribute its agreement advantage to rule enforcement, evidence recording or another component. Rules-only recomputation describes internal consistency but cannot recover those component effects. Minimal prompting also does not represent the structured alternatives already evaluated.[7,9,10,11] RoB2-Evaluator, described in a preprint, is another rule-constrained RoB 2 implementation.[21] ARBITER required greater computation: median runtime was 7.6 versus 0.5 minutes per trial, with higher API list-price equivalents. These quantities describe computational burden; the subscription-based runs did not incur those reconstructed list-price amounts as expenditure.</w:t>
       </w:r>
     </w:p>
     <w:p>
@@ -3521,7 +3560,7 @@
         <w:pStyle w:val="BodyText"/>
       </w:pPr>
       <w:r>
-        <w:t xml:space="preserve">Generalization is bounded by ordered, availability-dependent trial selection, 16 fixed reviews, two experts and one run per trial per arm. Bootstrap intervals describe trial variation within those reviews, conditional on the observed experts and runs. They do not quantify variation across new reviews, assessors or repeated runs. Prior model exposure to reports is unknown. Offered labels could influence forced choices and revised ratings, despite source blinding. Results pertain to the evaluated software revision; documented assessment-command correspondence does not establish equivalence with the complete public release.</w:t>
+        <w:t xml:space="preserve">Generalization is bounded by purposive review selection, ordered and availability-dependent trial selection, 16 fixed reviews, two experts and one run per trial per arm. Bootstrap intervals describe trial variation within those reviews, conditional on the observed experts and runs. They do not quantify variation across new reviews, assessors or repeated runs. Prior model exposure to reports is unknown. Offered labels could influence forced choices and revised ratings, despite source blinding. Results pertain to the evaluated software revision; documented assessment-command correspondence does not establish equivalence with the complete public release.</w:t>
       </w:r>
     </w:p>
     <w:p>
@@ -3529,12 +3568,12 @@
         <w:pStyle w:val="BodyText"/>
       </w:pPr>
       <w:r>
-        <w:t xml:space="preserve">Reviewer use requires a separate evaluation. Soboczenski and colleagues randomized manual and RobotReviewer-assisted tasks using four domains of the earlier instrument, directly observing assessment time and reviewer behavior.[21] Jardim’s study in ongoing reviews found mixed acceptability and lacked a manual-only time comparison.[22] These studies show why output agreement, checking time and adoption merit separate outcomes. They do not establish benefit for ARBITER. A reviewer study should examine whether users detect unsupported interpretations, how long verification takes and how suggestions affect their final judgments, without treating acceptance or correction rates as semantic validation. ARBITER’s computational runtime cannot answer those questions.</w:t>
+        <w:t xml:space="preserve">Reviewer use requires a separate evaluation. Soboczenski and colleagues randomized manual and RobotReviewer-assisted tasks using four domains of the earlier instrument, directly observing assessment time and reviewer behavior.[22] Jardim’s study in ongoing reviews found mixed acceptability and lacked a manual-only time comparison.[23] These studies show why output agreement, checking time and adoption merit separate outcomes. They do not establish benefit for ARBITER. A reviewer study should examine whether users detect unsupported interpretations, how long verification takes and how suggestions affect their final judgments, without treating acceptance or correction rates as semantic validation. ARBITER’s computational runtime cannot answer those questions.</w:t>
       </w:r>
     </w:p>
     <w:bookmarkStart w:id="27" w:name="conclusion-1"/>
     <w:p>
-      <w:bookmarkStart w:id="126" w:name="loc_63"/>
+      <w:bookmarkStart w:id="130" w:name="loc_66"/>
       <w:pPr>
         <w:pStyle w:val="Heading2"/>
       </w:pPr>
@@ -3544,7 +3583,7 @@
         </w:rPr>
         <w:t>Conclusion</w:t>
       </w:r>
-      <w:bookmarkEnd w:id="126"/>
+      <w:bookmarkEnd w:id="130"/>
     </w:p>
     <w:p>
       <w:pPr>
@@ -3558,7 +3597,7 @@
     <w:bookmarkEnd w:id="28"/>
     <w:bookmarkStart w:id="38" w:name="back-matter"/>
     <w:p>
-      <w:bookmarkStart w:id="128" w:name="loc_65"/>
+      <w:bookmarkStart w:id="132" w:name="loc_68"/>
       <w:pPr>
         <w:pStyle w:val="Heading1"/>
       </w:pPr>
@@ -3568,11 +3607,11 @@
         </w:rPr>
         <w:t>BACK MATTER</w:t>
       </w:r>
-      <w:bookmarkEnd w:id="128"/>
+      <w:bookmarkEnd w:id="132"/>
     </w:p>
     <w:bookmarkStart w:id="29" w:name="acknowledgments-and-ai-use"/>
     <w:p>
-      <w:bookmarkStart w:id="129" w:name="loc_66"/>
+      <w:bookmarkStart w:id="133" w:name="loc_69"/>
       <w:pPr>
         <w:pStyle w:val="Heading2"/>
       </w:pPr>
@@ -3582,7 +3621,7 @@
         </w:rPr>
         <w:t>Acknowledgments and AI use</w:t>
       </w:r>
-      <w:bookmarkEnd w:id="129"/>
+      <w:bookmarkEnd w:id="133"/>
     </w:p>
     <w:p>
       <w:pPr>
@@ -3595,7 +3634,7 @@
     <w:bookmarkEnd w:id="29"/>
     <w:bookmarkStart w:id="30" w:name="funding"/>
     <w:p>
-      <w:bookmarkStart w:id="131" w:name="loc_68"/>
+      <w:bookmarkStart w:id="135" w:name="loc_71"/>
       <w:pPr>
         <w:pStyle w:val="Heading2"/>
       </w:pPr>
@@ -3605,7 +3644,7 @@
         </w:rPr>
         <w:t>Funding</w:t>
       </w:r>
-      <w:bookmarkEnd w:id="131"/>
+      <w:bookmarkEnd w:id="135"/>
     </w:p>
     <w:p>
       <w:pPr>
@@ -3618,7 +3657,7 @@
     <w:bookmarkEnd w:id="30"/>
     <w:bookmarkStart w:id="31" w:name="competing-interests"/>
     <w:p>
-      <w:bookmarkStart w:id="133" w:name="loc_70"/>
+      <w:bookmarkStart w:id="137" w:name="loc_73"/>
       <w:pPr>
         <w:pStyle w:val="Heading2"/>
       </w:pPr>
@@ -3628,7 +3667,7 @@
         </w:rPr>
         <w:t>Competing interests</w:t>
       </w:r>
-      <w:bookmarkEnd w:id="133"/>
+      <w:bookmarkEnd w:id="137"/>
     </w:p>
     <w:p>
       <w:pPr>
@@ -3641,7 +3680,7 @@
     <w:bookmarkEnd w:id="31"/>
     <w:bookmarkStart w:id="32" w:name="author-contributions"/>
     <w:p>
-      <w:bookmarkStart w:id="135" w:name="loc_72"/>
+      <w:bookmarkStart w:id="139" w:name="loc_75"/>
       <w:pPr>
         <w:pStyle w:val="Heading2"/>
       </w:pPr>
@@ -3651,7 +3690,7 @@
         </w:rPr>
         <w:t>Author contributions</w:t>
       </w:r>
-      <w:bookmarkEnd w:id="135"/>
+      <w:bookmarkEnd w:id="139"/>
     </w:p>
     <w:p>
       <w:pPr>
@@ -3664,7 +3703,7 @@
     <w:bookmarkEnd w:id="32"/>
     <w:bookmarkStart w:id="33" w:name="Xa795f839aa3476760733bd38e4d2d15944e6881"/>
     <w:p>
-      <w:bookmarkStart w:id="137" w:name="loc_74"/>
+      <w:bookmarkStart w:id="141" w:name="loc_77"/>
       <w:pPr>
         <w:pStyle w:val="Heading2"/>
       </w:pPr>
@@ -3674,7 +3713,7 @@
         </w:rPr>
         <w:t>Ethics, registration and public involvement</w:t>
       </w:r>
-      <w:bookmarkEnd w:id="137"/>
+      <w:bookmarkEnd w:id="141"/>
     </w:p>
     <w:p>
       <w:pPr>
@@ -3687,7 +3726,7 @@
     <w:bookmarkEnd w:id="33"/>
     <w:bookmarkStart w:id="37" w:name="data-availability"/>
     <w:p>
-      <w:bookmarkStart w:id="139" w:name="loc_76"/>
+      <w:bookmarkStart w:id="143" w:name="loc_79"/>
       <w:pPr>
         <w:pStyle w:val="Heading2"/>
       </w:pPr>
@@ -3697,7 +3736,7 @@
         </w:rPr>
         <w:t>Data availability</w:t>
       </w:r>
-      <w:bookmarkEnd w:id="139"/>
+      <w:bookmarkEnd w:id="143"/>
     </w:p>
     <w:p>
       <w:pPr>
@@ -3774,9 +3813,9 @@
     </w:p>
     <w:bookmarkEnd w:id="37"/>
     <w:bookmarkEnd w:id="38"/>
-    <w:bookmarkStart w:id="61" w:name="references"/>
-    <w:p>
-      <w:bookmarkStart w:id="141" w:name="loc_78"/>
+    <w:bookmarkStart w:id="62" w:name="references"/>
+    <w:p>
+      <w:bookmarkStart w:id="145" w:name="loc_81"/>
       <w:pPr>
         <w:pStyle w:val="Heading1"/>
       </w:pPr>
@@ -3786,7 +3825,7 @@
         </w:rPr>
         <w:t>REFERENCES</w:t>
       </w:r>
-      <w:bookmarkEnd w:id="141"/>
+      <w:bookmarkEnd w:id="145"/>
     </w:p>
     <w:p>
       <w:pPr>
@@ -3948,6 +3987,44 @@
         </w:numPr>
       </w:pPr>
       <w:r>
+        <w:t xml:space="preserve">Riaz IB, Naqvi SAA, Hasan B, Murad MH. Future of Evidence Synthesis: Automated, Living, and Interactive Systematic Reviews and Meta-analyses.</w:t>
+      </w:r>
+      <w:r>
+        <w:t xml:space="preserve"> </w:t>
+      </w:r>
+      <w:r>
+        <w:rPr>
+          <w:i/>
+          <w:iCs/>
+        </w:rPr>
+        <w:t xml:space="preserve">Mayo Clin Proc Digit Health</w:t>
+      </w:r>
+      <w:r>
+        <w:t xml:space="preserve"> </w:t>
+      </w:r>
+      <w:r>
+        <w:t xml:space="preserve">2024;2:361–65. doi:</w:t>
+      </w:r>
+      <w:hyperlink r:id="rId43">
+        <w:r>
+          <w:rPr>
+            <w:rStyle w:val="Hyperlink"/>
+          </w:rPr>
+          <w:t xml:space="preserve">10.1016/j.mcpdig.2024.05.023</w:t>
+        </w:r>
+      </w:hyperlink>
+      <w:r>
+        <w:t xml:space="preserve">.</w:t>
+      </w:r>
+    </w:p>
+    <w:p>
+      <w:pPr>
+        <w:numPr>
+          <w:ilvl w:val="0"/>
+          <w:numId w:val="1001"/>
+        </w:numPr>
+      </w:pPr>
+      <w:r>
         <w:t xml:space="preserve">Marshall IJ, Kuiper J, Wallace BC. RobotReviewer: evaluation of a system for automatically assessing bias in clinical trials.</w:t>
       </w:r>
       <w:r>
@@ -3966,7 +4043,7 @@
       <w:r>
         <w:t xml:space="preserve">2016;23:193–201. doi:</w:t>
       </w:r>
-      <w:hyperlink r:id="rId43">
+      <w:hyperlink r:id="rId44">
         <w:r>
           <w:rPr>
             <w:rStyle w:val="Hyperlink"/>
@@ -4001,7 +4078,7 @@
       <w:r>
         <w:t xml:space="preserve">. Association for Computational Linguistics, 2025:12–25. doi:</w:t>
       </w:r>
-      <w:hyperlink r:id="rId44">
+      <w:hyperlink r:id="rId45">
         <w:r>
           <w:rPr>
             <w:rStyle w:val="Hyperlink"/>
@@ -4039,7 +4116,7 @@
       <w:r>
         <w:t xml:space="preserve"> </w:t>
       </w:r>
-      <w:hyperlink r:id="rId45">
+      <w:hyperlink r:id="rId46">
         <w:r>
           <w:rPr>
             <w:rStyle w:val="Hyperlink"/>
@@ -4077,7 +4154,7 @@
       <w:r>
         <w:t xml:space="preserve">2026;21:e0353155. doi:</w:t>
       </w:r>
-      <w:hyperlink r:id="rId46">
+      <w:hyperlink r:id="rId47">
         <w:r>
           <w:rPr>
             <w:rStyle w:val="Hyperlink"/>
@@ -4115,7 +4192,7 @@
       <w:r>
         <w:t xml:space="preserve">2025;27:e70450. doi:</w:t>
       </w:r>
-      <w:hyperlink r:id="rId47">
+      <w:hyperlink r:id="rId48">
         <w:r>
           <w:rPr>
             <w:rStyle w:val="Hyperlink"/>
@@ -4153,7 +4230,7 @@
       <w:r>
         <w:t xml:space="preserve">2026;31:332–41. doi:</w:t>
       </w:r>
-      <w:hyperlink r:id="rId48">
+      <w:hyperlink r:id="rId49">
         <w:r>
           <w:rPr>
             <w:rStyle w:val="Hyperlink"/>
@@ -4191,7 +4268,7 @@
       <w:r>
         <w:t xml:space="preserve">2025;3:e70044. doi:</w:t>
       </w:r>
-      <w:hyperlink r:id="rId49">
+      <w:hyperlink r:id="rId50">
         <w:r>
           <w:rPr>
             <w:rStyle w:val="Hyperlink"/>
@@ -4229,7 +4306,7 @@
       <w:r>
         <w:t xml:space="preserve">2026;28:e84915. doi:</w:t>
       </w:r>
-      <w:hyperlink r:id="rId50">
+      <w:hyperlink r:id="rId51">
         <w:r>
           <w:rPr>
             <w:rStyle w:val="Hyperlink"/>
@@ -4267,7 +4344,7 @@
       <w:r>
         <w:t xml:space="preserve">2025;178:1763–71. doi:</w:t>
       </w:r>
-      <w:hyperlink r:id="rId51">
+      <w:hyperlink r:id="rId52">
         <w:r>
           <w:rPr>
             <w:rStyle w:val="Hyperlink"/>
@@ -4305,7 +4382,7 @@
       <w:r>
         <w:t xml:space="preserve">2025;31:60–69. doi:</w:t>
       </w:r>
-      <w:hyperlink r:id="rId52">
+      <w:hyperlink r:id="rId53">
         <w:r>
           <w:rPr>
             <w:rStyle w:val="Hyperlink"/>
@@ -4343,7 +4420,7 @@
       <w:r>
         <w:t xml:space="preserve">2011;64:96–106. doi:</w:t>
       </w:r>
-      <w:hyperlink r:id="rId53">
+      <w:hyperlink r:id="rId54">
         <w:r>
           <w:rPr>
             <w:rStyle w:val="Hyperlink"/>
@@ -4381,7 +4458,7 @@
       <w:r>
         <w:t xml:space="preserve">2026;126:106238. doi:</w:t>
       </w:r>
-      <w:hyperlink r:id="rId54">
+      <w:hyperlink r:id="rId55">
         <w:r>
           <w:rPr>
             <w:rStyle w:val="Hyperlink"/>
@@ -4419,7 +4496,7 @@
       <w:r>
         <w:t xml:space="preserve">2026;2:91–97. doi:</w:t>
       </w:r>
-      <w:hyperlink r:id="rId55">
+      <w:hyperlink r:id="rId56">
         <w:r>
           <w:rPr>
             <w:rStyle w:val="Hyperlink"/>
@@ -4460,7 +4537,7 @@
       <w:r>
         <w:t xml:space="preserve"> </w:t>
       </w:r>
-      <w:hyperlink r:id="rId56">
+      <w:hyperlink r:id="rId57">
         <w:r>
           <w:rPr>
             <w:rStyle w:val="Hyperlink"/>
@@ -4498,7 +4575,7 @@
       <w:r>
         <w:t xml:space="preserve">2026;5:e93761. doi:</w:t>
       </w:r>
-      <w:hyperlink r:id="rId57">
+      <w:hyperlink r:id="rId58">
         <w:r>
           <w:rPr>
             <w:rStyle w:val="Hyperlink"/>
@@ -4536,7 +4613,7 @@
       <w:r>
         <w:t xml:space="preserve">[Preprint]. Posted 23 September 2026. doi:</w:t>
       </w:r>
-      <w:hyperlink r:id="rId58">
+      <w:hyperlink r:id="rId59">
         <w:r>
           <w:rPr>
             <w:rStyle w:val="Hyperlink"/>
@@ -4574,7 +4651,7 @@
       <w:r>
         <w:t xml:space="preserve">2019;19:96. doi:</w:t>
       </w:r>
-      <w:hyperlink r:id="rId59">
+      <w:hyperlink r:id="rId60">
         <w:r>
           <w:rPr>
             <w:rStyle w:val="Hyperlink"/>
@@ -4612,7 +4689,7 @@
       <w:r>
         <w:t xml:space="preserve">2022;22:167. doi:</w:t>
       </w:r>
-      <w:hyperlink r:id="rId60">
+      <w:hyperlink r:id="rId61">
         <w:r>
           <w:rPr>
             <w:rStyle w:val="Hyperlink"/>
@@ -4624,10 +4701,10 @@
         <w:t xml:space="preserve">.</w:t>
       </w:r>
     </w:p>
-    <w:bookmarkEnd w:id="61"/>
     <w:bookmarkEnd w:id="62"/>
-    <w:p>
-      <w:bookmarkStart w:id="164" w:name="loc_101"/>
+    <w:bookmarkEnd w:id="63"/>
+    <w:p>
+      <w:bookmarkStart w:id="169" w:name="loc_105"/>
       <w:pPr>
         <w:pStyle w:val="Heading1"/>
         <w:pageBreakBefore/>
@@ -4635,7 +4712,7 @@
       <w:r>
         <w:t>FIGURE LEGENDS</w:t>
       </w:r>
-      <w:bookmarkEnd w:id="164"/>
+      <w:bookmarkEnd w:id="169"/>
     </w:p>
     <w:p>
       <w:pPr>
@@ -4680,7 +4757,7 @@
         <w:pageBreakBefore/>
       </w:pPr>
       <w:r>
-        <w:t>Figure 3. Paired evaluation and conditional primary endpoint. Both arms assessed the same 102 trials using the same Sonnet model and supplied documents. Two experts independently recorded ratings and signalling answers for all 510 trial-domain cells before viewing labels. In a separate stage, each chose among three labels presented in random order without rationales. The primary endpoint uses 60 agreed choices from 80 arm-discordant cells; 20 split choices enter sensitivities. The all-cell expert comparisons are not restricted to that conditional population. Counts are trials or cells as indicated; no interval applies.</w:t>
+        <w:t>Figure 3. Paired evaluation and conditional blinded-label choices. Both arms assessed the same 102 trials using the same Sonnet model and supplied documents. Two experts independently recorded ratings and signalling answers for all 510 trial-domain cells before viewing labels. In a separate stage, each chose among three labels presented in random order without rationales. The conditional choice estimate uses 60 agreed choices from 80 arm-discordant cells; 20 split choices enter sensitivities. The all-cell expert comparisons are not restricted to that conditional population. Counts are trials or cells as indicated; no interval applies.</w:t>
       </w:r>
     </w:p>
     <w:p>

</xml_diff>

<commit_message>
Publish evidence-developed manuscript and synchronized supplement
</commit_message>
<xml_diff>
--- a/analysis/output/manuscript/Manuscript.docx
+++ b/analysis/output/manuscript/Manuscript.docx
@@ -2,7 +2,7 @@
 <file path=word/document.xml><?xml version="1.0" encoding="utf-8"?>
 <w:document xmlns:w="http://schemas.openxmlformats.org/wordprocessingml/2006/main" xmlns:m="http://schemas.openxmlformats.org/officeDocument/2006/math" xmlns:r="http://schemas.openxmlformats.org/officeDocument/2006/relationships" xmlns:o="urn:schemas-microsoft-com:office:office" xmlns:v="urn:schemas-microsoft-com:vml" xmlns:w10="urn:schemas-microsoft-com:office:word" xmlns:a="http://schemas.openxmlformats.org/drawingml/2006/main" xmlns:pic="http://schemas.openxmlformats.org/drawingml/2006/picture" xmlns:wp="http://schemas.openxmlformats.org/drawingml/2006/wordprocessingDrawing">
   <w:body>
-    <w:bookmarkStart w:id="63" w:name="Xd6bc0427f4ae1b62f36b1141b02008da0f1b7c7"/>
+    <w:bookmarkStart w:id="58" w:name="Xd6bc0427f4ae1b62f36b1141b02008da0f1b7c7"/>
     <w:p>
       <w:pPr>
         <w:pStyle w:val="Title"/>
@@ -42,13 +42,13 @@
     </w:p>
     <w:p>
       <w:r>
-        <w:t>Word counts: main text 3704; structured abstract 214.</w:t>
+        <w:t>Word counts: main text 3340; structured abstract 217.</w:t>
       </w:r>
     </w:p>
     <w:bookmarkEnd w:id="9"/>
     <w:bookmarkStart w:id="15" w:name="abstract"/>
     <w:p>
-      <w:bookmarkStart w:id="69" w:name="loc_5"/>
+      <w:bookmarkStart w:id="64" w:name="loc_5"/>
       <w:pPr>
         <w:pStyle w:val="Heading1"/>
         <w:pageBreakBefore/>
@@ -60,7 +60,7 @@
         </w:rPr>
         <w:t>ABSTRACT</w:t>
       </w:r>
-      <w:bookmarkEnd w:id="69"/>
+      <w:bookmarkEnd w:id="64"/>
     </w:p>
     <w:bookmarkStart w:id="10" w:name="objective"/>
     <w:p>
@@ -75,7 +75,7 @@
         <w:t xml:space="preserve">Objective. </w:t>
       </w:r>
       <w:r>
-        <w:t xml:space="preserve">To present ARBITER, an inspectable workflow for the Cochrane risk-of-bias tool for randomised trials (RoB 2), and compare its judgments with same-model minimal prompting.</w:t>
+        <w:t xml:space="preserve">To compare an evidence-linked RoB 2 workflow with minimal prompting using the same reported model identifier, and evaluate agreement and inspectability.</w:t>
       </w:r>
     </w:p>
     <w:bookmarkEnd w:id="10"/>
@@ -92,7 +92,7 @@
         <w:t xml:space="preserve">Materials and Methods. </w:t>
       </w:r>
       <w:r>
-        <w:t xml:space="preserve">ARBITER retains sources, evidence and signalling answers and applies decision rules in software. Its Sonnet workflow and a minimal-prompt comparator (Unassisted) assessed identical supplied documents for 102 trials from 16 reviews. Outcomes included agreement with published labels, independent expert ratings and conditional blinded label choices. Paired intervals resampled trials within fixed reviews.</w:t>
+        <w:t xml:space="preserve">ARBITER records sources, selected evidence and signalling answers; software derives proposed ratings. ARBITER and minimal prompting (Unassisted) assessed identical supplied documents for 102 trials from 16 reviews. We compared published labels, independent expert ratings and conditional blinded label choices. Paired intervals resampled trials within fixed reviews.</w:t>
       </w:r>
     </w:p>
     <w:bookmarkEnd w:id="11"/>
@@ -109,7 +109,7 @@
         <w:t xml:space="preserve">Results. </w:t>
       </w:r>
       <w:r>
-        <w:t xml:space="preserve">Against published labels, ARBITER minus Unassisted exact agreement was −1.8 percentage points (95% CI, −5.1 to 1.6). Exact agreement was 371/510 (72.7%) versus 332/510 (65.1%) against Expert 1 and 433/510 (84.9%) versus 400/510 (78.4%) against Expert 2. Paired gains were 7.6 points (95% CI, 5.1–10.2) and 6.5 (3.5–9.4). Among 80 workflow disagreements, experts agreed on 60 blinded label choices and split on 20; 53/60 agreed choices matched ARBITER (88%; 95% CI, 80–96%). All 510 ARBITER domain outputs followed executable rules. Structural checks did not assess evidence support. Median runtime was 7.6 versus 0.5 minutes per trial.</w:t>
+        <w:t xml:space="preserve">Against published labels, ARBITER minus Unassisted exact agreement was −1.8 percentage points (95% CI, −5.1 to 1.6). Agreement with Expert 1 was 371/510 (72.7%) versus 332/510 (65.1%), a gain of 7.6 points (95% CI, 5.1–10.2); with Expert 2, it was 433/510 (84.9%) versus 400/510 (78.4%), a gain of 6.5 (3.5–9.4). Among 80 workflow disagreements, experts agreed on 60 blinded choices and split on 20; 53/60 agreed choices matched ARBITER (88%; 95% CI, 80–96%). All 510 adopted ARBITER domain ratings conformed to the decision rules. Median runtime was 7.6 versus 0.5 minutes per trial.</w:t>
       </w:r>
     </w:p>
     <w:bookmarkEnd w:id="12"/>
@@ -126,7 +126,7 @@
         <w:t xml:space="preserve">Discussion. </w:t>
       </w:r>
       <w:r>
-        <w:t xml:space="preserve">Label matching does not endorse ARBITER’s reasoning. Agreement varied by domain and reference. The complete-workflow comparison cannot isolate component effects or establish reviewer benefit.</w:t>
+        <w:t xml:space="preserve">Agreement depended on the reference and domain. Structural source checks did not validate evidence support, and label choices did not evaluate reasoning. The complete-workflow comparison cannot isolate component effects or establish reviewer benefit.</w:t>
       </w:r>
     </w:p>
     <w:bookmarkEnd w:id="13"/>
@@ -143,14 +143,14 @@
         <w:t xml:space="preserve">Conclusion. </w:t>
       </w:r>
       <w:r>
-        <w:t xml:space="preserve">ARBITER preserved an inspectable assessment pathway and agreed more often with both independent experts in this single-run benchmark.</w:t>
+        <w:t xml:space="preserve">In this single-run benchmark, ARBITER preserved an inspectable assessment pathway and agreed more often with both independent experts, without a clear published-label agreement advantage.</w:t>
       </w:r>
     </w:p>
     <w:bookmarkEnd w:id="14"/>
     <w:bookmarkEnd w:id="15"/>
     <w:bookmarkStart w:id="18" w:name="introduction"/>
     <w:p>
-      <w:bookmarkStart w:id="75" w:name="loc_11"/>
+      <w:bookmarkStart w:id="70" w:name="loc_11"/>
       <w:pPr>
         <w:pStyle w:val="Heading1"/>
         <w:pageBreakBefore/>
@@ -161,11 +161,11 @@
         </w:rPr>
         <w:t>INTRODUCTION</w:t>
       </w:r>
-      <w:bookmarkEnd w:id="75"/>
+      <w:bookmarkEnd w:id="70"/>
     </w:p>
     <w:bookmarkStart w:id="16" w:name="background-and-significance"/>
     <w:p>
-      <w:bookmarkStart w:id="76" w:name="loc_12"/>
+      <w:bookmarkStart w:id="71" w:name="loc_12"/>
       <w:pPr>
         <w:pStyle w:val="Heading2"/>
       </w:pPr>
@@ -175,14 +175,14 @@
         </w:rPr>
         <w:t>Background and significance</w:t>
       </w:r>
-      <w:bookmarkEnd w:id="76"/>
+      <w:bookmarkEnd w:id="71"/>
     </w:p>
     <w:p>
       <w:pPr>
         <w:pStyle w:val="FirstParagraph"/>
       </w:pPr>
       <w:r>
-        <w:t xml:space="preserve">Risk-of-bias assessment informs how trial results contribute to evidence synthesis. The Cochrane risk-of-bias tool for randomised trials (RoB 2) evaluates a specified result across five domains, using signalling answers to propose domain judgments and an overall rating.[1] Reviewers must identify the relevant outcome, comparison and analysis, interpret information across trial reports and supporting documents, and justify their answers. The work therefore involves both evidence interpretation and consistent rule application.</w:t>
+        <w:t xml:space="preserve">Risk-of-bias assessment requires reviewers to connect a judgment to the particular trial result and evidence that justify it. RoB 2 formalizes the transition from signalling answers to proposed ratings,[1] but reaching those answers still requires interpretation across reports, registries and supporting documents. In a cross-sectional exercise involving four raters and 70 trial outcomes, overall Fleiss κ was 0.16 (95% CI, 0.08–0.24), and assessment took a mean 28 minutes per outcome.[2] Agreement can also change as teams develop shared conventions. In one multiple-sclerosis review, calibration and review-specific signalling-question instructions preceded an increase in overall κ from −0.15 during calibration to 0.11 for the first five studies assessed with the instructions and 0.42 for the remaining 11.[3] That sequential, single-team evaluation cannot separate instruction effects from discussion, practice or study order. Together, these findings identify interpretation and implementation as consequential parts of appraisal, even with a structured instrument.</w:t>
       </w:r>
     </w:p>
     <w:p>
@@ -190,29 +190,13 @@
         <w:pStyle w:val="BodyText"/>
       </w:pPr>
       <w:r>
-        <w:t xml:space="preserve">RoB 2 reliability studies document disagreement and application difficulties; review-specific instructions and calibration were followed by improved agreement in one setting.[2,3] Work with the earlier Cochrane instrument also identified different interpretations of the same information across reviews.[4] These demands recur as evidence syntheses are updated. Riaz and colleagues describe a framework for automated, living evidence synthesis that integrates distinct review tasks with human oversight.[5] This provides a motivation to investigate assistance with appraisal, without assuming that automation reduces reviewer workload.</w:t>
-      </w:r>
-    </w:p>
-    <w:p>
-      <w:pPr>
-        <w:pStyle w:val="BodyText"/>
-      </w:pPr>
-      <w:r>
-        <w:t xml:space="preserve">Prior systems have made substantial parts of the assessment accessible to automation. RobotReviewer paired judgments with supporting sentences for the earlier instrument and evaluated text relevance separately from classification.[6] ROBOTO2 integrates document parsing, retrieved evidence, preliminary signalling answers and editable judgments; its evaluation also identified overly conservative and no-information responses despite available evidence.[7] RoBGuard combines question reformulation, multimodal document parsing and collaboration among model roles.[8] Structured RoB 2 prompting has been compared with human assessments,[9,10] and same-model comparisons of direct and constrained prompts have been studied with the earlier instrument.[11] These approaches establish useful capabilities, but a plausible label or authentic quotation does not establish appropriate evidence interpretation. Evaluation must distinguish evidence selection, signalling answers and rule application, and identify the reference against which agreement is measured.</w:t>
-      </w:r>
-    </w:p>
-    <w:p>
-      <w:pPr>
-        <w:pStyle w:val="BodyText"/>
-      </w:pPr>
-      <w:r>
-        <w:t xml:space="preserve">The Agentic Risk of Bias Inference Tool for Evidence Reviews (ARBITER) retains sources, selected evidence, signalling answers and decision traces for experienced evidence reviewers who retain responsibility for the assessment. The model interprets trial evidence; software derives proposed ratings from the recorded answers. We evaluated this complete workflow against same-model minimal prompting with identical supplied trial documents.</w:t>
+        <w:t xml:space="preserve">Automated assistance must therefore preserve the connection between a result-specific judgment and its evidential basis. In living evidence synthesis, newly available trials and supporting documents require repeated appraisal; retaining the basis of earlier judgments could help reviewers revisit them when evidence changes, consistent with frameworks integrating automation and human oversight.[4] RobotReviewer paired classifications with supporting sentences for the earlier Cochrane instrument, evaluating text relevance separately from classification.[5] ROBOTO2 combines document parsing, retrieved passages, signalling answers and editable RoB 2 assessments;[6] RoBGuard adds multimodal parsing and collaboration among model roles.[7] These systems make evidence available for inspection, but a source-linked quotation can be authentic yet irrelevant to the assessed result, and a plausible rating can conflict with the answers offered to justify it. Source fidelity, support for an answer and conformity to decision rules therefore require distinct evaluation.</w:t>
       </w:r>
     </w:p>
     <w:bookmarkEnd w:id="16"/>
     <w:bookmarkStart w:id="17" w:name="objective-1"/>
     <w:p>
-      <w:bookmarkStart w:id="81" w:name="loc_17"/>
+      <w:bookmarkStart w:id="74" w:name="loc_15"/>
       <w:pPr>
         <w:pStyle w:val="Heading2"/>
       </w:pPr>
@@ -222,21 +206,21 @@
         </w:rPr>
         <w:t>Objective</w:t>
       </w:r>
-      <w:bookmarkEnd w:id="81"/>
+      <w:bookmarkEnd w:id="74"/>
     </w:p>
     <w:p>
       <w:pPr>
         <w:pStyle w:val="FirstParagraph"/>
       </w:pPr>
       <w:r>
-        <w:t xml:space="preserve">We examined agreement with published review labels and independently recorded expert ratings, followed by blinded label choices where the workflows disagreed. We also evaluated domain and signalling-answer variation, rule conformance, source records and computational burden. These outcomes address distinct properties of the assessment rather than a single standard of correctness.</w:t>
+        <w:t xml:space="preserve">We developed the Agentic Risk of Bias Inference Tool for Evidence Reviews (ARBITER) to preserve this pathway for experienced evidence reviewers. The model selects evidence and interprets it; software applies decision rules to the recorded answers. We asked whether the complete workflow was associated with different agreement from minimal prompting, and whether that comparison depended on the human reference. We used the same reported model identifier, comparable configuration and identical supplied trial documents to examine agreement with published review labels, independently recorded expert ratings and subsequent blinded label choices, alongside answer-level variation, rule conformance, source records and computational burden.</w:t>
       </w:r>
     </w:p>
     <w:bookmarkEnd w:id="17"/>
     <w:bookmarkEnd w:id="18"/>
-    <w:bookmarkStart w:id="25" w:name="materials-and-methods-1"/>
-    <w:p>
-      <w:bookmarkStart w:id="83" w:name="loc_19"/>
+    <w:bookmarkStart w:id="26" w:name="materials-and-methods-1"/>
+    <w:p>
+      <w:bookmarkStart w:id="76" w:name="loc_17"/>
       <w:pPr>
         <w:pStyle w:val="Heading1"/>
       </w:pPr>
@@ -246,11 +230,11 @@
         </w:rPr>
         <w:t>MATERIALS AND METHODS</w:t>
       </w:r>
-      <w:bookmarkEnd w:id="83"/>
+      <w:bookmarkEnd w:id="76"/>
     </w:p>
     <w:bookmarkStart w:id="19" w:name="system-design"/>
     <w:p>
-      <w:bookmarkStart w:id="84" w:name="loc_20"/>
+      <w:bookmarkStart w:id="77" w:name="loc_18"/>
       <w:pPr>
         <w:pStyle w:val="Heading2"/>
       </w:pPr>
@@ -260,14 +244,14 @@
         </w:rPr>
         <w:t>System design</w:t>
       </w:r>
-      <w:bookmarkEnd w:id="84"/>
+      <w:bookmarkEnd w:id="77"/>
     </w:p>
     <w:p>
       <w:pPr>
         <w:pStyle w:val="FirstParagraph"/>
       </w:pPr>
       <w:r>
-        <w:t xml:space="preserve">ARBITER separates interpretation of trial evidence from application of the RoB 2 decision rules (Figure 1). The model identifies the result to assess, examines the available documents and answers the signalling questions; software computes the domain ratings implied by those answers. A result-approval step allows an interactive reviewer to inspect the proposed target before domain assessment. In the automated benchmark, the harness accepted that proposal unchanged.</w:t>
+        <w:t xml:space="preserve">ARBITER separates evidence interpretation from rating derivation (Figure 1). The model identifies the result, examines documents and answers the signalling questions. Software checks permissible answers, required question paths and evidence references, then computes the proposed domain ratings. An interactive reviewer can approve the proposed target before assessment; our automated harness accepted it unchanged.</w:t>
       </w:r>
     </w:p>
     <w:p>
@@ -275,7 +259,7 @@
         <w:pStyle w:val="BodyText"/>
       </w:pPr>
       <w:r>
-        <w:t xml:space="preserve">Source documents are retained with cryptographic hashes identifying their contents. Extracted page text has a separate version identifier linking passages to the captured document and extraction. The model selects evidence through document-reading and search tools, using returned passage references, page and line ranges, or copied text that must match a source passage. Unmatched or ambiguous copied text is rejected. Software stores the selected source slice with its source, page and character offsets. This constrains fabricated quotation wording within the text evidence pathway; it does not establish that a passage is relevant, complete or appropriately interpreted. Document-extraction errors can persist.</w:t>
+        <w:t xml:space="preserve">ARBITER retains source documents and their extracted text. Reading and search tools return passage references. The model selects a passage using those references, page/line ranges or copied text as a locator. Copied text must match the captured source; unmatched or ambiguous selections are rejected. The accepted quotation is stored from the actual captured source slice, with its page and character offsets. Thus, the tool constrains fabricated quotation wording within this pathway, while errors in document extraction, incomplete selection and inappropriate interpretation remain possible. Visual evidence instead links a rendered page and selected region to a model-written transcription, which is not independently verified.</w:t>
       </w:r>
     </w:p>
     <w:p>
@@ -283,29 +267,13 @@
         <w:pStyle w:val="BodyText"/>
       </w:pPr>
       <w:r>
-        <w:t xml:space="preserve">For material requiring visual interpretation, evidence records link a rendered source page and selected region to a model-written transcription. These links do not independently verify the transcription or interpretation. Each signalling answer records its evidential basis and justification, with provision for uncertainty and counterevidence. Software checks answer options, required question paths and evidence references before applying the decision algorithms.</w:t>
-      </w:r>
-    </w:p>
-    <w:p>
-      <w:pPr>
-        <w:pStyle w:val="BodyText"/>
-      </w:pPr>
-      <w:r>
-        <w:t xml:space="preserve">The algorithm-derived proposal and adopted domain rating are recorded separately. A departure requires a documented rationale and supporting evidence linked to the saved answers. Proposed and adopted ratings were checked separately in the evaluation. The exported HTML report and audit file retain evidence links, answers and decision traces for inspection. Runtime source-text matching, assessment-file verification and the study’s structural source-provenance audit are distinct checks; the latter did not independently re-extract quotations from original documents. None determines whether the evidence justifies the signalling answers.</w:t>
-      </w:r>
-    </w:p>
-    <w:p>
-      <w:pPr>
-        <w:pStyle w:val="BodyText"/>
-      </w:pPr>
-      <w:r>
-        <w:t xml:space="preserve">The AVATAR assessment illustrates the pathway for all-cause death after early surgery versus watchful waiting in asymptomatic severe aortic stenosis (Figure 2; complete trace in the supplement). The case illustrates the workflow rather than typical performance. Its stored documents did not establish a dated analysis plan for the assessed result.</w:t>
+        <w:t xml:space="preserve">Each answer retains evidence and justification, with provision for uncertainty and counterevidence. The algorithm-derived proposal and adopted rating are separate: adopting a different rating requires a rationale and supporting evidence linked to the answers. We checked both. Exported HTML reports and audit files retain the assessment pathway. Runtime text matching, assessment-file verification and our structural source-provenance audit are separate checks; the audit did not re-extract quotations independently or test whether they justified the answers. Figure 2 illustrates the AVATAR assessment of all-cause death after early surgery versus watchful waiting in asymptomatic severe aortic stenosis, with its complete trace in the supplement. The case illustrates the workflow rather than typical performance; its stored documents did not establish a dated analysis plan for the assessed result.</w:t>
       </w:r>
     </w:p>
     <w:bookmarkEnd w:id="19"/>
-    <w:bookmarkStart w:id="21" w:name="benchmark-and-assessment-arms"/>
-    <w:p>
-      <w:bookmarkStart w:id="90" w:name="loc_26"/>
+    <w:bookmarkStart w:id="22" w:name="benchmark-and-assessment-arms"/>
+    <w:p>
+      <w:bookmarkStart w:id="81" w:name="loc_22"/>
       <w:pPr>
         <w:pStyle w:val="Heading2"/>
       </w:pPr>
@@ -315,14 +283,14 @@
         </w:rPr>
         <w:t>Benchmark and assessment arms</w:t>
       </w:r>
-      <w:bookmarkEnd w:id="90"/>
+      <w:bookmarkEnd w:id="81"/>
     </w:p>
     <w:p>
       <w:pPr>
         <w:pStyle w:val="FirstParagraph"/>
       </w:pPr>
       <w:r>
-        <w:t xml:space="preserve">We assembled a purposive benchmark spanning 15 medical specialties. The selection team reported searching Europe PMC for 2025–2026 meta-analyses of randomized trials, prioritizing journal standing and citation counts while requiring explicit RoB 2 use and extractable trial-level domain judgments. Search and ranking records were not recovered; the selected reviews are not verified as the highest-ranked or most-cited eligible candidates. The source set contained 105 trials from 16 reviews. Within reviews, trials were selected in table order, taking up to seven obtainable eligible trials and replacing unavailable reports with the next eligible trial; duplicate trials were removed. Three trials designated by the author as unsupported designs were excluded, leaving 102. Atwine’s stored design classification is disputed by the author; its specific unsupported subtype remains unverified. The supplementary benchmark table documents reviews, specialties and source availability.</w:t>
+        <w:t xml:space="preserve">We selected reviews purposively across 15 medical specialties. We searched Europe PMC for 2025–2026 meta-analyses of randomized trials, prioritizing journal standing and citation counts and requiring explicit RoB 2 use with extractable trial-level domain labels. Search dates and ranking records are unavailable. Within reviews, we took up to seven obtainable eligible trials in table order, replacing unavailable reports with the next eligible trial and removing duplicates. The source set comprised 105 trials from 16 reviews; we excluded three trials outside the supported design scope, leaving 102. The supplementary benchmark table documents reviews, specialties and source availability.</w:t>
       </w:r>
     </w:p>
     <w:p>
@@ -330,7 +298,7 @@
         <w:pStyle w:val="BodyText"/>
       </w:pPr>
       <w:r>
-        <w:t xml:space="preserve">Candidate targets initially followed trial-primary outcomes. Before the reported runs, 43 of 105 targets were revised toward the results underlying the published review labels. Final prompts specified the assessment outcome, comparison, time point and numerical result as printed in the revised target ledger. Correspondence with published labels could still be partial, inferred, different or indeterminate; some labels covered several outcomes. Comparisons retained all domain cells; target uncertainty was considered qualitatively.</w:t>
+        <w:t xml:space="preserve">Initial targets followed trial-primary outcomes. Before the runs, 43 of 105 targets were revised toward the results underlying published labels. Final prompts specified outcome, comparison, time point and numerical result. Alignment with published labels remained partial, inferred, different or indeterminate for some targets, and some labels covered several outcomes. We retained all domain cells and considered this uncertainty qualitatively.</w:t>
       </w:r>
     </w:p>
     <w:p>
@@ -338,7 +306,7 @@
         <w:pStyle w:val="BodyText"/>
       </w:pPr>
       <w:r>
-        <w:t xml:space="preserve">Both arms received identical underlying trial evidence: articles, supplements, stored copies of registry records, protocols and statistical analysis plans available in the captured input set. Unassisted, the same-model minimal-prompt comparator, received copies of the registry records and acquired documents from the ARBITER run; these were not fetched anew. Availability varied by trial. The supplied De Waal registry record concerned another trial and did not establish information about the assessed result.</w:t>
+        <w:t xml:space="preserve">Both arms received identical underlying trial evidence from the captured input set: articles, supplements, registry copies, protocols and analysis plans, with availability varying by trial. Unassisted received copies of registry records and acquired documents from the ARBITER run rather than newly retrieved versions. A supplied record could concern the wrong trial; sharing inputs did not establish their completeness or correctness.</w:t>
       </w:r>
     </w:p>
     <w:p>
@@ -346,7 +314,7 @@
         <w:pStyle w:val="BodyText"/>
       </w:pPr>
       <w:r>
-        <w:t xml:space="preserve">Unassisted received the assessment task sentence and one fixed output-format sentence, without RoB 2 guidance. It could read and search local documents but had no access to ARBITER’s software service, assessment instructions or the web. ARBITER additionally received assessment instructions and guidance through an assessment skill, a packaged set of workflow instructions. The arms therefore shared trial evidence but differed in instructions and processing. The comparison evaluated the complete workflow and did not isolate the effects of guidance, software or computation. It also differed from the structured-prompt comparators used in several prior studies.[9,10,12,13]</w:t>
+        <w:t>Unassisted received the task sentence and one fixed output-format sentence, without RoB 2 guidance. It could read and search local documents but could not access ARBITER’s software service, assessment instructions or the web. ARBITER additionally received packaged workflow instructions and RoB 2 guidance through an assessment skill. Structured-prompt alternatives have been evaluated elsewhere.⁠[8,9,10]</w:t>
       </w:r>
     </w:p>
     <w:p>
@@ -366,7 +334,7 @@
         <w:t xml:space="preserve">claude-sonnet-5-5</w:t>
       </w:r>
       <w:r>
-        <w:t xml:space="preserve">, medium effort, in Claude Code 2.1.278, with isolated settings and external connectors and memory disabled. ARBITER ran on 12 October 2026 and Unassisted on 14 October 2026, once per trial per arm. Identity of the immutable underlying model snapshot across the two dates was not established. eMethods identifies the evaluated software revision. The installable public release is ARBITER 1.0.0, commit</w:t>
+        <w:t xml:space="preserve">, medium effort, in Claude Code 2.1.278, with isolated settings, external connectors and memory disabled. ARBITER ran on 12 October 2026 and Unassisted on 14 October 2026, once per trial per arm. An identical immutable model snapshot across dates was not established. The protocol permitted “Continue.” at most twice per phase without coaching. The benchmark was not used to develop the workflow. Development included ten prostate-cancer trials and synthetic diagnostic cases. Complete development-exposure history, prompt and assessment-skill selection history, and version-freeze documentation remain pending. We evaluated</w:t>
       </w:r>
       <w:r>
         <w:t xml:space="preserve"> </w:t>
@@ -376,71 +344,34 @@
           <w:rPr>
             <w:rStyle w:val="Hyperlink"/>
           </w:rPr>
-          <w:t xml:space="preserve">2f549ae</w:t>
+          <w:t xml:space="preserve">this source revision</w:t>
         </w:r>
       </w:hyperlink>
       <w:r>
-        <w:t xml:space="preserve">. The evaluated runner invoked</w:t>
+        <w:t xml:space="preserve">;</w:t>
       </w:r>
       <w:r>
         <w:t xml:space="preserve"> </w:t>
       </w:r>
-      <w:r>
-        <w:rPr>
-          <w:rStyle w:val="VerbatimChar"/>
-        </w:rPr>
-        <w:t xml:space="preserve">/rob2-assess</w:t>
-      </w:r>
-      <w:r>
-        <w:t xml:space="preserve">;</w:t>
-      </w:r>
+      <w:hyperlink r:id="rId21">
+        <w:r>
+          <w:rPr>
+            <w:rStyle w:val="Hyperlink"/>
+          </w:rPr>
+          <w:t xml:space="preserve">public ARBITER 1.0.0 source</w:t>
+        </w:r>
+      </w:hyperlink>
       <w:r>
         <w:t xml:space="preserve"> </w:t>
       </w:r>
       <w:r>
-        <w:rPr>
-          <w:rStyle w:val="VerbatimChar"/>
-        </w:rPr>
-        <w:t xml:space="preserve">/arbiter-assess</w:t>
-      </w:r>
-      <w:r>
-        <w:t xml:space="preserve"> </w:t>
-      </w:r>
-      <w:r>
-        <w:t xml:space="preserve">is the public command name. The retained release audit documents correspondence between the evaluated and public assessment commands, without establishing equivalence of the complete releases. The protocol allowed</w:t>
-      </w:r>
-      <w:r>
-        <w:t xml:space="preserve"> </w:t>
-      </w:r>
-      <w:r>
-        <w:t xml:space="preserve">“Continue.”</w:t>
-      </w:r>
-      <w:r>
-        <w:t xml:space="preserve"> </w:t>
-      </w:r>
-      <w:r>
-        <w:t xml:space="preserve">at most twice per phase without coaching. eMethods reproduces both prompt templates, the command invoking the ARBITER assessment skill, the Unassisted format instruction and a filled example. Recovered ARBITER</w:t>
-      </w:r>
-      <w:r>
-        <w:t xml:space="preserve"> </w:t>
-      </w:r>
-      <w:r>
-        <w:rPr>
-          <w:rStyle w:val="VerbatimChar"/>
-        </w:rPr>
-        <w:t xml:space="preserve">eval/</w:t>
-      </w:r>
-      <w:r>
-        <w:t xml:space="preserve"> </w:t>
-      </w:r>
-      <w:r>
-        <w:t xml:space="preserve">records contain ten prostate-cancer trials and synthetic diagnostic cases used in development. The author reports that this benchmark was not used in development; the recovered records do not establish an exhaustive development-exposure history. [Pending: complete prompt and assessment-skill selection history and version-freeze documentation.]</w:t>
-      </w:r>
-    </w:p>
-    <w:bookmarkEnd w:id="21"/>
-    <w:bookmarkStart w:id="22" w:name="independent-expert-references"/>
-    <w:p>
-      <w:bookmarkStart w:id="96" w:name="loc_32"/>
+        <w:t xml:space="preserve">is available. eMethods describes prompts and invocation details.</w:t>
+      </w:r>
+    </w:p>
+    <w:bookmarkEnd w:id="22"/>
+    <w:bookmarkStart w:id="23" w:name="independent-expert-references"/>
+    <w:p>
+      <w:bookmarkStart w:id="87" w:name="loc_28"/>
       <w:pPr>
         <w:pStyle w:val="Heading2"/>
       </w:pPr>
@@ -450,14 +381,14 @@
         </w:rPr>
         <w:t>Independent expert references</w:t>
       </w:r>
-      <w:bookmarkEnd w:id="96"/>
+      <w:bookmarkEnd w:id="87"/>
     </w:p>
     <w:p>
       <w:pPr>
         <w:pStyle w:val="FirstParagraph"/>
       </w:pPr>
       <w:r>
-        <w:t xml:space="preserve">Two blinded experts, published researchers from BEACON Lab, assessed all 102 trials across the five domains. Each trial–domain pair constituted a cell. Each expert independently recorded and froze signalling answers and domain ratings before seeing any offered label. No AI was used for these judgments. Experts received the same trial materials, supplements and ClinicalTrials.gov records as the arms, the same task prompt specifying outcomes, contrasts and numerical anchors, and access to Cochrane RoB 2 guidance. [Pending: individual qualifications and RoB 2 experience, training/calibration and conventions for targets containing several outcomes.]</w:t>
+        <w:t xml:space="preserve">Two blinded experts, published researchers from BEACON Lab, independently assessed all five domains for every trial. A trial–domain pair constituted a cell. Each expert recorded and froze signalling answers and domain ratings before seeing offered labels, without AI assistance. Experts received the same trial materials, supplements and ClinicalTrials.gov records as the arms, the same target prompt specifying outcomes, contrasts and numerical anchors, and access to Cochrane guidance. [Pending: individual qualifications and RoB 2 experience, training/calibration and conventions for targets containing several outcomes.]</w:t>
       </w:r>
     </w:p>
     <w:p>
@@ -465,13 +396,13 @@
         <w:pStyle w:val="BodyText"/>
       </w:pPr>
       <w:r>
-        <w:t xml:space="preserve">Each expert then saw the published, Unassisted and ARBITER labels in an order randomized for each cell, without source identities or rationales, and chose the most defensible label. Each expert subsequently supplied a revised rating, which could differ from all offered labels, and recorded whether signalling answers were retained or changed. Independent ratings, label choices and revised ratings were analyzed separately. Blinded adjudication of discordant data-extraction items supplied a design precedent.[14] eMethods summarizes the assessment sequence; the completed assessment workbooks are available in the study repository. [Pending: original blank assessment form.]</w:t>
-      </w:r>
-    </w:p>
-    <w:bookmarkEnd w:id="22"/>
-    <w:bookmarkStart w:id="23" w:name="outcomes"/>
-    <w:p>
-      <w:bookmarkStart w:id="99" w:name="loc_35"/>
+        <w:t xml:space="preserve">Subsequently, each expert saw Published, Unassisted and ARBITER labels in an order randomized by cell, without source identities or rationales, and chose the most defensible label. Each then supplied a revised rating, potentially different from all offered labels, and recorded whether answers were retained or changed. We analyzed independent ratings, choices and revised ratings separately; blinded adjudication in data extraction provided a procedural precedent.[11] Completed workbooks are available in the study repository, and eMethods summarizes the sequence. [Pending: original blank assessment form.]</w:t>
+      </w:r>
+    </w:p>
+    <w:bookmarkEnd w:id="23"/>
+    <w:bookmarkStart w:id="24" w:name="outcomes"/>
+    <w:p>
+      <w:bookmarkStart w:id="90" w:name="loc_31"/>
       <w:pPr>
         <w:pStyle w:val="Heading2"/>
       </w:pPr>
@@ -481,14 +412,14 @@
         </w:rPr>
         <w:t>Outcomes</w:t>
       </w:r>
-      <w:bookmarkEnd w:id="99"/>
+      <w:bookmarkEnd w:id="90"/>
     </w:p>
     <w:p>
       <w:pPr>
         <w:pStyle w:val="FirstParagraph"/>
       </w:pPr>
       <w:r>
-        <w:t xml:space="preserve">We evaluated agreement with published review labels (Published), independent expert ratings and subsequent blinded label choices, followed by domain/answer detail, structural checks and computation. This reporting order was adopted after analysis; it does not imply prospective outcome specification.</w:t>
+        <w:t xml:space="preserve">We report published-label agreement first, followed by independent-expert agreement, conditional label choices, domain/answer detail and process outcomes. This order was adopted after analysis and does not imply prospective specification or a formal outcome hierarchy.</w:t>
       </w:r>
     </w:p>
     <w:p>
@@ -496,7 +427,7 @@
         <w:pStyle w:val="BodyText"/>
       </w:pPr>
       <w:r>
-        <w:t xml:space="preserve">Published-label comparisons used exact agreement and paired percentage-point differences between arms across all 510 cells, followed by linearly weighted Cohen’s κ, sensitivity for Some concerns or High, and specificity, with Gwet’s AC2 supplementary. An All-Low rule described label prevalence; its κ was suppressed because predictions lacked variance. Missing predictions counted as disagreement. Published labels were a review-derived reference, distinct from the independent expert ratings.</w:t>
+        <w:t xml:space="preserve">For Published, we calculated exact agreement and paired percentage-point differences across 510 cells, followed by linearly weighted Cohen’s κ, sensitivity for Some concerns or High, and specificity; Gwet’s AC2 is supplementary. An All-Low rule described prevalence, with κ suppressed because predictions lacked variance. Missing predictions counted as disagreement. We separately compared each source with each expert’s independent ratings using exact agreement, paired differences and weighted κ. Independent reference ratings were read directly from the expert assessment records. Supporting analyses included expert-to-expert agreement, unweighted κ, confusion matrices, expert means and cells where experts agreed.</w:t>
       </w:r>
     </w:p>
     <w:p>
@@ -504,7 +435,7 @@
         <w:pStyle w:val="BodyText"/>
       </w:pPr>
       <w:r>
-        <w:t xml:space="preserve">Each source was compared separately with each expert’s independent domain ratings using exact agreement, paired percentage-point differences between arms and linearly weighted κ. Reference ratings were read directly from the experts’ assessment records. Supporting analyses included expert-to-expert agreement, unweighted κ, confusion matrices, expert means and restriction to cells where independent experts agreed.</w:t>
+        <w:t xml:space="preserve">The conditional label-choice analysis included the cells where the arms differed and both experts chose the same label. Its numerator counted agreed labels matching ARBITER. Credit followed label equality, including credit to multiple sources with the same label or neither arm if neither matched. Identical labels from all sources could not distinguish sources. Sensitivities examined each expert’s choices over all arm disagreements and counted split choices as ARBITER losses without assigning Unassisted wins. These outcomes measured label matches, not endorsement of reasoning.</w:t>
       </w:r>
     </w:p>
     <w:p>
@@ -512,7 +443,7 @@
         <w:pStyle w:val="BodyText"/>
       </w:pPr>
       <w:r>
-        <w:t xml:space="preserve">The conditional blinded-label outcome was the proportion of agreed expert choices matching ARBITER among cells where the arms’ ratings differed. The denominator included only cells in which both experts chose the same label; the numerator included those where that label matched ARBITER. Credit followed label equality: every source matching the chosen label received credit, and neither arm received credit if neither matched. Cells with identical labels from all sources provided no information about choice between sources. Sensitivities used each expert’s choices across all arm disagreements and counted split choices as ARBITER losses without assigning Unassisted wins. This measures conditional label matching, not preference for a system’s reasoning or workflow.</w:t>
+        <w:t xml:space="preserve">We compared signalling answers with five-level coding (yes, probably yes, no, probably no, no information) and collapsed coding that combined yes with probably yes and no with probably no, retaining no information as a separate category. Matching used trial, domain, question and explicitly named answer component, such as an outcome; undivided answers formed one component, and different named components were not pooled. Missing, inactive, inapplicable, unmatched and unresolved answers were excluded. Paired contrasts required evaluability in both arms.</w:t>
       </w:r>
     </w:p>
     <w:p>
@@ -520,7 +451,7 @@
         <w:pStyle w:val="BodyText"/>
       </w:pPr>
       <w:r>
-        <w:t xml:space="preserve">Signalling-answer agreement distinguished five levels: yes, probably yes, no, probably no and no information. Collapsed coding combined definite and probable affirmative answers and combined definite and probable negative answers, leaving no information separate. Answers were matched by trial, domain, question and component. A component was an explicitly named part of an answer, such as a separate answer for a particular outcome; an undivided answer was treated as one component. Answers for different named components were not pooled. Missing, inactive, not applicable, unmatched and unresolved answers were excluded; paired contrasts required evaluable answers in both arms. These comparisons assessed signalling answers separately from the recorded domain ratings.</w:t>
+        <w:t xml:space="preserve">We applied official RoB 2 algorithms to each arm’s own answers, using effect of assignment for deviations from intended interventions.[1] We checked proposed and adopted ARBITER ratings separately because documented overrides were permitted. Contradictory ratings and required-question omissions were rule breaks; absent ratings and answer sets were unevaluable. A sensitivity analysis recursively resolved invalid required answers as negative or no information. Overall checks allowed escalation for multiple Some concerns domains. Process outcomes also counted required active answers citing evidence, source/location records and assessment-file integrity; none measured semantic evidence support.</w:t>
       </w:r>
     </w:p>
     <w:p>
@@ -528,7 +459,7 @@
         <w:pStyle w:val="BodyText"/>
       </w:pPr>
       <w:r>
-        <w:t xml:space="preserve">Process outcomes assessed algorithm conformance, record completeness and source provenance. We applied the official RoB 2 algorithms to each arm’s own answers, using effect of assignment for deviations from intended interventions.[1] Ratings that contradicted their answers or omitted required questions constituted rule breaks; absent ratings and answer sets were unevaluable. A sensitivity analysis recursively resolved invalid required answers as negative or no information. Overall checks permitted escalation when multiple domains had Some concerns. Evidence coverage counted required active answers citing a passage or image. Quotation checks assessed whether evidence records identified the captured source and its location; audit-file checks assessed the integrity of the retained assessment files. These structural checks did not assess whether the evidence justified the answer. The algorithm determines proposed ratings; adopted ratings were checked separately because documented overrides were permitted.</w:t>
+        <w:t xml:space="preserve">Computational runtime summed model-turn elapsed durations. Application programming interface (API) list-price equivalents used recorded tokens and fixed provider rates, with cached inputs and additional calls detailed in eMethods. Subscription-based runs did not incur these reconstructed amounts as expenditure.</w:t>
       </w:r>
     </w:p>
     <w:p>
@@ -536,21 +467,13 @@
         <w:pStyle w:val="BodyText"/>
       </w:pPr>
       <w:r>
-        <w:t xml:space="preserve">Computational outcomes were runtime, summed across the elapsed durations of the model’s turns, and application programming interface (API) list-price equivalents reconstructed from recorded token counts and fixed provider rates. The runs used a subscription, so these dollar estimates were not expenditure. eMethods details the treatment of cached inputs and additional model calls.</w:t>
-      </w:r>
-    </w:p>
-    <w:p>
-      <w:pPr>
-        <w:pStyle w:val="BodyText"/>
-      </w:pPr>
-      <w:r>
-        <w:t xml:space="preserve">Exploratory analyses examined derived Overall ratings, severity and direction of disagreement, and rules-only recomputation. Derived Overall took the worst independent domain rating without optional escalation for multiple Some concerns. It summarized the five domains and was not an independent sixth domain. Expert-reference analyses used all 102 trials; Published Overall comparisons used only the 81 trials with observed labels, excluding 21 without labels. Directional analyses partitioned ratings stricter or more lenient than Published into expert matches to the arm, Published or neither. Rules-only recomputation replaced Unassisted ratings that contradicted their answers while retaining invalid answer sequences and missing ratings. Original disagreement populations remained fixed; new ties could credit both arms. Binary expert comparisons and severity strata were exploratory. Label choices across all disputed cells and revised ratings were descriptive because offered labels could anchor responses.</w:t>
-      </w:r>
-    </w:p>
-    <w:bookmarkEnd w:id="23"/>
-    <w:bookmarkStart w:id="24" w:name="statistical-analysis"/>
-    <w:p>
-      <w:bookmarkStart w:id="108" w:name="loc_44"/>
+        <w:t xml:space="preserve">Exploratory analyses examined derived Overall ratings, disagreement severity/direction and rules-only recomputation. Overall used the worst independent domain rating without optional escalation and was not an independent sixth domain. Expert comparisons included 102 trials; Published Overall used 81 with observed labels, excluding 21 without. Directional analyses partitioned stricter or more lenient ratings than Published into expert matches to the arm, Published or neither. Rules-only recomputation replaced contradictory Unassisted ratings but retained invalid sequences and missing ratings; original disagreement sets stayed fixed, and new ties could credit both arms. Binary expert comparisons and severity strata were exploratory. Choices across all disputed cells and revised ratings were descriptive because offered labels could anchor responses.</w:t>
+      </w:r>
+    </w:p>
+    <w:bookmarkEnd w:id="24"/>
+    <w:bookmarkStart w:id="25" w:name="statistical-analysis"/>
+    <w:p>
+      <w:bookmarkStart w:id="98" w:name="loc_39"/>
       <w:pPr>
         <w:pStyle w:val="Heading2"/>
       </w:pPr>
@@ -560,37 +483,21 @@
         </w:rPr>
         <w:t>Statistical analysis</w:t>
       </w:r>
-      <w:bookmarkEnd w:id="108"/>
+      <w:bookmarkEnd w:id="98"/>
     </w:p>
     <w:p>
       <w:pPr>
         <w:pStyle w:val="FirstParagraph"/>
       </w:pPr>
       <w:r>
-        <w:t xml:space="preserve">We estimated uncertainty with 10,000 stratified trial-cluster bootstrap resamples, seed 20261018. Trials were sampled with replacement within each of the 16 fixed reviews, retaining each review’s trial count and carrying both arms and all domain ratings together. Paired contrasts shared resampling weights. Percentile 95% CIs quantify trial variation conditional on these reviews, two experts and observed model runs; they do not quantify variation across new reviews, experts or repeated runs. Expert means averaged expert-specific estimates within each shared resample. No</w:t>
-      </w:r>
-      <w:r>
-        <w:t xml:space="preserve"> </w:t>
-      </w:r>
-      <w:r>
-        <w:rPr>
-          <w:i/>
-          <w:iCs/>
-        </w:rPr>
-        <w:t xml:space="preserve">P</w:t>
-      </w:r>
-      <w:r>
-        <w:t xml:space="preserve"> </w:t>
-      </w:r>
-      <w:r>
-        <w:t>values or multiplicity adjustments were used. Reporting was guided by TRIPOD-LLM and GRRAS, with an accompanying item map and author-completion fields.⁠[15,16]</w:t>
-      </w:r>
-    </w:p>
-    <w:bookmarkEnd w:id="24"/>
+        <w:t>We used 10,000 stratified trial-cluster bootstrap resamples (seed 20261018), sampling trials within each of 16 fixed reviews, retaining review sizes and carrying both arms and all domains together. Paired contrasts shared weights; expert means averaged expert-specific estimates within each resample. Percentile 95% CIs describe trial variation conditional on these reviews, experts and observed runs, not variation across new reviews, experts or repeated runs. We used no P values or multiplicity adjustments. TRIPOD-LLM and GRRAS informed reporting, with an accompanying item map and author-completion fields.⁠[12,13]</w:t>
+      </w:r>
+    </w:p>
     <w:bookmarkEnd w:id="25"/>
-    <w:bookmarkStart w:id="26" w:name="results-1"/>
-    <w:p>
-      <w:bookmarkStart w:id="110" w:name="loc_46"/>
+    <w:bookmarkEnd w:id="26"/>
+    <w:bookmarkStart w:id="27" w:name="results-1"/>
+    <w:p>
+      <w:bookmarkStart w:id="100" w:name="loc_41"/>
       <w:pPr>
         <w:pStyle w:val="Heading1"/>
       </w:pPr>
@@ -600,7 +507,7 @@
         </w:rPr>
         <w:t>RESULTS</w:t>
       </w:r>
-      <w:bookmarkEnd w:id="110"/>
+      <w:bookmarkEnd w:id="100"/>
     </w:p>
     <w:p>
       <w:pPr>
@@ -613,7 +520,7 @@
       </w:r>
     </w:p>
     <w:p>
-      <w:bookmarkStart w:id="112" w:name="loc_48"/>
+      <w:bookmarkStart w:id="102" w:name="loc_43"/>
       <w:pPr>
         <w:pStyle w:val="Heading2"/>
         <w:keepNext/>
@@ -626,7 +533,7 @@
         </w:rPr>
         <w:t>Table 1. Benchmark and reference context</w:t>
       </w:r>
-      <w:bookmarkEnd w:id="112"/>
+      <w:bookmarkEnd w:id="102"/>
     </w:p>
     <w:tbl>
       <w:tblPr>
@@ -1441,7 +1348,7 @@
       </w:r>
     </w:p>
     <w:p>
-      <w:bookmarkStart w:id="115" w:name="loc_51"/>
+      <w:bookmarkStart w:id="105" w:name="loc_46"/>
       <w:pPr>
         <w:pStyle w:val="Heading2"/>
         <w:keepNext/>
@@ -1454,7 +1361,7 @@
         </w:rPr>
         <w:t>Table 2. Conditional blinded-label choices and sensitivities</w:t>
       </w:r>
-      <w:bookmarkEnd w:id="115"/>
+      <w:bookmarkEnd w:id="105"/>
     </w:p>
     <w:tbl>
       <w:tblPr>
@@ -1875,7 +1782,7 @@
       </w:r>
     </w:p>
     <w:p>
-      <w:bookmarkStart w:id="119" w:name="loc_55"/>
+      <w:bookmarkStart w:id="109" w:name="loc_50"/>
       <w:pPr>
         <w:pStyle w:val="Heading2"/>
         <w:keepNext/>
@@ -1888,7 +1795,7 @@
         </w:rPr>
         <w:t>Table 3. Process checks and computational resources</w:t>
       </w:r>
-      <w:bookmarkEnd w:id="119"/>
+      <w:bookmarkEnd w:id="109"/>
     </w:p>
     <w:tbl>
       <w:tblPr>
@@ -3492,10 +3399,10 @@
         <w:t xml:space="preserve">ARBITER required more computation. Median (IQR) runtime was 7.6 (6.1–10.5) versus 0.5 (0.4–0.5) minutes per trial; the paired mean difference was 11.0 minutes (95% CI, 8.4–14.1). Median (IQR) API list-price equivalents were US$3.78 (3.46–4.10) versus US$0.09 (0.07–0.13), with a paired mean difference of US$3.68 (3.61–3.75).</w:t>
       </w:r>
     </w:p>
-    <w:bookmarkEnd w:id="26"/>
-    <w:bookmarkStart w:id="28" w:name="discussion-1"/>
-    <w:p>
-      <w:bookmarkStart w:id="121" w:name="loc_57"/>
+    <w:bookmarkEnd w:id="27"/>
+    <w:bookmarkStart w:id="29" w:name="discussion-1"/>
+    <w:p>
+      <w:bookmarkStart w:id="111" w:name="loc_52"/>
       <w:pPr>
         <w:pStyle w:val="Heading1"/>
       </w:pPr>
@@ -3505,14 +3412,14 @@
         </w:rPr>
         <w:t>DISCUSSION</w:t>
       </w:r>
-      <w:bookmarkEnd w:id="121"/>
+      <w:bookmarkEnd w:id="111"/>
     </w:p>
     <w:p>
       <w:pPr>
         <w:pStyle w:val="FirstParagraph"/>
       </w:pPr>
       <w:r>
-        <w:t xml:space="preserve">Agreement depended on the reference: ARBITER did not show a clear advantage against published review labels, but agreed more often with each independent expert than Unassisted across the 510 trial–domain assessments. Independent ratings were frozen before exposure to offered labels. The blinded-choice result concerned a selected subset: among 80 arm-discordant assessments, experts agreed on 60 choices and split on 20; 53/60 agreed choices matched ARBITER (88%; 95% CI, 80–96%). Labels were shown without source identities or rationales, so this conditional match does not establish endorsement of ARBITER’s reasoning. The broader comparison comes from the independently recorded ratings.</w:t>
+        <w:t xml:space="preserve">ARBITER showed no clear agreement advantage over minimal prompting against published labels, whereas it agreed more often with each independent expert. Published labels were predominantly Low and did not always concern an exactly aligned result. Broader published targets could make an apparently discordant rating appropriate for a different result; review-level conventions could also differ from those applied to our specified task. These are plausible explanations for investigation, rather than demonstrated causes of the observed pattern. The independent ratings provide a complementary comparison because experts assessed the same inputs and target prompts before seeing offered labels. Their disagreement, particularly for missing outcome data, also shows why neither expert can be treated as an error-free standard.</w:t>
       </w:r>
     </w:p>
     <w:p>
@@ -3520,7 +3427,7 @@
         <w:pStyle w:val="BodyText"/>
       </w:pPr>
       <w:r>
-        <w:t xml:space="preserve">That agreement advantage was not uniform. Selection of the reported result (D5) had the largest observed domain-rating gains, whereas missing outcome data (D3) showed marked reference dependence. For D3 signalling answers against Expert 1, the paired ARBITER minus Unassisted difference was unfavorable with five-level coding, −10.3 percentage points (95% CI, −17.2 to −3.2), and favorable with collapsed coding, +8.5 (3.5–13.7). Combining probable with definite answers changes the distinctions being assessed; the favorable collapsed estimate does not remove the adverse five-level finding. The D5 collapsed contrast against Expert 2 was also smaller, +3.7 points (−0.3 to 7.4). Neither pattern identifies why the experts or workflows differed, and intervals for individual estimates do not test differences between domains.</w:t>
+        <w:t xml:space="preserve">Reference dependence is visible even when human comparators assess the same trial set. In Gandhi’s study of 50 RCTs sampled from 50 meta-analyses, overall exact agreement was 46% between ChatGPT-o3 and a masked panel, 36% between the model and original systematic review authors, and 54% between the two human sources.[8] Agreement therefore describes a relationship between assessments, rather than an intrinsic property of a model. Reporting each reference separately preserves the distinction between reproducing a review’s published judgments and agreeing with independently elicited assessments. Our subsequent blinded choices add a narrower perspective: 53 labels matched ARBITER among the 60 arm-discordant cells with an agreed expert choice, with another 20 split choices. Since experts saw labels without rationales, this finding concerns conditional label matching rather than endorsement of the underlying reasoning.</w:t>
       </w:r>
     </w:p>
     <w:p>
@@ -3528,7 +3435,7 @@
         <w:pStyle w:val="BodyText"/>
       </w:pPr>
       <w:r>
-        <w:t xml:space="preserve">The reference also changed the overall interpretation. Against Published labels, the paired ARBITER minus Unassisted difference was −1.8 percentage points (95% CI, −5.1 to 1.6), compatible with either direction. Published labels were predominantly Low, and some covered broader, inferred or different assessment targets. These differences qualify their use as a reference without establishing the cause of disagreement. Huang and Gandhi likewise evaluated model assessments against both review-derived and fresh human references,[9,10] while Nyrhi used published assessments in separate RoB 1 and RoB 2 corpora.[17] Those designs do not supply interchangeable standards. Our experts received the same trial materials and task prompts as the arms, but their own disagreement, especially in D3, precludes treating fresh ratings as error-free truth.</w:t>
+        <w:t xml:space="preserve">The domain and answer findings show where the apparent improvement needs closer examination. D5 had the largest observed domain-rating gains, but its collapsed-answer contrast against Expert 2 included no difference. In D3 against Expert 1, an unfavorable five-level contrast became favorable after yes was combined with probably yes and no with probably no. Collapsing these clinical answer categories changes the distinctions being tested; it does not resolve the adverse five-level result. Inspection should therefore address both the interpretation of missing outcome data and the choice between a definite and probable answer. Separate intervals do not test differences between domains, and the present study did not identify the reasons for these disagreements.</w:t>
       </w:r>
     </w:p>
     <w:p>
@@ -3536,7 +3443,7 @@
         <w:pStyle w:val="BodyText"/>
       </w:pPr>
       <w:r>
-        <w:t xml:space="preserve">The retained record allows these interpretations to be examined. In the illustrative AVATAR assessment, stored documents did not establish a dated analysis plan for the assessed result; the answers and cited passages preserve the basis for that judgment. ARBITER binds text quotations and image regions to stored sources and records their locations. Software computes proposed ratings, while a different adopted rating requires evidence and a rationale. All 510 adopted domain outputs conformed to the executable rules, and no domain overrides occurred. This observed conformance concerns the transition from recorded answers to ratings. It leaves the appropriateness of those answers open to assessment.</w:t>
+        <w:t xml:space="preserve">Executable rules settle one part of this pathway: the transition from recorded answers to proposed ratings. All adopted ARBITER ratings followed their answers, with no overrides observed, whereas Unassisted sometimes contradicted its answers or omitted required questions. In Choi’s single-trial pilot, ROBOTO2’s entered ratings matched those implied by its answers in a mean 60% of domain judgments across 10 runs and five domains.[14] The repeated single-trial design examines within-trial variation rather than performance across a trial population, but illustrates why agreement with an expert and conformity to one’s own answers are different properties. Software fixes the answer-to-rating transition; the interpretation producing those answers remains the unresolved step.</w:t>
       </w:r>
     </w:p>
     <w:p>
@@ -3544,7 +3451,7 @@
         <w:pStyle w:val="BodyText"/>
       </w:pPr>
       <w:r>
-        <w:t xml:space="preserve">Conformance is already an explicit evaluation target in related work. Choi and colleagues examined expert agreement, rule conformance and repeated outputs in a single-trial pilot.[18] Their questions overlap with ours, but their repeated single-trial design and this multi-trial, single-run comparison address different sources of variation. LogiMed-RoB audits hierarchical consistency in RoB 2 assessments.[19] ARBITER’s source checks assess a different property: they establish source binding and record integrity without determining whether passages justify answers; image descriptions remained model-written. Liang’s RoB 2 retrieve-then-verify study addresses evidence support using a judge model, rather than independent human adjudication.[20] Independent assessment of each passage-to-answer relation, including image-derived interpretations, remains necessary to evaluate that property in ARBITER.</w:t>
+        <w:t xml:space="preserve">That interpretive step is clinically consequential in selection of the reported result. The illustrative AVATAR assessment did not establish a dated analysis plan for the assessed mortality result from the supplied documents. A passage describing an analysis can establish what was reported without establishing that the plan preceded access to unblinded outcome data.[1] Retaining the source passage, signalling answer and justification lets a reviewer examine that temporal distinction and seek additional documentation. The example illustrates how an inspectable record can support scrutiny without making a claim about typical performance or the cause of the observed D5 gains.</w:t>
       </w:r>
     </w:p>
     <w:p>
@@ -3552,7 +3459,7 @@
         <w:pStyle w:val="BodyText"/>
       </w:pPr>
       <w:r>
-        <w:t xml:space="preserve">The observed differences belong to the complete workflows. Identical supplied trial documents and a common reported model identifier and configuration make the comparison informative, but ARBITER also received additional guidance, tools and computation. The study cannot attribute its agreement advantage to rule enforcement, evidence recording or another component. Rules-only recomputation describes internal consistency but cannot recover those component effects. Minimal prompting also does not represent the structured alternatives already evaluated.[7,9,10,11] RoB2-Evaluator, described in a preprint, is another rule-constrained RoB 2 implementation.[21] ARBITER required greater computation: median runtime was 7.6 versus 0.5 minutes per trial, with higher API list-price equivalents. These quantities describe computational burden; the subscription-based runs did not incur those reconstructed list-price amounts as expenditure.</w:t>
+        <w:t xml:space="preserve">Evidence support requires evaluating the relation between a claim and its source. In Liang’s study of 97 trial reports from one Cochrane review, GPT-5’s mean evidence support was 64.3% (SD 5.9%) under an automated retrieve-then-verify procedure.[15] These judgments depended on retrieved context and a single judge model, rather than independent human validation. The distinction is relevant to our structural findings: storing an actual captured slice establishes what text was selected, while a reviewer must determine whether it addresses the relevant result and sufficiently supports the answer. Omitted passages may change that interpretation, extraction may lose information, and image transcriptions remain model-written. Independent passage-to-answer assessment would test this unresolved relation.</w:t>
       </w:r>
     </w:p>
     <w:p>
@@ -3560,7 +3467,7 @@
         <w:pStyle w:val="BodyText"/>
       </w:pPr>
       <w:r>
-        <w:t xml:space="preserve">Generalization is bounded by purposive review selection, ordered and availability-dependent trial selection, 16 fixed reviews, two experts and one run per trial per arm. Bootstrap intervals describe trial variation within those reviews, conditional on the observed experts and runs. They do not quantify variation across new reviews, assessors or repeated runs. Prior model exposure to reports is unknown. Offered labels could influence forced choices and revised ratings, despite source blinding. Results pertain to the evaluated software revision; documented assessment-command correspondence does not establish equivalence with the complete public release.</w:t>
+        <w:t xml:space="preserve">The observed agreement differences belong to the complete workflows. ARBITER combined additional instructions, software and computation, so this comparison and the rules-only recomputation cannot isolate component effects. Minimal prompting also provides a limited comparator alongside structured alternatives.[8,9,10] Both arms used a common reported model identifier and configuration on different dates, without verified immutable snapshot identity. Purposive review selection, ordered and availability-dependent trial selection, target uncertainty, unsupported-design exclusions, two experts and one run per arm restrict generalization. Bootstrap intervals describe trial variation conditional on the fixed reviews, experts and observed runs. Prior model exposure to trial reports is unknown, and complete development and version-freeze documentation and expert qualifications remain pending. Offered labels could anchor later choices and revised ratings despite source blinding. Findings concern the evaluated software revision.</w:t>
       </w:r>
     </w:p>
     <w:p>
@@ -3568,12 +3475,12 @@
         <w:pStyle w:val="BodyText"/>
       </w:pPr>
       <w:r>
-        <w:t xml:space="preserve">Reviewer use requires a separate evaluation. Soboczenski and colleagues randomized manual and RobotReviewer-assisted tasks using four domains of the earlier instrument, directly observing assessment time and reviewer behavior.[22] Jardim’s study in ongoing reviews found mixed acceptability and lacked a manual-only time comparison.[23] These studies show why output agreement, checking time and adoption merit separate outcomes. They do not establish benefit for ARBITER. A reviewer study should examine whether users detect unsupported interpretations, how long verification takes and how suggestions affect their final judgments, without treating acceptance or correction rates as semantic validation. ARBITER’s computational runtime cannot answer those questions.</w:t>
-      </w:r>
-    </w:p>
-    <w:bookmarkStart w:id="27" w:name="conclusion-1"/>
-    <w:p>
-      <w:bookmarkStart w:id="130" w:name="loc_66"/>
+        <w:t xml:space="preserve">The practical question is whether reviewers can detect unsupported interpretations and reach defensible judgments with less verification effort. Computational runtime does not measure that work. In a randomized within-reviewer study of four domains of the earlier Cochrane tool, 41 participants assessed articles with and without RobotReviewer assistance; modeled relative assessment time was 0.75 (95% CI, 0.62–0.92).[16] An implementation study in ongoing reviews found mixed acceptability and lacked a manual-only time comparator.[17] These studies make reviewer behavior and verification time central outcomes for an evaluation of ARBITER in use. Such a study should examine which unsupported interpretations reviewers detect, how suggestions affect final judgments, and the effort required to check them. In living reviews, the retained record also provides a basis for studying how reviewers revisit assessments when new reports or supporting documents become available.</w:t>
+      </w:r>
+    </w:p>
+    <w:bookmarkStart w:id="28" w:name="conclusion-1"/>
+    <w:p>
+      <w:bookmarkStart w:id="120" w:name="loc_61"/>
       <w:pPr>
         <w:pStyle w:val="Heading2"/>
       </w:pPr>
@@ -3583,21 +3490,21 @@
         </w:rPr>
         <w:t>Conclusion</w:t>
       </w:r>
-      <w:bookmarkEnd w:id="130"/>
+      <w:bookmarkEnd w:id="120"/>
     </w:p>
     <w:p>
       <w:pPr>
         <w:pStyle w:val="FirstParagraph"/>
       </w:pPr>
       <w:r>
-        <w:t xml:space="preserve">ARBITER preserves the pathway from supplied sources through signalling answers to RoB 2 rating decisions. Its complete workflow agreed more often with both independent experts than same-model minimal prompting, with domain and reference dependence. The retained record supports inspection; evidence support and benefit during reviewer use remain to be evaluated.</w:t>
-      </w:r>
-    </w:p>
-    <w:bookmarkEnd w:id="27"/>
+        <w:t xml:space="preserve">In this single-run benchmark, ARBITER showed no clear published-label agreement advantage and agreed more often with both independent experts than minimal prompting using a comparably configured reported model. Evidence support and reviewer benefit remain untested. Its demonstrated contribution is an inspectable pathway connecting supplied sources and signalling answers to rule-conformant ratings.</w:t>
+      </w:r>
+    </w:p>
     <w:bookmarkEnd w:id="28"/>
-    <w:bookmarkStart w:id="38" w:name="back-matter"/>
-    <w:p>
-      <w:bookmarkStart w:id="132" w:name="loc_68"/>
+    <w:bookmarkEnd w:id="29"/>
+    <w:bookmarkStart w:id="39" w:name="back-matter"/>
+    <w:p>
+      <w:bookmarkStart w:id="122" w:name="loc_63"/>
       <w:pPr>
         <w:pStyle w:val="Heading1"/>
       </w:pPr>
@@ -3607,11 +3514,11 @@
         </w:rPr>
         <w:t>BACK MATTER</w:t>
       </w:r>
-      <w:bookmarkEnd w:id="132"/>
-    </w:p>
-    <w:bookmarkStart w:id="29" w:name="acknowledgments-and-ai-use"/>
-    <w:p>
-      <w:bookmarkStart w:id="133" w:name="loc_69"/>
+      <w:bookmarkEnd w:id="122"/>
+    </w:p>
+    <w:bookmarkStart w:id="30" w:name="acknowledgments-and-ai-use"/>
+    <w:p>
+      <w:bookmarkStart w:id="123" w:name="loc_64"/>
       <w:pPr>
         <w:pStyle w:val="Heading2"/>
       </w:pPr>
@@ -3621,7 +3528,7 @@
         </w:rPr>
         <w:t>Acknowledgments and AI use</w:t>
       </w:r>
-      <w:bookmarkEnd w:id="133"/>
+      <w:bookmarkEnd w:id="123"/>
     </w:p>
     <w:p>
       <w:pPr>
@@ -3631,10 +3538,10 @@
         <w:t xml:space="preserve">[Non-author contributors and acknowledgments]. OpenAI GPT-6-Astra, GPT-6.1-Sol and GPT-6-Luna, accessed through T3 Code, assisted literature research, drafting and editorial checks in this revision. Final author review, approval and accountability remain pending; any AI assistance before this revision remains to be confirmed. [Author to verify the complete disclosure, including any AI use in code, data processing or figures, and provide matching cover-letter disclosure]. The expert assessments and forced-choice adjudication used no AI.</w:t>
       </w:r>
     </w:p>
-    <w:bookmarkEnd w:id="29"/>
-    <w:bookmarkStart w:id="30" w:name="funding"/>
-    <w:p>
-      <w:bookmarkStart w:id="135" w:name="loc_71"/>
+    <w:bookmarkEnd w:id="30"/>
+    <w:bookmarkStart w:id="31" w:name="funding"/>
+    <w:p>
+      <w:bookmarkStart w:id="125" w:name="loc_66"/>
       <w:pPr>
         <w:pStyle w:val="Heading2"/>
       </w:pPr>
@@ -3644,7 +3551,7 @@
         </w:rPr>
         <w:t>Funding</w:t>
       </w:r>
-      <w:bookmarkEnd w:id="135"/>
+      <w:bookmarkEnd w:id="125"/>
     </w:p>
     <w:p>
       <w:pPr>
@@ -3654,10 +3561,10 @@
         <w:t xml:space="preserve">[Funding sources, grant identifiers and funder role, or an explicit statement of no funding].</w:t>
       </w:r>
     </w:p>
-    <w:bookmarkEnd w:id="30"/>
-    <w:bookmarkStart w:id="31" w:name="competing-interests"/>
-    <w:p>
-      <w:bookmarkStart w:id="137" w:name="loc_73"/>
+    <w:bookmarkEnd w:id="31"/>
+    <w:bookmarkStart w:id="32" w:name="competing-interests"/>
+    <w:p>
+      <w:bookmarkStart w:id="127" w:name="loc_68"/>
       <w:pPr>
         <w:pStyle w:val="Heading2"/>
       </w:pPr>
@@ -3667,7 +3574,7 @@
         </w:rPr>
         <w:t>Competing interests</w:t>
       </w:r>
-      <w:bookmarkEnd w:id="137"/>
+      <w:bookmarkEnd w:id="127"/>
     </w:p>
     <w:p>
       <w:pPr>
@@ -3677,10 +3584,10 @@
         <w:t xml:space="preserve">[Author-specific competing interests, including relevant relationships to ARBITER, or an explicit declaration of none].</w:t>
       </w:r>
     </w:p>
-    <w:bookmarkEnd w:id="31"/>
-    <w:bookmarkStart w:id="32" w:name="author-contributions"/>
-    <w:p>
-      <w:bookmarkStart w:id="139" w:name="loc_75"/>
+    <w:bookmarkEnd w:id="32"/>
+    <w:bookmarkStart w:id="33" w:name="author-contributions"/>
+    <w:p>
+      <w:bookmarkStart w:id="129" w:name="loc_70"/>
       <w:pPr>
         <w:pStyle w:val="Heading2"/>
       </w:pPr>
@@ -3690,7 +3597,7 @@
         </w:rPr>
         <w:t>Author contributions</w:t>
       </w:r>
-      <w:bookmarkEnd w:id="139"/>
+      <w:bookmarkEnd w:id="129"/>
     </w:p>
     <w:p>
       <w:pPr>
@@ -3700,10 +3607,10 @@
         <w:t xml:space="preserve">[Author names mapped to CRediT roles; confirmation of final approval and accountability].</w:t>
       </w:r>
     </w:p>
-    <w:bookmarkEnd w:id="32"/>
-    <w:bookmarkStart w:id="33" w:name="Xa795f839aa3476760733bd38e4d2d15944e6881"/>
-    <w:p>
-      <w:bookmarkStart w:id="141" w:name="loc_77"/>
+    <w:bookmarkEnd w:id="33"/>
+    <w:bookmarkStart w:id="34" w:name="Xa795f839aa3476760733bd38e4d2d15944e6881"/>
+    <w:p>
+      <w:bookmarkStart w:id="131" w:name="loc_72"/>
       <w:pPr>
         <w:pStyle w:val="Heading2"/>
       </w:pPr>
@@ -3713,7 +3620,7 @@
         </w:rPr>
         <w:t>Ethics, registration and public involvement</w:t>
       </w:r>
-      <w:bookmarkEnd w:id="141"/>
+      <w:bookmarkEnd w:id="131"/>
     </w:p>
     <w:p>
       <w:pPr>
@@ -3723,10 +3630,10 @@
         <w:t xml:space="preserve">[Ethics approval or exemption determination and consent requirements, including the expert assessment and forced-choice component]. [Study registration status and identifier, if applicable]. [Patient and public involvement statement].</w:t>
       </w:r>
     </w:p>
-    <w:bookmarkEnd w:id="33"/>
-    <w:bookmarkStart w:id="37" w:name="data-availability"/>
-    <w:p>
-      <w:bookmarkStart w:id="143" w:name="loc_79"/>
+    <w:bookmarkEnd w:id="34"/>
+    <w:bookmarkStart w:id="38" w:name="data-availability"/>
+    <w:p>
+      <w:bookmarkStart w:id="133" w:name="loc_74"/>
       <w:pPr>
         <w:pStyle w:val="Heading2"/>
       </w:pPr>
@@ -3736,7 +3643,7 @@
         </w:rPr>
         <w:t>Data availability</w:t>
       </w:r>
-      <w:bookmarkEnd w:id="143"/>
+      <w:bookmarkEnd w:id="133"/>
     </w:p>
     <w:p>
       <w:pPr>
@@ -3748,7 +3655,7 @@
       <w:r>
         <w:t xml:space="preserve"> </w:t>
       </w:r>
-      <w:hyperlink r:id="rId34">
+      <w:hyperlink r:id="rId35">
         <w:r>
           <w:rPr>
             <w:rStyle w:val="Hyperlink"/>
@@ -3765,7 +3672,7 @@
       <w:r>
         <w:t xml:space="preserve"> </w:t>
       </w:r>
-      <w:hyperlink r:id="rId20">
+      <w:hyperlink r:id="rId21">
         <w:r>
           <w:rPr>
             <w:rStyle w:val="Hyperlink"/>
@@ -3779,7 +3686,7 @@
       <w:r>
         <w:t xml:space="preserve"> </w:t>
       </w:r>
-      <w:hyperlink r:id="rId35">
+      <w:hyperlink r:id="rId36">
         <w:r>
           <w:rPr>
             <w:rStyle w:val="Hyperlink"/>
@@ -3796,7 +3703,7 @@
       <w:r>
         <w:t xml:space="preserve"> </w:t>
       </w:r>
-      <w:hyperlink r:id="rId36">
+      <w:hyperlink r:id="rId37">
         <w:r>
           <w:rPr>
             <w:rStyle w:val="Hyperlink"/>
@@ -3811,11 +3718,11 @@
         <w:t xml:space="preserve">provide the figures, editable tables and reproduction links. Trial PDFs will not be redistributed; trial DOIs and source-file hashes will identify the inputs. Author declarations and archival registration remain pending completion.</w:t>
       </w:r>
     </w:p>
-    <w:bookmarkEnd w:id="37"/>
     <w:bookmarkEnd w:id="38"/>
-    <w:bookmarkStart w:id="62" w:name="references"/>
-    <w:p>
-      <w:bookmarkStart w:id="145" w:name="loc_81"/>
+    <w:bookmarkEnd w:id="39"/>
+    <w:bookmarkStart w:id="57" w:name="references"/>
+    <w:p>
+      <w:bookmarkStart w:id="135" w:name="loc_76"/>
       <w:pPr>
         <w:pStyle w:val="Heading1"/>
       </w:pPr>
@@ -3825,7 +3732,7 @@
         </w:rPr>
         <w:t>REFERENCES</w:t>
       </w:r>
-      <w:bookmarkEnd w:id="145"/>
+      <w:bookmarkEnd w:id="135"/>
     </w:p>
     <w:p>
       <w:pPr>
@@ -3853,7 +3760,7 @@
       <w:r>
         <w:t xml:space="preserve">2019;366:l4898. doi:</w:t>
       </w:r>
-      <w:hyperlink r:id="rId39">
+      <w:hyperlink r:id="rId40">
         <w:r>
           <w:rPr>
             <w:rStyle w:val="Hyperlink"/>
@@ -3891,7 +3798,7 @@
       <w:r>
         <w:t xml:space="preserve">2020;126:37–44. doi:</w:t>
       </w:r>
-      <w:hyperlink r:id="rId40">
+      <w:hyperlink r:id="rId41">
         <w:r>
           <w:rPr>
             <w:rStyle w:val="Hyperlink"/>
@@ -3929,50 +3836,12 @@
       <w:r>
         <w:t xml:space="preserve">2022;141:99–105. doi:</w:t>
       </w:r>
-      <w:hyperlink r:id="rId41">
+      <w:hyperlink r:id="rId42">
         <w:r>
           <w:rPr>
             <w:rStyle w:val="Hyperlink"/>
           </w:rPr>
           <w:t xml:space="preserve">10.1016/j.jclinepi.2021.09.021</w:t>
-        </w:r>
-      </w:hyperlink>
-      <w:r>
-        <w:t xml:space="preserve">.</w:t>
-      </w:r>
-    </w:p>
-    <w:p>
-      <w:pPr>
-        <w:numPr>
-          <w:ilvl w:val="0"/>
-          <w:numId w:val="1001"/>
-        </w:numPr>
-      </w:pPr>
-      <w:r>
-        <w:t xml:space="preserve">Bertizzolo L, Bossuyt P, Atal I, et al. Disagreements in risk of bias assessment for randomised controlled trials included in more than one Cochrane systematic reviews: a research on research study using cross-sectional design.</w:t>
-      </w:r>
-      <w:r>
-        <w:t xml:space="preserve"> </w:t>
-      </w:r>
-      <w:r>
-        <w:rPr>
-          <w:i/>
-          <w:iCs/>
-        </w:rPr>
-        <w:t xml:space="preserve">BMJ Open</w:t>
-      </w:r>
-      <w:r>
-        <w:t xml:space="preserve"> </w:t>
-      </w:r>
-      <w:r>
-        <w:t xml:space="preserve">2019;9:e028382. doi:</w:t>
-      </w:r>
-      <w:hyperlink r:id="rId42">
-        <w:r>
-          <w:rPr>
-            <w:rStyle w:val="Hyperlink"/>
-          </w:rPr>
-          <w:t xml:space="preserve">10.1136/bmjopen-2018-028382</w:t>
         </w:r>
       </w:hyperlink>
       <w:r>
@@ -4250,82 +4119,6 @@
         </w:numPr>
       </w:pPr>
       <w:r>
-        <w:t xml:space="preserve">Taneri PE. Human Versus Artificial Intelligence: Comparing Cochrane Authors’ and ChatGPT’s Risk of Bias Assessments.</w:t>
-      </w:r>
-      <w:r>
-        <w:t xml:space="preserve"> </w:t>
-      </w:r>
-      <w:r>
-        <w:rPr>
-          <w:i/>
-          <w:iCs/>
-        </w:rPr>
-        <w:t xml:space="preserve">Cochrane Evidence Synthesis and Methods</w:t>
-      </w:r>
-      <w:r>
-        <w:t xml:space="preserve"> </w:t>
-      </w:r>
-      <w:r>
-        <w:t xml:space="preserve">2025;3:e70044. doi:</w:t>
-      </w:r>
-      <w:hyperlink r:id="rId50">
-        <w:r>
-          <w:rPr>
-            <w:rStyle w:val="Hyperlink"/>
-          </w:rPr>
-          <w:t xml:space="preserve">10.1002/cesm.70044</w:t>
-        </w:r>
-      </w:hyperlink>
-      <w:r>
-        <w:t xml:space="preserve">.</w:t>
-      </w:r>
-    </w:p>
-    <w:p>
-      <w:pPr>
-        <w:numPr>
-          <w:ilvl w:val="0"/>
-          <w:numId w:val="1001"/>
-        </w:numPr>
-      </w:pPr>
-      <w:r>
-        <w:t xml:space="preserve">Lai YJ, Lin SH, Liu JW. Evaluating the Accuracy of Large Language Models in Risk-of-Bias Assessment Using Version 2 of the Cochrane Risk-of-Bias Tool for Randomized Trials: Exploratory Feasibility Study.</w:t>
-      </w:r>
-      <w:r>
-        <w:t xml:space="preserve"> </w:t>
-      </w:r>
-      <w:r>
-        <w:rPr>
-          <w:i/>
-          <w:iCs/>
-        </w:rPr>
-        <w:t xml:space="preserve">J Med Internet Res</w:t>
-      </w:r>
-      <w:r>
-        <w:t xml:space="preserve"> </w:t>
-      </w:r>
-      <w:r>
-        <w:t xml:space="preserve">2026;28:e84915. doi:</w:t>
-      </w:r>
-      <w:hyperlink r:id="rId51">
-        <w:r>
-          <w:rPr>
-            <w:rStyle w:val="Hyperlink"/>
-          </w:rPr>
-          <w:t xml:space="preserve">10.2196/84915</w:t>
-        </w:r>
-      </w:hyperlink>
-      <w:r>
-        <w:t xml:space="preserve">.</w:t>
-      </w:r>
-    </w:p>
-    <w:p>
-      <w:pPr>
-        <w:numPr>
-          <w:ilvl w:val="0"/>
-          <w:numId w:val="1001"/>
-        </w:numPr>
-      </w:pPr>
-      <w:r>
         <w:t xml:space="preserve">Gartlehner G, Kugley S, Crotty K, et al. Artificial Intelligence–Assisted Data Extraction With a Large Language Model: A Study Within Reviews.</w:t>
       </w:r>
       <w:r>
@@ -4344,7 +4137,7 @@
       <w:r>
         <w:t xml:space="preserve">2025;178:1763–71. doi:</w:t>
       </w:r>
-      <w:hyperlink r:id="rId52">
+      <w:hyperlink r:id="rId50">
         <w:r>
           <w:rPr>
             <w:rStyle w:val="Hyperlink"/>
@@ -4382,7 +4175,7 @@
       <w:r>
         <w:t xml:space="preserve">2025;31:60–69. doi:</w:t>
       </w:r>
-      <w:hyperlink r:id="rId53">
+      <w:hyperlink r:id="rId51">
         <w:r>
           <w:rPr>
             <w:rStyle w:val="Hyperlink"/>
@@ -4420,7 +4213,7 @@
       <w:r>
         <w:t xml:space="preserve">2011;64:96–106. doi:</w:t>
       </w:r>
-      <w:hyperlink r:id="rId54">
+      <w:hyperlink r:id="rId52">
         <w:r>
           <w:rPr>
             <w:rStyle w:val="Hyperlink"/>
@@ -4440,44 +4233,6 @@
         </w:numPr>
       </w:pPr>
       <w:r>
-        <w:t xml:space="preserve">Nyrhi L, Ponkilainen V, Laaksonen J, et al. Large language models for risk-of-bias assessment in randomised clinical trials—a comparative validation study.</w:t>
-      </w:r>
-      <w:r>
-        <w:t xml:space="preserve"> </w:t>
-      </w:r>
-      <w:r>
-        <w:rPr>
-          <w:i/>
-          <w:iCs/>
-        </w:rPr>
-        <w:t xml:space="preserve">EBioMedicine</w:t>
-      </w:r>
-      <w:r>
-        <w:t xml:space="preserve"> </w:t>
-      </w:r>
-      <w:r>
-        <w:t xml:space="preserve">2026;126:106238. doi:</w:t>
-      </w:r>
-      <w:hyperlink r:id="rId55">
-        <w:r>
-          <w:rPr>
-            <w:rStyle w:val="Hyperlink"/>
-          </w:rPr>
-          <w:t xml:space="preserve">10.1016/j.ebiom.2026.106238</w:t>
-        </w:r>
-      </w:hyperlink>
-      <w:r>
-        <w:t xml:space="preserve">.</w:t>
-      </w:r>
-    </w:p>
-    <w:p>
-      <w:pPr>
-        <w:numPr>
-          <w:ilvl w:val="0"/>
-          <w:numId w:val="1001"/>
-        </w:numPr>
-      </w:pPr>
-      <w:r>
         <w:t xml:space="preserve">Choi J, Swan H, Kim MJ, et al. Variability, algorithm conformance, and accuracy of large language model–based tools for risk-of-bias (RoB 2.0) assessment of randomized trials: a pilot study.</w:t>
       </w:r>
       <w:r>
@@ -4496,7 +4251,7 @@
       <w:r>
         <w:t xml:space="preserve">2026;2:91–97. doi:</w:t>
       </w:r>
-      <w:hyperlink r:id="rId56">
+      <w:hyperlink r:id="rId53">
         <w:r>
           <w:rPr>
             <w:rStyle w:val="Hyperlink"/>
@@ -4516,47 +4271,6 @@
         </w:numPr>
       </w:pPr>
       <w:r>
-        <w:t xml:space="preserve">Huang J, Tang Z, Ling Q, Kuang Z, E H. Can LLMs Follow Medical Expert Logic? A Benchmark for Hierarchical Logical Consistency in Risk-of-Bias Assessment.</w:t>
-      </w:r>
-      <w:r>
-        <w:t xml:space="preserve"> </w:t>
-      </w:r>
-      <w:r>
-        <w:rPr>
-          <w:i/>
-          <w:iCs/>
-        </w:rPr>
-        <w:t xml:space="preserve">arXiv</w:t>
-      </w:r>
-      <w:r>
-        <w:t xml:space="preserve"> </w:t>
-      </w:r>
-      <w:r>
-        <w:t xml:space="preserve">report, version 1, 10 September 2026.</w:t>
-      </w:r>
-      <w:r>
-        <w:t xml:space="preserve"> </w:t>
-      </w:r>
-      <w:hyperlink r:id="rId57">
-        <w:r>
-          <w:rPr>
-            <w:rStyle w:val="Hyperlink"/>
-          </w:rPr>
-          <w:t xml:space="preserve">arXiv:2609.11185v1</w:t>
-        </w:r>
-      </w:hyperlink>
-      <w:r>
-        <w:t xml:space="preserve">. Accepted to EMNLP 2026 Main Conference.</w:t>
-      </w:r>
-    </w:p>
-    <w:p>
-      <w:pPr>
-        <w:numPr>
-          <w:ilvl w:val="0"/>
-          <w:numId w:val="1001"/>
-        </w:numPr>
-      </w:pPr>
-      <w:r>
         <w:t xml:space="preserve">Liang Z, Sheffield C, Butera G, Antani S. Retrieve-Then-Verify for Evaluating Evidence Support and Hallucination in Large Language Model–Generated Medical Information: Empirical Study.</w:t>
       </w:r>
       <w:r>
@@ -4575,7 +4289,7 @@
       <w:r>
         <w:t xml:space="preserve">2026;5:e93761. doi:</w:t>
       </w:r>
-      <w:hyperlink r:id="rId58">
+      <w:hyperlink r:id="rId54">
         <w:r>
           <w:rPr>
             <w:rStyle w:val="Hyperlink"/>
@@ -4595,44 +4309,6 @@
         </w:numPr>
       </w:pPr>
       <w:r>
-        <w:t xml:space="preserve">Joseph J, Vishwanath R, Sisirkumar JV. RoB2-Evaluator: Development and Technical Evaluation of a Rule-Constrained Large Language Model System for Cochrane Risk of Bias 2 Assessment.</w:t>
-      </w:r>
-      <w:r>
-        <w:t xml:space="preserve"> </w:t>
-      </w:r>
-      <w:r>
-        <w:rPr>
-          <w:i/>
-          <w:iCs/>
-        </w:rPr>
-        <w:t xml:space="preserve">medRxiv</w:t>
-      </w:r>
-      <w:r>
-        <w:t xml:space="preserve"> </w:t>
-      </w:r>
-      <w:r>
-        <w:t xml:space="preserve">[Preprint]. Posted 23 September 2026. doi:</w:t>
-      </w:r>
-      <w:hyperlink r:id="rId59">
-        <w:r>
-          <w:rPr>
-            <w:rStyle w:val="Hyperlink"/>
-          </w:rPr>
-          <w:t xml:space="preserve">10.64898/2026.09.22.26363693</w:t>
-        </w:r>
-      </w:hyperlink>
-      <w:r>
-        <w:t xml:space="preserve">.</w:t>
-      </w:r>
-    </w:p>
-    <w:p>
-      <w:pPr>
-        <w:numPr>
-          <w:ilvl w:val="0"/>
-          <w:numId w:val="1001"/>
-        </w:numPr>
-      </w:pPr>
-      <w:r>
         <w:t xml:space="preserve">Soboczenski F, Trikalinos TA, Kuiper J, et al. Machine learning to help researchers evaluate biases in clinical trials: a prospective, randomized user study.</w:t>
       </w:r>
       <w:r>
@@ -4651,7 +4327,7 @@
       <w:r>
         <w:t xml:space="preserve">2019;19:96. doi:</w:t>
       </w:r>
-      <w:hyperlink r:id="rId60">
+      <w:hyperlink r:id="rId55">
         <w:r>
           <w:rPr>
             <w:rStyle w:val="Hyperlink"/>
@@ -4689,7 +4365,7 @@
       <w:r>
         <w:t xml:space="preserve">2022;22:167. doi:</w:t>
       </w:r>
-      <w:hyperlink r:id="rId61">
+      <w:hyperlink r:id="rId56">
         <w:r>
           <w:rPr>
             <w:rStyle w:val="Hyperlink"/>
@@ -4701,10 +4377,10 @@
         <w:t xml:space="preserve">.</w:t>
       </w:r>
     </w:p>
-    <w:bookmarkEnd w:id="62"/>
-    <w:bookmarkEnd w:id="63"/>
-    <w:p>
-      <w:bookmarkStart w:id="169" w:name="loc_105"/>
+    <w:bookmarkEnd w:id="57"/>
+    <w:bookmarkEnd w:id="58"/>
+    <w:p>
+      <w:bookmarkStart w:id="153" w:name="loc_94"/>
       <w:pPr>
         <w:pStyle w:val="Heading1"/>
         <w:pageBreakBefore/>
@@ -4712,7 +4388,7 @@
       <w:r>
         <w:t>FIGURE LEGENDS</w:t>
       </w:r>
-      <w:bookmarkEnd w:id="169"/>
+      <w:bookmarkEnd w:id="153"/>
     </w:p>
     <w:p>
       <w:pPr>

</xml_diff>

<commit_message>
Condense supplementary analyses and use neutral human review labels
</commit_message>
<xml_diff>
--- a/analysis/output/manuscript/Manuscript.docx
+++ b/analysis/output/manuscript/Manuscript.docx
@@ -42,7 +42,7 @@
     </w:p>
     <w:p>
       <w:r>
-        <w:t>Word counts: main text 3340; structured abstract 217.</w:t>
+        <w:t>Word counts: main text 3077; structured abstract 198.</w:t>
       </w:r>
     </w:p>
     <w:bookmarkEnd w:id="9"/>
@@ -92,7 +92,7 @@
         <w:t xml:space="preserve">Materials and Methods. </w:t>
       </w:r>
       <w:r>
-        <w:t xml:space="preserve">ARBITER records sources, selected evidence and signalling answers; software derives proposed ratings. ARBITER and minimal prompting (Unassisted) assessed identical supplied documents for 102 trials from 16 reviews. We compared published labels, independent expert ratings and conditional blinded label choices. Paired intervals resampled trials within fixed reviews.</w:t>
+        <w:t xml:space="preserve">ARBITER records sources, selected evidence and signalling answers; software derives proposed ratings. ARBITER and minimal prompting (Unassisted) assessed identical supplied documents for 102 trials from 16 reviews. We compared published labels, independent human reviewer ratings and conditional blinded label choices. Paired intervals resampled trials within fixed reviews.</w:t>
       </w:r>
     </w:p>
     <w:bookmarkEnd w:id="11"/>
@@ -109,7 +109,7 @@
         <w:t xml:space="preserve">Results. </w:t>
       </w:r>
       <w:r>
-        <w:t xml:space="preserve">Against published labels, ARBITER minus Unassisted exact agreement was −1.8 percentage points (95% CI, −5.1 to 1.6). Agreement with Expert 1 was 371/510 (72.7%) versus 332/510 (65.1%), a gain of 7.6 points (95% CI, 5.1–10.2); with Expert 2, it was 433/510 (84.9%) versus 400/510 (78.4%), a gain of 6.5 (3.5–9.4). Among 80 workflow disagreements, experts agreed on 60 blinded choices and split on 20; 53/60 agreed choices matched ARBITER (88%; 95% CI, 80–96%). All 510 adopted ARBITER domain ratings conformed to the decision rules. Median runtime was 7.6 versus 0.5 minutes per trial.</w:t>
+        <w:t xml:space="preserve">Against published labels, ARBITER minus Unassisted exact agreement was −1.8 percentage points (95% CI, −5.1 to 1.6). Agreement with Human Review 1 was 371/510 (72.7%) versus 332/510 (65.1%), a gain of 7.6 points (95% CI, 5.1–10.2); with Human Review 2, it was 433/510 (84.9%) versus 400/510 (78.4%), a gain of 6.5 (3.5–9.4). All 510 adopted ARBITER domain ratings conformed to the decision rules. Median runtime was 7.6 versus 0.5 minutes per trial.</w:t>
       </w:r>
     </w:p>
     <w:bookmarkEnd w:id="12"/>
@@ -143,7 +143,7 @@
         <w:t xml:space="preserve">Conclusion. </w:t>
       </w:r>
       <w:r>
-        <w:t xml:space="preserve">In this single-run benchmark, ARBITER preserved an inspectable assessment pathway and agreed more often with both independent experts, without a clear published-label agreement advantage.</w:t>
+        <w:t xml:space="preserve">In this single-run benchmark, ARBITER preserved an inspectable assessment pathway and agreed more often with both independent human reviewers, without a clear published-label agreement advantage.</w:t>
       </w:r>
     </w:p>
     <w:bookmarkEnd w:id="14"/>
@@ -213,7 +213,7 @@
         <w:pStyle w:val="FirstParagraph"/>
       </w:pPr>
       <w:r>
-        <w:t xml:space="preserve">We developed the Agentic Risk of Bias Inference Tool for Evidence Reviews (ARBITER) to preserve this pathway for experienced evidence reviewers. The model selects evidence and interprets it; software applies decision rules to the recorded answers. We asked whether the complete workflow was associated with different agreement from minimal prompting, and whether that comparison depended on the human reference. We used the same reported model identifier, comparable configuration and identical supplied trial documents to examine agreement with published review labels, independently recorded expert ratings and subsequent blinded label choices, alongside answer-level variation, rule conformance, source records and computational burden.</w:t>
+        <w:t xml:space="preserve">We developed the Agentic Risk of Bias Inference Tool for Evidence Reviews (ARBITER) to preserve this pathway for experienced evidence reviewers. The model selects evidence and interprets it; software applies decision rules to the recorded answers. We asked what assessment record the workflow preserves and how its ratings compare with published review labels and independent human reviewer ratings. We compared the complete workflow with minimal prompting using the same reported model identifier, comparable configuration and identical supplied trial documents.</w:t>
       </w:r>
     </w:p>
     <w:bookmarkEnd w:id="17"/>
@@ -267,7 +267,7 @@
         <w:pStyle w:val="BodyText"/>
       </w:pPr>
       <w:r>
-        <w:t xml:space="preserve">Each answer retains evidence and justification, with provision for uncertainty and counterevidence. The algorithm-derived proposal and adopted rating are separate: adopting a different rating requires a rationale and supporting evidence linked to the answers. We checked both. Exported HTML reports and audit files retain the assessment pathway. Runtime text matching, assessment-file verification and our structural source-provenance audit are separate checks; the audit did not re-extract quotations independently or test whether they justified the answers. Figure 2 illustrates the AVATAR assessment of all-cause death after early surgery versus watchful waiting in asymptomatic severe aortic stenosis, with its complete trace in the supplement. The case illustrates the workflow rather than typical performance; its stored documents did not establish a dated analysis plan for the assessed result.</w:t>
+        <w:t xml:space="preserve">Each answer retains evidence and justification, with provision for uncertainty and counterevidence. The algorithm-derived proposal and adopted rating are separate. Adopting a different rating requires a rationale and supporting evidence linked to the answers. Exported HTML reports and audit files retain the assessment pathway. Figure 2 illustrates the AVATAR assessment of all-cause death after early surgery versus watchful waiting in asymptomatic severe aortic stenosis. The case illustrates the workflow rather than typical performance; its stored documents did not establish a dated analysis plan for the assessed result.</w:t>
       </w:r>
     </w:p>
     <w:bookmarkEnd w:id="19"/>
@@ -369,7 +369,7 @@
       </w:r>
     </w:p>
     <w:bookmarkEnd w:id="22"/>
-    <w:bookmarkStart w:id="23" w:name="independent-expert-references"/>
+    <w:bookmarkStart w:id="23" w:name="independent-human-reviews"/>
     <w:p>
       <w:bookmarkStart w:id="87" w:name="loc_28"/>
       <w:pPr>
@@ -379,7 +379,7 @@
         <w:rPr>
           <w:b/>
         </w:rPr>
-        <w:t>Independent expert references</w:t>
+        <w:t>Independent human reviews</w:t>
       </w:r>
       <w:bookmarkEnd w:id="87"/>
     </w:p>
@@ -388,7 +388,7 @@
         <w:pStyle w:val="FirstParagraph"/>
       </w:pPr>
       <w:r>
-        <w:t xml:space="preserve">Two blinded experts, published researchers from BEACON Lab, independently assessed all five domains for every trial. A trial–domain pair constituted a cell. Each expert recorded and froze signalling answers and domain ratings before seeing offered labels, without AI assistance. Experts received the same trial materials, supplements and ClinicalTrials.gov records as the arms, the same target prompt specifying outcomes, contrasts and numerical anchors, and access to Cochrane guidance. [Pending: individual qualifications and RoB 2 experience, training/calibration and conventions for targets containing several outcomes.]</w:t>
+        <w:t xml:space="preserve">Two blinded human reviewers, published researchers from BEACON Lab, independently assessed all five domains for every trial. Their independent assessments are labeled Human Review 1 and Human Review 2. A trial–domain pair constituted a cell. Each human reviewer recorded and froze signalling answers and domain ratings before seeing offered labels, without AI assistance. Human reviewers received the same trial materials, supplements and ClinicalTrials.gov records as the arms, the same target prompt specifying outcomes, contrasts and numerical anchors, and access to Cochrane guidance. [Pending: individual qualifications and RoB 2 experience, training/calibration and conventions for targets containing several outcomes.]</w:t>
       </w:r>
     </w:p>
     <w:p>
@@ -396,7 +396,7 @@
         <w:pStyle w:val="BodyText"/>
       </w:pPr>
       <w:r>
-        <w:t xml:space="preserve">Subsequently, each expert saw Published, Unassisted and ARBITER labels in an order randomized by cell, without source identities or rationales, and chose the most defensible label. Each then supplied a revised rating, potentially different from all offered labels, and recorded whether answers were retained or changed. We analyzed independent ratings, choices and revised ratings separately; blinded adjudication in data extraction provided a procedural precedent.[11] Completed workbooks are available in the study repository, and eMethods summarizes the sequence. [Pending: original blank assessment form.]</w:t>
+        <w:t xml:space="preserve">Subsequently, each human reviewer saw Published, Unassisted and ARBITER labels in an order randomized by cell, without source identities or rationales, and chose the most defensible label. Human reviewers could then revise their ratings and answers. We use the frozen independent ratings for agreement comparisons and report the blinded choices separately; blinded adjudication in data extraction provided a procedural precedent.[11] Completed workbooks are available in the study repository. [Pending: original blank assessment form.]</w:t>
       </w:r>
     </w:p>
     <w:bookmarkEnd w:id="23"/>
@@ -419,7 +419,7 @@
         <w:pStyle w:val="FirstParagraph"/>
       </w:pPr>
       <w:r>
-        <w:t xml:space="preserve">We report published-label agreement first, followed by independent-expert agreement, conditional label choices, domain/answer detail and process outcomes. This order was adopted after analysis and does not imply prospective specification or a formal outcome hierarchy.</w:t>
+        <w:t xml:space="preserve">We report published-label agreement first, followed by agreement with independent human reviews and process/resource outcomes. Conditional label choices and signalling-answer comparisons provide supporting evidence. The reporting scope was reduced after analysis for focus, without a formal outcome hierarchy or a claim of prospective specification. The supplement records omitted analysis families and the Git revision retaining them.</w:t>
       </w:r>
     </w:p>
     <w:p>
@@ -427,7 +427,7 @@
         <w:pStyle w:val="BodyText"/>
       </w:pPr>
       <w:r>
-        <w:t xml:space="preserve">For Published, we calculated exact agreement and paired percentage-point differences across 510 cells, followed by linearly weighted Cohen’s κ, sensitivity for Some concerns or High, and specificity; Gwet’s AC2 is supplementary. An All-Low rule described prevalence, with κ suppressed because predictions lacked variance. Missing predictions counted as disagreement. We separately compared each source with each expert’s independent ratings using exact agreement, paired differences and weighted κ. Independent reference ratings were read directly from the expert assessment records. Supporting analyses included expert-to-expert agreement, unweighted κ, confusion matrices, expert means and cells where experts agreed.</w:t>
+        <w:t xml:space="preserve">For Published, we calculated exact agreement and paired percentage-point differences across 510 cells, followed by linearly weighted Cohen’s κ. An All-Low rule described prevalence, with κ suppressed because predictions lacked variance. Missing predictions counted as disagreement. We compared each source with each human reviewer’s independent ratings separately, pooled and by domain, using exact agreement and weighted κ. Paired contrasts compared ARBITER with Unassisted. Between human reviews agreement and category distributions describe the references.</w:t>
       </w:r>
     </w:p>
     <w:p>
@@ -435,7 +435,7 @@
         <w:pStyle w:val="BodyText"/>
       </w:pPr>
       <w:r>
-        <w:t xml:space="preserve">The conditional label-choice analysis included the cells where the arms differed and both experts chose the same label. Its numerator counted agreed labels matching ARBITER. Credit followed label equality, including credit to multiple sources with the same label or neither arm if neither matched. Identical labels from all sources could not distinguish sources. Sensitivities examined each expert’s choices over all arm disagreements and counted split choices as ARBITER losses without assigning Unassisted wins. These outcomes measured label matches, not endorsement of reasoning.</w:t>
+        <w:t xml:space="preserve">The conditional label-choice analysis included the cells where the arms differed and both human reviewers chose the same label. Its numerator counted agreed labels matching ARBITER. Sensitivities used each human reviewer’s choices over all arm disagreements and counted split choices as ARBITER losses without assigning Unassisted wins. Credit followed label equality. Choices measured label matches, not endorsement of reasoning.</w:t>
       </w:r>
     </w:p>
     <w:p>
@@ -443,7 +443,7 @@
         <w:pStyle w:val="BodyText"/>
       </w:pPr>
       <w:r>
-        <w:t xml:space="preserve">We compared signalling answers with five-level coding (yes, probably yes, no, probably no, no information) and collapsed coding that combined yes with probably yes and no with probably no, retaining no information as a separate category. Matching used trial, domain, question and explicitly named answer component, such as an outcome; undivided answers formed one component, and different named components were not pooled. Missing, inactive, inapplicable, unmatched and unresolved answers were excluded. Paired contrasts required evaluability in both arms.</w:t>
+        <w:t xml:space="preserve">Supporting domain summaries and complete paired question results compare signalling answers with five-level coding (yes, probably yes, no, probably no, no information) and collapsed coding that combines yes/probably yes and no/probably no, retaining no information separately. Matching used trial, domain, question and explicitly named answer component. Missing, inactive, inapplicable, unmatched and unresolved answers were excluded. Paired contrasts required evaluability in both arms; the supplement gives eligible denominators. Compact exploratory checks compare recorded arm Overall ratings with each human reviewer’s worst independent domain rating and recompute contradictory Unassisted labels from their recorded answers. These checks neither supply directly rated human reviewer Overall judgments nor isolate component effects.</w:t>
       </w:r>
     </w:p>
     <w:p>
@@ -451,7 +451,7 @@
         <w:pStyle w:val="BodyText"/>
       </w:pPr>
       <w:r>
-        <w:t xml:space="preserve">We applied official RoB 2 algorithms to each arm’s own answers, using effect of assignment for deviations from intended interventions.[1] We checked proposed and adopted ARBITER ratings separately because documented overrides were permitted. Contradictory ratings and required-question omissions were rule breaks; absent ratings and answer sets were unevaluable. A sensitivity analysis recursively resolved invalid required answers as negative or no information. Overall checks allowed escalation for multiple Some concerns domains. Process outcomes also counted required active answers citing evidence, source/location records and assessment-file integrity; none measured semantic evidence support.</w:t>
+        <w:t xml:space="preserve">We applied official RoB 2 algorithms to each arm’s own answers, using effect of assignment for deviations from intended interventions.[1] We checked proposed and adopted ARBITER ratings separately because documented overrides were permitted. Contradictory ratings and required-question omissions were rule breaks; absent ratings and answer sets were unevaluable. Process checks also counted active required answers citing evidence, source/location records and assessment-file integrity. The structural source audit did not independently re-extract quotations or assess whether they supported the answers.</w:t>
       </w:r>
     </w:p>
     <w:p>
@@ -460,20 +460,12 @@
       </w:pPr>
       <w:r>
         <w:t xml:space="preserve">Computational runtime summed model-turn elapsed durations. Application programming interface (API) list-price equivalents used recorded tokens and fixed provider rates, with cached inputs and additional calls detailed in eMethods. Subscription-based runs did not incur these reconstructed amounts as expenditure.</w:t>
-      </w:r>
-    </w:p>
-    <w:p>
-      <w:pPr>
-        <w:pStyle w:val="BodyText"/>
-      </w:pPr>
-      <w:r>
-        <w:t xml:space="preserve">Exploratory analyses examined derived Overall ratings, disagreement severity/direction and rules-only recomputation. Overall used the worst independent domain rating without optional escalation and was not an independent sixth domain. Expert comparisons included 102 trials; Published Overall used 81 with observed labels, excluding 21 without. Directional analyses partitioned stricter or more lenient ratings than Published into expert matches to the arm, Published or neither. Rules-only recomputation replaced contradictory Unassisted ratings but retained invalid sequences and missing ratings; original disagreement sets stayed fixed, and new ties could credit both arms. Binary expert comparisons and severity strata were exploratory. Choices across all disputed cells and revised ratings were descriptive because offered labels could anchor responses.</w:t>
       </w:r>
     </w:p>
     <w:bookmarkEnd w:id="24"/>
     <w:bookmarkStart w:id="25" w:name="statistical-analysis"/>
     <w:p>
-      <w:bookmarkStart w:id="98" w:name="loc_39"/>
+      <w:bookmarkStart w:id="97" w:name="loc_38"/>
       <w:pPr>
         <w:pStyle w:val="Heading2"/>
       </w:pPr>
@@ -483,21 +475,21 @@
         </w:rPr>
         <w:t>Statistical analysis</w:t>
       </w:r>
-      <w:bookmarkEnd w:id="98"/>
+      <w:bookmarkEnd w:id="97"/>
     </w:p>
     <w:p>
       <w:pPr>
         <w:pStyle w:val="FirstParagraph"/>
       </w:pPr>
       <w:r>
-        <w:t>We used 10,000 stratified trial-cluster bootstrap resamples (seed 20261018), sampling trials within each of 16 fixed reviews, retaining review sizes and carrying both arms and all domains together. Paired contrasts shared weights; expert means averaged expert-specific estimates within each resample. Percentile 95% CIs describe trial variation conditional on these reviews, experts and observed runs, not variation across new reviews, experts or repeated runs. We used no P values or multiplicity adjustments. TRIPOD-LLM and GRRAS informed reporting, with an accompanying item map and author-completion fields.⁠[12,13]</w:t>
+        <w:t>We used 10,000 stratified trial-cluster bootstrap resamples (seed 20261018), sampling trials within each of 16 fixed reviews, retaining review sizes and carrying both arms and all domains together. Paired contrasts shared weights. Percentile 95% CIs describe trial variation conditional on these reviews, human reviewers and observed runs, not variation across new reviews, human reviewers or repeated runs. We used no P values or multiplicity adjustments. TRIPOD-LLM and GRRAS informed reporting, with an accompanying item map and author-completion fields.⁠[12,13]</w:t>
       </w:r>
     </w:p>
     <w:bookmarkEnd w:id="25"/>
     <w:bookmarkEnd w:id="26"/>
     <w:bookmarkStart w:id="27" w:name="results-1"/>
     <w:p>
-      <w:bookmarkStart w:id="100" w:name="loc_41"/>
+      <w:bookmarkStart w:id="99" w:name="loc_40"/>
       <w:pPr>
         <w:pStyle w:val="Heading1"/>
       </w:pPr>
@@ -507,7 +499,7 @@
         </w:rPr>
         <w:t>RESULTS</w:t>
       </w:r>
-      <w:bookmarkEnd w:id="100"/>
+      <w:bookmarkEnd w:id="99"/>
     </w:p>
     <w:p>
       <w:pPr>
@@ -516,11 +508,11 @@
         <w:keepLines/>
       </w:pPr>
       <w:r>
-        <w:t xml:space="preserve">The 102 included trials yielded 510 trial–domain cells, all independently assessed by both experts (Figure 3; Table 1). Published labels were Low in 427/510 cells (83.7%), compared with 277/510 (54.3%) for Expert 1 and 346/510 (67.8%) for Expert 2. An all-Low rule matched 83.7% of Published domain labels. Against Published across all 510 cells, ARBITER matched 386/510 (75.7%) and Unassisted 395/510 (77.5%), a paired difference of −1.8 points (95% CI, −5.1 to 1.6).</w:t>
-      </w:r>
-    </w:p>
-    <w:p>
-      <w:bookmarkStart w:id="102" w:name="loc_43"/>
+        <w:t xml:space="preserve">The 102 included trials yielded 510 trial–domain cells, all independently assessed by both human reviewers (Figure 3; Table 1). Published labels were Low in 427/510 cells (83.7%), compared with 277/510 (54.3%) for Human Review 1 and 346/510 (67.8%) for Human Review 2. An all-Low rule matched 83.7% of Published domain labels. Against Published across all 510 cells, ARBITER matched 386/510 (75.7%) and Unassisted 395/510 (77.5%), a paired difference of −1.8 points (95% CI, −5.1 to 1.6).</w:t>
+      </w:r>
+    </w:p>
+    <w:p>
+      <w:bookmarkStart w:id="101" w:name="loc_42"/>
       <w:pPr>
         <w:pStyle w:val="Heading2"/>
         <w:keepNext/>
@@ -533,7 +525,7 @@
         </w:rPr>
         <w:t>Table 1. Benchmark and reference context</w:t>
       </w:r>
-      <w:bookmarkEnd w:id="102"/>
+      <w:bookmarkEnd w:id="101"/>
     </w:p>
     <w:tbl>
       <w:tblPr>
@@ -1189,7 +1181,7 @@
                 <w:rFonts w:ascii="Arial" w:hAnsi="Arial"/>
                 <w:sz w:val="20"/>
               </w:rPr>
-              <w:t xml:space="default">D1–D5: Expert 1</w:t>
+              <w:t xml:space="default">D1–D5: Human Review 1</w:t>
             </w:r>
           </w:p>
         </w:tc>
@@ -1256,7 +1248,7 @@
                 <w:rFonts w:ascii="Arial" w:hAnsi="Arial"/>
                 <w:sz w:val="20"/>
               </w:rPr>
-              <w:t xml:space="default">D1–D5: Expert 2</w:t>
+              <w:t xml:space="default">D1–D5: Human Review 2</w:t>
             </w:r>
           </w:p>
         </w:tc>
@@ -1323,7 +1315,7 @@
                 <w:rFonts w:ascii="Arial" w:hAnsi="Arial"/>
                 <w:sz w:val="20"/>
               </w:rPr>
-              <w:t xml:space="default">Reference categories are Low, Some concerns and High; each reference contributes 510 domain cells. Document counts are trials with each role recorded in the source inventory among 102 trials; roles can overlap. SAP, statistical analysis plan. Detailed distributions for all sources and derived Overall appear in the supplement.</w:t>
+              <w:t xml:space="default">Reference categories are Low, Some concerns and High; each reference contributes 510 domain cells. Document counts are trials with each role recorded in the source inventory among 102 trials; roles can overlap. SAP, statistical analysis plan. Reference distributions and separate human reviewer agreement appear in the compact supplement.</w:t>
             </w:r>
           </w:p>
         </w:tc>
@@ -1334,7 +1326,15 @@
         <w:pStyle w:val="BodyText"/>
       </w:pPr>
       <w:r>
-        <w:t xml:space="preserve">Across the full cohort, ARBITER agreed more often with both independent experts (Figure 4). It matched Expert 1 in 371/510 cells (72.7%) versus 332/510 (65.1%) for Unassisted, a paired gain of 7.6 percentage points (95% CI, 5.1–10.2). Against Expert 2, agreement was 433/510 (84.9%) versus 400/510 (78.4%), a gain of 6.5 points (3.5–9.4). The experts agreed in 388/510 cells (76.1%); Published labels matched the experts in 301/510 and 362/510 cells. Weighted κ values were 0.51 and 0.69 for ARBITER, compared with 0.35 and 0.53 for Unassisted; expert-to-expert weighted κ was 0.59.</w:t>
+        <w:t xml:space="preserve">Across the full cohort, ARBITER agreed more often with both independent human reviewers (Figure 4). It matched Human Review 1 in 371/510 cells (72.7%) versus 332/510 (65.1%) for Unassisted, a paired gain of 7.6 percentage points (95% CI, 5.1–10.2). Against Human Review 2, agreement was 433/510 (84.9%) versus 400/510 (78.4%), a gain of 6.5 points (3.5–9.4). The human reviewers agreed in 388/510 cells (76.1%). Weighted κ values were 0.51 and 0.69 for ARBITER, compared with 0.35 and 0.53 for Unassisted; weighted κ between the human reviews was 0.59.</w:t>
+      </w:r>
+    </w:p>
+    <w:p>
+      <w:pPr>
+        <w:pStyle w:val="BodyText"/>
+      </w:pPr>
+      <w:r>
+        <w:t xml:space="preserve">Agreement gains varied by domain, alongside disagreement between human reviewers. Selection of the reported result (D5) had the largest observed gains of 19.6 points (95% CI, 11.8–27.5) and 11.8 (2.9–20.6) against Human Reviews 1 and 2. For missing outcome data (D3), ARBITER matched 43/102 ratings from Human Review 1 (42.2%) and 80/102 from Human Review 2 (78.4%); the human reviewers agreed in 54/102 cells.</w:t>
       </w:r>
     </w:p>
     <w:p>
@@ -1344,7 +1344,7 @@
         <w:keepLines/>
       </w:pPr>
       <w:r>
-        <w:t xml:space="preserve">The arms’ ratings differed in 80 cells; the experts chose the same label in 60 and split in 20. The agreed label matched ARBITER in 53/60 cells (88%; 95% CI, 80–96%) and Unassisted in 7/60 (12%); Table 2 summarizes these choices. Across all 80 disagreements, the label chosen by Expert 1 matched ARBITER in 63/80 (79%), and that chosen by Expert 2 matched ARBITER in 61/80 (76%). Counting every split choice against ARBITER gave 53/80 (66%).</w:t>
+        <w:t xml:space="preserve">In the supporting label-choice exercise, the arms differed in 80 cells; human reviewers chose the same label in 60 and split in 20. The agreed label matched ARBITER in 53/60 cells (88%; 95% CI, 80–96%) and Unassisted in 7/60 (12%). Counting every split choice against ARBITER gave 53/80 (66%). Table 2 gives choice sensitivities.</w:t>
       </w:r>
     </w:p>
     <w:p>
@@ -1548,7 +1548,7 @@
                 <w:rFonts w:ascii="Arial" w:hAnsi="Arial"/>
                 <w:sz w:val="20"/>
               </w:rPr>
-              <w:t xml:space="default">Expert 1</w:t>
+              <w:t xml:space="default">Human Review 1</w:t>
             </w:r>
           </w:p>
         </w:tc>
@@ -1615,7 +1615,7 @@
                 <w:rFonts w:ascii="Arial" w:hAnsi="Arial"/>
                 <w:sz w:val="20"/>
               </w:rPr>
-              <w:t xml:space="default">Expert 2</w:t>
+              <w:t xml:space="default">Human Review 2</w:t>
             </w:r>
           </w:p>
         </w:tc>
@@ -1749,7 +1749,7 @@
                 <w:rFonts w:ascii="Arial" w:hAnsi="Arial"/>
                 <w:sz w:val="20"/>
               </w:rPr>
-              <w:t xml:space="default">Conditional blinded-label choice evaluation includes 80 arm-discordant cells and the 60 for which the experts made an agreed choice; 20 choices split. Expert-specific sensitivities use all 80. The final row counts all 20 splits against ARBITER by assumption, without assigning Unassisted wins. Expert 1 chose neither arm in 4/80 cells; this is distinct from the split-loss assumption. CI, 95% confidence interval; 10,000 percentile bootstrap replicates, trials resampled within meta-analysis; seed 20261018.</w:t>
+              <w:t xml:space="default">Conditional blinded-label choice evaluation includes 80 arm-cells where the two arms disagreed and the 60 for which the human reviewers made an agreed choice; 20 choices split. Review-specific sensitivities use all 80. The final row counts all 20 splits against ARBITER by assumption, without assigning Unassisted wins. Human Review 1 chose neither arm in 4/80 cells; this is distinct from the split-loss assumption. CI, 95% confidence interval; 10,000 percentile bootstrap replicates, trials resampled within meta-analysis; seed 20261018.</w:t>
             </w:r>
           </w:p>
         </w:tc>
@@ -1760,15 +1760,7 @@
         <w:pStyle w:val="BodyText"/>
       </w:pPr>
       <w:r>
-        <w:t xml:space="preserve">Agreement gains varied by domain, alongside disagreement between experts. Selection of the reported result (D5) had the largest observed gains: 19.6 points (95% CI, 11.8–27.5) and 11.8 (2.9–20.6) against Experts 1 and 2. For missing outcome data (D3), ARBITER matched 43/102 ratings from Expert 1 (42.2%) and 80/102 from Expert 2 (78.4%); the experts agreed in 54/102 cells.</w:t>
-      </w:r>
-    </w:p>
-    <w:p>
-      <w:pPr>
-        <w:pStyle w:val="BodyText"/>
-      </w:pPr>
-      <w:r>
-        <w:t xml:space="preserve">Signalling-answer agreement depended on whether probable and definite answers were distinguished (Figure 5). In D3 against Expert 1, the five-level paired ARBITER minus Unassisted difference was −10.3 points (95% CI, −17.2 to −3.2), whereas the collapsed difference was +8.5 (3.5–13.7), both using 165 paired components. In D5, collapsed gains were +11.3 points against Expert 1, using 301 paired components, and +3.7 (−0.3 to 7.4) against Expert 2, using 300. The supplement reports complete question-level results and source-specific absolute rates, whose eligible denominators may differ from those of the paired contrasts. Exploratory rules-only recomputation changed 26 Unassisted labels while retaining their recorded answers, invalid answer sequences and missingness.</w:t>
+        <w:t xml:space="preserve">Signalling-answer agreement depended on coding (Figure 5). In D3 against Human Review 1, the five-level paired difference was −10.3 points (95% CI, −17.2 to −3.2), whereas the collapsed difference was +8.5 (3.5–13.7), both using 165 paired components. For question 4.1, five-level differences favored Unassisted against both human reviewers, whereas collapsed differences were zero. The supplement gives complete paired question results, both codings and eligible denominators.</w:t>
       </w:r>
     </w:p>
     <w:p>
@@ -1778,11 +1770,11 @@
         <w:keepLines/>
       </w:pPr>
       <w:r>
-        <w:t xml:space="preserve">All 510 adopted ARBITER domain outputs conformed to the algorithms, with no recorded domain overrides (Table 3). Proposed ratings are determined algorithmically; the absence of overrides and conformance of adopted ratings were observations in this benchmark. Unassisted had rule breaks in 65/509 evaluable domain outputs: 26 contradictory ratings and 39 required-question omissions; one cell was unevaluable. All 1538 active required answers cited a passage or image. All 1407/1407 text spans and 14 image records passed source-provenance checks, and all 102 exported assessment records passed completeness and consistency checks. These audits counted different objects and did not establish whether the cited evidence supported the answers.</w:t>
-      </w:r>
-    </w:p>
-    <w:p>
-      <w:bookmarkStart w:id="109" w:name="loc_50"/>
+        <w:t xml:space="preserve">All 510 adopted ARBITER domain outputs conformed to the algorithms, with no recorded domain overrides (Table 3). Unassisted had rule breaks in 65/509 evaluable domain outputs, comprising 26 contradictory ratings and 39 required-question omissions; one cell was unevaluable. All 1538 active required answers cited a passage or image. All 1407/1407 text spans and 14 image records passed source-provenance checks, and all 102 exported assessment records passed structural verification. These checks did not assess whether evidence supported the answers.</w:t>
+      </w:r>
+    </w:p>
+    <w:p>
+      <w:bookmarkStart w:id="108" w:name="loc_49"/>
       <w:pPr>
         <w:pStyle w:val="Heading2"/>
         <w:keepNext/>
@@ -1795,7 +1787,7 @@
         </w:rPr>
         <w:t>Table 3. Process checks and computational resources</w:t>
       </w:r>
-      <w:bookmarkEnd w:id="109"/>
+      <w:bookmarkEnd w:id="108"/>
     </w:p>
     <w:tbl>
       <w:tblPr>
@@ -3396,13 +3388,13 @@
         <w:pStyle w:val="BodyText"/>
       </w:pPr>
       <w:r>
-        <w:t xml:space="preserve">ARBITER required more computation. Median (IQR) runtime was 7.6 (6.1–10.5) versus 0.5 (0.4–0.5) minutes per trial; the paired mean difference was 11.0 minutes (95% CI, 8.4–14.1). Median (IQR) API list-price equivalents were US$3.78 (3.46–4.10) versus US$0.09 (0.07–0.13), with a paired mean difference of US$3.68 (3.61–3.75).</w:t>
+        <w:t xml:space="preserve">Median runtime was 7.6 versus 0.5 minutes per trial. Median API list-price equivalents were US$3.78 versus US$0.09. Table 3 gives distributions and paired resource differences. Human verification time and expenditure were not measured.</w:t>
       </w:r>
     </w:p>
     <w:bookmarkEnd w:id="27"/>
     <w:bookmarkStart w:id="29" w:name="discussion-1"/>
     <w:p>
-      <w:bookmarkStart w:id="111" w:name="loc_52"/>
+      <w:bookmarkStart w:id="110" w:name="loc_51"/>
       <w:pPr>
         <w:pStyle w:val="Heading1"/>
       </w:pPr>
@@ -3412,14 +3404,14 @@
         </w:rPr>
         <w:t>DISCUSSION</w:t>
       </w:r>
-      <w:bookmarkEnd w:id="111"/>
+      <w:bookmarkEnd w:id="110"/>
     </w:p>
     <w:p>
       <w:pPr>
         <w:pStyle w:val="FirstParagraph"/>
       </w:pPr>
       <w:r>
-        <w:t xml:space="preserve">ARBITER showed no clear agreement advantage over minimal prompting against published labels, whereas it agreed more often with each independent expert. Published labels were predominantly Low and did not always concern an exactly aligned result. Broader published targets could make an apparently discordant rating appropriate for a different result; review-level conventions could also differ from those applied to our specified task. These are plausible explanations for investigation, rather than demonstrated causes of the observed pattern. The independent ratings provide a complementary comparison because experts assessed the same inputs and target prompts before seeing offered labels. Their disagreement, particularly for missing outcome data, also shows why neither expert can be treated as an error-free standard.</w:t>
+        <w:t xml:space="preserve">ARBITER showed no clear agreement advantage over minimal prompting against published labels, whereas it agreed more often with each independent human reviewer. Published labels were predominantly Low and did not always concern an exactly aligned result. Broader published targets could make an apparently discordant rating appropriate for a different result; review-level conventions could also differ from those applied to our specified task. These are plausible explanations for investigation, rather than demonstrated causes of the observed pattern. The independent ratings provide a complementary comparison because human reviewers assessed the same inputs and target prompts before seeing offered labels. Their disagreement, particularly for missing outcome data, also shows why neither human reviewer can be treated as an error-free standard.</w:t>
       </w:r>
     </w:p>
     <w:p>
@@ -3427,7 +3419,7 @@
         <w:pStyle w:val="BodyText"/>
       </w:pPr>
       <w:r>
-        <w:t xml:space="preserve">Reference dependence is visible even when human comparators assess the same trial set. In Gandhi’s study of 50 RCTs sampled from 50 meta-analyses, overall exact agreement was 46% between ChatGPT-o3 and a masked panel, 36% between the model and original systematic review authors, and 54% between the two human sources.[8] Agreement therefore describes a relationship between assessments, rather than an intrinsic property of a model. Reporting each reference separately preserves the distinction between reproducing a review’s published judgments and agreeing with independently elicited assessments. Our subsequent blinded choices add a narrower perspective: 53 labels matched ARBITER among the 60 arm-discordant cells with an agreed expert choice, with another 20 split choices. Since experts saw labels without rationales, this finding concerns conditional label matching rather than endorsement of the underlying reasoning.</w:t>
+        <w:t xml:space="preserve">Reference dependence is visible even when human comparators assess the same trial set. In Gandhi’s study of 50 RCTs sampled from 50 meta-analyses, overall exact agreement was 46% between ChatGPT-o3 and a masked panel, 36% between the model and original systematic review authors, and 54% between the two human sources.[8] Agreement therefore describes a relationship between assessments, rather than an intrinsic property of a model. Reporting each reference separately preserves the distinction between reproducing a review’s published judgments and agreeing with independently elicited assessments. Our subsequent blinded choices add a narrower perspective: 53 labels matched ARBITER among the 60 arm-discordant cells with an agreed human reviewer choice, with another 20 split choices. Since human reviewers saw labels without rationales, this finding concerns conditional label matching rather than endorsement of the underlying reasoning.</w:t>
       </w:r>
     </w:p>
     <w:p>
@@ -3435,7 +3427,7 @@
         <w:pStyle w:val="BodyText"/>
       </w:pPr>
       <w:r>
-        <w:t xml:space="preserve">The domain and answer findings show where the apparent improvement needs closer examination. D5 had the largest observed domain-rating gains, but its collapsed-answer contrast against Expert 2 included no difference. In D3 against Expert 1, an unfavorable five-level contrast became favorable after yes was combined with probably yes and no with probably no. Collapsing these clinical answer categories changes the distinctions being tested; it does not resolve the adverse five-level result. Inspection should therefore address both the interpretation of missing outcome data and the choice between a definite and probable answer. Separate intervals do not test differences between domains, and the present study did not identify the reasons for these disagreements.</w:t>
+        <w:t xml:space="preserve">The domain and answer findings show where the apparent improvement needs closer examination. D5 had the largest observed domain-rating gains, but its collapsed-answer contrast against Human Review 2 included no difference. In D3 against Human Review 1, an unfavorable five-level contrast became favorable after yes was combined with probably yes and no with probably no. Collapsing these clinical answer categories changes the distinctions being tested; it does not resolve the adverse five-level result. Inspection should therefore address both the interpretation of missing outcome data and the choice between a definite and probable answer. Separate intervals do not test differences between domains, and the present study did not identify the reasons for these disagreements.</w:t>
       </w:r>
     </w:p>
     <w:p>
@@ -3443,7 +3435,7 @@
         <w:pStyle w:val="BodyText"/>
       </w:pPr>
       <w:r>
-        <w:t xml:space="preserve">Executable rules settle one part of this pathway: the transition from recorded answers to proposed ratings. All adopted ARBITER ratings followed their answers, with no overrides observed, whereas Unassisted sometimes contradicted its answers or omitted required questions. In Choi’s single-trial pilot, ROBOTO2’s entered ratings matched those implied by its answers in a mean 60% of domain judgments across 10 runs and five domains.[14] The repeated single-trial design examines within-trial variation rather than performance across a trial population, but illustrates why agreement with an expert and conformity to one’s own answers are different properties. Software fixes the answer-to-rating transition; the interpretation producing those answers remains the unresolved step.</w:t>
+        <w:t xml:space="preserve">Executable rules settle one part of this pathway: the transition from recorded answers to proposed ratings. All adopted ARBITER ratings followed their answers, with no overrides observed, whereas Unassisted sometimes contradicted its answers or omitted required questions. In Choi’s single-trial pilot, ROBOTO2’s entered ratings matched those implied by its answers in a mean 60% of domain judgments across 10 runs and five domains.[14] The repeated single-trial design examines within-trial variation rather than performance across a trial population, but illustrates why agreement with a human reviewer and conformity to one’s own answers are different properties. Software fixes the answer-to-rating transition; the interpretation producing those answers remains the unresolved step.</w:t>
       </w:r>
     </w:p>
     <w:p>
@@ -3467,7 +3459,7 @@
         <w:pStyle w:val="BodyText"/>
       </w:pPr>
       <w:r>
-        <w:t xml:space="preserve">The observed agreement differences belong to the complete workflows. ARBITER combined additional instructions, software and computation, so this comparison and the rules-only recomputation cannot isolate component effects. Minimal prompting also provides a limited comparator alongside structured alternatives.[8,9,10] Both arms used a common reported model identifier and configuration on different dates, without verified immutable snapshot identity. Purposive review selection, ordered and availability-dependent trial selection, target uncertainty, unsupported-design exclusions, two experts and one run per arm restrict generalization. Bootstrap intervals describe trial variation conditional on the fixed reviews, experts and observed runs. Prior model exposure to trial reports is unknown, and complete development and version-freeze documentation and expert qualifications remain pending. Offered labels could anchor later choices and revised ratings despite source blinding. Findings concern the evaluated software revision.</w:t>
+        <w:t xml:space="preserve">The observed agreement differences belong to the complete workflows. ARBITER combined additional instructions, software and computation, so the comparison cannot isolate component effects. Minimal prompting also provides a limited comparator alongside structured alternatives.[8,9,10] Both arms used a common reported model identifier and configuration on different dates, without verified immutable snapshot identity. Purposive review selection, ordered and availability-dependent trial selection, target uncertainty, unsupported-design exclusions, two human reviewers and one run per arm restrict generalization. Bootstrap intervals describe trial variation conditional on the fixed reviews, human reviewers and observed runs. Prior model exposure to trial reports is unknown, and complete development and version-freeze documentation and human reviewer qualifications remain pending. Offered labels could anchor later choices despite source blinding. Findings concern the evaluated software revision.</w:t>
       </w:r>
     </w:p>
     <w:p>
@@ -3480,7 +3472,7 @@
     </w:p>
     <w:bookmarkStart w:id="28" w:name="conclusion-1"/>
     <w:p>
-      <w:bookmarkStart w:id="120" w:name="loc_61"/>
+      <w:bookmarkStart w:id="119" w:name="loc_60"/>
       <w:pPr>
         <w:pStyle w:val="Heading2"/>
       </w:pPr>
@@ -3490,21 +3482,21 @@
         </w:rPr>
         <w:t>Conclusion</w:t>
       </w:r>
-      <w:bookmarkEnd w:id="120"/>
+      <w:bookmarkEnd w:id="119"/>
     </w:p>
     <w:p>
       <w:pPr>
         <w:pStyle w:val="FirstParagraph"/>
       </w:pPr>
       <w:r>
-        <w:t xml:space="preserve">In this single-run benchmark, ARBITER showed no clear published-label agreement advantage and agreed more often with both independent experts than minimal prompting using a comparably configured reported model. Evidence support and reviewer benefit remain untested. Its demonstrated contribution is an inspectable pathway connecting supplied sources and signalling answers to rule-conformant ratings.</w:t>
+        <w:t xml:space="preserve">In this single-run benchmark, ARBITER showed no clear published-label agreement advantage and agreed more often with both independent human reviewers than minimal prompting using a comparably configured reported model. Evidence support and reviewer benefit remain untested. Its demonstrated contribution is an inspectable pathway connecting supplied sources and signalling answers to rule-conformant ratings.</w:t>
       </w:r>
     </w:p>
     <w:bookmarkEnd w:id="28"/>
     <w:bookmarkEnd w:id="29"/>
     <w:bookmarkStart w:id="39" w:name="back-matter"/>
     <w:p>
-      <w:bookmarkStart w:id="122" w:name="loc_63"/>
+      <w:bookmarkStart w:id="121" w:name="loc_62"/>
       <w:pPr>
         <w:pStyle w:val="Heading1"/>
       </w:pPr>
@@ -3514,11 +3506,11 @@
         </w:rPr>
         <w:t>BACK MATTER</w:t>
       </w:r>
-      <w:bookmarkEnd w:id="122"/>
+      <w:bookmarkEnd w:id="121"/>
     </w:p>
     <w:bookmarkStart w:id="30" w:name="acknowledgments-and-ai-use"/>
     <w:p>
-      <w:bookmarkStart w:id="123" w:name="loc_64"/>
+      <w:bookmarkStart w:id="122" w:name="loc_63"/>
       <w:pPr>
         <w:pStyle w:val="Heading2"/>
       </w:pPr>
@@ -3528,20 +3520,20 @@
         </w:rPr>
         <w:t>Acknowledgments and AI use</w:t>
       </w:r>
-      <w:bookmarkEnd w:id="123"/>
+      <w:bookmarkEnd w:id="122"/>
     </w:p>
     <w:p>
       <w:pPr>
         <w:pStyle w:val="FirstParagraph"/>
       </w:pPr>
       <w:r>
-        <w:t xml:space="preserve">[Non-author contributors and acknowledgments]. OpenAI GPT-6-Astra, GPT-6.1-Sol and GPT-6-Luna, accessed through T3 Code, assisted literature research, drafting and editorial checks in this revision. Final author review, approval and accountability remain pending; any AI assistance before this revision remains to be confirmed. [Author to verify the complete disclosure, including any AI use in code, data processing or figures, and provide matching cover-letter disclosure]. The expert assessments and forced-choice adjudication used no AI.</w:t>
+        <w:t xml:space="preserve">[Non-author contributors and acknowledgments]. OpenAI GPT-6-Astra, GPT-6.1-Sol and GPT-6-Luna, accessed through T3 Code, assisted literature research, drafting and editorial checks in this revision. Final author review, approval and accountability remain pending; any AI assistance before this revision remains to be confirmed. [Author to verify the complete disclosure, including any AI use in code, data processing or figures, and provide matching cover-letter disclosure]. The human reviewer assessments and forced-choice adjudication used no AI.</w:t>
       </w:r>
     </w:p>
     <w:bookmarkEnd w:id="30"/>
     <w:bookmarkStart w:id="31" w:name="funding"/>
     <w:p>
-      <w:bookmarkStart w:id="125" w:name="loc_66"/>
+      <w:bookmarkStart w:id="124" w:name="loc_65"/>
       <w:pPr>
         <w:pStyle w:val="Heading2"/>
       </w:pPr>
@@ -3551,7 +3543,7 @@
         </w:rPr>
         <w:t>Funding</w:t>
       </w:r>
-      <w:bookmarkEnd w:id="125"/>
+      <w:bookmarkEnd w:id="124"/>
     </w:p>
     <w:p>
       <w:pPr>
@@ -3564,7 +3556,7 @@
     <w:bookmarkEnd w:id="31"/>
     <w:bookmarkStart w:id="32" w:name="competing-interests"/>
     <w:p>
-      <w:bookmarkStart w:id="127" w:name="loc_68"/>
+      <w:bookmarkStart w:id="126" w:name="loc_67"/>
       <w:pPr>
         <w:pStyle w:val="Heading2"/>
       </w:pPr>
@@ -3574,7 +3566,7 @@
         </w:rPr>
         <w:t>Competing interests</w:t>
       </w:r>
-      <w:bookmarkEnd w:id="127"/>
+      <w:bookmarkEnd w:id="126"/>
     </w:p>
     <w:p>
       <w:pPr>
@@ -3587,7 +3579,7 @@
     <w:bookmarkEnd w:id="32"/>
     <w:bookmarkStart w:id="33" w:name="author-contributions"/>
     <w:p>
-      <w:bookmarkStart w:id="129" w:name="loc_70"/>
+      <w:bookmarkStart w:id="128" w:name="loc_69"/>
       <w:pPr>
         <w:pStyle w:val="Heading2"/>
       </w:pPr>
@@ -3597,7 +3589,7 @@
         </w:rPr>
         <w:t>Author contributions</w:t>
       </w:r>
-      <w:bookmarkEnd w:id="129"/>
+      <w:bookmarkEnd w:id="128"/>
     </w:p>
     <w:p>
       <w:pPr>
@@ -3610,7 +3602,7 @@
     <w:bookmarkEnd w:id="33"/>
     <w:bookmarkStart w:id="34" w:name="Xa795f839aa3476760733bd38e4d2d15944e6881"/>
     <w:p>
-      <w:bookmarkStart w:id="131" w:name="loc_72"/>
+      <w:bookmarkStart w:id="130" w:name="loc_71"/>
       <w:pPr>
         <w:pStyle w:val="Heading2"/>
       </w:pPr>
@@ -3620,20 +3612,20 @@
         </w:rPr>
         <w:t>Ethics, registration and public involvement</w:t>
       </w:r>
-      <w:bookmarkEnd w:id="131"/>
+      <w:bookmarkEnd w:id="130"/>
     </w:p>
     <w:p>
       <w:pPr>
         <w:pStyle w:val="FirstParagraph"/>
       </w:pPr>
       <w:r>
-        <w:t xml:space="preserve">[Ethics approval or exemption determination and consent requirements, including the expert assessment and forced-choice component]. [Study registration status and identifier, if applicable]. [Patient and public involvement statement].</w:t>
+        <w:t xml:space="preserve">[Ethics approval or exemption determination and consent requirements, including the human reviewer assessment and forced-choice component]. [Study registration status and identifier, if applicable]. [Patient and public involvement statement].</w:t>
       </w:r>
     </w:p>
     <w:bookmarkEnd w:id="34"/>
     <w:bookmarkStart w:id="38" w:name="data-availability"/>
     <w:p>
-      <w:bookmarkStart w:id="133" w:name="loc_74"/>
+      <w:bookmarkStart w:id="132" w:name="loc_73"/>
       <w:pPr>
         <w:pStyle w:val="Heading2"/>
       </w:pPr>
@@ -3643,7 +3635,7 @@
         </w:rPr>
         <w:t>Data availability</w:t>
       </w:r>
-      <w:bookmarkEnd w:id="133"/>
+      <w:bookmarkEnd w:id="132"/>
     </w:p>
     <w:p>
       <w:pPr>
@@ -3667,7 +3659,7 @@
         <w:t xml:space="preserve"> </w:t>
       </w:r>
       <w:r>
-        <w:t xml:space="preserve">provides analysis code, derived data, expert assessment sheets, prompts and reproducibility materials. An archival DOI and complete dataset citation remain pending. ARBITER source is available at</w:t>
+        <w:t xml:space="preserve">provides analysis code, derived data, human reviewer assessment sheets, prompts and reproducibility materials. An archival DOI and complete dataset citation remain pending. ARBITER source is available at</w:t>
       </w:r>
       <w:r>
         <w:t xml:space="preserve"> </w:t>
@@ -3722,7 +3714,7 @@
     <w:bookmarkEnd w:id="39"/>
     <w:bookmarkStart w:id="57" w:name="references"/>
     <w:p>
-      <w:bookmarkStart w:id="135" w:name="loc_76"/>
+      <w:bookmarkStart w:id="134" w:name="loc_75"/>
       <w:pPr>
         <w:pStyle w:val="Heading1"/>
       </w:pPr>
@@ -3732,7 +3724,7 @@
         </w:rPr>
         <w:t>REFERENCES</w:t>
       </w:r>
-      <w:bookmarkEnd w:id="135"/>
+      <w:bookmarkEnd w:id="134"/>
     </w:p>
     <w:p>
       <w:pPr>
@@ -4380,7 +4372,7 @@
     <w:bookmarkEnd w:id="57"/>
     <w:bookmarkEnd w:id="58"/>
     <w:p>
-      <w:bookmarkStart w:id="153" w:name="loc_94"/>
+      <w:bookmarkStart w:id="152" w:name="loc_93"/>
       <w:pPr>
         <w:pStyle w:val="Heading1"/>
         <w:pageBreakBefore/>
@@ -4388,7 +4380,7 @@
       <w:r>
         <w:t>FIGURE LEGENDS</w:t>
       </w:r>
-      <w:bookmarkEnd w:id="153"/>
+      <w:bookmarkEnd w:id="152"/>
     </w:p>
     <w:p>
       <w:pPr>
@@ -4415,7 +4407,7 @@
         <w:pageBreakBefore/>
       </w:pPr>
       <w:r>
-        <w:t>Figure 2. Each answer is tied to stored sources, and RoB 2 rules compute the rating across every domain. AVATAR compares early surgery with watchful waiting in asymptomatic severe aortic stenosis; the outcome is all-cause death. This trial was chosen to illustrate the process, not as representative. Rows link paraphrased questions, source excerpts, AI answers, software checks and domain ratings. Letter/page tabs identify sources; “Weighed against” and “Open point” give counter-evidence and unknowns. A missing dated analysis plan leads to Some concerns overall. Full answers and official question wording appear in the AVATAR complete trace in the supplement. Y, yes; PY, probably yes; PN, probably no; N, no; NI, no information.</w:t>
+        <w:t>Figure 2. Each answer is tied to stored sources, and RoB 2 rules compute the rating across every domain. AVATAR compares early surgery with watchful waiting in asymptomatic severe aortic stenosis; the outcome is all-cause death. This trial was chosen to illustrate the process, not as representative. Rows link paraphrased questions, source excerpts, AI answers, software checks and domain ratings. Letter/page tabs identify sources; “Weighed against” and “Open point” give counter-evidence and unknowns. A missing dated analysis plan leads to Some concerns overall. Full answers and official question wording appear in the linked repository AVATAR answer and evidence records. Y, yes; PY, probably yes; PN, probably no; N, no; NI, no information. The footer compares the Published D5 label with the subsequent blinded D5 choices from both human reviews; it does not report independently rated Overall judgments.</w:t>
       </w:r>
     </w:p>
     <w:p>
@@ -4425,6 +4417,20 @@
       <w:r>
         <w:t>Alt text: AVATAR's five risk-of-bias domains connect source excerpts to the AI model's answers and the ratings computed by ARBITER. Four domains are Low. For selection of the reported result, the stored sources do not establish a dated plan for this analysis. The model answers No information, and the RoB 2 rules yield Some concerns for that domain and overall. Counter-evidence and unresolved questions remain visible alongside the answers.</w:t>
       </w:r>
+    </w:p>
+    <w:p>
+      <w:hyperlink r:id="rId9">
+        <w:r>
+          <w:t>Complete AVATAR answers</w:t>
+        </w:r>
+      </w:hyperlink>
+    </w:p>
+    <w:p>
+      <w:hyperlink r:id="rId10">
+        <w:r>
+          <w:t>Complete AVATAR evidence and quotations</w:t>
+        </w:r>
+      </w:hyperlink>
     </w:p>
     <w:p>
       <w:pPr>
@@ -4433,7 +4439,7 @@
         <w:pageBreakBefore/>
       </w:pPr>
       <w:r>
-        <w:t>Figure 3. Paired evaluation and conditional blinded-label choices. Both arms assessed the same 102 trials using the same Sonnet model and supplied documents. Two experts independently recorded ratings and signalling answers for all 510 trial-domain cells before viewing labels. In a separate stage, each chose among three labels presented in random order without rationales. The conditional choice estimate uses 60 agreed choices from 80 arm-discordant cells; 20 split choices enter sensitivities. The all-cell expert comparisons are not restricted to that conditional population. Counts are trials or cells as indicated; no interval applies.</w:t>
+        <w:t>Figure 3. Paired evaluation and conditional blinded-label choices. Both arms assessed the same 102 trials using the same reported model identifier and supplied documents. Two human reviewers independently recorded ratings and signalling answers for all 510 trial-domain cells before viewing labels. In a separate stage, each chose among three labels presented in random order without rationales. The conditional choice estimate uses 60 agreed choices from 80 arm-cells where the two arms disagreed; 20 split choices enter sensitivities. The all-cell human reviewer comparisons are not restricted to that conditional population. Counts are trials or cells as indicated; no interval applies.</w:t>
       </w:r>
     </w:p>
     <w:p>
@@ -4441,7 +4447,7 @@
         <w:keepLines/>
       </w:pPr>
       <w:r>
-        <w:t>Alt text: Paired evaluation of 102 trials and 510 cells against two independent experts. A separate conditional branch contains 80 arm-discordant cells, 60 agreed choices and 20 splits.</w:t>
+        <w:t>Alt text: Paired evaluation of 102 trials and 510 cells against two independent human reviewers. A separate conditional branch contains 80 arm-discordant cells, 60 agreed choices and 20 splits.</w:t>
       </w:r>
     </w:p>
     <w:p>
@@ -4451,7 +4457,7 @@
         <w:pageBreakBefore/>
       </w:pPr>
       <w:r>
-        <w:t>Figure 4. Absolute and paired domain agreement with each independent expert. Blue circles denote ARBITER and orange squares Unassisted. Left panels show exact agreement with 95% intervals on a 0–100% scale; right panels show paired ARBITER minus Unassisted differences in percentage points, with neutral diamonds and zero lines. Each expert contributes 510 pooled cells and 102 per domain. Expert-to-expert agreement is 388/510 (76.1%; weighted κ 0.59), context rather than a performance ceiling. The compact Published comparison retains all 510 cells. D1: randomisation process; D2: deviations from intended interventions; D3: missing outcome data; D4: outcome measurement; D5: selection of the reported result. Overall is supplementary. CI, 95% confidence interval; 10,000 percentile bootstrap replicates, trials resampled within meta-analysis; seed 20261018.</w:t>
+        <w:t>Figure 4. Absolute and paired domain agreement with each independent human reviewer. Blue circles denote ARBITER and orange squares Unassisted. Left panels show exact agreement with 95% intervals on a 0–100% scale; right panels show paired ARBITER minus Unassisted differences in percentage points, with neutral diamonds and zero lines. Each human reviewer contributes 510 pooled cells and 102 per domain. Between human reviews agreement is 388/510 (76.1%; weighted κ 0.59), context rather than a performance ceiling. The compact Published comparison retains all 510 cells. D1: randomisation process; D2: deviations from intended interventions; D3: missing outcome data; D4: outcome measurement; D5: selection of the reported result.  CI, 95% confidence interval; 10,000 percentile bootstrap replicates, trials resampled within meta-analysis; seed 20261018.</w:t>
       </w:r>
     </w:p>
     <w:p>
@@ -4459,7 +4465,7 @@
         <w:keepLines/>
       </w:pPr>
       <w:r>
-        <w:t>Alt text: Exact agreement and paired gains against each expert, pooled and by domain. Both pooled gains favor ARBITER; D5 gains are largest and D3 depends strongly on the expert reference. The full-cohort Published comparison is shown separately.</w:t>
+        <w:t>Alt text: Exact agreement and paired gains against each human reviewer, pooled and by domain. Both pooled gains favor ARBITER; D5 gains are largest and D3 depends strongly on the human reviewer reference. The full-cohort Published comparison is shown separately.</w:t>
       </w:r>
     </w:p>
     <w:p>
@@ -4469,7 +4475,7 @@
         <w:pageBreakBefore/>
       </w:pPr>
       <w:r>
-        <w:t>Figure 5. Paired signalling-answer diagnostics. Rows cover all five domains against each expert; n is the number of question components evaluable in both arms. Diamonds and bars show ARBITER minus Unassisted exact agreement and 95% intervals. Five-level matching distinguishes yes, probably yes, no, probably no and no information. Collapsed matching combines yes/probably yes and no/probably no, leaving no information separate. These are different estimands. D1: randomisation process; D2: deviations from intended interventions; D3: missing outcome data; D4: outcome measurement; D5: selection of the reported result. D3 and D5 illustrate reference dependence and the effect of coding; the complete question-level results, including sparse and unfavorable comparisons, are in eFigures 2 and 5. Source-specific absolute rates appear separately in eFigure 4. CI, 95% confidence interval; 10,000 percentile bootstrap replicates, trials resampled within meta-analysis; seed 20261018.</w:t>
+        <w:t>Figure 5. Paired signalling-answer diagnostics. Rows cover all five domains against each human reviewer; n is the number of question components evaluable in both arms. Diamonds and bars show ARBITER minus Unassisted exact agreement and 95% intervals. Five-level matching distinguishes yes, probably yes, no, probably no and no information. Collapsed matching combines yes/probably yes and no/probably no, leaving no information separate. These are different estimands. D1: randomisation process; D2: deviations from intended interventions; D3: missing outcome data; D4: outcome measurement; D5: selection of the reported result. D3 and D5 illustrate reference dependence and the effect of coding. eTable 6 contains source-specific domain summaries, complete paired question contrasts and eligibility accounting for both codings. CI, 95% confidence interval; 10,000 percentile bootstrap replicates, trials resampled within meta-analysis; seed 20261018.</w:t>
       </w:r>
     </w:p>
     <w:p>
@@ -4477,11 +4483,11 @@
         <w:keepLines/>
       </w:pPr>
       <w:r>
-        <w:t>Alt text: Paired signalling-answer differences by domain and expert, separating five-level and collapsed coding. D3 changes direction with coding against Expert 1; D5 collapsed gains are smaller against Expert 2.</w:t>
+        <w:t>Alt text: Paired signalling-answer differences by domain and human reviewer, separating five-level and collapsed coding. D3 changes direction with coding against Human Review 1; D5 collapsed gains are smaller against Human Review 2.</w:t>
       </w:r>
     </w:p>
     <w:sectPr>
-      <w:footerReference w:type="default" r:id="rId9"/>
+      <w:footerReference w:type="default" r:id="rId11"/>
       <w:footnotePr>
         <w:numRestart w:val="eachSect"/>
       </w:footnotePr>
@@ -5170,9 +5176,9 @@
     <w:rsid w:val="00A10FD9"/>
     <w:rPr>
       <w:rFonts w:asciiTheme="majorHAnsi" w:cstheme="majorBidi" w:eastAsiaTheme="majorEastAsia" w:hAnsiTheme="majorHAnsi"/>
-      <w:color w:themeColor="accent1" w:themeShade="BF" w:val="0F4761"/>
       <w:sz w:val="40"/>
       <w:szCs w:val="40"/>
+      <w:color w:val="000000"/>
     </w:rPr>
   </w:style>
   <w:style w:customStyle="1" w:styleId="Heading2Char" w:type="character">
@@ -5184,9 +5190,9 @@
     <w:rsid w:val="00A10FD9"/>
     <w:rPr>
       <w:rFonts w:asciiTheme="majorHAnsi" w:cstheme="majorBidi" w:eastAsiaTheme="majorEastAsia" w:hAnsiTheme="majorHAnsi"/>
-      <w:color w:themeColor="accent1" w:themeShade="BF" w:val="0F4761"/>
       <w:sz w:val="32"/>
       <w:szCs w:val="32"/>
+      <w:color w:val="000000"/>
     </w:rPr>
   </w:style>
   <w:style w:customStyle="1" w:styleId="Heading3Char" w:type="character">
@@ -5198,9 +5204,9 @@
     <w:rsid w:val="00A10FD9"/>
     <w:rPr>
       <w:rFonts w:cstheme="majorBidi" w:eastAsiaTheme="majorEastAsia"/>
-      <w:color w:themeColor="accent1" w:themeShade="BF" w:val="0F4761"/>
       <w:sz w:val="28"/>
       <w:szCs w:val="28"/>
+      <w:color w:val="000000"/>
     </w:rPr>
   </w:style>
   <w:style w:customStyle="1" w:styleId="Heading4Char" w:type="character">
@@ -5214,7 +5220,7 @@
       <w:rFonts w:cstheme="majorBidi" w:eastAsiaTheme="majorEastAsia"/>
       <w:i/>
       <w:iCs/>
-      <w:color w:themeColor="accent1" w:themeShade="BF" w:val="0F4761"/>
+      <w:color w:val="000000"/>
     </w:rPr>
   </w:style>
   <w:style w:customStyle="1" w:styleId="Heading5Char" w:type="character">
@@ -5226,7 +5232,7 @@
     <w:rsid w:val="00A10FD9"/>
     <w:rPr>
       <w:rFonts w:cstheme="majorBidi" w:eastAsiaTheme="majorEastAsia"/>
-      <w:color w:themeColor="accent1" w:themeShade="BF" w:val="0F4761"/>
+      <w:color w:val="000000"/>
     </w:rPr>
   </w:style>
   <w:style w:customStyle="1" w:styleId="Heading6Char" w:type="character">
@@ -5240,7 +5246,7 @@
       <w:rFonts w:cstheme="majorBidi" w:eastAsiaTheme="majorEastAsia"/>
       <w:i/>
       <w:iCs/>
-      <w:color w:themeColor="text1" w:themeTint="A6" w:val="595959"/>
+      <w:color w:val="000000"/>
     </w:rPr>
   </w:style>
   <w:style w:customStyle="1" w:styleId="Heading7Char" w:type="character">
@@ -5252,7 +5258,7 @@
     <w:rsid w:val="00A10FD9"/>
     <w:rPr>
       <w:rFonts w:cstheme="majorBidi" w:eastAsiaTheme="majorEastAsia"/>
-      <w:color w:themeColor="text1" w:themeTint="A6" w:val="595959"/>
+      <w:color w:val="000000"/>
     </w:rPr>
   </w:style>
   <w:style w:customStyle="1" w:styleId="Heading8Char" w:type="character">
@@ -5266,7 +5272,7 @@
       <w:rFonts w:cstheme="majorBidi" w:eastAsiaTheme="majorEastAsia"/>
       <w:i/>
       <w:iCs/>
-      <w:color w:themeColor="text1" w:themeTint="D8" w:val="272727"/>
+      <w:color w:val="000000"/>
     </w:rPr>
   </w:style>
   <w:style w:customStyle="1" w:styleId="Heading9Char" w:type="character">
@@ -5278,7 +5284,7 @@
     <w:rsid w:val="00A10FD9"/>
     <w:rPr>
       <w:rFonts w:cstheme="majorBidi" w:eastAsiaTheme="majorEastAsia"/>
-      <w:color w:themeColor="text1" w:themeTint="D8" w:val="272727"/>
+      <w:color w:val="000000"/>
     </w:rPr>
   </w:style>
   <w:style w:styleId="BlockText" w:type="paragraph">

</xml_diff>